<commit_message>
feat: refresh human-AI course and publish connected lab prompts
</commit_message>
<xml_diff>
--- a/courseware/LP-Human-AI Workforce with Autonomous AI Agents.docx
+++ b/courseware/LP-Human-AI Workforce with Autonomous AI Agents.docx
@@ -179,7 +179,7 @@
           <w:color w:val="1F6FEB"/>
           <w:sz w:val="24"/>
         </w:rPr>
-        <w:t>Version 2.0</w:t>
+        <w:t>Version 2.1</w:t>
       </w:r>
     </w:p>
     <w:p>
@@ -1020,6 +1020,64 @@
                 <w:sz w:val="19"/>
               </w:rPr>
               <w:t>Major revision. Deck redesigned in the 'Agentic AI Applications with Claude Code' house design. Topic 1 rebuilt as Foundations: history of AI, AI agents vs agentic AI, the agentic loop, harness engineering, the brain–perception–action framework, short/long-term memory, world models, single → multi-agent → human–agent collaboration paradigms, agent society, the Oct 2026 agent market (OpenClaw, Hermes Agent, Paperclip, OpenAI Dots, Meta Muse, Block Buzz, Manus Cue and more), Singapore's AgentSea (12,000+ agents) and human–AI use cases in science, maths, drug discovery and business. OpenClaw labs removed; 33 feature labs replaced by 10 connected use-case labs for the fictional Kopi Kaki Co. — Day 1 Hermes Agent (research brief, end-to-end social media campaign, human-in-the-loop publishing, multi-agent video studio, campaign command centre) and Day 2 Paperclip (found the company, hire the team, launch project, weekly video routine, govern &amp; improve) — with mock data, brand assets, skills, instruction PDFs and a local Lab Prompts page. Assessment v5 aligned; FG and AP added.</w:t>
+            </w:r>
+          </w:p>
+        </w:tc>
+        <w:tc>
+          <w:tcPr>
+            <w:tcW w:type="dxa" w:w="1440"/>
+          </w:tcPr>
+          <w:p>
+            <w:r/>
+            <w:r>
+              <w:rPr>
+                <w:sz w:val="19"/>
+              </w:rPr>
+              <w:t>Dr. Alfred Ang</w:t>
+            </w:r>
+          </w:p>
+        </w:tc>
+      </w:tr>
+      <w:tr>
+        <w:tc>
+          <w:tcPr>
+            <w:tcW w:type="dxa" w:w="1152"/>
+          </w:tcPr>
+          <w:p>
+            <w:r/>
+            <w:r>
+              <w:rPr>
+                <w:sz w:val="19"/>
+              </w:rPr>
+              <w:t>2.1</w:t>
+            </w:r>
+          </w:p>
+        </w:tc>
+        <w:tc>
+          <w:tcPr>
+            <w:tcW w:type="dxa" w:w="1656"/>
+          </w:tcPr>
+          <w:p>
+            <w:r/>
+            <w:r>
+              <w:rPr>
+                <w:sz w:val="19"/>
+              </w:rPr>
+              <w:t>29 October 2026</w:t>
+            </w:r>
+          </w:p>
+        </w:tc>
+        <w:tc>
+          <w:tcPr>
+            <w:tcW w:type="dxa" w:w="5544"/>
+          </w:tcPr>
+          <w:p>
+            <w:r/>
+            <w:r>
+              <w:rPr>
+                <w:sz w:val="19"/>
+              </w:rPr>
+              <w:t>Human–AI landscape rebuilt with practical workflows, research evidence, collaboration modes and humanoid futures; Day 1 single Hermes office automation with gog, Excel, interactive dashboard and professional PPT; Day 2 Kanban and Claude Code video team; SWDA subscription steps and connected GitHub Pages prompts.</w:t>
             </w:r>
           </w:p>
         </w:tc>
@@ -1139,7 +1197,7 @@
         </w:rPr>
         <w:t>Learning Units (approved Course Proposal TPG-2024060313)</w:t>
         <w:tab/>
-        <w:t>5</w:t>
+        <w:t>6</w:t>
       </w:r>
     </w:p>
     <w:p>
@@ -1158,7 +1216,7 @@
         </w:rPr>
         <w:t>Assessment</w:t>
         <w:tab/>
-        <w:t>5</w:t>
+        <w:t>6</w:t>
       </w:r>
     </w:p>
     <w:p>
@@ -1195,7 +1253,7 @@
           <w:color w:val="333333"/>
           <w:sz w:val="21"/>
         </w:rPr>
-        <w:t>Day 1 — Foundations (Topic 1) &amp; Hermes Agent — single to multi-agent (Topic 2, Labs 1–5)</w:t>
+        <w:t>Day 1 — Human–AI landscape and single Hermes agent: office automation, tools, skills and practice (Labs 1–3)</w:t>
         <w:tab/>
         <w:t>6</w:t>
       </w:r>
@@ -1215,7 +1273,7 @@
           <w:color w:val="333333"/>
           <w:sz w:val="21"/>
         </w:rPr>
-        <w:t>Day 2 — Paperclip — a governed company of agents (Topic 3, Labs 6–10) &amp; Final Assessment</w:t>
+        <w:t>Day 2 — Multi-agent teams: Kanban, Claude Code video studio, governance (Labs 4–10), then assessment</w:t>
         <w:tab/>
         <w:t>7</w:t>
       </w:r>
@@ -1401,7 +1459,7 @@
                 <w:b w:val="0"/>
                 <w:sz w:val="20"/>
               </w:rPr>
-              <w:t>2 days · 8 training hours per day (16 hours), including 2 hours of assessment</w:t>
+              <w:t>9:30 am–6:30 pm both days. 16 scheduled course hours excluding lunch include 13 hours instruction/practice, 1 hour tea breaks and 2 hours assessment. Tea is included in the scheduled LU allocations; this is not a claim of 14 net instructional hours.</w:t>
             </w:r>
           </w:p>
         </w:tc>
@@ -1541,7 +1599,7 @@
                 <w:b w:val="0"/>
                 <w:sz w:val="20"/>
               </w:rPr>
-              <w:t>Human-AI Workforce with Autonomous AI Agents-v2.0.pptx (153 slides)</w:t>
+              <w:t>Human-AI Workforce with Autonomous AI Agents-v2.1.pptx (218 slides)</w:t>
             </w:r>
           </w:p>
         </w:tc>
@@ -1718,7 +1776,7 @@
                 <w:b/>
                 <w:sz w:val="19"/>
               </w:rPr>
-              <w:t>Topic 1: Foundations of Autonomous AI Agents &amp; the Human–AI Workforce</w:t>
+              <w:t>Topic 1: Human–AI Collaboration: Landscape, Agents, Use Cases &amp; Futures</w:t>
             </w:r>
           </w:p>
         </w:tc>
@@ -1734,7 +1792,7 @@
                 <w:b w:val="0"/>
                 <w:sz w:val="19"/>
               </w:rPr>
-              <w:t>A brief history of AI; AI agents vs agentic AI; The agentic loop &amp; harness engineering; Brain · perception · action, memory &amp; world models; From single agent to human–AI collaboration; The 2026 agent market, use cases &amp; governance.  Activity: Human–AI Workforce Canvas.</w:t>
+              <w:t>Current human–AI interaction landscape; 2023 prompt → 2024 context → 2025 harness → 2026 agents; 48 practical workflows, scientific discovery and humanoid futures; Single agents, teams, orchestration and human control; Agent mechanisms, evidence, permissions and governance.  Activity: Human–AI Workforce Canvas.</w:t>
             </w:r>
           </w:p>
         </w:tc>
@@ -1750,7 +1808,7 @@
                 <w:b w:val="0"/>
                 <w:sz w:val="19"/>
               </w:rPr>
-              <w:t>20–60</w:t>
+              <w:t>22–99</w:t>
             </w:r>
           </w:p>
         </w:tc>
@@ -1769,7 +1827,7 @@
                 <w:b/>
                 <w:sz w:val="19"/>
               </w:rPr>
-              <w:t>Topic 2: Hermes Agent — From a Single AI Employee to a Multi-Agent Team</w:t>
+              <w:t>Topic 2: Hermes Agent — Single-Agent Office Automation, Tools &amp; Skills</w:t>
             </w:r>
           </w:p>
         </w:tc>
@@ -1785,7 +1843,7 @@
                 <w:b w:val="0"/>
                 <w:sz w:val="19"/>
               </w:rPr>
-              <w:t>Lab 1 · Your first AI employee; Lab 2 · End-to-end social media campaign; Lab 3 · Human-in-the-loop publishing; Lab 4 · Multi-agent video studio; Lab 5 · Campaign command centre.</w:t>
+              <w:t>Lab 1 · Install Hermes, Telegram and an evidence brief; Lab 2 · Gmail, Calendar, Drive, Excel, dashboard and PowerPoint; Lab 3 · Office approval and exception handling; Day 2 bridge · Labs 4–5 Kanban and multi-agent work.</w:t>
             </w:r>
           </w:p>
         </w:tc>
@@ -1801,7 +1859,7 @@
                 <w:b w:val="0"/>
                 <w:sz w:val="19"/>
               </w:rPr>
-              <w:t>61–104</w:t>
+              <w:t>100–161</w:t>
             </w:r>
           </w:p>
         </w:tc>
@@ -1820,7 +1878,7 @@
                 <w:b/>
                 <w:sz w:val="19"/>
               </w:rPr>
-              <w:t>Topic 3: Paperclip — Running &amp; Governing a Company of AI Agents</w:t>
+              <w:t>Topic 3: Multi-Agent Teams — Kanban, Claude Code &amp; Governance</w:t>
             </w:r>
           </w:p>
         </w:tc>
@@ -1836,7 +1894,7 @@
                 <w:b w:val="0"/>
                 <w:sz w:val="19"/>
               </w:rPr>
-              <w:t>Lab 6 · Found the AI company; Lab 7 · Hire the team; Lab 8 · Launch campaign project; Lab 9 · Weekly video routine; Lab 10 · Govern, measure &amp; improve.</w:t>
+              <w:t>Labs 4–5 · Kanban video studio and analysis team; Labs 6–7 · Company and org-chart governance; Lab 8 · Claude Code multi-agent video team; Labs 9–10 · Repeatable work, evaluation and improvement.</w:t>
             </w:r>
           </w:p>
         </w:tc>
@@ -1852,7 +1910,7 @@
                 <w:b w:val="0"/>
                 <w:sz w:val="19"/>
               </w:rPr>
-              <w:t>105–145</w:t>
+              <w:t>162–210</w:t>
             </w:r>
           </w:p>
         </w:tc>
@@ -1887,6 +1945,9 @@
             <w:shd w:val="clear" w:color="auto" w:fill="1F6FEB"/>
           </w:tcPr>
           <w:p>
+            <w:pPr>
+              <w:keepNext/>
+            </w:pPr>
             <w:r/>
             <w:r>
               <w:rPr>
@@ -1905,6 +1966,9 @@
             <w:shd w:val="clear" w:color="auto" w:fill="1F6FEB"/>
           </w:tcPr>
           <w:p>
+            <w:pPr>
+              <w:keepNext/>
+            </w:pPr>
             <w:r/>
             <w:r>
               <w:rPr>
@@ -1923,6 +1987,9 @@
             <w:shd w:val="clear" w:color="auto" w:fill="1F6FEB"/>
           </w:tcPr>
           <w:p>
+            <w:pPr>
+              <w:keepNext/>
+            </w:pPr>
             <w:r/>
             <w:r>
               <w:rPr>
@@ -1941,6 +2008,9 @@
             <w:shd w:val="clear" w:color="auto" w:fill="1F6FEB"/>
           </w:tcPr>
           <w:p>
+            <w:pPr>
+              <w:keepNext/>
+            </w:pPr>
             <w:r/>
             <w:r>
               <w:rPr>
@@ -1959,6 +2029,9 @@
             <w:shd w:val="clear" w:color="auto" w:fill="1F6FEB"/>
           </w:tcPr>
           <w:p>
+            <w:pPr>
+              <w:keepNext/>
+            </w:pPr>
             <w:r/>
             <w:r>
               <w:rPr>
@@ -1979,6 +2052,9 @@
             <w:shd w:val="clear" w:color="auto" w:fill="E8F0FE"/>
           </w:tcPr>
           <w:p>
+            <w:pPr>
+              <w:keepNext/>
+            </w:pPr>
             <w:r/>
             <w:r>
               <w:rPr>
@@ -1995,6 +2071,9 @@
             <w:tcW w:type="dxa" w:w="2736"/>
           </w:tcPr>
           <w:p>
+            <w:pPr>
+              <w:keepNext/>
+            </w:pPr>
             <w:r/>
             <w:r>
               <w:rPr>
@@ -2011,6 +2090,9 @@
             <w:tcW w:type="dxa" w:w="3456"/>
           </w:tcPr>
           <w:p>
+            <w:pPr>
+              <w:keepNext/>
+            </w:pPr>
             <w:r/>
             <w:r>
               <w:rPr>
@@ -2018,7 +2100,7 @@
                 <w:b w:val="0"/>
                 <w:sz w:val="19"/>
               </w:rPr>
-              <w:t>Topic 1 (Foundations) + Topic 2 Labs 1–2 (single Hermes agent)</w:t>
+              <w:t>Topic 1 landscape, canvas and office design clinic + demo + Lab 1A installation and evidence brief</w:t>
             </w:r>
           </w:p>
         </w:tc>
@@ -2027,6 +2109,9 @@
             <w:tcW w:type="dxa" w:w="1512"/>
           </w:tcPr>
           <w:p>
+            <w:pPr>
+              <w:keepNext/>
+            </w:pPr>
             <w:r/>
             <w:r>
               <w:rPr>
@@ -2043,6 +2128,9 @@
             <w:tcW w:type="dxa" w:w="1008"/>
           </w:tcPr>
           <w:p>
+            <w:pPr>
+              <w:keepNext/>
+            </w:pPr>
             <w:r/>
             <w:r>
               <w:rPr>
@@ -2101,7 +2189,7 @@
                 <w:b w:val="0"/>
                 <w:sz w:val="19"/>
               </w:rPr>
-              <w:t>Topic 2 Labs 3–5 (human-in-the-loop, multi-agent studio, swarm) + Topic 3 Lab 6 (designing a governed agent company)</w:t>
+              <w:t>Lab 1B + Labs 2–5 tools/skills, human gates, Kanban studio and parallel team; governance introduction</w:t>
             </w:r>
           </w:p>
         </w:tc>
@@ -2184,7 +2272,7 @@
                 <w:b w:val="0"/>
                 <w:sz w:val="19"/>
               </w:rPr>
-              <w:t>Topic 3 Labs 7–10 (team, launch project, routine, governance and improvement)</w:t>
+              <w:t>Labs 6–10 company governance, Claude video team, repeatable work and evaluation</w:t>
             </w:r>
           </w:p>
         </w:tc>
@@ -2311,7 +2399,7 @@
           <w:i/>
           <w:sz w:val="19"/>
         </w:rPr>
-        <w:t>Total: 16 hours = LU1 5 h + LU2 5 h + LU3 4 h + assessment 2 h, matching the approved Course Proposal.</w:t>
+        <w:t>Scheduled LU allocations: 5 h + 5 h + 4 h, plus 2 h assessment; these include tea. Net instruction/practice is 13 h. Retained 9:30–18:30 timing was confirmed by the trainer.</w:t>
       </w:r>
     </w:p>
     <w:p>
@@ -2390,7 +2478,7 @@
         <w:pStyle w:val="Heading2"/>
       </w:pPr>
       <w:r>
-        <w:t>Day 1 — Foundations (Topic 1) &amp; Hermes Agent — single to multi-agent (Topic 2, Labs 1–5)</w:t>
+        <w:t>Day 1 — Human–AI landscape and single Hermes agent: office automation, tools, skills and practice (Labs 1–3)</w:t>
       </w:r>
     </w:p>
     <w:tbl>
@@ -2548,7 +2636,7 @@
                 <w:b w:val="0"/>
                 <w:sz w:val="19"/>
               </w:rPr>
-              <w:t>Welcome, housekeeping, trainer introduction, learning outcomes and AM digital attendance</w:t>
+              <w:t>Welcome, attendance, learning outcomes and official SWDA AI subscription redemption steps</w:t>
             </w:r>
           </w:p>
         </w:tc>
@@ -2582,7 +2670,7 @@
                 <w:b w:val="0"/>
                 <w:sz w:val="19"/>
               </w:rPr>
-              <w:t>1–19</w:t>
+              <w:t>1–21</w:t>
             </w:r>
           </w:p>
         </w:tc>
@@ -2635,7 +2723,7 @@
                 <w:b/>
                 <w:sz w:val="19"/>
               </w:rPr>
-              <w:t>Topic 1 (Part A) — history of AI; AI agents vs agentic AI; the agentic loop; harness engineering; brain–perception–action; short- and long-term memory; RAG; world models</w:t>
+              <w:t>Topic 1 (Part A) — current human–AI landscape; history; agents and agentic AI; practical use-case gallery; science; future humanoid collaboration</w:t>
             </w:r>
           </w:p>
         </w:tc>
@@ -2669,7 +2757,7 @@
                 <w:b w:val="0"/>
                 <w:sz w:val="19"/>
               </w:rPr>
-              <w:t>20–39</w:t>
+              <w:t>22–64</w:t>
             </w:r>
           </w:p>
         </w:tc>
@@ -2722,7 +2810,7 @@
                 <w:b w:val="0"/>
                 <w:sz w:val="19"/>
               </w:rPr>
-              <w:t>Tea break</w:t>
+              <w:t>Tea break (included in scheduled LU time)</w:t>
             </w:r>
           </w:p>
         </w:tc>
@@ -2775,7 +2863,7 @@
                 <w:b/>
                 <w:sz w:val="19"/>
               </w:rPr>
-              <w:t>11:20–12:10</w:t>
+              <w:t>11:20–12:40</w:t>
             </w:r>
           </w:p>
         </w:tc>
@@ -2792,7 +2880,7 @@
                 <w:b w:val="0"/>
                 <w:sz w:val="19"/>
               </w:rPr>
-              <w:t>50 min</w:t>
+              <w:t>80 min</w:t>
             </w:r>
           </w:p>
         </w:tc>
@@ -2809,7 +2897,7 @@
                 <w:b/>
                 <w:sz w:val="19"/>
               </w:rPr>
-              <w:t>Topic 1 (Part B) — single agent → multi-agent → human–agent collaboration; levels of autonomy; agent society; the 2026 agent market (OpenClaw, Hermes, Paperclip, OpenAI Dots, Meta Muse, Block Buzz, Manus Cue …); Singapore's AgentSea; human–AI use cases in science, maths, drug discovery and business; risks and governance</w:t>
+              <w:t>Topic 1 (Part B) — collaboration modes; single and multi-agent patterns; orchestration; tools, skills, memory, RAG, permissions, governance and evidence</w:t>
             </w:r>
           </w:p>
         </w:tc>
@@ -2843,7 +2931,7 @@
                 <w:b w:val="0"/>
                 <w:sz w:val="19"/>
               </w:rPr>
-              <w:t>40–58</w:t>
+              <w:t>65–94</w:t>
             </w:r>
           </w:p>
         </w:tc>
@@ -2862,7 +2950,7 @@
                 <w:b/>
                 <w:sz w:val="19"/>
               </w:rPr>
-              <w:t>12:10–12:35</w:t>
+              <w:t>12:40–13:00</w:t>
             </w:r>
           </w:p>
         </w:tc>
@@ -2879,7 +2967,7 @@
                 <w:b w:val="0"/>
                 <w:sz w:val="19"/>
               </w:rPr>
-              <w:t>25 min</w:t>
+              <w:t>20 min</w:t>
             </w:r>
           </w:p>
         </w:tc>
@@ -2896,7 +2984,7 @@
                 <w:b/>
                 <w:sz w:val="19"/>
               </w:rPr>
-              <w:t>Activity — Human–AI Workforce Canvas for Kopi Kaki Co., and start the Hermes Agent install</w:t>
+              <w:t>Activity — design the Kopi Kaki launch-office canvas, inputs, outputs and human decisions</w:t>
             </w:r>
           </w:p>
         </w:tc>
@@ -2930,7 +3018,7 @@
                 <w:b w:val="0"/>
                 <w:sz w:val="19"/>
               </w:rPr>
-              <w:t>59–60</w:t>
+              <w:t>95–97</w:t>
             </w:r>
           </w:p>
         </w:tc>
@@ -2939,6 +3027,24 @@
         <w:tc>
           <w:tcPr>
             <w:tcW w:type="dxa" w:w="1512"/>
+            <w:shd w:val="clear" w:color="auto" w:fill="E8F0FE"/>
+          </w:tcPr>
+          <w:p>
+            <w:r/>
+            <w:r>
+              <w:rPr>
+                <w:rFonts w:ascii="Arial" w:hAnsi="Arial"/>
+                <w:b/>
+                <w:sz w:val="19"/>
+              </w:rPr>
+              <w:t>13:00–13:30</w:t>
+            </w:r>
+          </w:p>
+        </w:tc>
+        <w:tc>
+          <w:tcPr>
+            <w:tcW w:type="dxa" w:w="1080"/>
+            <w:shd w:val="clear" w:color="auto" w:fill="E8F0FE"/>
           </w:tcPr>
           <w:p>
             <w:r/>
@@ -2948,13 +3054,31 @@
                 <w:b w:val="0"/>
                 <w:sz w:val="19"/>
               </w:rPr>
-              <w:t>12:35–13:30</w:t>
-            </w:r>
-          </w:p>
-        </w:tc>
-        <w:tc>
-          <w:tcPr>
-            <w:tcW w:type="dxa" w:w="1080"/>
+              <w:t>30 min</w:t>
+            </w:r>
+          </w:p>
+        </w:tc>
+        <w:tc>
+          <w:tcPr>
+            <w:tcW w:type="dxa" w:w="5400"/>
+            <w:shd w:val="clear" w:color="auto" w:fill="E8F0FE"/>
+          </w:tcPr>
+          <w:p>
+            <w:r/>
+            <w:r>
+              <w:rPr>
+                <w:rFonts w:ascii="Arial" w:hAnsi="Arial"/>
+                <w:b/>
+                <w:sz w:val="19"/>
+              </w:rPr>
+              <w:t>Office workflow design clinic — analyse task ownership, tool contracts and acceptance tests</w:t>
+            </w:r>
+          </w:p>
+        </w:tc>
+        <w:tc>
+          <w:tcPr>
+            <w:tcW w:type="dxa" w:w="864"/>
+            <w:shd w:val="clear" w:color="auto" w:fill="E8F0FE"/>
           </w:tcPr>
           <w:p>
             <w:r/>
@@ -2964,13 +3088,14 @@
                 <w:b w:val="0"/>
                 <w:sz w:val="19"/>
               </w:rPr>
-              <w:t>55 min</w:t>
-            </w:r>
-          </w:p>
-        </w:tc>
-        <w:tc>
-          <w:tcPr>
-            <w:tcW w:type="dxa" w:w="5400"/>
+              <w:t>LU1</w:t>
+            </w:r>
+          </w:p>
+        </w:tc>
+        <w:tc>
+          <w:tcPr>
+            <w:tcW w:type="dxa" w:w="1008"/>
+            <w:shd w:val="clear" w:color="auto" w:fill="E8F0FE"/>
           </w:tcPr>
           <w:p>
             <w:r/>
@@ -2980,13 +3105,16 @@
                 <w:b w:val="0"/>
                 <w:sz w:val="19"/>
               </w:rPr>
-              <w:t>Topic 2 — Lab 1: Hire Your First AI Employee (Hermes) — customer &amp; market research brief</w:t>
-            </w:r>
-          </w:p>
-        </w:tc>
-        <w:tc>
-          <w:tcPr>
-            <w:tcW w:type="dxa" w:w="864"/>
+              <w:t>95–97</w:t>
+            </w:r>
+          </w:p>
+        </w:tc>
+      </w:tr>
+      <w:tr>
+        <w:tc>
+          <w:tcPr>
+            <w:tcW w:type="dxa" w:w="1512"/>
+            <w:shd w:val="clear" w:color="auto" w:fill="FDE9D9"/>
           </w:tcPr>
           <w:p>
             <w:r/>
@@ -2996,13 +3124,14 @@
                 <w:b w:val="0"/>
                 <w:sz w:val="19"/>
               </w:rPr>
-              <w:t>LU1</w:t>
-            </w:r>
-          </w:p>
-        </w:tc>
-        <w:tc>
-          <w:tcPr>
-            <w:tcW w:type="dxa" w:w="1008"/>
+              <w:t>13:30–14:30</w:t>
+            </w:r>
+          </w:p>
+        </w:tc>
+        <w:tc>
+          <w:tcPr>
+            <w:tcW w:type="dxa" w:w="1080"/>
+            <w:shd w:val="clear" w:color="auto" w:fill="FDE9D9"/>
           </w:tcPr>
           <w:p>
             <w:r/>
@@ -3012,15 +3141,13 @@
                 <w:b w:val="0"/>
                 <w:sz w:val="19"/>
               </w:rPr>
-              <w:t>61–73</w:t>
-            </w:r>
-          </w:p>
-        </w:tc>
-      </w:tr>
-      <w:tr>
-        <w:tc>
-          <w:tcPr>
-            <w:tcW w:type="dxa" w:w="1512"/>
+              <w:t>60 min</w:t>
+            </w:r>
+          </w:p>
+        </w:tc>
+        <w:tc>
+          <w:tcPr>
+            <w:tcW w:type="dxa" w:w="5400"/>
             <w:shd w:val="clear" w:color="auto" w:fill="FDE9D9"/>
           </w:tcPr>
           <w:p>
@@ -3031,13 +3158,13 @@
                 <w:b w:val="0"/>
                 <w:sz w:val="19"/>
               </w:rPr>
-              <w:t>13:30–14:30</w:t>
-            </w:r>
-          </w:p>
-        </w:tc>
-        <w:tc>
-          <w:tcPr>
-            <w:tcW w:type="dxa" w:w="1080"/>
+              <w:t>Lunch break</w:t>
+            </w:r>
+          </w:p>
+        </w:tc>
+        <w:tc>
+          <w:tcPr>
+            <w:tcW w:type="dxa" w:w="864"/>
             <w:shd w:val="clear" w:color="auto" w:fill="FDE9D9"/>
           </w:tcPr>
           <w:p>
@@ -3048,13 +3175,13 @@
                 <w:b w:val="0"/>
                 <w:sz w:val="19"/>
               </w:rPr>
-              <w:t>60 min</w:t>
-            </w:r>
-          </w:p>
-        </w:tc>
-        <w:tc>
-          <w:tcPr>
-            <w:tcW w:type="dxa" w:w="5400"/>
+              <w:t>—</w:t>
+            </w:r>
+          </w:p>
+        </w:tc>
+        <w:tc>
+          <w:tcPr>
+            <w:tcW w:type="dxa" w:w="1008"/>
             <w:shd w:val="clear" w:color="auto" w:fill="FDE9D9"/>
           </w:tcPr>
           <w:p>
@@ -3065,14 +3192,33 @@
                 <w:b w:val="0"/>
                 <w:sz w:val="19"/>
               </w:rPr>
-              <w:t>Lunch break</w:t>
-            </w:r>
-          </w:p>
-        </w:tc>
-        <w:tc>
-          <w:tcPr>
-            <w:tcW w:type="dxa" w:w="864"/>
-            <w:shd w:val="clear" w:color="auto" w:fill="FDE9D9"/>
+              <w:t>—</w:t>
+            </w:r>
+          </w:p>
+        </w:tc>
+      </w:tr>
+      <w:tr>
+        <w:tc>
+          <w:tcPr>
+            <w:tcW w:type="dxa" w:w="1512"/>
+            <w:shd w:val="clear" w:color="auto" w:fill="E8F0FE"/>
+          </w:tcPr>
+          <w:p>
+            <w:r/>
+            <w:r>
+              <w:rPr>
+                <w:rFonts w:ascii="Arial" w:hAnsi="Arial"/>
+                <w:b/>
+                <w:sz w:val="19"/>
+              </w:rPr>
+              <w:t>14:30–14:45</w:t>
+            </w:r>
+          </w:p>
+        </w:tc>
+        <w:tc>
+          <w:tcPr>
+            <w:tcW w:type="dxa" w:w="1080"/>
+            <w:shd w:val="clear" w:color="auto" w:fill="E8F0FE"/>
           </w:tcPr>
           <w:p>
             <w:r/>
@@ -3082,14 +3228,31 @@
                 <w:b w:val="0"/>
                 <w:sz w:val="19"/>
               </w:rPr>
-              <w:t>—</w:t>
-            </w:r>
-          </w:p>
-        </w:tc>
-        <w:tc>
-          <w:tcPr>
-            <w:tcW w:type="dxa" w:w="1008"/>
-            <w:shd w:val="clear" w:color="auto" w:fill="FDE9D9"/>
+              <w:t>15 min</w:t>
+            </w:r>
+          </w:p>
+        </w:tc>
+        <w:tc>
+          <w:tcPr>
+            <w:tcW w:type="dxa" w:w="5400"/>
+            <w:shd w:val="clear" w:color="auto" w:fill="E8F0FE"/>
+          </w:tcPr>
+          <w:p>
+            <w:r/>
+            <w:r>
+              <w:rPr>
+                <w:rFonts w:ascii="Arial" w:hAnsi="Arial"/>
+                <w:b/>
+                <w:sz w:val="19"/>
+              </w:rPr>
+              <w:t>Trainer demo — OpenAI Dots office workflow, tool evidence and human control; Hermes fallback</w:t>
+            </w:r>
+          </w:p>
+        </w:tc>
+        <w:tc>
+          <w:tcPr>
+            <w:tcW w:type="dxa" w:w="864"/>
+            <w:shd w:val="clear" w:color="auto" w:fill="E8F0FE"/>
           </w:tcPr>
           <w:p>
             <w:r/>
@@ -3099,15 +3262,14 @@
                 <w:b w:val="0"/>
                 <w:sz w:val="19"/>
               </w:rPr>
-              <w:t>—</w:t>
-            </w:r>
-          </w:p>
-        </w:tc>
-      </w:tr>
-      <w:tr>
-        <w:tc>
-          <w:tcPr>
-            <w:tcW w:type="dxa" w:w="1512"/>
+              <w:t>LU1</w:t>
+            </w:r>
+          </w:p>
+        </w:tc>
+        <w:tc>
+          <w:tcPr>
+            <w:tcW w:type="dxa" w:w="1008"/>
+            <w:shd w:val="clear" w:color="auto" w:fill="E8F0FE"/>
           </w:tcPr>
           <w:p>
             <w:r/>
@@ -3117,13 +3279,15 @@
                 <w:b w:val="0"/>
                 <w:sz w:val="19"/>
               </w:rPr>
-              <w:t>14:30–15:30</w:t>
-            </w:r>
-          </w:p>
-        </w:tc>
-        <w:tc>
-          <w:tcPr>
-            <w:tcW w:type="dxa" w:w="1080"/>
+              <w:t>98–99</w:t>
+            </w:r>
+          </w:p>
+        </w:tc>
+      </w:tr>
+      <w:tr>
+        <w:tc>
+          <w:tcPr>
+            <w:tcW w:type="dxa" w:w="1512"/>
           </w:tcPr>
           <w:p>
             <w:r/>
@@ -3133,13 +3297,13 @@
                 <w:b w:val="0"/>
                 <w:sz w:val="19"/>
               </w:rPr>
-              <w:t>60 min</w:t>
-            </w:r>
-          </w:p>
-        </w:tc>
-        <w:tc>
-          <w:tcPr>
-            <w:tcW w:type="dxa" w:w="5400"/>
+              <w:t>14:45–15:30</w:t>
+            </w:r>
+          </w:p>
+        </w:tc>
+        <w:tc>
+          <w:tcPr>
+            <w:tcW w:type="dxa" w:w="1080"/>
           </w:tcPr>
           <w:p>
             <w:r/>
@@ -3149,13 +3313,13 @@
                 <w:b w:val="0"/>
                 <w:sz w:val="19"/>
               </w:rPr>
-              <w:t>Lab 2: End-to-End Social Media Campaign with one agent (skills + tools)</w:t>
-            </w:r>
-          </w:p>
-        </w:tc>
-        <w:tc>
-          <w:tcPr>
-            <w:tcW w:type="dxa" w:w="864"/>
+              <w:t>45 min</w:t>
+            </w:r>
+          </w:p>
+        </w:tc>
+        <w:tc>
+          <w:tcPr>
+            <w:tcW w:type="dxa" w:w="5400"/>
           </w:tcPr>
           <w:p>
             <w:r/>
@@ -3165,13 +3329,13 @@
                 <w:b w:val="0"/>
                 <w:sz w:val="19"/>
               </w:rPr>
-              <w:t>LU1</w:t>
-            </w:r>
-          </w:p>
-        </w:tc>
-        <w:tc>
-          <w:tcPr>
-            <w:tcW w:type="dxa" w:w="1008"/>
+              <w:t>Lab 1: Activity 1A — install Hermes, connect Telegram and produce the source-linked brief (PP Q1 preparation)</w:t>
+            </w:r>
+          </w:p>
+        </w:tc>
+        <w:tc>
+          <w:tcPr>
+            <w:tcW w:type="dxa" w:w="864"/>
           </w:tcPr>
           <w:p>
             <w:r/>
@@ -3181,15 +3345,13 @@
                 <w:b w:val="0"/>
                 <w:sz w:val="19"/>
               </w:rPr>
-              <w:t>74–80</w:t>
-            </w:r>
-          </w:p>
-        </w:tc>
-      </w:tr>
-      <w:tr>
-        <w:tc>
-          <w:tcPr>
-            <w:tcW w:type="dxa" w:w="1512"/>
+              <w:t>LU1</w:t>
+            </w:r>
+          </w:p>
+        </w:tc>
+        <w:tc>
+          <w:tcPr>
+            <w:tcW w:type="dxa" w:w="1008"/>
           </w:tcPr>
           <w:p>
             <w:r/>
@@ -3199,13 +3361,15 @@
                 <w:b w:val="0"/>
                 <w:sz w:val="19"/>
               </w:rPr>
-              <w:t>15:30–16:15</w:t>
-            </w:r>
-          </w:p>
-        </w:tc>
-        <w:tc>
-          <w:tcPr>
-            <w:tcW w:type="dxa" w:w="1080"/>
+              <w:t>128–133</w:t>
+            </w:r>
+          </w:p>
+        </w:tc>
+      </w:tr>
+      <w:tr>
+        <w:tc>
+          <w:tcPr>
+            <w:tcW w:type="dxa" w:w="1512"/>
           </w:tcPr>
           <w:p>
             <w:r/>
@@ -3215,13 +3379,13 @@
                 <w:b w:val="0"/>
                 <w:sz w:val="19"/>
               </w:rPr>
-              <w:t>45 min</w:t>
-            </w:r>
-          </w:p>
-        </w:tc>
-        <w:tc>
-          <w:tcPr>
-            <w:tcW w:type="dxa" w:w="5400"/>
+              <w:t>15:30–16:00</w:t>
+            </w:r>
+          </w:p>
+        </w:tc>
+        <w:tc>
+          <w:tcPr>
+            <w:tcW w:type="dxa" w:w="1080"/>
           </w:tcPr>
           <w:p>
             <w:r/>
@@ -3231,13 +3395,13 @@
                 <w:b w:val="0"/>
                 <w:sz w:val="19"/>
               </w:rPr>
-              <w:t>Lab 3: Human-in-the-Loop Publishing &amp; Community Care (Telegram + cron)</w:t>
-            </w:r>
-          </w:p>
-        </w:tc>
-        <w:tc>
-          <w:tcPr>
-            <w:tcW w:type="dxa" w:w="864"/>
+              <w:t>30 min</w:t>
+            </w:r>
+          </w:p>
+        </w:tc>
+        <w:tc>
+          <w:tcPr>
+            <w:tcW w:type="dxa" w:w="5400"/>
           </w:tcPr>
           <w:p>
             <w:r/>
@@ -3247,13 +3411,13 @@
                 <w:b w:val="0"/>
                 <w:sz w:val="19"/>
               </w:rPr>
-              <w:t>LU2</w:t>
-            </w:r>
-          </w:p>
-        </w:tc>
-        <w:tc>
-          <w:tcPr>
-            <w:tcW w:type="dxa" w:w="1008"/>
+              <w:t>Lab 1: Activity 1B — test tools, memory recall and evidence; analyse the agent design</w:t>
+            </w:r>
+          </w:p>
+        </w:tc>
+        <w:tc>
+          <w:tcPr>
+            <w:tcW w:type="dxa" w:w="864"/>
           </w:tcPr>
           <w:p>
             <w:r/>
@@ -3263,16 +3427,13 @@
                 <w:b w:val="0"/>
                 <w:sz w:val="19"/>
               </w:rPr>
-              <w:t>81–88</w:t>
-            </w:r>
-          </w:p>
-        </w:tc>
-      </w:tr>
-      <w:tr>
-        <w:tc>
-          <w:tcPr>
-            <w:tcW w:type="dxa" w:w="1512"/>
-            <w:shd w:val="clear" w:color="auto" w:fill="FFF4E5"/>
+              <w:t>LU2</w:t>
+            </w:r>
+          </w:p>
+        </w:tc>
+        <w:tc>
+          <w:tcPr>
+            <w:tcW w:type="dxa" w:w="1008"/>
           </w:tcPr>
           <w:p>
             <w:r/>
@@ -3282,13 +3443,15 @@
                 <w:b w:val="0"/>
                 <w:sz w:val="19"/>
               </w:rPr>
-              <w:t>16:15–16:30</w:t>
-            </w:r>
-          </w:p>
-        </w:tc>
-        <w:tc>
-          <w:tcPr>
-            <w:tcW w:type="dxa" w:w="1080"/>
+              <w:t>128–133</w:t>
+            </w:r>
+          </w:p>
+        </w:tc>
+      </w:tr>
+      <w:tr>
+        <w:tc>
+          <w:tcPr>
+            <w:tcW w:type="dxa" w:w="1512"/>
             <w:shd w:val="clear" w:color="auto" w:fill="FFF4E5"/>
           </w:tcPr>
           <w:p>
@@ -3299,13 +3462,13 @@
                 <w:b w:val="0"/>
                 <w:sz w:val="19"/>
               </w:rPr>
-              <w:t>15 min</w:t>
-            </w:r>
-          </w:p>
-        </w:tc>
-        <w:tc>
-          <w:tcPr>
-            <w:tcW w:type="dxa" w:w="5400"/>
+              <w:t>16:00–16:15</w:t>
+            </w:r>
+          </w:p>
+        </w:tc>
+        <w:tc>
+          <w:tcPr>
+            <w:tcW w:type="dxa" w:w="1080"/>
             <w:shd w:val="clear" w:color="auto" w:fill="FFF4E5"/>
           </w:tcPr>
           <w:p>
@@ -3316,13 +3479,13 @@
                 <w:b w:val="0"/>
                 <w:sz w:val="19"/>
               </w:rPr>
-              <w:t>Tea break</w:t>
-            </w:r>
-          </w:p>
-        </w:tc>
-        <w:tc>
-          <w:tcPr>
-            <w:tcW w:type="dxa" w:w="864"/>
+              <w:t>15 min</w:t>
+            </w:r>
+          </w:p>
+        </w:tc>
+        <w:tc>
+          <w:tcPr>
+            <w:tcW w:type="dxa" w:w="5400"/>
             <w:shd w:val="clear" w:color="auto" w:fill="FFF4E5"/>
           </w:tcPr>
           <w:p>
@@ -3333,13 +3496,13 @@
                 <w:b w:val="0"/>
                 <w:sz w:val="19"/>
               </w:rPr>
-              <w:t>LU2</w:t>
-            </w:r>
-          </w:p>
-        </w:tc>
-        <w:tc>
-          <w:tcPr>
-            <w:tcW w:type="dxa" w:w="1008"/>
+              <w:t>Tea break (included in scheduled LU time)</w:t>
+            </w:r>
+          </w:p>
+        </w:tc>
+        <w:tc>
+          <w:tcPr>
+            <w:tcW w:type="dxa" w:w="864"/>
             <w:shd w:val="clear" w:color="auto" w:fill="FFF4E5"/>
           </w:tcPr>
           <w:p>
@@ -3350,15 +3513,14 @@
                 <w:b w:val="0"/>
                 <w:sz w:val="19"/>
               </w:rPr>
-              <w:t>—</w:t>
-            </w:r>
-          </w:p>
-        </w:tc>
-      </w:tr>
-      <w:tr>
-        <w:tc>
-          <w:tcPr>
-            <w:tcW w:type="dxa" w:w="1512"/>
+              <w:t>LU2</w:t>
+            </w:r>
+          </w:p>
+        </w:tc>
+        <w:tc>
+          <w:tcPr>
+            <w:tcW w:type="dxa" w:w="1008"/>
+            <w:shd w:val="clear" w:color="auto" w:fill="FFF4E5"/>
           </w:tcPr>
           <w:p>
             <w:r/>
@@ -3368,13 +3530,15 @@
                 <w:b w:val="0"/>
                 <w:sz w:val="19"/>
               </w:rPr>
-              <w:t>16:30–17:30</w:t>
-            </w:r>
-          </w:p>
-        </w:tc>
-        <w:tc>
-          <w:tcPr>
-            <w:tcW w:type="dxa" w:w="1080"/>
+              <w:t>—</w:t>
+            </w:r>
+          </w:p>
+        </w:tc>
+      </w:tr>
+      <w:tr>
+        <w:tc>
+          <w:tcPr>
+            <w:tcW w:type="dxa" w:w="1512"/>
           </w:tcPr>
           <w:p>
             <w:r/>
@@ -3384,13 +3548,13 @@
                 <w:b w:val="0"/>
                 <w:sz w:val="19"/>
               </w:rPr>
-              <w:t>60 min</w:t>
-            </w:r>
-          </w:p>
-        </w:tc>
-        <w:tc>
-          <w:tcPr>
-            <w:tcW w:type="dxa" w:w="5400"/>
+              <w:t>16:15–17:45</w:t>
+            </w:r>
+          </w:p>
+        </w:tc>
+        <w:tc>
+          <w:tcPr>
+            <w:tcW w:type="dxa" w:w="1080"/>
           </w:tcPr>
           <w:p>
             <w:r/>
@@ -3400,13 +3564,13 @@
                 <w:b w:val="0"/>
                 <w:sz w:val="19"/>
               </w:rPr>
-              <w:t>Lab 4: Multi-Agent Video Studio — research → script → production → audit → publish</w:t>
-            </w:r>
-          </w:p>
-        </w:tc>
-        <w:tc>
-          <w:tcPr>
-            <w:tcW w:type="dxa" w:w="864"/>
+              <w:t>90 min</w:t>
+            </w:r>
+          </w:p>
+        </w:tc>
+        <w:tc>
+          <w:tcPr>
+            <w:tcW w:type="dxa" w:w="5400"/>
           </w:tcPr>
           <w:p>
             <w:r/>
@@ -3416,13 +3580,13 @@
                 <w:b w:val="0"/>
                 <w:sz w:val="19"/>
               </w:rPr>
-              <w:t>LU2</w:t>
-            </w:r>
-          </w:p>
-        </w:tc>
-        <w:tc>
-          <w:tcPr>
-            <w:tcW w:type="dxa" w:w="1008"/>
+              <w:t>Lab 2: Single-agent launch office — gog Gmail/Calendar/Drive, Excel analysis, interactive dashboard and professional PowerPoint</w:t>
+            </w:r>
+          </w:p>
+        </w:tc>
+        <w:tc>
+          <w:tcPr>
+            <w:tcW w:type="dxa" w:w="864"/>
           </w:tcPr>
           <w:p>
             <w:r/>
@@ -3432,15 +3596,13 @@
                 <w:b w:val="0"/>
                 <w:sz w:val="19"/>
               </w:rPr>
-              <w:t>89–96</w:t>
-            </w:r>
-          </w:p>
-        </w:tc>
-      </w:tr>
-      <w:tr>
-        <w:tc>
-          <w:tcPr>
-            <w:tcW w:type="dxa" w:w="1512"/>
+              <w:t>LU2</w:t>
+            </w:r>
+          </w:p>
+        </w:tc>
+        <w:tc>
+          <w:tcPr>
+            <w:tcW w:type="dxa" w:w="1008"/>
           </w:tcPr>
           <w:p>
             <w:r/>
@@ -3450,13 +3612,15 @@
                 <w:b w:val="0"/>
                 <w:sz w:val="19"/>
               </w:rPr>
-              <w:t>17:30–18:15</w:t>
-            </w:r>
-          </w:p>
-        </w:tc>
-        <w:tc>
-          <w:tcPr>
-            <w:tcW w:type="dxa" w:w="1080"/>
+              <w:t>134–139</w:t>
+            </w:r>
+          </w:p>
+        </w:tc>
+      </w:tr>
+      <w:tr>
+        <w:tc>
+          <w:tcPr>
+            <w:tcW w:type="dxa" w:w="1512"/>
           </w:tcPr>
           <w:p>
             <w:r/>
@@ -3466,13 +3630,13 @@
                 <w:b w:val="0"/>
                 <w:sz w:val="19"/>
               </w:rPr>
-              <w:t>45 min</w:t>
-            </w:r>
-          </w:p>
-        </w:tc>
-        <w:tc>
-          <w:tcPr>
-            <w:tcW w:type="dxa" w:w="5400"/>
+              <w:t>17:45–18:15</w:t>
+            </w:r>
+          </w:p>
+        </w:tc>
+        <w:tc>
+          <w:tcPr>
+            <w:tcW w:type="dxa" w:w="1080"/>
           </w:tcPr>
           <w:p>
             <w:r/>
@@ -3482,13 +3646,13 @@
                 <w:b w:val="0"/>
                 <w:sz w:val="19"/>
               </w:rPr>
-              <w:t>Lab 5: Multi-Agent Campaign Command Centre — measure, optimise &amp; report</w:t>
-            </w:r>
-          </w:p>
-        </w:tc>
-        <w:tc>
-          <w:tcPr>
-            <w:tcW w:type="dxa" w:w="864"/>
+              <w:t>30 min</w:t>
+            </w:r>
+          </w:p>
+        </w:tc>
+        <w:tc>
+          <w:tcPr>
+            <w:tcW w:type="dxa" w:w="5400"/>
           </w:tcPr>
           <w:p>
             <w:r/>
@@ -3498,13 +3662,13 @@
                 <w:b w:val="0"/>
                 <w:sz w:val="19"/>
               </w:rPr>
-              <w:t>LU2</w:t>
-            </w:r>
-          </w:p>
-        </w:tc>
-        <w:tc>
-          <w:tcPr>
-            <w:tcW w:type="dxa" w:w="1008"/>
+              <w:t>Lab 3: Human approval, office exceptions and safe internal reporting</w:t>
+            </w:r>
+          </w:p>
+        </w:tc>
+        <w:tc>
+          <w:tcPr>
+            <w:tcW w:type="dxa" w:w="864"/>
           </w:tcPr>
           <w:p>
             <w:r/>
@@ -3514,16 +3678,13 @@
                 <w:b w:val="0"/>
                 <w:sz w:val="19"/>
               </w:rPr>
-              <w:t>97–103</w:t>
-            </w:r>
-          </w:p>
-        </w:tc>
-      </w:tr>
-      <w:tr>
-        <w:tc>
-          <w:tcPr>
-            <w:tcW w:type="dxa" w:w="1512"/>
-            <w:shd w:val="clear" w:color="auto" w:fill="F3F5F8"/>
+              <w:t>LU2</w:t>
+            </w:r>
+          </w:p>
+        </w:tc>
+        <w:tc>
+          <w:tcPr>
+            <w:tcW w:type="dxa" w:w="1008"/>
           </w:tcPr>
           <w:p>
             <w:r/>
@@ -3533,13 +3694,15 @@
                 <w:b w:val="0"/>
                 <w:sz w:val="19"/>
               </w:rPr>
-              <w:t>18:15–18:30</w:t>
-            </w:r>
-          </w:p>
-        </w:tc>
-        <w:tc>
-          <w:tcPr>
-            <w:tcW w:type="dxa" w:w="1080"/>
+              <w:t>140–146</w:t>
+            </w:r>
+          </w:p>
+        </w:tc>
+      </w:tr>
+      <w:tr>
+        <w:tc>
+          <w:tcPr>
+            <w:tcW w:type="dxa" w:w="1512"/>
             <w:shd w:val="clear" w:color="auto" w:fill="F3F5F8"/>
           </w:tcPr>
           <w:p>
@@ -3550,13 +3713,13 @@
                 <w:b w:val="0"/>
                 <w:sz w:val="19"/>
               </w:rPr>
-              <w:t>15 min</w:t>
-            </w:r>
-          </w:p>
-        </w:tc>
-        <w:tc>
-          <w:tcPr>
-            <w:tcW w:type="dxa" w:w="5400"/>
+              <w:t>18:15–18:30</w:t>
+            </w:r>
+          </w:p>
+        </w:tc>
+        <w:tc>
+          <w:tcPr>
+            <w:tcW w:type="dxa" w:w="1080"/>
             <w:shd w:val="clear" w:color="auto" w:fill="F3F5F8"/>
           </w:tcPr>
           <w:p>
@@ -3567,13 +3730,13 @@
                 <w:b w:val="0"/>
                 <w:sz w:val="19"/>
               </w:rPr>
-              <w:t>Day 1 recap, Q&amp;A and PM digital attendance</w:t>
-            </w:r>
-          </w:p>
-        </w:tc>
-        <w:tc>
-          <w:tcPr>
-            <w:tcW w:type="dxa" w:w="864"/>
+              <w:t>15 min</w:t>
+            </w:r>
+          </w:p>
+        </w:tc>
+        <w:tc>
+          <w:tcPr>
+            <w:tcW w:type="dxa" w:w="5400"/>
             <w:shd w:val="clear" w:color="auto" w:fill="F3F5F8"/>
           </w:tcPr>
           <w:p>
@@ -3584,13 +3747,13 @@
                 <w:b w:val="0"/>
                 <w:sz w:val="19"/>
               </w:rPr>
-              <w:t>LU2</w:t>
-            </w:r>
-          </w:p>
-        </w:tc>
-        <w:tc>
-          <w:tcPr>
-            <w:tcW w:type="dxa" w:w="1008"/>
+              <w:t>Day 1 recap, Q&amp;A and PM digital attendance</w:t>
+            </w:r>
+          </w:p>
+        </w:tc>
+        <w:tc>
+          <w:tcPr>
+            <w:tcW w:type="dxa" w:w="864"/>
             <w:shd w:val="clear" w:color="auto" w:fill="F3F5F8"/>
           </w:tcPr>
           <w:p>
@@ -3601,7 +3764,24 @@
                 <w:b w:val="0"/>
                 <w:sz w:val="19"/>
               </w:rPr>
-              <w:t>104</w:t>
+              <w:t>LU2</w:t>
+            </w:r>
+          </w:p>
+        </w:tc>
+        <w:tc>
+          <w:tcPr>
+            <w:tcW w:type="dxa" w:w="1008"/>
+            <w:shd w:val="clear" w:color="auto" w:fill="F3F5F8"/>
+          </w:tcPr>
+          <w:p>
+            <w:r/>
+            <w:r>
+              <w:rPr>
+                <w:rFonts w:ascii="Arial" w:hAnsi="Arial"/>
+                <w:b w:val="0"/>
+                <w:sz w:val="19"/>
+              </w:rPr>
+              <w:t>161</w:t>
             </w:r>
           </w:p>
         </w:tc>
@@ -3614,7 +3794,7 @@
           <w:color w:val="555B66"/>
           <w:sz w:val="19"/>
         </w:rPr>
-        <w:t>Total training time: 480 minutes (8 hours).</w:t>
+        <w:t>Scheduled time excluding lunch: 480 minutes (8 hours), including tea and any assessment.</w:t>
       </w:r>
     </w:p>
     <w:p>
@@ -3622,7 +3802,7 @@
         <w:pStyle w:val="Heading2"/>
       </w:pPr>
       <w:r>
-        <w:t>Day 2 — Paperclip — a governed company of agents (Topic 3, Labs 6–10) &amp; Final Assessment</w:t>
+        <w:t>Day 2 — Multi-agent teams: Kanban, Claude Code video studio, governance (Labs 4–10), then assessment</w:t>
       </w:r>
     </w:p>
     <w:tbl>
@@ -3780,7 +3960,7 @@
                 <w:b w:val="0"/>
                 <w:sz w:val="19"/>
               </w:rPr>
-              <w:t>Day 1 recap and AM digital attendance</w:t>
+              <w:t>Day 1 recap and AM attendance; prepare the multi-agent board</w:t>
             </w:r>
           </w:p>
         </w:tc>
@@ -3814,7 +3994,258 @@
                 <w:b w:val="0"/>
                 <w:sz w:val="19"/>
               </w:rPr>
-              <w:t>104</w:t>
+              <w:t>161</w:t>
+            </w:r>
+          </w:p>
+        </w:tc>
+      </w:tr>
+      <w:tr>
+        <w:tc>
+          <w:tcPr>
+            <w:tcW w:type="dxa" w:w="1512"/>
+          </w:tcPr>
+          <w:p>
+            <w:r/>
+            <w:r>
+              <w:rPr>
+                <w:rFonts w:ascii="Arial" w:hAnsi="Arial"/>
+                <w:b w:val="0"/>
+                <w:sz w:val="19"/>
+              </w:rPr>
+              <w:t>9:45–10:35</w:t>
+            </w:r>
+          </w:p>
+        </w:tc>
+        <w:tc>
+          <w:tcPr>
+            <w:tcW w:type="dxa" w:w="1080"/>
+          </w:tcPr>
+          <w:p>
+            <w:r/>
+            <w:r>
+              <w:rPr>
+                <w:rFonts w:ascii="Arial" w:hAnsi="Arial"/>
+                <w:b w:val="0"/>
+                <w:sz w:val="19"/>
+              </w:rPr>
+              <w:t>50 min</w:t>
+            </w:r>
+          </w:p>
+        </w:tc>
+        <w:tc>
+          <w:tcPr>
+            <w:tcW w:type="dxa" w:w="5400"/>
+          </w:tcPr>
+          <w:p>
+            <w:r/>
+            <w:r>
+              <w:rPr>
+                <w:rFonts w:ascii="Arial" w:hAnsi="Arial"/>
+                <w:b w:val="0"/>
+                <w:sz w:val="19"/>
+              </w:rPr>
+              <w:t>Lab 4: Multi-Agent Video Studio — Kanban roles, dependencies, production, audit and human release gate</w:t>
+            </w:r>
+          </w:p>
+        </w:tc>
+        <w:tc>
+          <w:tcPr>
+            <w:tcW w:type="dxa" w:w="864"/>
+          </w:tcPr>
+          <w:p>
+            <w:r/>
+            <w:r>
+              <w:rPr>
+                <w:rFonts w:ascii="Arial" w:hAnsi="Arial"/>
+                <w:b w:val="0"/>
+                <w:sz w:val="19"/>
+              </w:rPr>
+              <w:t>LU2</w:t>
+            </w:r>
+          </w:p>
+        </w:tc>
+        <w:tc>
+          <w:tcPr>
+            <w:tcW w:type="dxa" w:w="1008"/>
+          </w:tcPr>
+          <w:p>
+            <w:r/>
+            <w:r>
+              <w:rPr>
+                <w:rFonts w:ascii="Arial" w:hAnsi="Arial"/>
+                <w:b w:val="0"/>
+                <w:sz w:val="19"/>
+              </w:rPr>
+              <w:t>147–153</w:t>
+            </w:r>
+          </w:p>
+        </w:tc>
+      </w:tr>
+      <w:tr>
+        <w:tc>
+          <w:tcPr>
+            <w:tcW w:type="dxa" w:w="1512"/>
+          </w:tcPr>
+          <w:p>
+            <w:r/>
+            <w:r>
+              <w:rPr>
+                <w:rFonts w:ascii="Arial" w:hAnsi="Arial"/>
+                <w:b w:val="0"/>
+                <w:sz w:val="19"/>
+              </w:rPr>
+              <w:t>10:35–11:10</w:t>
+            </w:r>
+          </w:p>
+        </w:tc>
+        <w:tc>
+          <w:tcPr>
+            <w:tcW w:type="dxa" w:w="1080"/>
+          </w:tcPr>
+          <w:p>
+            <w:r/>
+            <w:r>
+              <w:rPr>
+                <w:rFonts w:ascii="Arial" w:hAnsi="Arial"/>
+                <w:b w:val="0"/>
+                <w:sz w:val="19"/>
+              </w:rPr>
+              <w:t>35 min</w:t>
+            </w:r>
+          </w:p>
+        </w:tc>
+        <w:tc>
+          <w:tcPr>
+            <w:tcW w:type="dxa" w:w="5400"/>
+          </w:tcPr>
+          <w:p>
+            <w:r/>
+            <w:r>
+              <w:rPr>
+                <w:rFonts w:ascii="Arial" w:hAnsi="Arial"/>
+                <w:b w:val="0"/>
+                <w:sz w:val="19"/>
+              </w:rPr>
+              <w:t>Lab 5: Multi-Agent Campaign Command Centre — parallel analysis, verifier and synthesis</w:t>
+            </w:r>
+          </w:p>
+        </w:tc>
+        <w:tc>
+          <w:tcPr>
+            <w:tcW w:type="dxa" w:w="864"/>
+          </w:tcPr>
+          <w:p>
+            <w:r/>
+            <w:r>
+              <w:rPr>
+                <w:rFonts w:ascii="Arial" w:hAnsi="Arial"/>
+                <w:b w:val="0"/>
+                <w:sz w:val="19"/>
+              </w:rPr>
+              <w:t>LU2</w:t>
+            </w:r>
+          </w:p>
+        </w:tc>
+        <w:tc>
+          <w:tcPr>
+            <w:tcW w:type="dxa" w:w="1008"/>
+          </w:tcPr>
+          <w:p>
+            <w:r/>
+            <w:r>
+              <w:rPr>
+                <w:rFonts w:ascii="Arial" w:hAnsi="Arial"/>
+                <w:b w:val="0"/>
+                <w:sz w:val="19"/>
+              </w:rPr>
+              <w:t>154–160</w:t>
+            </w:r>
+          </w:p>
+        </w:tc>
+      </w:tr>
+      <w:tr>
+        <w:tc>
+          <w:tcPr>
+            <w:tcW w:type="dxa" w:w="1512"/>
+            <w:shd w:val="clear" w:color="auto" w:fill="FFF4E5"/>
+          </w:tcPr>
+          <w:p>
+            <w:r/>
+            <w:r>
+              <w:rPr>
+                <w:rFonts w:ascii="Arial" w:hAnsi="Arial"/>
+                <w:b w:val="0"/>
+                <w:sz w:val="19"/>
+              </w:rPr>
+              <w:t>11:10–11:25</w:t>
+            </w:r>
+          </w:p>
+        </w:tc>
+        <w:tc>
+          <w:tcPr>
+            <w:tcW w:type="dxa" w:w="1080"/>
+            <w:shd w:val="clear" w:color="auto" w:fill="FFF4E5"/>
+          </w:tcPr>
+          <w:p>
+            <w:r/>
+            <w:r>
+              <w:rPr>
+                <w:rFonts w:ascii="Arial" w:hAnsi="Arial"/>
+                <w:b w:val="0"/>
+                <w:sz w:val="19"/>
+              </w:rPr>
+              <w:t>15 min</w:t>
+            </w:r>
+          </w:p>
+        </w:tc>
+        <w:tc>
+          <w:tcPr>
+            <w:tcW w:type="dxa" w:w="5400"/>
+            <w:shd w:val="clear" w:color="auto" w:fill="FFF4E5"/>
+          </w:tcPr>
+          <w:p>
+            <w:r/>
+            <w:r>
+              <w:rPr>
+                <w:rFonts w:ascii="Arial" w:hAnsi="Arial"/>
+                <w:b w:val="0"/>
+                <w:sz w:val="19"/>
+              </w:rPr>
+              <w:t>Tea break (included in scheduled LU time)</w:t>
+            </w:r>
+          </w:p>
+        </w:tc>
+        <w:tc>
+          <w:tcPr>
+            <w:tcW w:type="dxa" w:w="864"/>
+            <w:shd w:val="clear" w:color="auto" w:fill="FFF4E5"/>
+          </w:tcPr>
+          <w:p>
+            <w:r/>
+            <w:r>
+              <w:rPr>
+                <w:rFonts w:ascii="Arial" w:hAnsi="Arial"/>
+                <w:b w:val="0"/>
+                <w:sz w:val="19"/>
+              </w:rPr>
+              <w:t>LU2</w:t>
+            </w:r>
+          </w:p>
+        </w:tc>
+        <w:tc>
+          <w:tcPr>
+            <w:tcW w:type="dxa" w:w="1008"/>
+            <w:shd w:val="clear" w:color="auto" w:fill="FFF4E5"/>
+          </w:tcPr>
+          <w:p>
+            <w:r/>
+            <w:r>
+              <w:rPr>
+                <w:rFonts w:ascii="Arial" w:hAnsi="Arial"/>
+                <w:b w:val="0"/>
+                <w:sz w:val="19"/>
+              </w:rPr>
+              <w:t>—</w:t>
             </w:r>
           </w:p>
         </w:tc>
@@ -3833,7 +4264,7 @@
                 <w:b/>
                 <w:sz w:val="19"/>
               </w:rPr>
-              <w:t>9:45–10:15</w:t>
+              <w:t>11:25–11:30</w:t>
             </w:r>
           </w:p>
         </w:tc>
@@ -3850,7 +4281,7 @@
                 <w:b w:val="0"/>
                 <w:sz w:val="19"/>
               </w:rPr>
-              <w:t>30 min</w:t>
+              <w:t>5 min</w:t>
             </w:r>
           </w:p>
         </w:tc>
@@ -3867,7 +4298,7 @@
                 <w:b/>
                 <w:sz w:val="19"/>
               </w:rPr>
-              <w:t>Topic 3 — Paperclip: the company as the agent harness; Board, CEO and org chart; adapters; goals, projects and tasks; routines and heartbeats; budgets, approvals and the audit trail</w:t>
+              <w:t>Topic 3 — company-level governance and team accountability</w:t>
             </w:r>
           </w:p>
         </w:tc>
@@ -3901,7 +4332,7 @@
                 <w:b w:val="0"/>
                 <w:sz w:val="19"/>
               </w:rPr>
-              <w:t>105–109</w:t>
+              <w:t>162–166</w:t>
             </w:r>
           </w:p>
         </w:tc>
@@ -3919,7 +4350,7 @@
                 <w:b w:val="0"/>
                 <w:sz w:val="19"/>
               </w:rPr>
-              <w:t>10:15–11:15</w:t>
+              <w:t>11:30–12:15</w:t>
             </w:r>
           </w:p>
         </w:tc>
@@ -3935,7 +4366,7 @@
                 <w:b w:val="0"/>
                 <w:sz w:val="19"/>
               </w:rPr>
-              <w:t>60 min</w:t>
+              <w:t>45 min</w:t>
             </w:r>
           </w:p>
         </w:tc>
@@ -3951,7 +4382,7 @@
                 <w:b w:val="0"/>
                 <w:sz w:val="19"/>
               </w:rPr>
-              <w:t>Lab 6: Found Kopi Kaki Growth Studio — an AI company you govern</w:t>
+              <w:t>Lab 6: Found Kopi Kaki Growth Studio — mission, company and governed CEO</w:t>
             </w:r>
           </w:p>
         </w:tc>
@@ -3967,7 +4398,7 @@
                 <w:b w:val="0"/>
                 <w:sz w:val="19"/>
               </w:rPr>
-              <w:t>LU2</w:t>
+              <w:t>LU3</w:t>
             </w:r>
           </w:p>
         </w:tc>
@@ -3983,7 +4414,7 @@
                 <w:b w:val="0"/>
                 <w:sz w:val="19"/>
               </w:rPr>
-              <w:t>110–116</w:t>
+              <w:t>167–173</w:t>
             </w:r>
           </w:p>
         </w:tc>
@@ -3992,7 +4423,7 @@
         <w:tc>
           <w:tcPr>
             <w:tcW w:type="dxa" w:w="1512"/>
-            <w:shd w:val="clear" w:color="auto" w:fill="FFF4E5"/>
+            <w:shd w:val="clear" w:color="auto" w:fill="FDE9D9"/>
           </w:tcPr>
           <w:p>
             <w:r/>
@@ -4002,14 +4433,14 @@
                 <w:b w:val="0"/>
                 <w:sz w:val="19"/>
               </w:rPr>
-              <w:t>11:15–11:30</w:t>
+              <w:t>12:15–13:15</w:t>
             </w:r>
           </w:p>
         </w:tc>
         <w:tc>
           <w:tcPr>
             <w:tcW w:type="dxa" w:w="1080"/>
-            <w:shd w:val="clear" w:color="auto" w:fill="FFF4E5"/>
+            <w:shd w:val="clear" w:color="auto" w:fill="FDE9D9"/>
           </w:tcPr>
           <w:p>
             <w:r/>
@@ -4019,14 +4450,14 @@
                 <w:b w:val="0"/>
                 <w:sz w:val="19"/>
               </w:rPr>
-              <w:t>15 min</w:t>
+              <w:t>60 min</w:t>
             </w:r>
           </w:p>
         </w:tc>
         <w:tc>
           <w:tcPr>
             <w:tcW w:type="dxa" w:w="5400"/>
-            <w:shd w:val="clear" w:color="auto" w:fill="FFF4E5"/>
+            <w:shd w:val="clear" w:color="auto" w:fill="FDE9D9"/>
           </w:tcPr>
           <w:p>
             <w:r/>
@@ -4036,14 +4467,14 @@
                 <w:b w:val="0"/>
                 <w:sz w:val="19"/>
               </w:rPr>
-              <w:t>Tea break</w:t>
+              <w:t>Lunch break</w:t>
             </w:r>
           </w:p>
         </w:tc>
         <w:tc>
           <w:tcPr>
             <w:tcW w:type="dxa" w:w="864"/>
-            <w:shd w:val="clear" w:color="auto" w:fill="FFF4E5"/>
+            <w:shd w:val="clear" w:color="auto" w:fill="FDE9D9"/>
           </w:tcPr>
           <w:p>
             <w:r/>
@@ -4053,14 +4484,14 @@
                 <w:b w:val="0"/>
                 <w:sz w:val="19"/>
               </w:rPr>
-              <w:t>LU2</w:t>
+              <w:t>—</w:t>
             </w:r>
           </w:p>
         </w:tc>
         <w:tc>
           <w:tcPr>
             <w:tcW w:type="dxa" w:w="1008"/>
-            <w:shd w:val="clear" w:color="auto" w:fill="FFF4E5"/>
+            <w:shd w:val="clear" w:color="auto" w:fill="FDE9D9"/>
           </w:tcPr>
           <w:p>
             <w:r/>
@@ -4088,7 +4519,7 @@
                 <w:b w:val="0"/>
                 <w:sz w:val="19"/>
               </w:rPr>
-              <w:t>11:30–12:15</w:t>
+              <w:t>13:15–13:50</w:t>
             </w:r>
           </w:p>
         </w:tc>
@@ -4104,7 +4535,7 @@
                 <w:b w:val="0"/>
                 <w:sz w:val="19"/>
               </w:rPr>
-              <w:t>45 min</w:t>
+              <w:t>35 min</w:t>
             </w:r>
           </w:p>
         </w:tc>
@@ -4120,7 +4551,7 @@
                 <w:b w:val="0"/>
                 <w:sz w:val="19"/>
               </w:rPr>
-              <w:t>Lab 7: Hire the Marketing Team through the Board approval gate</w:t>
+              <w:t>Lab 7: Hire the Marketing Team through the Board gate — org-chart evidence for PP Q3</w:t>
             </w:r>
           </w:p>
         </w:tc>
@@ -4152,7 +4583,7 @@
                 <w:b w:val="0"/>
                 <w:sz w:val="19"/>
               </w:rPr>
-              <w:t>117–124</w:t>
+              <w:t>174–191</w:t>
             </w:r>
           </w:p>
         </w:tc>
@@ -4161,7 +4592,6 @@
         <w:tc>
           <w:tcPr>
             <w:tcW w:type="dxa" w:w="1512"/>
-            <w:shd w:val="clear" w:color="auto" w:fill="FDE9D9"/>
           </w:tcPr>
           <w:p>
             <w:r/>
@@ -4171,14 +4601,13 @@
                 <w:b w:val="0"/>
                 <w:sz w:val="19"/>
               </w:rPr>
-              <w:t>12:15–13:15</w:t>
+              <w:t>13:50–14:40</w:t>
             </w:r>
           </w:p>
         </w:tc>
         <w:tc>
           <w:tcPr>
             <w:tcW w:type="dxa" w:w="1080"/>
-            <w:shd w:val="clear" w:color="auto" w:fill="FDE9D9"/>
           </w:tcPr>
           <w:p>
             <w:r/>
@@ -4188,14 +4617,13 @@
                 <w:b w:val="0"/>
                 <w:sz w:val="19"/>
               </w:rPr>
-              <w:t>60 min</w:t>
+              <w:t>50 min</w:t>
             </w:r>
           </w:p>
         </w:tc>
         <w:tc>
           <w:tcPr>
             <w:tcW w:type="dxa" w:w="5400"/>
-            <w:shd w:val="clear" w:color="auto" w:fill="FDE9D9"/>
           </w:tcPr>
           <w:p>
             <w:r/>
@@ -4205,14 +4633,13 @@
                 <w:b w:val="0"/>
                 <w:sz w:val="19"/>
               </w:rPr>
-              <w:t>Lunch break</w:t>
+              <w:t>Lab 8: Claude Code Agent Team — create and audit a launch video with independent teammates</w:t>
             </w:r>
           </w:p>
         </w:tc>
         <w:tc>
           <w:tcPr>
             <w:tcW w:type="dxa" w:w="864"/>
-            <w:shd w:val="clear" w:color="auto" w:fill="FDE9D9"/>
           </w:tcPr>
           <w:p>
             <w:r/>
@@ -4222,14 +4649,13 @@
                 <w:b w:val="0"/>
                 <w:sz w:val="19"/>
               </w:rPr>
-              <w:t>—</w:t>
+              <w:t>LU3</w:t>
             </w:r>
           </w:p>
         </w:tc>
         <w:tc>
           <w:tcPr>
             <w:tcW w:type="dxa" w:w="1008"/>
-            <w:shd w:val="clear" w:color="auto" w:fill="FDE9D9"/>
           </w:tcPr>
           <w:p>
             <w:r/>
@@ -4239,7 +4665,7 @@
                 <w:b w:val="0"/>
                 <w:sz w:val="19"/>
               </w:rPr>
-              <w:t>—</w:t>
+              <w:t>192–196</w:t>
             </w:r>
           </w:p>
         </w:tc>
@@ -4257,7 +4683,7 @@
                 <w:b w:val="0"/>
                 <w:sz w:val="19"/>
               </w:rPr>
-              <w:t>13:15–14:10</w:t>
+              <w:t>14:40–15:10</w:t>
             </w:r>
           </w:p>
         </w:tc>
@@ -4273,7 +4699,7 @@
                 <w:b w:val="0"/>
                 <w:sz w:val="19"/>
               </w:rPr>
-              <w:t>55 min</w:t>
+              <w:t>30 min</w:t>
             </w:r>
           </w:p>
         </w:tc>
@@ -4289,7 +4715,7 @@
                 <w:b w:val="0"/>
                 <w:sz w:val="19"/>
               </w:rPr>
-              <w:t>Lab 8: Run the #ShiokColdBrew launch as a project — review, revise, release</w:t>
+              <w:t>Lab 9: Repeatable Weekly Video Pipeline — routine, verification and Board review</w:t>
             </w:r>
           </w:p>
         </w:tc>
@@ -4321,7 +4747,7 @@
                 <w:b w:val="0"/>
                 <w:sz w:val="19"/>
               </w:rPr>
-              <w:t>125–131</w:t>
+              <w:t>197–202</w:t>
             </w:r>
           </w:p>
         </w:tc>
@@ -4330,6 +4756,7 @@
         <w:tc>
           <w:tcPr>
             <w:tcW w:type="dxa" w:w="1512"/>
+            <w:shd w:val="clear" w:color="auto" w:fill="FFF4E5"/>
           </w:tcPr>
           <w:p>
             <w:r/>
@@ -4339,13 +4766,14 @@
                 <w:b w:val="0"/>
                 <w:sz w:val="19"/>
               </w:rPr>
-              <w:t>14:10–14:55</w:t>
+              <w:t>15:10–15:25</w:t>
             </w:r>
           </w:p>
         </w:tc>
         <w:tc>
           <w:tcPr>
             <w:tcW w:type="dxa" w:w="1080"/>
+            <w:shd w:val="clear" w:color="auto" w:fill="FFF4E5"/>
           </w:tcPr>
           <w:p>
             <w:r/>
@@ -4355,13 +4783,14 @@
                 <w:b w:val="0"/>
                 <w:sz w:val="19"/>
               </w:rPr>
-              <w:t>45 min</w:t>
+              <w:t>15 min</w:t>
             </w:r>
           </w:p>
         </w:tc>
         <w:tc>
           <w:tcPr>
             <w:tcW w:type="dxa" w:w="5400"/>
+            <w:shd w:val="clear" w:color="auto" w:fill="FFF4E5"/>
           </w:tcPr>
           <w:p>
             <w:r/>
@@ -4371,13 +4800,14 @@
                 <w:b w:val="0"/>
                 <w:sz w:val="19"/>
               </w:rPr>
-              <w:t>Lab 9: Automate the weekly video pipeline with a routine and a Board gate</w:t>
+              <w:t>Tea break (included in scheduled LU time)</w:t>
             </w:r>
           </w:p>
         </w:tc>
         <w:tc>
           <w:tcPr>
             <w:tcW w:type="dxa" w:w="864"/>
+            <w:shd w:val="clear" w:color="auto" w:fill="FFF4E5"/>
           </w:tcPr>
           <w:p>
             <w:r/>
@@ -4394,6 +4824,7 @@
         <w:tc>
           <w:tcPr>
             <w:tcW w:type="dxa" w:w="1008"/>
+            <w:shd w:val="clear" w:color="auto" w:fill="FFF4E5"/>
           </w:tcPr>
           <w:p>
             <w:r/>
@@ -4403,7 +4834,7 @@
                 <w:b w:val="0"/>
                 <w:sz w:val="19"/>
               </w:rPr>
-              <w:t>132–137</w:t>
+              <w:t>—</w:t>
             </w:r>
           </w:p>
         </w:tc>
@@ -4412,7 +4843,6 @@
         <w:tc>
           <w:tcPr>
             <w:tcW w:type="dxa" w:w="1512"/>
-            <w:shd w:val="clear" w:color="auto" w:fill="FFF4E5"/>
           </w:tcPr>
           <w:p>
             <w:r/>
@@ -4422,14 +4852,13 @@
                 <w:b w:val="0"/>
                 <w:sz w:val="19"/>
               </w:rPr>
-              <w:t>14:55–15:10</w:t>
+              <w:t>15:25–16:00</w:t>
             </w:r>
           </w:p>
         </w:tc>
         <w:tc>
           <w:tcPr>
             <w:tcW w:type="dxa" w:w="1080"/>
-            <w:shd w:val="clear" w:color="auto" w:fill="FFF4E5"/>
           </w:tcPr>
           <w:p>
             <w:r/>
@@ -4439,14 +4868,13 @@
                 <w:b w:val="0"/>
                 <w:sz w:val="19"/>
               </w:rPr>
-              <w:t>15 min</w:t>
+              <w:t>35 min</w:t>
             </w:r>
           </w:p>
         </w:tc>
         <w:tc>
           <w:tcPr>
             <w:tcW w:type="dxa" w:w="5400"/>
-            <w:shd w:val="clear" w:color="auto" w:fill="FFF4E5"/>
           </w:tcPr>
           <w:p>
             <w:r/>
@@ -4456,14 +4884,13 @@
                 <w:b w:val="0"/>
                 <w:sz w:val="19"/>
               </w:rPr>
-              <w:t>Tea break</w:t>
+              <w:t>Lab 10: Govern, Measure and Improve — compare single-agent and team workflows</w:t>
             </w:r>
           </w:p>
         </w:tc>
         <w:tc>
           <w:tcPr>
             <w:tcW w:type="dxa" w:w="864"/>
-            <w:shd w:val="clear" w:color="auto" w:fill="FFF4E5"/>
           </w:tcPr>
           <w:p>
             <w:r/>
@@ -4480,7 +4907,6 @@
         <w:tc>
           <w:tcPr>
             <w:tcW w:type="dxa" w:w="1008"/>
-            <w:shd w:val="clear" w:color="auto" w:fill="FFF4E5"/>
           </w:tcPr>
           <w:p>
             <w:r/>
@@ -4490,7 +4916,7 @@
                 <w:b w:val="0"/>
                 <w:sz w:val="19"/>
               </w:rPr>
-              <w:t>—</w:t>
+              <w:t>203–209</w:t>
             </w:r>
           </w:p>
         </w:tc>
@@ -4499,6 +4925,7 @@
         <w:tc>
           <w:tcPr>
             <w:tcW w:type="dxa" w:w="1512"/>
+            <w:shd w:val="clear" w:color="auto" w:fill="F3F5F8"/>
           </w:tcPr>
           <w:p>
             <w:r/>
@@ -4508,13 +4935,14 @@
                 <w:b w:val="0"/>
                 <w:sz w:val="19"/>
               </w:rPr>
-              <w:t>15:10–15:55</w:t>
+              <w:t>16:00–16:15</w:t>
             </w:r>
           </w:p>
         </w:tc>
         <w:tc>
           <w:tcPr>
             <w:tcW w:type="dxa" w:w="1080"/>
+            <w:shd w:val="clear" w:color="auto" w:fill="F3F5F8"/>
           </w:tcPr>
           <w:p>
             <w:r/>
@@ -4524,13 +4952,14 @@
                 <w:b w:val="0"/>
                 <w:sz w:val="19"/>
               </w:rPr>
-              <w:t>45 min</w:t>
+              <w:t>15 min</w:t>
             </w:r>
           </w:p>
         </w:tc>
         <w:tc>
           <w:tcPr>
             <w:tcW w:type="dxa" w:w="5400"/>
+            <w:shd w:val="clear" w:color="auto" w:fill="F3F5F8"/>
           </w:tcPr>
           <w:p>
             <w:r/>
@@ -4540,13 +4969,14 @@
                 <w:b w:val="0"/>
                 <w:sz w:val="19"/>
               </w:rPr>
-              <w:t>Lab 10: Govern, measure &amp; improve your human–AI workforce</w:t>
+              <w:t>Course recap, practice questions and Q&amp;A</w:t>
             </w:r>
           </w:p>
         </w:tc>
         <w:tc>
           <w:tcPr>
             <w:tcW w:type="dxa" w:w="864"/>
+            <w:shd w:val="clear" w:color="auto" w:fill="F3F5F8"/>
           </w:tcPr>
           <w:p>
             <w:r/>
@@ -4563,6 +4993,7 @@
         <w:tc>
           <w:tcPr>
             <w:tcW w:type="dxa" w:w="1008"/>
+            <w:shd w:val="clear" w:color="auto" w:fill="F3F5F8"/>
           </w:tcPr>
           <w:p>
             <w:r/>
@@ -4572,7 +5003,7 @@
                 <w:b w:val="0"/>
                 <w:sz w:val="19"/>
               </w:rPr>
-              <w:t>138–144</w:t>
+              <w:t>211–214</w:t>
             </w:r>
           </w:p>
         </w:tc>
@@ -4581,7 +5012,24 @@
         <w:tc>
           <w:tcPr>
             <w:tcW w:type="dxa" w:w="1512"/>
-            <w:shd w:val="clear" w:color="auto" w:fill="F3F5F8"/>
+            <w:shd w:val="clear" w:color="auto" w:fill="E8F7EE"/>
+          </w:tcPr>
+          <w:p>
+            <w:r/>
+            <w:r>
+              <w:rPr>
+                <w:rFonts w:ascii="Arial" w:hAnsi="Arial"/>
+                <w:b/>
+                <w:sz w:val="19"/>
+              </w:rPr>
+              <w:t>16:15–16:30</w:t>
+            </w:r>
+          </w:p>
+        </w:tc>
+        <w:tc>
+          <w:tcPr>
+            <w:tcW w:type="dxa" w:w="1080"/>
+            <w:shd w:val="clear" w:color="auto" w:fill="E8F7EE"/>
           </w:tcPr>
           <w:p>
             <w:r/>
@@ -4591,14 +5039,31 @@
                 <w:b w:val="0"/>
                 <w:sz w:val="19"/>
               </w:rPr>
-              <w:t>15:55–16:15</w:t>
-            </w:r>
-          </w:p>
-        </w:tc>
-        <w:tc>
-          <w:tcPr>
-            <w:tcW w:type="dxa" w:w="1080"/>
-            <w:shd w:val="clear" w:color="auto" w:fill="F3F5F8"/>
+              <w:t>15 min</w:t>
+            </w:r>
+          </w:p>
+        </w:tc>
+        <w:tc>
+          <w:tcPr>
+            <w:tcW w:type="dxa" w:w="5400"/>
+            <w:shd w:val="clear" w:color="auto" w:fill="E8F7EE"/>
+          </w:tcPr>
+          <w:p>
+            <w:r/>
+            <w:r>
+              <w:rPr>
+                <w:rFonts w:ascii="Arial" w:hAnsi="Arial"/>
+                <w:b/>
+                <w:sz w:val="19"/>
+              </w:rPr>
+              <w:t>Briefing for Assessment</w:t>
+            </w:r>
+          </w:p>
+        </w:tc>
+        <w:tc>
+          <w:tcPr>
+            <w:tcW w:type="dxa" w:w="864"/>
+            <w:shd w:val="clear" w:color="auto" w:fill="E8F7EE"/>
           </w:tcPr>
           <w:p>
             <w:r/>
@@ -4608,14 +5073,14 @@
                 <w:b w:val="0"/>
                 <w:sz w:val="19"/>
               </w:rPr>
-              <w:t>20 min</w:t>
-            </w:r>
-          </w:p>
-        </w:tc>
-        <w:tc>
-          <w:tcPr>
-            <w:tcW w:type="dxa" w:w="5400"/>
-            <w:shd w:val="clear" w:color="auto" w:fill="F3F5F8"/>
+              <w:t>LU3</w:t>
+            </w:r>
+          </w:p>
+        </w:tc>
+        <w:tc>
+          <w:tcPr>
+            <w:tcW w:type="dxa" w:w="1008"/>
+            <w:shd w:val="clear" w:color="auto" w:fill="E8F7EE"/>
           </w:tcPr>
           <w:p>
             <w:r/>
@@ -4625,14 +5090,33 @@
                 <w:b w:val="0"/>
                 <w:sz w:val="19"/>
               </w:rPr>
-              <w:t>Course recap, practice exam and Q&amp;A</w:t>
-            </w:r>
-          </w:p>
-        </w:tc>
-        <w:tc>
-          <w:tcPr>
-            <w:tcW w:type="dxa" w:w="864"/>
-            <w:shd w:val="clear" w:color="auto" w:fill="F3F5F8"/>
+              <w:t>17</w:t>
+            </w:r>
+          </w:p>
+        </w:tc>
+      </w:tr>
+      <w:tr>
+        <w:tc>
+          <w:tcPr>
+            <w:tcW w:type="dxa" w:w="1512"/>
+            <w:shd w:val="clear" w:color="auto" w:fill="E8F7EE"/>
+          </w:tcPr>
+          <w:p>
+            <w:r/>
+            <w:r>
+              <w:rPr>
+                <w:rFonts w:ascii="Arial" w:hAnsi="Arial"/>
+                <w:b/>
+                <w:sz w:val="19"/>
+              </w:rPr>
+              <w:t>16:30–17:30</w:t>
+            </w:r>
+          </w:p>
+        </w:tc>
+        <w:tc>
+          <w:tcPr>
+            <w:tcW w:type="dxa" w:w="1080"/>
+            <w:shd w:val="clear" w:color="auto" w:fill="E8F7EE"/>
           </w:tcPr>
           <w:p>
             <w:r/>
@@ -4642,14 +5126,31 @@
                 <w:b w:val="0"/>
                 <w:sz w:val="19"/>
               </w:rPr>
-              <w:t>LU3</w:t>
-            </w:r>
-          </w:p>
-        </w:tc>
-        <w:tc>
-          <w:tcPr>
-            <w:tcW w:type="dxa" w:w="1008"/>
-            <w:shd w:val="clear" w:color="auto" w:fill="F3F5F8"/>
+              <w:t>60 min</w:t>
+            </w:r>
+          </w:p>
+        </w:tc>
+        <w:tc>
+          <w:tcPr>
+            <w:tcW w:type="dxa" w:w="5400"/>
+            <w:shd w:val="clear" w:color="auto" w:fill="E8F7EE"/>
+          </w:tcPr>
+          <w:p>
+            <w:r/>
+            <w:r>
+              <w:rPr>
+                <w:rFonts w:ascii="Arial" w:hAnsi="Arial"/>
+                <w:b/>
+                <w:sz w:val="19"/>
+              </w:rPr>
+              <w:t>Written Assessment (WA) — 1 hour, open book</w:t>
+            </w:r>
+          </w:p>
+        </w:tc>
+        <w:tc>
+          <w:tcPr>
+            <w:tcW w:type="dxa" w:w="864"/>
+            <w:shd w:val="clear" w:color="auto" w:fill="E8F7EE"/>
           </w:tcPr>
           <w:p>
             <w:r/>
@@ -4659,7 +5160,24 @@
                 <w:b w:val="0"/>
                 <w:sz w:val="19"/>
               </w:rPr>
-              <w:t>146–149</w:t>
+              <w:t>Assessment</w:t>
+            </w:r>
+          </w:p>
+        </w:tc>
+        <w:tc>
+          <w:tcPr>
+            <w:tcW w:type="dxa" w:w="1008"/>
+            <w:shd w:val="clear" w:color="auto" w:fill="E8F7EE"/>
+          </w:tcPr>
+          <w:p>
+            <w:r/>
+            <w:r>
+              <w:rPr>
+                <w:rFonts w:ascii="Arial" w:hAnsi="Arial"/>
+                <w:b w:val="0"/>
+                <w:sz w:val="19"/>
+              </w:rPr>
+              <w:t>215–218</w:t>
             </w:r>
           </w:p>
         </w:tc>
@@ -4678,7 +5196,7 @@
                 <w:b/>
                 <w:sz w:val="19"/>
               </w:rPr>
-              <w:t>16:15–16:30</w:t>
+              <w:t>17:30–18:30</w:t>
             </w:r>
           </w:p>
         </w:tc>
@@ -4695,7 +5213,7 @@
                 <w:b w:val="0"/>
                 <w:sz w:val="19"/>
               </w:rPr>
-              <w:t>15 min</w:t>
+              <w:t>60 min</w:t>
             </w:r>
           </w:p>
         </w:tc>
@@ -4712,7 +5230,7 @@
                 <w:b/>
                 <w:sz w:val="19"/>
               </w:rPr>
-              <w:t>Briefing for Assessment</w:t>
+              <w:t>Practical Performance (PP) — 1 hour, open book; TRAQOM survey and PM / assessment attendance</w:t>
             </w:r>
           </w:p>
         </w:tc>
@@ -4729,7 +5247,7 @@
                 <w:b w:val="0"/>
                 <w:sz w:val="19"/>
               </w:rPr>
-              <w:t>LU3</w:t>
+              <w:t>Assessment</w:t>
             </w:r>
           </w:p>
         </w:tc>
@@ -4746,181 +5264,7 @@
                 <w:b w:val="0"/>
                 <w:sz w:val="19"/>
               </w:rPr>
-              <w:t>17</w:t>
-            </w:r>
-          </w:p>
-        </w:tc>
-      </w:tr>
-      <w:tr>
-        <w:tc>
-          <w:tcPr>
-            <w:tcW w:type="dxa" w:w="1512"/>
-            <w:shd w:val="clear" w:color="auto" w:fill="E8F7EE"/>
-          </w:tcPr>
-          <w:p>
-            <w:r/>
-            <w:r>
-              <w:rPr>
-                <w:rFonts w:ascii="Arial" w:hAnsi="Arial"/>
-                <w:b/>
-                <w:sz w:val="19"/>
-              </w:rPr>
-              <w:t>16:30–17:30</w:t>
-            </w:r>
-          </w:p>
-        </w:tc>
-        <w:tc>
-          <w:tcPr>
-            <w:tcW w:type="dxa" w:w="1080"/>
-            <w:shd w:val="clear" w:color="auto" w:fill="E8F7EE"/>
-          </w:tcPr>
-          <w:p>
-            <w:r/>
-            <w:r>
-              <w:rPr>
-                <w:rFonts w:ascii="Arial" w:hAnsi="Arial"/>
-                <w:b w:val="0"/>
-                <w:sz w:val="19"/>
-              </w:rPr>
-              <w:t>60 min</w:t>
-            </w:r>
-          </w:p>
-        </w:tc>
-        <w:tc>
-          <w:tcPr>
-            <w:tcW w:type="dxa" w:w="5400"/>
-            <w:shd w:val="clear" w:color="auto" w:fill="E8F7EE"/>
-          </w:tcPr>
-          <w:p>
-            <w:r/>
-            <w:r>
-              <w:rPr>
-                <w:rFonts w:ascii="Arial" w:hAnsi="Arial"/>
-                <w:b/>
-                <w:sz w:val="19"/>
-              </w:rPr>
-              <w:t>Written Assessment (WA) — Short-Answer Questions (SAQ), 1 hour, open book</w:t>
-            </w:r>
-          </w:p>
-        </w:tc>
-        <w:tc>
-          <w:tcPr>
-            <w:tcW w:type="dxa" w:w="864"/>
-            <w:shd w:val="clear" w:color="auto" w:fill="E8F7EE"/>
-          </w:tcPr>
-          <w:p>
-            <w:r/>
-            <w:r>
-              <w:rPr>
-                <w:rFonts w:ascii="Arial" w:hAnsi="Arial"/>
-                <w:b w:val="0"/>
-                <w:sz w:val="19"/>
-              </w:rPr>
-              <w:t>Assessment</w:t>
-            </w:r>
-          </w:p>
-        </w:tc>
-        <w:tc>
-          <w:tcPr>
-            <w:tcW w:type="dxa" w:w="1008"/>
-            <w:shd w:val="clear" w:color="auto" w:fill="E8F7EE"/>
-          </w:tcPr>
-          <w:p>
-            <w:r/>
-            <w:r>
-              <w:rPr>
-                <w:rFonts w:ascii="Arial" w:hAnsi="Arial"/>
-                <w:b w:val="0"/>
-                <w:sz w:val="19"/>
-              </w:rPr>
-              <w:t>150–153</w:t>
-            </w:r>
-          </w:p>
-        </w:tc>
-      </w:tr>
-      <w:tr>
-        <w:tc>
-          <w:tcPr>
-            <w:tcW w:type="dxa" w:w="1512"/>
-            <w:shd w:val="clear" w:color="auto" w:fill="E8F7EE"/>
-          </w:tcPr>
-          <w:p>
-            <w:r/>
-            <w:r>
-              <w:rPr>
-                <w:rFonts w:ascii="Arial" w:hAnsi="Arial"/>
-                <w:b/>
-                <w:sz w:val="19"/>
-              </w:rPr>
-              <w:t>17:30–18:30</w:t>
-            </w:r>
-          </w:p>
-        </w:tc>
-        <w:tc>
-          <w:tcPr>
-            <w:tcW w:type="dxa" w:w="1080"/>
-            <w:shd w:val="clear" w:color="auto" w:fill="E8F7EE"/>
-          </w:tcPr>
-          <w:p>
-            <w:r/>
-            <w:r>
-              <w:rPr>
-                <w:rFonts w:ascii="Arial" w:hAnsi="Arial"/>
-                <w:b w:val="0"/>
-                <w:sz w:val="19"/>
-              </w:rPr>
-              <w:t>60 min</w:t>
-            </w:r>
-          </w:p>
-        </w:tc>
-        <w:tc>
-          <w:tcPr>
-            <w:tcW w:type="dxa" w:w="5400"/>
-            <w:shd w:val="clear" w:color="auto" w:fill="E8F7EE"/>
-          </w:tcPr>
-          <w:p>
-            <w:r/>
-            <w:r>
-              <w:rPr>
-                <w:rFonts w:ascii="Arial" w:hAnsi="Arial"/>
-                <w:b/>
-                <w:sz w:val="19"/>
-              </w:rPr>
-              <w:t>Practical Performance (PP) — 1 hour, open book; TRAQOM survey and PM / assessment digital attendance</w:t>
-            </w:r>
-          </w:p>
-        </w:tc>
-        <w:tc>
-          <w:tcPr>
-            <w:tcW w:type="dxa" w:w="864"/>
-            <w:shd w:val="clear" w:color="auto" w:fill="E8F7EE"/>
-          </w:tcPr>
-          <w:p>
-            <w:r/>
-            <w:r>
-              <w:rPr>
-                <w:rFonts w:ascii="Arial" w:hAnsi="Arial"/>
-                <w:b w:val="0"/>
-                <w:sz w:val="19"/>
-              </w:rPr>
-              <w:t>Assessment</w:t>
-            </w:r>
-          </w:p>
-        </w:tc>
-        <w:tc>
-          <w:tcPr>
-            <w:tcW w:type="dxa" w:w="1008"/>
-            <w:shd w:val="clear" w:color="auto" w:fill="E8F7EE"/>
-          </w:tcPr>
-          <w:p>
-            <w:r/>
-            <w:r>
-              <w:rPr>
-                <w:rFonts w:ascii="Arial" w:hAnsi="Arial"/>
-                <w:b w:val="0"/>
-                <w:sz w:val="19"/>
-              </w:rPr>
-              <w:t>150–153</w:t>
+              <w:t>215–218</w:t>
             </w:r>
           </w:p>
         </w:tc>
@@ -4933,7 +5277,7 @@
           <w:color w:val="555B66"/>
           <w:sz w:val="19"/>
         </w:rPr>
-        <w:t>Total training time: 480 minutes (8 hours).</w:t>
+        <w:t>Scheduled time excluding lunch: 480 minutes (8 hours), including tea and any assessment.</w:t>
       </w:r>
     </w:p>
     <w:p>
@@ -5079,7 +5423,7 @@
                 <w:b w:val="0"/>
                 <w:sz w:val="19"/>
               </w:rPr>
-              <w:t>Hire Your First AI Employee — Customer &amp; Market Research Brief</w:t>
+              <w:t>Activity 1 — Install Hermes, Connect Telegram &amp; Build the Launch Brief</w:t>
             </w:r>
           </w:p>
         </w:tc>
@@ -5127,7 +5471,7 @@
                 <w:b w:val="0"/>
                 <w:sz w:val="19"/>
               </w:rPr>
-              <w:t>67–73</w:t>
+              <w:t>128–133</w:t>
             </w:r>
           </w:p>
         </w:tc>
@@ -5161,7 +5505,7 @@
                 <w:b w:val="0"/>
                 <w:sz w:val="19"/>
               </w:rPr>
-              <w:t>End-to-End Social Media Campaign with One Agent</w:t>
+              <w:t>Single-Agent Launch Office — Google, Excel, Dashboard &amp; Professional PPT</w:t>
             </w:r>
           </w:p>
         </w:tc>
@@ -5177,7 +5521,7 @@
                 <w:b w:val="0"/>
                 <w:sz w:val="19"/>
               </w:rPr>
-              <w:t>Single agent + skills</w:t>
+              <w:t>Single agent + four skills</w:t>
             </w:r>
           </w:p>
         </w:tc>
@@ -5209,7 +5553,7 @@
                 <w:b w:val="0"/>
                 <w:sz w:val="19"/>
               </w:rPr>
-              <w:t>74–80</w:t>
+              <w:t>134–139</w:t>
             </w:r>
           </w:p>
         </w:tc>
@@ -5243,7 +5587,7 @@
                 <w:b w:val="0"/>
                 <w:sz w:val="19"/>
               </w:rPr>
-              <w:t>Human-in-the-Loop Publishing &amp; Community Care (Telegram + Cron)</w:t>
+              <w:t>Human-in-the-Loop Office Approval &amp; Exception Handling</w:t>
             </w:r>
           </w:p>
         </w:tc>
@@ -5291,7 +5635,7 @@
                 <w:b w:val="0"/>
                 <w:sz w:val="19"/>
               </w:rPr>
-              <w:t>81–88</w:t>
+              <w:t>140–146</w:t>
             </w:r>
           </w:p>
         </w:tc>
@@ -5309,7 +5653,7 @@
                 <w:b/>
                 <w:sz w:val="19"/>
               </w:rPr>
-              <w:t>Lab 4 (Day 1)</w:t>
+              <w:t>Lab 4 (Day 2)</w:t>
             </w:r>
           </w:p>
         </w:tc>
@@ -5325,7 +5669,7 @@
                 <w:b w:val="0"/>
                 <w:sz w:val="19"/>
               </w:rPr>
-              <w:t>Multi-Agent Video Studio — Research → Script → Production → Audit → Publish</w:t>
+              <w:t>Multi-Agent Video Studio — Kanban, Production &amp; Human Review</w:t>
             </w:r>
           </w:p>
         </w:tc>
@@ -5373,7 +5717,7 @@
                 <w:b w:val="0"/>
                 <w:sz w:val="19"/>
               </w:rPr>
-              <w:t>89–96</w:t>
+              <w:t>147–153</w:t>
             </w:r>
           </w:p>
         </w:tc>
@@ -5391,7 +5735,7 @@
                 <w:b/>
                 <w:sz w:val="19"/>
               </w:rPr>
-              <w:t>Lab 5 (Day 1)</w:t>
+              <w:t>Lab 5 (Day 2)</w:t>
             </w:r>
           </w:p>
         </w:tc>
@@ -5455,7 +5799,7 @@
                 <w:b w:val="0"/>
                 <w:sz w:val="19"/>
               </w:rPr>
-              <w:t>97–103</w:t>
+              <w:t>154–160</w:t>
             </w:r>
           </w:p>
         </w:tc>
@@ -5537,7 +5881,7 @@
                 <w:b w:val="0"/>
                 <w:sz w:val="19"/>
               </w:rPr>
-              <w:t>110–116</w:t>
+              <w:t>167–173</w:t>
             </w:r>
           </w:p>
         </w:tc>
@@ -5619,7 +5963,7 @@
                 <w:b w:val="0"/>
                 <w:sz w:val="19"/>
               </w:rPr>
-              <w:t>117–124</w:t>
+              <w:t>174–191</w:t>
             </w:r>
           </w:p>
         </w:tc>
@@ -5653,7 +5997,7 @@
                 <w:b w:val="0"/>
                 <w:sz w:val="19"/>
               </w:rPr>
-              <w:t>Run the #ShiokColdBrew Launch as a Project — Review, Revise, Release</w:t>
+              <w:t>Claude Code Agent Team — Produce the Launch Video</w:t>
             </w:r>
           </w:p>
         </w:tc>
@@ -5669,7 +6013,7 @@
                 <w:b w:val="0"/>
                 <w:sz w:val="19"/>
               </w:rPr>
-              <w:t>Multi-agent project with Board review</w:t>
+              <w:t>Claude team + human gate</w:t>
             </w:r>
           </w:p>
         </w:tc>
@@ -5701,7 +6045,7 @@
                 <w:b w:val="0"/>
                 <w:sz w:val="19"/>
               </w:rPr>
-              <w:t>125–131</w:t>
+              <w:t>192–196</w:t>
             </w:r>
           </w:p>
         </w:tc>
@@ -5783,7 +6127,7 @@
                 <w:b w:val="0"/>
                 <w:sz w:val="19"/>
               </w:rPr>
-              <w:t>132–137</w:t>
+              <w:t>197–202</w:t>
             </w:r>
           </w:p>
         </w:tc>
@@ -5865,7 +6209,7 @@
                 <w:b w:val="0"/>
                 <w:sz w:val="19"/>
               </w:rPr>
-              <w:t>138–144</w:t>
+              <w:t>203–209</w:t>
             </w:r>
           </w:p>
         </w:tc>

</xml_diff>

<commit_message>
feat: streamline workforce course to eight Hermes and Dots activities
</commit_message>
<xml_diff>
--- a/courseware/LP-Human-AI Workforce with Autonomous AI Agents.docx
+++ b/courseware/LP-Human-AI Workforce with Autonomous AI Agents.docx
@@ -179,7 +179,7 @@
           <w:color w:val="1F6FEB"/>
           <w:sz w:val="24"/>
         </w:rPr>
-        <w:t>Version 2.1</w:t>
+        <w:t>Version 2.2</w:t>
       </w:r>
     </w:p>
     <w:p>
@@ -1078,6 +1078,64 @@
                 <w:sz w:val="19"/>
               </w:rPr>
               <w:t>Human–AI landscape rebuilt with practical workflows, research evidence, collaboration modes and humanoid futures; Day 1 single Hermes office automation with gog, Excel, interactive dashboard and professional PPT; Day 2 Kanban and Claude Code video team; SWDA subscription steps and connected GitHub Pages prompts.</w:t>
+            </w:r>
+          </w:p>
+        </w:tc>
+        <w:tc>
+          <w:tcPr>
+            <w:tcW w:type="dxa" w:w="1440"/>
+          </w:tcPr>
+          <w:p>
+            <w:r/>
+            <w:r>
+              <w:rPr>
+                <w:sz w:val="19"/>
+              </w:rPr>
+              <w:t>Dr. Alfred Ang</w:t>
+            </w:r>
+          </w:p>
+        </w:tc>
+      </w:tr>
+      <w:tr>
+        <w:tc>
+          <w:tcPr>
+            <w:tcW w:type="dxa" w:w="1152"/>
+          </w:tcPr>
+          <w:p>
+            <w:r/>
+            <w:r>
+              <w:rPr>
+                <w:sz w:val="19"/>
+              </w:rPr>
+              <w:t>2.2</w:t>
+            </w:r>
+          </w:p>
+        </w:tc>
+        <w:tc>
+          <w:tcPr>
+            <w:tcW w:type="dxa" w:w="1656"/>
+          </w:tcPr>
+          <w:p>
+            <w:r/>
+            <w:r>
+              <w:rPr>
+                <w:sz w:val="19"/>
+              </w:rPr>
+              <w:t>29 October 2026</w:t>
+            </w:r>
+          </w:p>
+        </w:tc>
+        <w:tc>
+          <w:tcPr>
+            <w:tcW w:type="dxa" w:w="5544"/>
+          </w:tcPr>
+          <w:p>
+            <w:r/>
+            <w:r>
+              <w:rPr>
+                <w:sz w:val="19"/>
+              </w:rPr>
+              <w:t>Streamlined to eight connected activities, four per day, using Hermes Desktop and OpenAI Dots. Removed Paperclip and Claude-specific training. PP v6 evidence: Telegram, single-agent professional PPT with skills/tools, and multi-agent Kanban video creation with Hermes bots. FG/AP v5 aligned. Corrected shared use-case slide spacing.</w:t>
             </w:r>
           </w:p>
         </w:tc>
@@ -1140,7 +1198,7 @@
         </w:rPr>
         <w:t>Course Information</w:t>
         <w:tab/>
-        <w:t>5</w:t>
+        <w:t>6</w:t>
       </w:r>
     </w:p>
     <w:p>
@@ -1159,7 +1217,7 @@
         </w:rPr>
         <w:t>Learning Outcomes</w:t>
         <w:tab/>
-        <w:t>5</w:t>
+        <w:t>6</w:t>
       </w:r>
     </w:p>
     <w:p>
@@ -1178,7 +1236,7 @@
         </w:rPr>
         <w:t>Topics and Labs</w:t>
         <w:tab/>
-        <w:t>5</w:t>
+        <w:t>6</w:t>
       </w:r>
     </w:p>
     <w:p>
@@ -1197,7 +1255,7 @@
         </w:rPr>
         <w:t>Learning Units (approved Course Proposal TPG-2024060313)</w:t>
         <w:tab/>
-        <w:t>6</w:t>
+        <w:t>7</w:t>
       </w:r>
     </w:p>
     <w:p>
@@ -1216,7 +1274,7 @@
         </w:rPr>
         <w:t>Assessment</w:t>
         <w:tab/>
-        <w:t>6</w:t>
+        <w:t>7</w:t>
       </w:r>
     </w:p>
     <w:p>
@@ -1235,7 +1293,7 @@
         </w:rPr>
         <w:t>Course Schedule</w:t>
         <w:tab/>
-        <w:t>6</w:t>
+        <w:t>7</w:t>
       </w:r>
     </w:p>
     <w:p>
@@ -1253,9 +1311,9 @@
           <w:color w:val="333333"/>
           <w:sz w:val="21"/>
         </w:rPr>
-        <w:t>Day 1 — Human–AI landscape and single Hermes agent: office automation, tools, skills and practice (Labs 1–3)</w:t>
+        <w:t>Day 1 — Human–AI landscape and one Hermes office assistant: tools, skills and practice (Activities 1–4)</w:t>
         <w:tab/>
-        <w:t>6</w:t>
+        <w:t>7</w:t>
       </w:r>
     </w:p>
     <w:p>
@@ -1273,9 +1331,9 @@
           <w:color w:val="333333"/>
           <w:sz w:val="21"/>
         </w:rPr>
-        <w:t>Day 2 — Multi-agent teams: Kanban, Claude Code video studio, governance (Labs 4–10), then assessment</w:t>
+        <w:t>Day 2 — Hermes multi-agent Kanban video team and OpenAI Dots (Activities 5–8), then assessment</w:t>
         <w:tab/>
-        <w:t>7</w:t>
+        <w:t>8</w:t>
       </w:r>
     </w:p>
     <w:p>
@@ -1294,7 +1352,7 @@
         </w:rPr>
         <w:t>Lab Reference</w:t>
         <w:tab/>
-        <w:t>7</w:t>
+        <w:t>8</w:t>
       </w:r>
       <w:r>
         <w:fldChar w:fldCharType="end"/>
@@ -1529,7 +1587,7 @@
                 <w:b w:val="0"/>
                 <w:sz w:val="20"/>
               </w:rPr>
-              <w:t>Instructor-led; hands-on use-case labs on Hermes Agent and Paperclip (learner laptop)</w:t>
+              <w:t>Instructor-led; hands-on use-case labs on Hermes Agent and OpenAI Dots (learner laptop)</w:t>
             </w:r>
           </w:p>
         </w:tc>
@@ -1599,7 +1657,7 @@
                 <w:b w:val="0"/>
                 <w:sz w:val="20"/>
               </w:rPr>
-              <w:t>Human-AI Workforce with Autonomous AI Agents-v2.1.pptx (218 slides)</w:t>
+              <w:t>Human-AI Workforce with Autonomous AI Agents-v2.2.pptx (225 slides)</w:t>
             </w:r>
           </w:p>
         </w:tc>
@@ -1792,7 +1850,7 @@
                 <w:b w:val="0"/>
                 <w:sz w:val="19"/>
               </w:rPr>
-              <w:t>Current human–AI interaction landscape; 2023 prompt → 2024 context → 2025 harness → 2026 agents; 48 practical workflows, scientific discovery and humanoid futures; Single agents, teams, orchestration and human control; Agent mechanisms, evidence, permissions and governance.  Activity: Human–AI Workforce Canvas.</w:t>
+              <w:t>2026 interaction landscape and history; 48 practical workflows and humanoid futures; Single agents, teams, orchestration and human control; Agent mechanisms, evidence and governance.  Activity: Human–AI Workforce Canvas.</w:t>
             </w:r>
           </w:p>
         </w:tc>
@@ -1843,7 +1901,7 @@
                 <w:b w:val="0"/>
                 <w:sz w:val="19"/>
               </w:rPr>
-              <w:t>Lab 1 · Install Hermes, Telegram and an evidence brief; Lab 2 · Gmail, Calendar, Drive, Excel, dashboard and PowerPoint; Lab 3 · Office approval and exception handling; Day 2 bridge · Labs 4–5 Kanban and multi-agent work.</w:t>
+              <w:t>Activity 1 · Desktop, Telegram and launch brief; Activity 2 · gog: Gmail, Calendar, Drive and Excel; Activity 3 · Interactive dashboard and professional PPT; Activity 4 · Office approval and exceptions.</w:t>
             </w:r>
           </w:p>
         </w:tc>
@@ -1859,7 +1917,7 @@
                 <w:b w:val="0"/>
                 <w:sz w:val="19"/>
               </w:rPr>
-              <w:t>100–161</w:t>
+              <w:t>100–153</w:t>
             </w:r>
           </w:p>
         </w:tc>
@@ -1878,7 +1936,7 @@
                 <w:b/>
                 <w:sz w:val="19"/>
               </w:rPr>
-              <w:t>Topic 3: Multi-Agent Teams — Kanban, Claude Code &amp; Governance</w:t>
+              <w:t>Topic 3: Hermes Teams &amp; OpenAI Dots — Kanban, Video &amp; Human Oversight</w:t>
             </w:r>
           </w:p>
         </w:tc>
@@ -1894,7 +1952,7 @@
                 <w:b w:val="0"/>
                 <w:sz w:val="19"/>
               </w:rPr>
-              <w:t>Labs 4–5 · Kanban video studio and analysis team; Labs 6–7 · Company and org-chart governance; Lab 8 · Claude Code multi-agent video team; Labs 9–10 · Repeatable work, evaluation and improvement.</w:t>
+              <w:t>Activity 5 · Hermes bots and Kanban video studio; Activity 6 · Source retrieval, verification and maintenance; Activity 7 · Dots: supervised launch review; Activity 8 · Team video revision, local release and evaluation.</w:t>
             </w:r>
           </w:p>
         </w:tc>
@@ -1910,7 +1968,7 @@
                 <w:b w:val="0"/>
                 <w:sz w:val="19"/>
               </w:rPr>
-              <w:t>162–210</w:t>
+              <w:t>154–217</w:t>
             </w:r>
           </w:p>
         </w:tc>
@@ -2100,7 +2158,7 @@
                 <w:b w:val="0"/>
                 <w:sz w:val="19"/>
               </w:rPr>
-              <w:t>Topic 1 landscape, canvas and office design clinic + demo + Lab 1A installation and evidence brief</w:t>
+              <w:t>Topic 1 landscape, canvas and office design clinic + demo + Activity 1A Desktop, Telegram and evidence brief</w:t>
             </w:r>
           </w:p>
         </w:tc>
@@ -2189,7 +2247,7 @@
                 <w:b w:val="0"/>
                 <w:sz w:val="19"/>
               </w:rPr>
-              <w:t>Lab 1B + Labs 2–5 tools/skills, human gates, Kanban studio and parallel team; governance introduction</w:t>
+              <w:t>Activity 1B + Activities 2–5: tools/skills, office artifacts, human gates and Kanban video studio</w:t>
             </w:r>
           </w:p>
         </w:tc>
@@ -2272,7 +2330,7 @@
                 <w:b w:val="0"/>
                 <w:sz w:val="19"/>
               </w:rPr>
-              <w:t>Labs 6–10 company governance, Claude video team, repeatable work and evaluation</w:t>
+              <w:t>Activities 6–8: source assurance, Dots, video-team revision and evaluation</w:t>
             </w:r>
           </w:p>
         </w:tc>
@@ -2429,7 +2487,7 @@
         <w:rPr>
           <w:sz w:val="22"/>
         </w:rPr>
-        <w:t>Practical Performance (PP) — three tasks, each with ONE screenshot from a lab (Lab 1 Hermes agent, Lab 4 multi-agent studio, Lab 7 Paperclip org chart) plus written analysis, 1 hour, open book.</w:t>
+        <w:t>Practical Performance (PP) — three tasks, each with ONE screenshot: Activity 1 Telegram interaction; Activity 3 professional PPT using skills/tools; Activity 5 or 8 video creation with a real multi-agent Kanban team and Hermes bots; plus written analysis, 1 hour, open book.</w:t>
       </w:r>
     </w:p>
     <w:p>
@@ -2478,7 +2536,7 @@
         <w:pStyle w:val="Heading2"/>
       </w:pPr>
       <w:r>
-        <w:t>Day 1 — Human–AI landscape and single Hermes agent: office automation, tools, skills and practice (Labs 1–3)</w:t>
+        <w:t>Day 1 — Human–AI landscape and one Hermes office assistant: tools, skills and practice (Activities 1–4)</w:t>
       </w:r>
     </w:p>
     <w:tbl>
@@ -2984,7 +3042,7 @@
                 <w:b/>
                 <w:sz w:val="19"/>
               </w:rPr>
-              <w:t>Activity — design the Kopi Kaki launch-office canvas, inputs, outputs and human decisions</w:t>
+              <w:t>Design discussion — map the Kopi Kaki launch-office canvas, inputs, outputs and human decisions</w:t>
             </w:r>
           </w:p>
         </w:tc>
@@ -3329,7 +3387,7 @@
                 <w:b w:val="0"/>
                 <w:sz w:val="19"/>
               </w:rPr>
-              <w:t>Lab 1: Activity 1A — install Hermes, connect Telegram and produce the source-linked brief (PP Q1 preparation)</w:t>
+              <w:t>Lab 1: Activity 1A — install Hermes, connect Telegram and produce the source-linked brief (PP Task 1 preparation)</w:t>
             </w:r>
           </w:p>
         </w:tc>
@@ -3548,7 +3606,7 @@
                 <w:b w:val="0"/>
                 <w:sz w:val="19"/>
               </w:rPr>
-              <w:t>16:15–17:45</w:t>
+              <w:t>16:15–17:05</w:t>
             </w:r>
           </w:p>
         </w:tc>
@@ -3564,7 +3622,7 @@
                 <w:b w:val="0"/>
                 <w:sz w:val="19"/>
               </w:rPr>
-              <w:t>90 min</w:t>
+              <w:t>50 min</w:t>
             </w:r>
           </w:p>
         </w:tc>
@@ -3580,7 +3638,7 @@
                 <w:b w:val="0"/>
                 <w:sz w:val="19"/>
               </w:rPr>
-              <w:t>Lab 2: Single-agent launch office — gog Gmail/Calendar/Drive, Excel analysis, interactive dashboard and professional PowerPoint</w:t>
+              <w:t>Lab 2: Activity 2 — gog Gmail/Calendar/Drive and verified Excel analysis</w:t>
             </w:r>
           </w:p>
         </w:tc>
@@ -3630,7 +3688,7 @@
                 <w:b w:val="0"/>
                 <w:sz w:val="19"/>
               </w:rPr>
-              <w:t>17:45–18:15</w:t>
+              <w:t>17:05–17:45</w:t>
             </w:r>
           </w:p>
         </w:tc>
@@ -3646,7 +3704,7 @@
                 <w:b w:val="0"/>
                 <w:sz w:val="19"/>
               </w:rPr>
-              <w:t>30 min</w:t>
+              <w:t>40 min</w:t>
             </w:r>
           </w:p>
         </w:tc>
@@ -3662,7 +3720,7 @@
                 <w:b w:val="0"/>
                 <w:sz w:val="19"/>
               </w:rPr>
-              <w:t>Lab 3: Human approval, office exceptions and safe internal reporting</w:t>
+              <w:t>Lab 3: Activity 3 — interactive dashboard and professional PPT using tools and skills (PP Task 2)</w:t>
             </w:r>
           </w:p>
         </w:tc>
@@ -3694,7 +3752,7 @@
                 <w:b w:val="0"/>
                 <w:sz w:val="19"/>
               </w:rPr>
-              <w:t>140–146</w:t>
+              <w:t>140–145</w:t>
             </w:r>
           </w:p>
         </w:tc>
@@ -3703,7 +3761,6 @@
         <w:tc>
           <w:tcPr>
             <w:tcW w:type="dxa" w:w="1512"/>
-            <w:shd w:val="clear" w:color="auto" w:fill="F3F5F8"/>
           </w:tcPr>
           <w:p>
             <w:r/>
@@ -3713,14 +3770,13 @@
                 <w:b w:val="0"/>
                 <w:sz w:val="19"/>
               </w:rPr>
-              <w:t>18:15–18:30</w:t>
+              <w:t>17:45–18:15</w:t>
             </w:r>
           </w:p>
         </w:tc>
         <w:tc>
           <w:tcPr>
             <w:tcW w:type="dxa" w:w="1080"/>
-            <w:shd w:val="clear" w:color="auto" w:fill="F3F5F8"/>
           </w:tcPr>
           <w:p>
             <w:r/>
@@ -3730,14 +3786,13 @@
                 <w:b w:val="0"/>
                 <w:sz w:val="19"/>
               </w:rPr>
-              <w:t>15 min</w:t>
+              <w:t>30 min</w:t>
             </w:r>
           </w:p>
         </w:tc>
         <w:tc>
           <w:tcPr>
             <w:tcW w:type="dxa" w:w="5400"/>
-            <w:shd w:val="clear" w:color="auto" w:fill="F3F5F8"/>
           </w:tcPr>
           <w:p>
             <w:r/>
@@ -3747,14 +3802,13 @@
                 <w:b w:val="0"/>
                 <w:sz w:val="19"/>
               </w:rPr>
-              <w:t>Day 1 recap, Q&amp;A and PM digital attendance</w:t>
+              <w:t>Lab 4: Activity 4 — human approval, office exceptions and safe internal reporting</w:t>
             </w:r>
           </w:p>
         </w:tc>
         <w:tc>
           <w:tcPr>
             <w:tcW w:type="dxa" w:w="864"/>
-            <w:shd w:val="clear" w:color="auto" w:fill="F3F5F8"/>
           </w:tcPr>
           <w:p>
             <w:r/>
@@ -3771,7 +3825,6 @@
         <w:tc>
           <w:tcPr>
             <w:tcW w:type="dxa" w:w="1008"/>
-            <w:shd w:val="clear" w:color="auto" w:fill="F3F5F8"/>
           </w:tcPr>
           <w:p>
             <w:r/>
@@ -3781,7 +3834,94 @@
                 <w:b w:val="0"/>
                 <w:sz w:val="19"/>
               </w:rPr>
-              <w:t>161</w:t>
+              <w:t>146–151</w:t>
+            </w:r>
+          </w:p>
+        </w:tc>
+      </w:tr>
+      <w:tr>
+        <w:tc>
+          <w:tcPr>
+            <w:tcW w:type="dxa" w:w="1512"/>
+            <w:shd w:val="clear" w:color="auto" w:fill="F3F5F8"/>
+          </w:tcPr>
+          <w:p>
+            <w:r/>
+            <w:r>
+              <w:rPr>
+                <w:rFonts w:ascii="Arial" w:hAnsi="Arial"/>
+                <w:b w:val="0"/>
+                <w:sz w:val="19"/>
+              </w:rPr>
+              <w:t>18:15–18:30</w:t>
+            </w:r>
+          </w:p>
+        </w:tc>
+        <w:tc>
+          <w:tcPr>
+            <w:tcW w:type="dxa" w:w="1080"/>
+            <w:shd w:val="clear" w:color="auto" w:fill="F3F5F8"/>
+          </w:tcPr>
+          <w:p>
+            <w:r/>
+            <w:r>
+              <w:rPr>
+                <w:rFonts w:ascii="Arial" w:hAnsi="Arial"/>
+                <w:b w:val="0"/>
+                <w:sz w:val="19"/>
+              </w:rPr>
+              <w:t>15 min</w:t>
+            </w:r>
+          </w:p>
+        </w:tc>
+        <w:tc>
+          <w:tcPr>
+            <w:tcW w:type="dxa" w:w="5400"/>
+            <w:shd w:val="clear" w:color="auto" w:fill="F3F5F8"/>
+          </w:tcPr>
+          <w:p>
+            <w:r/>
+            <w:r>
+              <w:rPr>
+                <w:rFonts w:ascii="Arial" w:hAnsi="Arial"/>
+                <w:b w:val="0"/>
+                <w:sz w:val="19"/>
+              </w:rPr>
+              <w:t>Day 1 recap, Q&amp;A and PM digital attendance</w:t>
+            </w:r>
+          </w:p>
+        </w:tc>
+        <w:tc>
+          <w:tcPr>
+            <w:tcW w:type="dxa" w:w="864"/>
+            <w:shd w:val="clear" w:color="auto" w:fill="F3F5F8"/>
+          </w:tcPr>
+          <w:p>
+            <w:r/>
+            <w:r>
+              <w:rPr>
+                <w:rFonts w:ascii="Arial" w:hAnsi="Arial"/>
+                <w:b w:val="0"/>
+                <w:sz w:val="19"/>
+              </w:rPr>
+              <w:t>LU2</w:t>
+            </w:r>
+          </w:p>
+        </w:tc>
+        <w:tc>
+          <w:tcPr>
+            <w:tcW w:type="dxa" w:w="1008"/>
+            <w:shd w:val="clear" w:color="auto" w:fill="F3F5F8"/>
+          </w:tcPr>
+          <w:p>
+            <w:r/>
+            <w:r>
+              <w:rPr>
+                <w:rFonts w:ascii="Arial" w:hAnsi="Arial"/>
+                <w:b w:val="0"/>
+                <w:sz w:val="19"/>
+              </w:rPr>
+              <w:t>152</w:t>
             </w:r>
           </w:p>
         </w:tc>
@@ -3802,7 +3942,7 @@
         <w:pStyle w:val="Heading2"/>
       </w:pPr>
       <w:r>
-        <w:t>Day 2 — Multi-agent teams: Kanban, Claude Code video studio, governance (Labs 4–10), then assessment</w:t>
+        <w:t>Day 2 — Hermes multi-agent Kanban video team and OpenAI Dots (Activities 5–8), then assessment</w:t>
       </w:r>
     </w:p>
     <w:tbl>
@@ -3994,7 +4134,7 @@
                 <w:b w:val="0"/>
                 <w:sz w:val="19"/>
               </w:rPr>
-              <w:t>161</w:t>
+              <w:t>152</w:t>
             </w:r>
           </w:p>
         </w:tc>
@@ -4044,7 +4184,7 @@
                 <w:b w:val="0"/>
                 <w:sz w:val="19"/>
               </w:rPr>
-              <w:t>Lab 4: Multi-Agent Video Studio — Kanban roles, dependencies, production, audit and human release gate</w:t>
+              <w:t>Lab 5: Activity 5A — Hermes bots, Kanban roles, dependencies and video production</w:t>
             </w:r>
           </w:p>
         </w:tc>
@@ -4076,7 +4216,7 @@
                 <w:b w:val="0"/>
                 <w:sz w:val="19"/>
               </w:rPr>
-              <w:t>147–153</w:t>
+              <w:t>171–177</w:t>
             </w:r>
           </w:p>
         </w:tc>
@@ -4126,7 +4266,7 @@
                 <w:b w:val="0"/>
                 <w:sz w:val="19"/>
               </w:rPr>
-              <w:t>Lab 5: Multi-Agent Campaign Command Centre — parallel analysis, verifier and synthesis</w:t>
+              <w:t>Lab 5: Activity 5B — independent audit, human revision and video-team evidence</w:t>
             </w:r>
           </w:p>
         </w:tc>
@@ -4158,7 +4298,7 @@
                 <w:b w:val="0"/>
                 <w:sz w:val="19"/>
               </w:rPr>
-              <w:t>154–160</w:t>
+              <w:t>171–177</w:t>
             </w:r>
           </w:p>
         </w:tc>
@@ -4298,7 +4438,7 @@
                 <w:b/>
                 <w:sz w:val="19"/>
               </w:rPr>
-              <w:t>Topic 3 — company-level governance and team accountability</w:t>
+              <w:t>Topic 3 — team source assurance and accountability</w:t>
             </w:r>
           </w:p>
         </w:tc>
@@ -4332,7 +4472,7 @@
                 <w:b w:val="0"/>
                 <w:sz w:val="19"/>
               </w:rPr>
-              <w:t>162–166</w:t>
+              <w:t>154–170</w:t>
             </w:r>
           </w:p>
         </w:tc>
@@ -4382,7 +4522,7 @@
                 <w:b w:val="0"/>
                 <w:sz w:val="19"/>
               </w:rPr>
-              <w:t>Lab 6: Found Kopi Kaki Growth Studio — mission, company and governed CEO</w:t>
+              <w:t>Lab 6: Activity 6 — source retrieval, verification and RAG maintenance</w:t>
             </w:r>
           </w:p>
         </w:tc>
@@ -4414,7 +4554,7 @@
                 <w:b w:val="0"/>
                 <w:sz w:val="19"/>
               </w:rPr>
-              <w:t>167–173</w:t>
+              <w:t>178–189</w:t>
             </w:r>
           </w:p>
         </w:tc>
@@ -4551,7 +4691,7 @@
                 <w:b w:val="0"/>
                 <w:sz w:val="19"/>
               </w:rPr>
-              <w:t>Lab 7: Hire the Marketing Team through the Board gate — org-chart evidence for PP Q3</w:t>
+              <w:t>Lab 7: Activity 7 — supervised OpenAI Dots launch review and Hermes comparison</w:t>
             </w:r>
           </w:p>
         </w:tc>
@@ -4583,7 +4723,7 @@
                 <w:b w:val="0"/>
                 <w:sz w:val="19"/>
               </w:rPr>
-              <w:t>174–191</w:t>
+              <w:t>190–200</w:t>
             </w:r>
           </w:p>
         </w:tc>
@@ -4633,7 +4773,7 @@
                 <w:b w:val="0"/>
                 <w:sz w:val="19"/>
               </w:rPr>
-              <w:t>Lab 8: Claude Code Agent Team — create and audit a launch video with independent teammates</w:t>
+              <w:t>Lab 8: Activity 8A — multi-agent Kanban video revision with Hermes bots (PP Task 3)</w:t>
             </w:r>
           </w:p>
         </w:tc>
@@ -4665,7 +4805,7 @@
                 <w:b w:val="0"/>
                 <w:sz w:val="19"/>
               </w:rPr>
-              <w:t>192–196</w:t>
+              <w:t>201–216</w:t>
             </w:r>
           </w:p>
         </w:tc>
@@ -4715,7 +4855,7 @@
                 <w:b w:val="0"/>
                 <w:sz w:val="19"/>
               </w:rPr>
-              <w:t>Lab 9: Repeatable Weekly Video Pipeline — routine, verification and Board review</w:t>
+              <w:t>Lab 8: Activity 8B — repeat-run test, failed-source recovery and exact-version review</w:t>
             </w:r>
           </w:p>
         </w:tc>
@@ -4747,7 +4887,7 @@
                 <w:b w:val="0"/>
                 <w:sz w:val="19"/>
               </w:rPr>
-              <w:t>197–202</w:t>
+              <w:t>201–216</w:t>
             </w:r>
           </w:p>
         </w:tc>
@@ -4884,7 +5024,7 @@
                 <w:b w:val="0"/>
                 <w:sz w:val="19"/>
               </w:rPr>
-              <w:t>Lab 10: Govern, Measure and Improve — compare single-agent and team workflows</w:t>
+              <w:t>Lab 8: Activity 8C — final local release, scorecard and team improvement</w:t>
             </w:r>
           </w:p>
         </w:tc>
@@ -4916,7 +5056,7 @@
                 <w:b w:val="0"/>
                 <w:sz w:val="19"/>
               </w:rPr>
-              <w:t>203–209</w:t>
+              <w:t>201–216</w:t>
             </w:r>
           </w:p>
         </w:tc>
@@ -5003,7 +5143,7 @@
                 <w:b w:val="0"/>
                 <w:sz w:val="19"/>
               </w:rPr>
-              <w:t>211–214</w:t>
+              <w:t>218–221</w:t>
             </w:r>
           </w:p>
         </w:tc>
@@ -5177,7 +5317,7 @@
                 <w:b w:val="0"/>
                 <w:sz w:val="19"/>
               </w:rPr>
-              <w:t>215–218</w:t>
+              <w:t>222–225</w:t>
             </w:r>
           </w:p>
         </w:tc>
@@ -5264,7 +5404,7 @@
                 <w:b w:val="0"/>
                 <w:sz w:val="19"/>
               </w:rPr>
-              <w:t>215–218</w:t>
+              <w:t>222–225</w:t>
             </w:r>
           </w:p>
         </w:tc>
@@ -5423,7 +5563,7 @@
                 <w:b w:val="0"/>
                 <w:sz w:val="19"/>
               </w:rPr>
-              <w:t>Activity 1 — Install Hermes, Connect Telegram &amp; Build the Launch Brief</w:t>
+              <w:t>Activity 1 — Hermes Desktop, Telegram &amp; the Launch Brief</w:t>
             </w:r>
           </w:p>
         </w:tc>
@@ -5505,7 +5645,7 @@
                 <w:b w:val="0"/>
                 <w:sz w:val="19"/>
               </w:rPr>
-              <w:t>Single-Agent Launch Office — Google, Excel, Dashboard &amp; Professional PPT</w:t>
+              <w:t>Activity 2 — Google Workspace &amp; Verified Excel Analysis</w:t>
             </w:r>
           </w:p>
         </w:tc>
@@ -5521,7 +5661,7 @@
                 <w:b w:val="0"/>
                 <w:sz w:val="19"/>
               </w:rPr>
-              <w:t>Single agent + four skills</w:t>
+              <w:t>One agent + gog + analytics skill</w:t>
             </w:r>
           </w:p>
         </w:tc>
@@ -5587,7 +5727,7 @@
                 <w:b w:val="0"/>
                 <w:sz w:val="19"/>
               </w:rPr>
-              <w:t>Human-in-the-Loop Office Approval &amp; Exception Handling</w:t>
+              <w:t>Activity 3 — Interactive Dashboard &amp; Professional PPT</w:t>
             </w:r>
           </w:p>
         </w:tc>
@@ -5603,7 +5743,7 @@
                 <w:b w:val="0"/>
                 <w:sz w:val="19"/>
               </w:rPr>
-              <w:t>Human–agent collaboration</w:t>
+              <w:t>Single agent + four skills</w:t>
             </w:r>
           </w:p>
         </w:tc>
@@ -5619,7 +5759,7 @@
                 <w:b w:val="0"/>
                 <w:sz w:val="19"/>
               </w:rPr>
-              <w:t>LO2</w:t>
+              <w:t>LO1</w:t>
             </w:r>
           </w:p>
         </w:tc>
@@ -5635,7 +5775,7 @@
                 <w:b w:val="0"/>
                 <w:sz w:val="19"/>
               </w:rPr>
-              <w:t>140–146</w:t>
+              <w:t>140–145</w:t>
             </w:r>
           </w:p>
         </w:tc>
@@ -5653,7 +5793,7 @@
                 <w:b/>
                 <w:sz w:val="19"/>
               </w:rPr>
-              <w:t>Lab 4 (Day 2)</w:t>
+              <w:t>Lab 4 (Day 1)</w:t>
             </w:r>
           </w:p>
         </w:tc>
@@ -5669,7 +5809,7 @@
                 <w:b w:val="0"/>
                 <w:sz w:val="19"/>
               </w:rPr>
-              <w:t>Multi-Agent Video Studio — Kanban, Production &amp; Human Review</w:t>
+              <w:t>Activity 4 — Office Approval &amp; Exception Handling</w:t>
             </w:r>
           </w:p>
         </w:tc>
@@ -5685,7 +5825,7 @@
                 <w:b w:val="0"/>
                 <w:sz w:val="19"/>
               </w:rPr>
-              <w:t>Multi-agent (ordered pipeline)</w:t>
+              <w:t>Human–agent collaboration</w:t>
             </w:r>
           </w:p>
         </w:tc>
@@ -5717,7 +5857,7 @@
                 <w:b w:val="0"/>
                 <w:sz w:val="19"/>
               </w:rPr>
-              <w:t>147–153</w:t>
+              <w:t>146–151</w:t>
             </w:r>
           </w:p>
         </w:tc>
@@ -5751,7 +5891,7 @@
                 <w:b w:val="0"/>
                 <w:sz w:val="19"/>
               </w:rPr>
-              <w:t>Multi-Agent Campaign Command Centre — Measure, Optimise &amp; Report</w:t>
+              <w:t>Activity 5 — Hermes Bots &amp; Kanban Video Studio</w:t>
             </w:r>
           </w:p>
         </w:tc>
@@ -5767,7 +5907,7 @@
                 <w:b w:val="0"/>
                 <w:sz w:val="19"/>
               </w:rPr>
-              <w:t>Multi-agent (parallel swarm)</w:t>
+              <w:t>Multi-agent (ordered pipeline)</w:t>
             </w:r>
           </w:p>
         </w:tc>
@@ -5799,7 +5939,7 @@
                 <w:b w:val="0"/>
                 <w:sz w:val="19"/>
               </w:rPr>
-              <w:t>154–160</w:t>
+              <w:t>171–177</w:t>
             </w:r>
           </w:p>
         </w:tc>
@@ -5833,7 +5973,7 @@
                 <w:b w:val="0"/>
                 <w:sz w:val="19"/>
               </w:rPr>
-              <w:t>Found Kopi Kaki Growth Studio — an AI Company You Govern</w:t>
+              <w:t>Activity 6 — Source Assurance, RAG Comparison &amp; Maintenance</w:t>
             </w:r>
           </w:p>
         </w:tc>
@@ -5849,7 +5989,7 @@
                 <w:b w:val="0"/>
                 <w:sz w:val="19"/>
               </w:rPr>
-              <w:t>Human-governed company of agents</w:t>
+              <w:t>Multi-agent team + human oversight</w:t>
             </w:r>
           </w:p>
         </w:tc>
@@ -5865,7 +6005,7 @@
                 <w:b w:val="0"/>
                 <w:sz w:val="19"/>
               </w:rPr>
-              <w:t>LO2</w:t>
+              <w:t>LO3</w:t>
             </w:r>
           </w:p>
         </w:tc>
@@ -5881,7 +6021,7 @@
                 <w:b w:val="0"/>
                 <w:sz w:val="19"/>
               </w:rPr>
-              <w:t>167–173</w:t>
+              <w:t>178–189</w:t>
             </w:r>
           </w:p>
         </w:tc>
@@ -5915,7 +6055,7 @@
                 <w:b w:val="0"/>
                 <w:sz w:val="19"/>
               </w:rPr>
-              <w:t>Hire the Marketing Team Through the Board Approval Gate</w:t>
+              <w:t>Activity 7 — OpenAI Dots: Supervised Launch Review</w:t>
             </w:r>
           </w:p>
         </w:tc>
@@ -5931,7 +6071,7 @@
                 <w:b w:val="0"/>
                 <w:sz w:val="19"/>
               </w:rPr>
-              <w:t>Multi-agent organisation</w:t>
+              <w:t>Persistent assistant + human supervision</w:t>
             </w:r>
           </w:p>
         </w:tc>
@@ -5963,7 +6103,7 @@
                 <w:b w:val="0"/>
                 <w:sz w:val="19"/>
               </w:rPr>
-              <w:t>174–191</w:t>
+              <w:t>190–200</w:t>
             </w:r>
           </w:p>
         </w:tc>
@@ -5997,7 +6137,7 @@
                 <w:b w:val="0"/>
                 <w:sz w:val="19"/>
               </w:rPr>
-              <w:t>Claude Code Agent Team — Produce the Launch Video</w:t>
+              <w:t>Activity 8 — Revise, Verify &amp; Release the Team Video Locally</w:t>
             </w:r>
           </w:p>
         </w:tc>
@@ -6013,7 +6153,7 @@
                 <w:b w:val="0"/>
                 <w:sz w:val="19"/>
               </w:rPr>
-              <w:t>Claude team + human gate</w:t>
+              <w:t>Multi-agent team + human oversight</w:t>
             </w:r>
           </w:p>
         </w:tc>
@@ -6045,171 +6185,7 @@
                 <w:b w:val="0"/>
                 <w:sz w:val="19"/>
               </w:rPr>
-              <w:t>192–196</w:t>
-            </w:r>
-          </w:p>
-        </w:tc>
-      </w:tr>
-      <w:tr>
-        <w:tc>
-          <w:tcPr>
-            <w:tcW w:type="dxa" w:w="1296"/>
-          </w:tcPr>
-          <w:p>
-            <w:r/>
-            <w:r>
-              <w:rPr>
-                <w:rFonts w:ascii="Arial" w:hAnsi="Arial"/>
-                <w:b/>
-                <w:sz w:val="19"/>
-              </w:rPr>
-              <w:t>Lab 9 (Day 2)</w:t>
-            </w:r>
-          </w:p>
-        </w:tc>
-        <w:tc>
-          <w:tcPr>
-            <w:tcW w:type="dxa" w:w="4896"/>
-          </w:tcPr>
-          <w:p>
-            <w:r/>
-            <w:r>
-              <w:rPr>
-                <w:rFonts w:ascii="Arial" w:hAnsi="Arial"/>
-                <w:b w:val="0"/>
-                <w:sz w:val="19"/>
-              </w:rPr>
-              <w:t>Automate the Weekly Video Pipeline with a Routine and a Board Gate</w:t>
-            </w:r>
-          </w:p>
-        </w:tc>
-        <w:tc>
-          <w:tcPr>
-            <w:tcW w:type="dxa" w:w="2160"/>
-          </w:tcPr>
-          <w:p>
-            <w:r/>
-            <w:r>
-              <w:rPr>
-                <w:rFonts w:ascii="Arial" w:hAnsi="Arial"/>
-                <w:b w:val="0"/>
-                <w:sz w:val="19"/>
-              </w:rPr>
-              <w:t>Scheduled multi-agent workflow</w:t>
-            </w:r>
-          </w:p>
-        </w:tc>
-        <w:tc>
-          <w:tcPr>
-            <w:tcW w:type="dxa" w:w="720"/>
-          </w:tcPr>
-          <w:p>
-            <w:r/>
-            <w:r>
-              <w:rPr>
-                <w:rFonts w:ascii="Arial" w:hAnsi="Arial"/>
-                <w:b w:val="0"/>
-                <w:sz w:val="19"/>
-              </w:rPr>
-              <w:t>LO3</w:t>
-            </w:r>
-          </w:p>
-        </w:tc>
-        <w:tc>
-          <w:tcPr>
-            <w:tcW w:type="dxa" w:w="1008"/>
-          </w:tcPr>
-          <w:p>
-            <w:r/>
-            <w:r>
-              <w:rPr>
-                <w:rFonts w:ascii="Arial" w:hAnsi="Arial"/>
-                <w:b w:val="0"/>
-                <w:sz w:val="19"/>
-              </w:rPr>
-              <w:t>197–202</w:t>
-            </w:r>
-          </w:p>
-        </w:tc>
-      </w:tr>
-      <w:tr>
-        <w:tc>
-          <w:tcPr>
-            <w:tcW w:type="dxa" w:w="1296"/>
-          </w:tcPr>
-          <w:p>
-            <w:r/>
-            <w:r>
-              <w:rPr>
-                <w:rFonts w:ascii="Arial" w:hAnsi="Arial"/>
-                <w:b/>
-                <w:sz w:val="19"/>
-              </w:rPr>
-              <w:t>Lab 10 (Day 2)</w:t>
-            </w:r>
-          </w:p>
-        </w:tc>
-        <w:tc>
-          <w:tcPr>
-            <w:tcW w:type="dxa" w:w="4896"/>
-          </w:tcPr>
-          <w:p>
-            <w:r/>
-            <w:r>
-              <w:rPr>
-                <w:rFonts w:ascii="Arial" w:hAnsi="Arial"/>
-                <w:b w:val="0"/>
-                <w:sz w:val="19"/>
-              </w:rPr>
-              <w:t>Govern, Measure &amp; Improve Your Human–AI Workforce</w:t>
-            </w:r>
-          </w:p>
-        </w:tc>
-        <w:tc>
-          <w:tcPr>
-            <w:tcW w:type="dxa" w:w="2160"/>
-          </w:tcPr>
-          <w:p>
-            <w:r/>
-            <w:r>
-              <w:rPr>
-                <w:rFonts w:ascii="Arial" w:hAnsi="Arial"/>
-                <w:b w:val="0"/>
-                <w:sz w:val="19"/>
-              </w:rPr>
-              <w:t>Workforce governance</w:t>
-            </w:r>
-          </w:p>
-        </w:tc>
-        <w:tc>
-          <w:tcPr>
-            <w:tcW w:type="dxa" w:w="720"/>
-          </w:tcPr>
-          <w:p>
-            <w:r/>
-            <w:r>
-              <w:rPr>
-                <w:rFonts w:ascii="Arial" w:hAnsi="Arial"/>
-                <w:b w:val="0"/>
-                <w:sz w:val="19"/>
-              </w:rPr>
-              <w:t>LO3</w:t>
-            </w:r>
-          </w:p>
-        </w:tc>
-        <w:tc>
-          <w:tcPr>
-            <w:tcW w:type="dxa" w:w="1008"/>
-          </w:tcPr>
-          <w:p>
-            <w:r/>
-            <w:r>
-              <w:rPr>
-                <w:rFonts w:ascii="Arial" w:hAnsi="Arial"/>
-                <w:b w:val="0"/>
-                <w:sz w:val="19"/>
-              </w:rPr>
-              <w:t>203–209</w:t>
+              <w:t>201–216</w:t>
             </w:r>
           </w:p>
         </w:tc>

</xml_diff>

<commit_message>
Revise Day 1 around always-on assistants and Hermes office practice
</commit_message>
<xml_diff>
--- a/courseware/LP-Human-AI Workforce with Autonomous AI Agents.docx
+++ b/courseware/LP-Human-AI Workforce with Autonomous AI Agents.docx
@@ -179,7 +179,7 @@
           <w:color w:val="1F6FEB"/>
           <w:sz w:val="24"/>
         </w:rPr>
-        <w:t>Version 2.2</w:t>
+        <w:t>Version 2.3</w:t>
       </w:r>
     </w:p>
     <w:p>
@@ -1136,6 +1136,64 @@
                 <w:sz w:val="19"/>
               </w:rPr>
               <w:t>Streamlined to eight connected activities, four per day, using Hermes Desktop and OpenAI Dots. Removed Paperclip and Claude-specific training. PP v6 evidence: Telegram, single-agent professional PPT with skills/tools, and multi-agent Kanban video creation with Hermes bots. FG/AP v5 aligned. Corrected shared use-case slide spacing.</w:t>
+            </w:r>
+          </w:p>
+        </w:tc>
+        <w:tc>
+          <w:tcPr>
+            <w:tcW w:type="dxa" w:w="1440"/>
+          </w:tcPr>
+          <w:p>
+            <w:r/>
+            <w:r>
+              <w:rPr>
+                <w:sz w:val="19"/>
+              </w:rPr>
+              <w:t>Dr. Alfred Ang</w:t>
+            </w:r>
+          </w:p>
+        </w:tc>
+      </w:tr>
+      <w:tr>
+        <w:tc>
+          <w:tcPr>
+            <w:tcW w:type="dxa" w:w="1152"/>
+          </w:tcPr>
+          <w:p>
+            <w:r/>
+            <w:r>
+              <w:rPr>
+                <w:sz w:val="19"/>
+              </w:rPr>
+              <w:t>2.3</w:t>
+            </w:r>
+          </w:p>
+        </w:tc>
+        <w:tc>
+          <w:tcPr>
+            <w:tcW w:type="dxa" w:w="1656"/>
+          </w:tcPr>
+          <w:p>
+            <w:r/>
+            <w:r>
+              <w:rPr>
+                <w:sz w:val="19"/>
+              </w:rPr>
+              <w:t>29 October 2026</w:t>
+            </w:r>
+          </w:p>
+        </w:tc>
+        <w:tc>
+          <w:tcPr>
+            <w:tcW w:type="dxa" w:w="5544"/>
+          </w:tcPr>
+          <w:p>
+            <w:r/>
+            <w:r>
+              <w:rPr>
+                <w:sz w:val="19"/>
+              </w:rPr>
+              <w:t>Day 1 reordered: brief AI history, two human–AI work modes, always-on agents, harness and Big Four comparison using BULDRR plus official product documentation. Added Meta Muse Singapore launch news (27 October), official app links and one accessible assistant setup activity. Company scenario moved to afternoon Hermes Desktop/skills labs; Google/Excel, dashboard/PPT, single-agent video and approved test email. Day 2 kept. PP v7: Task 1 two images (chosen assistant and Hermes artifact), Task 2 Activity 4 PPT; FG/AP v6 aligned.</w:t>
             </w:r>
           </w:p>
         </w:tc>
@@ -1311,7 +1369,7 @@
           <w:color w:val="333333"/>
           <w:sz w:val="21"/>
         </w:rPr>
-        <w:t>Day 1 — Human–AI landscape and one Hermes office assistant: tools, skills and practice (Activities 1–4)</w:t>
+        <w:t>Day 1 — Human–AI overview → always-on assistants → Hermes single-agent office practice (Activities 1–4)</w:t>
         <w:tab/>
         <w:t>7</w:t>
       </w:r>
@@ -1587,7 +1645,7 @@
                 <w:b w:val="0"/>
                 <w:sz w:val="20"/>
               </w:rPr>
-              <w:t>Instructor-led; hands-on use-case labs on Hermes Agent and OpenAI Dots (learner laptop)</w:t>
+              <w:t>Instructor-led; always-on assistant setup followed by Hermes Desktop office and team practice (learner laptop)</w:t>
             </w:r>
           </w:p>
         </w:tc>
@@ -1657,7 +1715,7 @@
                 <w:b w:val="0"/>
                 <w:sz w:val="20"/>
               </w:rPr>
-              <w:t>Human-AI Workforce with Autonomous AI Agents-v2.2.pptx (225 slides)</w:t>
+              <w:t>Human-AI Workforce with Autonomous AI Agents-v2.3.pptx (215 slides)</w:t>
             </w:r>
           </w:p>
         </w:tc>
@@ -1834,7 +1892,7 @@
                 <w:b/>
                 <w:sz w:val="19"/>
               </w:rPr>
-              <w:t>Topic 1: Human–AI Collaboration: Landscape, Agents, Use Cases &amp; Futures</w:t>
+              <w:t>Topic 1: Human–AI Collaboration &amp; Always-On AI Agents</w:t>
             </w:r>
           </w:p>
         </w:tc>
@@ -1850,7 +1908,7 @@
                 <w:b w:val="0"/>
                 <w:sz w:val="19"/>
               </w:rPr>
-              <w:t>2026 interaction landscape and history; 48 practical workflows and humanoid futures; Single agents, teams, orchestration and human control; Agent mechanisms, evidence and governance.  Activity: Human–AI Workforce Canvas.</w:t>
+              <w:t>Brief AI history and two human–AI work modes; Agent harness, loop, context and human decisions; Big Four: Duet, Muse, Grok Bot and Dots; Activity 1 · Set up an always-on assistant.  Activity 1: always-on assistant setup.</w:t>
             </w:r>
           </w:p>
         </w:tc>
@@ -1866,7 +1924,7 @@
                 <w:b w:val="0"/>
                 <w:sz w:val="19"/>
               </w:rPr>
-              <w:t>22–99</w:t>
+              <w:t>21–79</w:t>
             </w:r>
           </w:p>
         </w:tc>
@@ -1901,7 +1959,7 @@
                 <w:b w:val="0"/>
                 <w:sz w:val="19"/>
               </w:rPr>
-              <w:t>Activity 1 · Desktop, Telegram and launch brief; Activity 2 · gog: Gmail, Calendar, Drive and Excel; Activity 3 · Interactive dashboard and professional PPT; Activity 4 · Office approval and exceptions.</w:t>
+              <w:t>Activity 2 · Hermes Desktop, tools, skills and source brief; Activity 3 · gog: Gmail, Calendar, Drive and Excel; Activity 4 · Dashboard, professional PPT and single-agent video; Human review and one approved training email.</w:t>
             </w:r>
           </w:p>
         </w:tc>
@@ -1917,7 +1975,7 @@
                 <w:b w:val="0"/>
                 <w:sz w:val="19"/>
               </w:rPr>
-              <w:t>100–153</w:t>
+              <w:t>80–144</w:t>
             </w:r>
           </w:p>
         </w:tc>
@@ -1968,7 +2026,7 @@
                 <w:b w:val="0"/>
                 <w:sz w:val="19"/>
               </w:rPr>
-              <w:t>154–217</w:t>
+              <w:t>145–208</w:t>
             </w:r>
           </w:p>
         </w:tc>
@@ -2158,7 +2216,7 @@
                 <w:b w:val="0"/>
                 <w:sz w:val="19"/>
               </w:rPr>
-              <w:t>Topic 1 landscape, canvas and office design clinic + demo + Activity 1A Desktop, Telegram and evidence brief</w:t>
+              <w:t>Topic 1 history, collaboration, harness and Big Four + Activity 1 always-on setup + Activity 2A Hermes Desktop and company brief</w:t>
             </w:r>
           </w:p>
         </w:tc>
@@ -2247,7 +2305,7 @@
                 <w:b w:val="0"/>
                 <w:sz w:val="19"/>
               </w:rPr>
-              <w:t>Activity 1B + Activities 2–5: tools/skills, office artifacts, human gates and Kanban video studio</w:t>
+              <w:t>Activity 2B skills/tools + Activities 3–5: Google/Excel, office/video artifacts, human approval and Kanban video studio</w:t>
             </w:r>
           </w:p>
         </w:tc>
@@ -2487,7 +2545,7 @@
         <w:rPr>
           <w:sz w:val="22"/>
         </w:rPr>
-        <w:t>Practical Performance (PP) — three tasks, each with ONE screenshot: Activity 1 Telegram interaction; Activity 3 professional PPT using skills/tools; Activity 5 or 8 video creation with a real multi-agent Kanban team and Hermes bots; plus written analysis, 1 hour, open book.</w:t>
+        <w:t>Practical Performance (PP) — three tasks plus written analysis, 1 hour, open book. Task 1: TWO screenshots (Activity 1 chosen always-on assistant and Activity 4 Hermes-generated artifact). Task 2: ONE professional PPT screenshot using skills/tools (Activity 4). Task 3: ONE real multi-agent Kanban video-team screenshot with Hermes bots (Activity 5 or 8).</w:t>
       </w:r>
     </w:p>
     <w:p>
@@ -2536,7 +2594,7 @@
         <w:pStyle w:val="Heading2"/>
       </w:pPr>
       <w:r>
-        <w:t>Day 1 — Human–AI landscape and one Hermes office assistant: tools, skills and practice (Activities 1–4)</w:t>
+        <w:t>Day 1 — Human–AI overview → always-on assistants → Hermes single-agent office practice (Activities 1–4)</w:t>
       </w:r>
     </w:p>
     <w:tbl>
@@ -2694,7 +2752,7 @@
                 <w:b w:val="0"/>
                 <w:sz w:val="19"/>
               </w:rPr>
-              <w:t>Welcome, attendance, learning outcomes and official SWDA AI subscription redemption steps</w:t>
+              <w:t>Welcome, attendance, outcomes and official SWDA AI subscription redemption steps</w:t>
             </w:r>
           </w:p>
         </w:tc>
@@ -2728,7 +2786,7 @@
                 <w:b w:val="0"/>
                 <w:sz w:val="19"/>
               </w:rPr>
-              <w:t>1–21</w:t>
+              <w:t>1–20</w:t>
             </w:r>
           </w:p>
         </w:tc>
@@ -2781,7 +2839,7 @@
                 <w:b/>
                 <w:sz w:val="19"/>
               </w:rPr>
-              <w:t>Topic 1 (Part A) — current human–AI landscape; history; agents and agentic AI; practical use-case gallery; science; future humanoid collaboration</w:t>
+              <w:t>Topic 1 (Part A) — brief AI history; human–AI roles; two work modes; always-on agents; harness and Big Four comparison</w:t>
             </w:r>
           </w:p>
         </w:tc>
@@ -2815,7 +2873,7 @@
                 <w:b w:val="0"/>
                 <w:sz w:val="19"/>
               </w:rPr>
-              <w:t>22–64</w:t>
+              <w:t>21–62</w:t>
             </w:r>
           </w:p>
         </w:tc>
@@ -2911,6 +2969,88 @@
         <w:tc>
           <w:tcPr>
             <w:tcW w:type="dxa" w:w="1512"/>
+          </w:tcPr>
+          <w:p>
+            <w:r/>
+            <w:r>
+              <w:rPr>
+                <w:rFonts w:ascii="Arial" w:hAnsi="Arial"/>
+                <w:b w:val="0"/>
+                <w:sz w:val="19"/>
+              </w:rPr>
+              <w:t>11:20–12:35</w:t>
+            </w:r>
+          </w:p>
+        </w:tc>
+        <w:tc>
+          <w:tcPr>
+            <w:tcW w:type="dxa" w:w="1080"/>
+          </w:tcPr>
+          <w:p>
+            <w:r/>
+            <w:r>
+              <w:rPr>
+                <w:rFonts w:ascii="Arial" w:hAnsi="Arial"/>
+                <w:b w:val="0"/>
+                <w:sz w:val="19"/>
+              </w:rPr>
+              <w:t>75 min</w:t>
+            </w:r>
+          </w:p>
+        </w:tc>
+        <w:tc>
+          <w:tcPr>
+            <w:tcW w:type="dxa" w:w="5400"/>
+          </w:tcPr>
+          <w:p>
+            <w:r/>
+            <w:r>
+              <w:rPr>
+                <w:rFonts w:ascii="Arial" w:hAnsi="Arial"/>
+                <w:b w:val="0"/>
+                <w:sz w:val="19"/>
+              </w:rPr>
+              <w:t>Lab 1: Activity 1 — set up one accessible always-on assistant; Gmail/Calendar, schedule check and email draft (PP Task 1 image A)</w:t>
+            </w:r>
+          </w:p>
+        </w:tc>
+        <w:tc>
+          <w:tcPr>
+            <w:tcW w:type="dxa" w:w="864"/>
+          </w:tcPr>
+          <w:p>
+            <w:r/>
+            <w:r>
+              <w:rPr>
+                <w:rFonts w:ascii="Arial" w:hAnsi="Arial"/>
+                <w:b w:val="0"/>
+                <w:sz w:val="19"/>
+              </w:rPr>
+              <w:t>LU1</w:t>
+            </w:r>
+          </w:p>
+        </w:tc>
+        <w:tc>
+          <w:tcPr>
+            <w:tcW w:type="dxa" w:w="1008"/>
+          </w:tcPr>
+          <w:p>
+            <w:r/>
+            <w:r>
+              <w:rPr>
+                <w:rFonts w:ascii="Arial" w:hAnsi="Arial"/>
+                <w:b w:val="0"/>
+                <w:sz w:val="19"/>
+              </w:rPr>
+              <w:t>63–68</w:t>
+            </w:r>
+          </w:p>
+        </w:tc>
+      </w:tr>
+      <w:tr>
+        <w:tc>
+          <w:tcPr>
+            <w:tcW w:type="dxa" w:w="1512"/>
             <w:shd w:val="clear" w:color="auto" w:fill="E8F0FE"/>
           </w:tcPr>
           <w:p>
@@ -2921,7 +3061,7 @@
                 <w:b/>
                 <w:sz w:val="19"/>
               </w:rPr>
-              <w:t>11:20–12:40</w:t>
+              <w:t>12:35–13:00</w:t>
             </w:r>
           </w:p>
         </w:tc>
@@ -2938,7 +3078,7 @@
                 <w:b w:val="0"/>
                 <w:sz w:val="19"/>
               </w:rPr>
-              <w:t>80 min</w:t>
+              <w:t>25 min</w:t>
             </w:r>
           </w:p>
         </w:tc>
@@ -2955,7 +3095,7 @@
                 <w:b/>
                 <w:sz w:val="19"/>
               </w:rPr>
-              <w:t>Topic 1 (Part B) — collaboration modes; single and multi-agent patterns; orchestration; tools, skills, memory, RAG, permissions, governance and evidence</w:t>
+              <w:t>Assistant results review — compare source accuracy, approval controls, limits and actual stop state</w:t>
             </w:r>
           </w:p>
         </w:tc>
@@ -2989,7 +3129,7 @@
                 <w:b w:val="0"/>
                 <w:sz w:val="19"/>
               </w:rPr>
-              <w:t>65–94</w:t>
+              <w:t>69–69</w:t>
             </w:r>
           </w:p>
         </w:tc>
@@ -3008,7 +3148,7 @@
                 <w:b/>
                 <w:sz w:val="19"/>
               </w:rPr>
-              <w:t>12:40–13:00</w:t>
+              <w:t>13:00–13:30</w:t>
             </w:r>
           </w:p>
         </w:tc>
@@ -3025,7 +3165,7 @@
                 <w:b w:val="0"/>
                 <w:sz w:val="19"/>
               </w:rPr>
-              <w:t>20 min</w:t>
+              <w:t>30 min</w:t>
             </w:r>
           </w:p>
         </w:tc>
@@ -3042,7 +3182,7 @@
                 <w:b/>
                 <w:sz w:val="19"/>
               </w:rPr>
-              <w:t>Design discussion — map the Kopi Kaki launch-office canvas, inputs, outputs and human decisions</w:t>
+              <w:t>Harness consolidation — context, memory, knowledge base, instructions, tools, security and human judgment</w:t>
             </w:r>
           </w:p>
         </w:tc>
@@ -3076,7 +3216,7 @@
                 <w:b w:val="0"/>
                 <w:sz w:val="19"/>
               </w:rPr>
-              <w:t>95–97</w:t>
+              <w:t>70–79</w:t>
             </w:r>
           </w:p>
         </w:tc>
@@ -3085,24 +3225,7 @@
         <w:tc>
           <w:tcPr>
             <w:tcW w:type="dxa" w:w="1512"/>
-            <w:shd w:val="clear" w:color="auto" w:fill="E8F0FE"/>
-          </w:tcPr>
-          <w:p>
-            <w:r/>
-            <w:r>
-              <w:rPr>
-                <w:rFonts w:ascii="Arial" w:hAnsi="Arial"/>
-                <w:b/>
-                <w:sz w:val="19"/>
-              </w:rPr>
-              <w:t>13:00–13:30</w:t>
-            </w:r>
-          </w:p>
-        </w:tc>
-        <w:tc>
-          <w:tcPr>
-            <w:tcW w:type="dxa" w:w="1080"/>
-            <w:shd w:val="clear" w:color="auto" w:fill="E8F0FE"/>
+            <w:shd w:val="clear" w:color="auto" w:fill="FDE9D9"/>
           </w:tcPr>
           <w:p>
             <w:r/>
@@ -3112,31 +3235,14 @@
                 <w:b w:val="0"/>
                 <w:sz w:val="19"/>
               </w:rPr>
-              <w:t>30 min</w:t>
-            </w:r>
-          </w:p>
-        </w:tc>
-        <w:tc>
-          <w:tcPr>
-            <w:tcW w:type="dxa" w:w="5400"/>
-            <w:shd w:val="clear" w:color="auto" w:fill="E8F0FE"/>
-          </w:tcPr>
-          <w:p>
-            <w:r/>
-            <w:r>
-              <w:rPr>
-                <w:rFonts w:ascii="Arial" w:hAnsi="Arial"/>
-                <w:b/>
-                <w:sz w:val="19"/>
-              </w:rPr>
-              <w:t>Office workflow design clinic — analyse task ownership, tool contracts and acceptance tests</w:t>
-            </w:r>
-          </w:p>
-        </w:tc>
-        <w:tc>
-          <w:tcPr>
-            <w:tcW w:type="dxa" w:w="864"/>
-            <w:shd w:val="clear" w:color="auto" w:fill="E8F0FE"/>
+              <w:t>13:30–14:30</w:t>
+            </w:r>
+          </w:p>
+        </w:tc>
+        <w:tc>
+          <w:tcPr>
+            <w:tcW w:type="dxa" w:w="1080"/>
+            <w:shd w:val="clear" w:color="auto" w:fill="FDE9D9"/>
           </w:tcPr>
           <w:p>
             <w:r/>
@@ -3146,14 +3252,14 @@
                 <w:b w:val="0"/>
                 <w:sz w:val="19"/>
               </w:rPr>
-              <w:t>LU1</w:t>
-            </w:r>
-          </w:p>
-        </w:tc>
-        <w:tc>
-          <w:tcPr>
-            <w:tcW w:type="dxa" w:w="1008"/>
-            <w:shd w:val="clear" w:color="auto" w:fill="E8F0FE"/>
+              <w:t>60 min</w:t>
+            </w:r>
+          </w:p>
+        </w:tc>
+        <w:tc>
+          <w:tcPr>
+            <w:tcW w:type="dxa" w:w="5400"/>
+            <w:shd w:val="clear" w:color="auto" w:fill="FDE9D9"/>
           </w:tcPr>
           <w:p>
             <w:r/>
@@ -3163,15 +3269,13 @@
                 <w:b w:val="0"/>
                 <w:sz w:val="19"/>
               </w:rPr>
-              <w:t>95–97</w:t>
-            </w:r>
-          </w:p>
-        </w:tc>
-      </w:tr>
-      <w:tr>
-        <w:tc>
-          <w:tcPr>
-            <w:tcW w:type="dxa" w:w="1512"/>
+              <w:t>Lunch break</w:t>
+            </w:r>
+          </w:p>
+        </w:tc>
+        <w:tc>
+          <w:tcPr>
+            <w:tcW w:type="dxa" w:w="864"/>
             <w:shd w:val="clear" w:color="auto" w:fill="FDE9D9"/>
           </w:tcPr>
           <w:p>
@@ -3182,13 +3286,13 @@
                 <w:b w:val="0"/>
                 <w:sz w:val="19"/>
               </w:rPr>
-              <w:t>13:30–14:30</w:t>
-            </w:r>
-          </w:p>
-        </w:tc>
-        <w:tc>
-          <w:tcPr>
-            <w:tcW w:type="dxa" w:w="1080"/>
+              <w:t>—</w:t>
+            </w:r>
+          </w:p>
+        </w:tc>
+        <w:tc>
+          <w:tcPr>
+            <w:tcW w:type="dxa" w:w="1008"/>
             <w:shd w:val="clear" w:color="auto" w:fill="FDE9D9"/>
           </w:tcPr>
           <w:p>
@@ -3199,14 +3303,15 @@
                 <w:b w:val="0"/>
                 <w:sz w:val="19"/>
               </w:rPr>
-              <w:t>60 min</w:t>
-            </w:r>
-          </w:p>
-        </w:tc>
-        <w:tc>
-          <w:tcPr>
-            <w:tcW w:type="dxa" w:w="5400"/>
-            <w:shd w:val="clear" w:color="auto" w:fill="FDE9D9"/>
+              <w:t>—</w:t>
+            </w:r>
+          </w:p>
+        </w:tc>
+      </w:tr>
+      <w:tr>
+        <w:tc>
+          <w:tcPr>
+            <w:tcW w:type="dxa" w:w="1512"/>
           </w:tcPr>
           <w:p>
             <w:r/>
@@ -3216,14 +3321,13 @@
                 <w:b w:val="0"/>
                 <w:sz w:val="19"/>
               </w:rPr>
-              <w:t>Lunch break</w:t>
-            </w:r>
-          </w:p>
-        </w:tc>
-        <w:tc>
-          <w:tcPr>
-            <w:tcW w:type="dxa" w:w="864"/>
-            <w:shd w:val="clear" w:color="auto" w:fill="FDE9D9"/>
+              <w:t>14:30–15:30</w:t>
+            </w:r>
+          </w:p>
+        </w:tc>
+        <w:tc>
+          <w:tcPr>
+            <w:tcW w:type="dxa" w:w="1080"/>
           </w:tcPr>
           <w:p>
             <w:r/>
@@ -3233,14 +3337,13 @@
                 <w:b w:val="0"/>
                 <w:sz w:val="19"/>
               </w:rPr>
-              <w:t>—</w:t>
-            </w:r>
-          </w:p>
-        </w:tc>
-        <w:tc>
-          <w:tcPr>
-            <w:tcW w:type="dxa" w:w="1008"/>
-            <w:shd w:val="clear" w:color="auto" w:fill="FDE9D9"/>
+              <w:t>60 min</w:t>
+            </w:r>
+          </w:p>
+        </w:tc>
+        <w:tc>
+          <w:tcPr>
+            <w:tcW w:type="dxa" w:w="5400"/>
           </w:tcPr>
           <w:p>
             <w:r/>
@@ -3250,33 +3353,13 @@
                 <w:b w:val="0"/>
                 <w:sz w:val="19"/>
               </w:rPr>
-              <w:t>—</w:t>
-            </w:r>
-          </w:p>
-        </w:tc>
-      </w:tr>
-      <w:tr>
-        <w:tc>
-          <w:tcPr>
-            <w:tcW w:type="dxa" w:w="1512"/>
-            <w:shd w:val="clear" w:color="auto" w:fill="E8F0FE"/>
-          </w:tcPr>
-          <w:p>
-            <w:r/>
-            <w:r>
-              <w:rPr>
-                <w:rFonts w:ascii="Arial" w:hAnsi="Arial"/>
-                <w:b/>
-                <w:sz w:val="19"/>
-              </w:rPr>
-              <w:t>14:30–14:45</w:t>
-            </w:r>
-          </w:p>
-        </w:tc>
-        <w:tc>
-          <w:tcPr>
-            <w:tcW w:type="dxa" w:w="1080"/>
-            <w:shd w:val="clear" w:color="auto" w:fill="E8F0FE"/>
+              <w:t>Lab 2: Activity 2A — introduce Kopi Kaki; Hermes Desktop, features, tools and reviewed skills</w:t>
+            </w:r>
+          </w:p>
+        </w:tc>
+        <w:tc>
+          <w:tcPr>
+            <w:tcW w:type="dxa" w:w="864"/>
           </w:tcPr>
           <w:p>
             <w:r/>
@@ -3286,31 +3369,13 @@
                 <w:b w:val="0"/>
                 <w:sz w:val="19"/>
               </w:rPr>
-              <w:t>15 min</w:t>
-            </w:r>
-          </w:p>
-        </w:tc>
-        <w:tc>
-          <w:tcPr>
-            <w:tcW w:type="dxa" w:w="5400"/>
-            <w:shd w:val="clear" w:color="auto" w:fill="E8F0FE"/>
-          </w:tcPr>
-          <w:p>
-            <w:r/>
-            <w:r>
-              <w:rPr>
-                <w:rFonts w:ascii="Arial" w:hAnsi="Arial"/>
-                <w:b/>
-                <w:sz w:val="19"/>
-              </w:rPr>
-              <w:t>Trainer demo — OpenAI Dots office workflow, tool evidence and human control; Hermes fallback</w:t>
-            </w:r>
-          </w:p>
-        </w:tc>
-        <w:tc>
-          <w:tcPr>
-            <w:tcW w:type="dxa" w:w="864"/>
-            <w:shd w:val="clear" w:color="auto" w:fill="E8F0FE"/>
+              <w:t>LU1</w:t>
+            </w:r>
+          </w:p>
+        </w:tc>
+        <w:tc>
+          <w:tcPr>
+            <w:tcW w:type="dxa" w:w="1008"/>
           </w:tcPr>
           <w:p>
             <w:r/>
@@ -3320,14 +3385,15 @@
                 <w:b w:val="0"/>
                 <w:sz w:val="19"/>
               </w:rPr>
-              <w:t>LU1</w:t>
-            </w:r>
-          </w:p>
-        </w:tc>
-        <w:tc>
-          <w:tcPr>
-            <w:tcW w:type="dxa" w:w="1008"/>
-            <w:shd w:val="clear" w:color="auto" w:fill="E8F0FE"/>
+              <w:t>80–130</w:t>
+            </w:r>
+          </w:p>
+        </w:tc>
+      </w:tr>
+      <w:tr>
+        <w:tc>
+          <w:tcPr>
+            <w:tcW w:type="dxa" w:w="1512"/>
           </w:tcPr>
           <w:p>
             <w:r/>
@@ -3337,15 +3403,13 @@
                 <w:b w:val="0"/>
                 <w:sz w:val="19"/>
               </w:rPr>
-              <w:t>98–99</w:t>
-            </w:r>
-          </w:p>
-        </w:tc>
-      </w:tr>
-      <w:tr>
-        <w:tc>
-          <w:tcPr>
-            <w:tcW w:type="dxa" w:w="1512"/>
+              <w:t>15:30–16:00</w:t>
+            </w:r>
+          </w:p>
+        </w:tc>
+        <w:tc>
+          <w:tcPr>
+            <w:tcW w:type="dxa" w:w="1080"/>
           </w:tcPr>
           <w:p>
             <w:r/>
@@ -3355,13 +3419,13 @@
                 <w:b w:val="0"/>
                 <w:sz w:val="19"/>
               </w:rPr>
-              <w:t>14:45–15:30</w:t>
-            </w:r>
-          </w:p>
-        </w:tc>
-        <w:tc>
-          <w:tcPr>
-            <w:tcW w:type="dxa" w:w="1080"/>
+              <w:t>30 min</w:t>
+            </w:r>
+          </w:p>
+        </w:tc>
+        <w:tc>
+          <w:tcPr>
+            <w:tcW w:type="dxa" w:w="5400"/>
           </w:tcPr>
           <w:p>
             <w:r/>
@@ -3371,13 +3435,13 @@
                 <w:b w:val="0"/>
                 <w:sz w:val="19"/>
               </w:rPr>
-              <w:t>45 min</w:t>
-            </w:r>
-          </w:p>
-        </w:tc>
-        <w:tc>
-          <w:tcPr>
-            <w:tcW w:type="dxa" w:w="5400"/>
+              <w:t>Lab 2: Activity 2B — install office/gog/video skills, verify tools and save the source brief</w:t>
+            </w:r>
+          </w:p>
+        </w:tc>
+        <w:tc>
+          <w:tcPr>
+            <w:tcW w:type="dxa" w:w="864"/>
           </w:tcPr>
           <w:p>
             <w:r/>
@@ -3387,13 +3451,13 @@
                 <w:b w:val="0"/>
                 <w:sz w:val="19"/>
               </w:rPr>
-              <w:t>Lab 1: Activity 1A — install Hermes, connect Telegram and produce the source-linked brief (PP Task 1 preparation)</w:t>
-            </w:r>
-          </w:p>
-        </w:tc>
-        <w:tc>
-          <w:tcPr>
-            <w:tcW w:type="dxa" w:w="864"/>
+              <w:t>LU2</w:t>
+            </w:r>
+          </w:p>
+        </w:tc>
+        <w:tc>
+          <w:tcPr>
+            <w:tcW w:type="dxa" w:w="1008"/>
           </w:tcPr>
           <w:p>
             <w:r/>
@@ -3403,13 +3467,16 @@
                 <w:b w:val="0"/>
                 <w:sz w:val="19"/>
               </w:rPr>
-              <w:t>LU1</w:t>
-            </w:r>
-          </w:p>
-        </w:tc>
-        <w:tc>
-          <w:tcPr>
-            <w:tcW w:type="dxa" w:w="1008"/>
+              <w:t>125–130</w:t>
+            </w:r>
+          </w:p>
+        </w:tc>
+      </w:tr>
+      <w:tr>
+        <w:tc>
+          <w:tcPr>
+            <w:tcW w:type="dxa" w:w="1512"/>
+            <w:shd w:val="clear" w:color="auto" w:fill="FFF4E5"/>
           </w:tcPr>
           <w:p>
             <w:r/>
@@ -3419,15 +3486,14 @@
                 <w:b w:val="0"/>
                 <w:sz w:val="19"/>
               </w:rPr>
-              <w:t>128–133</w:t>
-            </w:r>
-          </w:p>
-        </w:tc>
-      </w:tr>
-      <w:tr>
-        <w:tc>
-          <w:tcPr>
-            <w:tcW w:type="dxa" w:w="1512"/>
+              <w:t>16:00–16:15</w:t>
+            </w:r>
+          </w:p>
+        </w:tc>
+        <w:tc>
+          <w:tcPr>
+            <w:tcW w:type="dxa" w:w="1080"/>
+            <w:shd w:val="clear" w:color="auto" w:fill="FFF4E5"/>
           </w:tcPr>
           <w:p>
             <w:r/>
@@ -3437,13 +3503,14 @@
                 <w:b w:val="0"/>
                 <w:sz w:val="19"/>
               </w:rPr>
-              <w:t>15:30–16:00</w:t>
-            </w:r>
-          </w:p>
-        </w:tc>
-        <w:tc>
-          <w:tcPr>
-            <w:tcW w:type="dxa" w:w="1080"/>
+              <w:t>15 min</w:t>
+            </w:r>
+          </w:p>
+        </w:tc>
+        <w:tc>
+          <w:tcPr>
+            <w:tcW w:type="dxa" w:w="5400"/>
+            <w:shd w:val="clear" w:color="auto" w:fill="FFF4E5"/>
           </w:tcPr>
           <w:p>
             <w:r/>
@@ -3453,13 +3520,14 @@
                 <w:b w:val="0"/>
                 <w:sz w:val="19"/>
               </w:rPr>
-              <w:t>30 min</w:t>
-            </w:r>
-          </w:p>
-        </w:tc>
-        <w:tc>
-          <w:tcPr>
-            <w:tcW w:type="dxa" w:w="5400"/>
+              <w:t>Tea break (included in scheduled LU time)</w:t>
+            </w:r>
+          </w:p>
+        </w:tc>
+        <w:tc>
+          <w:tcPr>
+            <w:tcW w:type="dxa" w:w="864"/>
+            <w:shd w:val="clear" w:color="auto" w:fill="FFF4E5"/>
           </w:tcPr>
           <w:p>
             <w:r/>
@@ -3469,13 +3537,14 @@
                 <w:b w:val="0"/>
                 <w:sz w:val="19"/>
               </w:rPr>
-              <w:t>Lab 1: Activity 1B — test tools, memory recall and evidence; analyse the agent design</w:t>
-            </w:r>
-          </w:p>
-        </w:tc>
-        <w:tc>
-          <w:tcPr>
-            <w:tcW w:type="dxa" w:w="864"/>
+              <w:t>LU2</w:t>
+            </w:r>
+          </w:p>
+        </w:tc>
+        <w:tc>
+          <w:tcPr>
+            <w:tcW w:type="dxa" w:w="1008"/>
+            <w:shd w:val="clear" w:color="auto" w:fill="FFF4E5"/>
           </w:tcPr>
           <w:p>
             <w:r/>
@@ -3485,13 +3554,15 @@
                 <w:b w:val="0"/>
                 <w:sz w:val="19"/>
               </w:rPr>
-              <w:t>LU2</w:t>
-            </w:r>
-          </w:p>
-        </w:tc>
-        <w:tc>
-          <w:tcPr>
-            <w:tcW w:type="dxa" w:w="1008"/>
+              <w:t>—</w:t>
+            </w:r>
+          </w:p>
+        </w:tc>
+      </w:tr>
+      <w:tr>
+        <w:tc>
+          <w:tcPr>
+            <w:tcW w:type="dxa" w:w="1512"/>
           </w:tcPr>
           <w:p>
             <w:r/>
@@ -3501,16 +3572,13 @@
                 <w:b w:val="0"/>
                 <w:sz w:val="19"/>
               </w:rPr>
-              <w:t>128–133</w:t>
-            </w:r>
-          </w:p>
-        </w:tc>
-      </w:tr>
-      <w:tr>
-        <w:tc>
-          <w:tcPr>
-            <w:tcW w:type="dxa" w:w="1512"/>
-            <w:shd w:val="clear" w:color="auto" w:fill="FFF4E5"/>
+              <w:t>16:15–17:05</w:t>
+            </w:r>
+          </w:p>
+        </w:tc>
+        <w:tc>
+          <w:tcPr>
+            <w:tcW w:type="dxa" w:w="1080"/>
           </w:tcPr>
           <w:p>
             <w:r/>
@@ -3520,14 +3588,13 @@
                 <w:b w:val="0"/>
                 <w:sz w:val="19"/>
               </w:rPr>
-              <w:t>16:00–16:15</w:t>
-            </w:r>
-          </w:p>
-        </w:tc>
-        <w:tc>
-          <w:tcPr>
-            <w:tcW w:type="dxa" w:w="1080"/>
-            <w:shd w:val="clear" w:color="auto" w:fill="FFF4E5"/>
+              <w:t>50 min</w:t>
+            </w:r>
+          </w:p>
+        </w:tc>
+        <w:tc>
+          <w:tcPr>
+            <w:tcW w:type="dxa" w:w="5400"/>
           </w:tcPr>
           <w:p>
             <w:r/>
@@ -3537,14 +3604,13 @@
                 <w:b w:val="0"/>
                 <w:sz w:val="19"/>
               </w:rPr>
-              <w:t>15 min</w:t>
-            </w:r>
-          </w:p>
-        </w:tc>
-        <w:tc>
-          <w:tcPr>
-            <w:tcW w:type="dxa" w:w="5400"/>
-            <w:shd w:val="clear" w:color="auto" w:fill="FFF4E5"/>
+              <w:t>Lab 3: Activity 3 — Hermes gog Gmail/Calendar/Drive and verified Excel analysis</w:t>
+            </w:r>
+          </w:p>
+        </w:tc>
+        <w:tc>
+          <w:tcPr>
+            <w:tcW w:type="dxa" w:w="864"/>
           </w:tcPr>
           <w:p>
             <w:r/>
@@ -3554,14 +3620,13 @@
                 <w:b w:val="0"/>
                 <w:sz w:val="19"/>
               </w:rPr>
-              <w:t>Tea break (included in scheduled LU time)</w:t>
-            </w:r>
-          </w:p>
-        </w:tc>
-        <w:tc>
-          <w:tcPr>
-            <w:tcW w:type="dxa" w:w="864"/>
-            <w:shd w:val="clear" w:color="auto" w:fill="FFF4E5"/>
+              <w:t>LU2</w:t>
+            </w:r>
+          </w:p>
+        </w:tc>
+        <w:tc>
+          <w:tcPr>
+            <w:tcW w:type="dxa" w:w="1008"/>
           </w:tcPr>
           <w:p>
             <w:r/>
@@ -3571,14 +3636,15 @@
                 <w:b w:val="0"/>
                 <w:sz w:val="19"/>
               </w:rPr>
-              <w:t>LU2</w:t>
-            </w:r>
-          </w:p>
-        </w:tc>
-        <w:tc>
-          <w:tcPr>
-            <w:tcW w:type="dxa" w:w="1008"/>
-            <w:shd w:val="clear" w:color="auto" w:fill="FFF4E5"/>
+              <w:t>131–136</w:t>
+            </w:r>
+          </w:p>
+        </w:tc>
+      </w:tr>
+      <w:tr>
+        <w:tc>
+          <w:tcPr>
+            <w:tcW w:type="dxa" w:w="1512"/>
           </w:tcPr>
           <w:p>
             <w:r/>
@@ -3588,15 +3654,13 @@
                 <w:b w:val="0"/>
                 <w:sz w:val="19"/>
               </w:rPr>
-              <w:t>—</w:t>
-            </w:r>
-          </w:p>
-        </w:tc>
-      </w:tr>
-      <w:tr>
-        <w:tc>
-          <w:tcPr>
-            <w:tcW w:type="dxa" w:w="1512"/>
+              <w:t>17:05–17:45</w:t>
+            </w:r>
+          </w:p>
+        </w:tc>
+        <w:tc>
+          <w:tcPr>
+            <w:tcW w:type="dxa" w:w="1080"/>
           </w:tcPr>
           <w:p>
             <w:r/>
@@ -3606,13 +3670,13 @@
                 <w:b w:val="0"/>
                 <w:sz w:val="19"/>
               </w:rPr>
-              <w:t>16:15–17:05</w:t>
-            </w:r>
-          </w:p>
-        </w:tc>
-        <w:tc>
-          <w:tcPr>
-            <w:tcW w:type="dxa" w:w="1080"/>
+              <w:t>40 min</w:t>
+            </w:r>
+          </w:p>
+        </w:tc>
+        <w:tc>
+          <w:tcPr>
+            <w:tcW w:type="dxa" w:w="5400"/>
           </w:tcPr>
           <w:p>
             <w:r/>
@@ -3622,13 +3686,13 @@
                 <w:b w:val="0"/>
                 <w:sz w:val="19"/>
               </w:rPr>
-              <w:t>50 min</w:t>
-            </w:r>
-          </w:p>
-        </w:tc>
-        <w:tc>
-          <w:tcPr>
-            <w:tcW w:type="dxa" w:w="5400"/>
+              <w:t>Lab 4: Activity 4A — interactive dashboard and professional PPT (PP Task 2; PP Task 1 image B)</w:t>
+            </w:r>
+          </w:p>
+        </w:tc>
+        <w:tc>
+          <w:tcPr>
+            <w:tcW w:type="dxa" w:w="864"/>
           </w:tcPr>
           <w:p>
             <w:r/>
@@ -3638,13 +3702,13 @@
                 <w:b w:val="0"/>
                 <w:sz w:val="19"/>
               </w:rPr>
-              <w:t>Lab 2: Activity 2 — gog Gmail/Calendar/Drive and verified Excel analysis</w:t>
-            </w:r>
-          </w:p>
-        </w:tc>
-        <w:tc>
-          <w:tcPr>
-            <w:tcW w:type="dxa" w:w="864"/>
+              <w:t>LU2</w:t>
+            </w:r>
+          </w:p>
+        </w:tc>
+        <w:tc>
+          <w:tcPr>
+            <w:tcW w:type="dxa" w:w="1008"/>
           </w:tcPr>
           <w:p>
             <w:r/>
@@ -3654,13 +3718,15 @@
                 <w:b w:val="0"/>
                 <w:sz w:val="19"/>
               </w:rPr>
-              <w:t>LU2</w:t>
-            </w:r>
-          </w:p>
-        </w:tc>
-        <w:tc>
-          <w:tcPr>
-            <w:tcW w:type="dxa" w:w="1008"/>
+              <w:t>137–142</w:t>
+            </w:r>
+          </w:p>
+        </w:tc>
+      </w:tr>
+      <w:tr>
+        <w:tc>
+          <w:tcPr>
+            <w:tcW w:type="dxa" w:w="1512"/>
           </w:tcPr>
           <w:p>
             <w:r/>
@@ -3670,15 +3736,13 @@
                 <w:b w:val="0"/>
                 <w:sz w:val="19"/>
               </w:rPr>
-              <w:t>134–139</w:t>
-            </w:r>
-          </w:p>
-        </w:tc>
-      </w:tr>
-      <w:tr>
-        <w:tc>
-          <w:tcPr>
-            <w:tcW w:type="dxa" w:w="1512"/>
+              <w:t>17:45–18:15</w:t>
+            </w:r>
+          </w:p>
+        </w:tc>
+        <w:tc>
+          <w:tcPr>
+            <w:tcW w:type="dxa" w:w="1080"/>
           </w:tcPr>
           <w:p>
             <w:r/>
@@ -3688,13 +3752,13 @@
                 <w:b w:val="0"/>
                 <w:sz w:val="19"/>
               </w:rPr>
-              <w:t>17:05–17:45</w:t>
-            </w:r>
-          </w:p>
-        </w:tc>
-        <w:tc>
-          <w:tcPr>
-            <w:tcW w:type="dxa" w:w="1080"/>
+              <w:t>30 min</w:t>
+            </w:r>
+          </w:p>
+        </w:tc>
+        <w:tc>
+          <w:tcPr>
+            <w:tcW w:type="dxa" w:w="5400"/>
           </w:tcPr>
           <w:p>
             <w:r/>
@@ -3704,13 +3768,13 @@
                 <w:b w:val="0"/>
                 <w:sz w:val="19"/>
               </w:rPr>
-              <w:t>40 min</w:t>
-            </w:r>
-          </w:p>
-        </w:tc>
-        <w:tc>
-          <w:tcPr>
-            <w:tcW w:type="dxa" w:w="5400"/>
+              <w:t>Lab 4: Activity 4B — single-agent video, exact-version review and one approved test email with Sent readback</w:t>
+            </w:r>
+          </w:p>
+        </w:tc>
+        <w:tc>
+          <w:tcPr>
+            <w:tcW w:type="dxa" w:w="864"/>
           </w:tcPr>
           <w:p>
             <w:r/>
@@ -3720,13 +3784,13 @@
                 <w:b w:val="0"/>
                 <w:sz w:val="19"/>
               </w:rPr>
-              <w:t>Lab 3: Activity 3 — interactive dashboard and professional PPT using tools and skills (PP Task 2)</w:t>
-            </w:r>
-          </w:p>
-        </w:tc>
-        <w:tc>
-          <w:tcPr>
-            <w:tcW w:type="dxa" w:w="864"/>
+              <w:t>LU2</w:t>
+            </w:r>
+          </w:p>
+        </w:tc>
+        <w:tc>
+          <w:tcPr>
+            <w:tcW w:type="dxa" w:w="1008"/>
           </w:tcPr>
           <w:p>
             <w:r/>
@@ -3736,13 +3800,16 @@
                 <w:b w:val="0"/>
                 <w:sz w:val="19"/>
               </w:rPr>
-              <w:t>LU2</w:t>
-            </w:r>
-          </w:p>
-        </w:tc>
-        <w:tc>
-          <w:tcPr>
-            <w:tcW w:type="dxa" w:w="1008"/>
+              <w:t>137–142</w:t>
+            </w:r>
+          </w:p>
+        </w:tc>
+      </w:tr>
+      <w:tr>
+        <w:tc>
+          <w:tcPr>
+            <w:tcW w:type="dxa" w:w="1512"/>
+            <w:shd w:val="clear" w:color="auto" w:fill="F3F5F8"/>
           </w:tcPr>
           <w:p>
             <w:r/>
@@ -3752,15 +3819,14 @@
                 <w:b w:val="0"/>
                 <w:sz w:val="19"/>
               </w:rPr>
-              <w:t>140–145</w:t>
-            </w:r>
-          </w:p>
-        </w:tc>
-      </w:tr>
-      <w:tr>
-        <w:tc>
-          <w:tcPr>
-            <w:tcW w:type="dxa" w:w="1512"/>
+              <w:t>18:15–18:30</w:t>
+            </w:r>
+          </w:p>
+        </w:tc>
+        <w:tc>
+          <w:tcPr>
+            <w:tcW w:type="dxa" w:w="1080"/>
+            <w:shd w:val="clear" w:color="auto" w:fill="F3F5F8"/>
           </w:tcPr>
           <w:p>
             <w:r/>
@@ -3770,13 +3836,14 @@
                 <w:b w:val="0"/>
                 <w:sz w:val="19"/>
               </w:rPr>
-              <w:t>17:45–18:15</w:t>
-            </w:r>
-          </w:p>
-        </w:tc>
-        <w:tc>
-          <w:tcPr>
-            <w:tcW w:type="dxa" w:w="1080"/>
+              <w:t>15 min</w:t>
+            </w:r>
+          </w:p>
+        </w:tc>
+        <w:tc>
+          <w:tcPr>
+            <w:tcW w:type="dxa" w:w="5400"/>
+            <w:shd w:val="clear" w:color="auto" w:fill="F3F5F8"/>
           </w:tcPr>
           <w:p>
             <w:r/>
@@ -3786,13 +3853,14 @@
                 <w:b w:val="0"/>
                 <w:sz w:val="19"/>
               </w:rPr>
-              <w:t>30 min</w:t>
-            </w:r>
-          </w:p>
-        </w:tc>
-        <w:tc>
-          <w:tcPr>
-            <w:tcW w:type="dxa" w:w="5400"/>
+              <w:t>Day 1 recap, Q&amp;A and PM digital attendance</w:t>
+            </w:r>
+          </w:p>
+        </w:tc>
+        <w:tc>
+          <w:tcPr>
+            <w:tcW w:type="dxa" w:w="864"/>
+            <w:shd w:val="clear" w:color="auto" w:fill="F3F5F8"/>
           </w:tcPr>
           <w:p>
             <w:r/>
@@ -3802,13 +3870,14 @@
                 <w:b w:val="0"/>
                 <w:sz w:val="19"/>
               </w:rPr>
-              <w:t>Lab 4: Activity 4 — human approval, office exceptions and safe internal reporting</w:t>
-            </w:r>
-          </w:p>
-        </w:tc>
-        <w:tc>
-          <w:tcPr>
-            <w:tcW w:type="dxa" w:w="864"/>
+              <w:t>LU2</w:t>
+            </w:r>
+          </w:p>
+        </w:tc>
+        <w:tc>
+          <w:tcPr>
+            <w:tcW w:type="dxa" w:w="1008"/>
+            <w:shd w:val="clear" w:color="auto" w:fill="F3F5F8"/>
           </w:tcPr>
           <w:p>
             <w:r/>
@@ -3818,110 +3887,7 @@
                 <w:b w:val="0"/>
                 <w:sz w:val="19"/>
               </w:rPr>
-              <w:t>LU2</w:t>
-            </w:r>
-          </w:p>
-        </w:tc>
-        <w:tc>
-          <w:tcPr>
-            <w:tcW w:type="dxa" w:w="1008"/>
-          </w:tcPr>
-          <w:p>
-            <w:r/>
-            <w:r>
-              <w:rPr>
-                <w:rFonts w:ascii="Arial" w:hAnsi="Arial"/>
-                <w:b w:val="0"/>
-                <w:sz w:val="19"/>
-              </w:rPr>
-              <w:t>146–151</w:t>
-            </w:r>
-          </w:p>
-        </w:tc>
-      </w:tr>
-      <w:tr>
-        <w:tc>
-          <w:tcPr>
-            <w:tcW w:type="dxa" w:w="1512"/>
-            <w:shd w:val="clear" w:color="auto" w:fill="F3F5F8"/>
-          </w:tcPr>
-          <w:p>
-            <w:r/>
-            <w:r>
-              <w:rPr>
-                <w:rFonts w:ascii="Arial" w:hAnsi="Arial"/>
-                <w:b w:val="0"/>
-                <w:sz w:val="19"/>
-              </w:rPr>
-              <w:t>18:15–18:30</w:t>
-            </w:r>
-          </w:p>
-        </w:tc>
-        <w:tc>
-          <w:tcPr>
-            <w:tcW w:type="dxa" w:w="1080"/>
-            <w:shd w:val="clear" w:color="auto" w:fill="F3F5F8"/>
-          </w:tcPr>
-          <w:p>
-            <w:r/>
-            <w:r>
-              <w:rPr>
-                <w:rFonts w:ascii="Arial" w:hAnsi="Arial"/>
-                <w:b w:val="0"/>
-                <w:sz w:val="19"/>
-              </w:rPr>
-              <w:t>15 min</w:t>
-            </w:r>
-          </w:p>
-        </w:tc>
-        <w:tc>
-          <w:tcPr>
-            <w:tcW w:type="dxa" w:w="5400"/>
-            <w:shd w:val="clear" w:color="auto" w:fill="F3F5F8"/>
-          </w:tcPr>
-          <w:p>
-            <w:r/>
-            <w:r>
-              <w:rPr>
-                <w:rFonts w:ascii="Arial" w:hAnsi="Arial"/>
-                <w:b w:val="0"/>
-                <w:sz w:val="19"/>
-              </w:rPr>
-              <w:t>Day 1 recap, Q&amp;A and PM digital attendance</w:t>
-            </w:r>
-          </w:p>
-        </w:tc>
-        <w:tc>
-          <w:tcPr>
-            <w:tcW w:type="dxa" w:w="864"/>
-            <w:shd w:val="clear" w:color="auto" w:fill="F3F5F8"/>
-          </w:tcPr>
-          <w:p>
-            <w:r/>
-            <w:r>
-              <w:rPr>
-                <w:rFonts w:ascii="Arial" w:hAnsi="Arial"/>
-                <w:b w:val="0"/>
-                <w:sz w:val="19"/>
-              </w:rPr>
-              <w:t>LU2</w:t>
-            </w:r>
-          </w:p>
-        </w:tc>
-        <w:tc>
-          <w:tcPr>
-            <w:tcW w:type="dxa" w:w="1008"/>
-            <w:shd w:val="clear" w:color="auto" w:fill="F3F5F8"/>
-          </w:tcPr>
-          <w:p>
-            <w:r/>
-            <w:r>
-              <w:rPr>
-                <w:rFonts w:ascii="Arial" w:hAnsi="Arial"/>
-                <w:b w:val="0"/>
-                <w:sz w:val="19"/>
-              </w:rPr>
-              <w:t>152</w:t>
+              <w:t>143</w:t>
             </w:r>
           </w:p>
         </w:tc>
@@ -4134,7 +4100,7 @@
                 <w:b w:val="0"/>
                 <w:sz w:val="19"/>
               </w:rPr>
-              <w:t>152</w:t>
+              <w:t>143</w:t>
             </w:r>
           </w:p>
         </w:tc>
@@ -4216,7 +4182,7 @@
                 <w:b w:val="0"/>
                 <w:sz w:val="19"/>
               </w:rPr>
-              <w:t>171–177</w:t>
+              <w:t>162–168</w:t>
             </w:r>
           </w:p>
         </w:tc>
@@ -4298,7 +4264,7 @@
                 <w:b w:val="0"/>
                 <w:sz w:val="19"/>
               </w:rPr>
-              <w:t>171–177</w:t>
+              <w:t>162–168</w:t>
             </w:r>
           </w:p>
         </w:tc>
@@ -4472,7 +4438,7 @@
                 <w:b w:val="0"/>
                 <w:sz w:val="19"/>
               </w:rPr>
-              <w:t>154–170</w:t>
+              <w:t>145–161</w:t>
             </w:r>
           </w:p>
         </w:tc>
@@ -4554,7 +4520,7 @@
                 <w:b w:val="0"/>
                 <w:sz w:val="19"/>
               </w:rPr>
-              <w:t>178–189</w:t>
+              <w:t>169–180</w:t>
             </w:r>
           </w:p>
         </w:tc>
@@ -4723,7 +4689,7 @@
                 <w:b w:val="0"/>
                 <w:sz w:val="19"/>
               </w:rPr>
-              <w:t>190–200</w:t>
+              <w:t>181–191</w:t>
             </w:r>
           </w:p>
         </w:tc>
@@ -4805,7 +4771,7 @@
                 <w:b w:val="0"/>
                 <w:sz w:val="19"/>
               </w:rPr>
-              <w:t>201–216</w:t>
+              <w:t>192–207</w:t>
             </w:r>
           </w:p>
         </w:tc>
@@ -4887,7 +4853,7 @@
                 <w:b w:val="0"/>
                 <w:sz w:val="19"/>
               </w:rPr>
-              <w:t>201–216</w:t>
+              <w:t>192–207</w:t>
             </w:r>
           </w:p>
         </w:tc>
@@ -5056,7 +5022,7 @@
                 <w:b w:val="0"/>
                 <w:sz w:val="19"/>
               </w:rPr>
-              <w:t>201–216</w:t>
+              <w:t>192–207</w:t>
             </w:r>
           </w:p>
         </w:tc>
@@ -5143,7 +5109,7 @@
                 <w:b w:val="0"/>
                 <w:sz w:val="19"/>
               </w:rPr>
-              <w:t>218–221</w:t>
+              <w:t>209–211</w:t>
             </w:r>
           </w:p>
         </w:tc>
@@ -5230,7 +5196,7 @@
                 <w:b w:val="0"/>
                 <w:sz w:val="19"/>
               </w:rPr>
-              <w:t>17</w:t>
+              <w:t>16</w:t>
             </w:r>
           </w:p>
         </w:tc>
@@ -5317,7 +5283,7 @@
                 <w:b w:val="0"/>
                 <w:sz w:val="19"/>
               </w:rPr>
-              <w:t>222–225</w:t>
+              <w:t>212–215</w:t>
             </w:r>
           </w:p>
         </w:tc>
@@ -5404,7 +5370,7 @@
                 <w:b w:val="0"/>
                 <w:sz w:val="19"/>
               </w:rPr>
-              <w:t>222–225</w:t>
+              <w:t>212–215</w:t>
             </w:r>
           </w:p>
         </w:tc>
@@ -5563,7 +5529,7 @@
                 <w:b w:val="0"/>
                 <w:sz w:val="19"/>
               </w:rPr>
-              <w:t>Activity 1 — Hermes Desktop, Telegram &amp; the Launch Brief</w:t>
+              <w:t>Activity 1 — Set Up an Always-On Personal Assistant</w:t>
             </w:r>
           </w:p>
         </w:tc>
@@ -5579,7 +5545,7 @@
                 <w:b w:val="0"/>
                 <w:sz w:val="19"/>
               </w:rPr>
-              <w:t>Single agent</w:t>
+              <w:t>Personal assistant + human decisions</w:t>
             </w:r>
           </w:p>
         </w:tc>
@@ -5611,7 +5577,7 @@
                 <w:b w:val="0"/>
                 <w:sz w:val="19"/>
               </w:rPr>
-              <w:t>128–133</w:t>
+              <w:t>63–68</w:t>
             </w:r>
           </w:p>
         </w:tc>
@@ -5645,7 +5611,7 @@
                 <w:b w:val="0"/>
                 <w:sz w:val="19"/>
               </w:rPr>
-              <w:t>Activity 2 — Google Workspace &amp; Verified Excel Analysis</w:t>
+              <w:t>Activity 2 — Hermes Desktop, Tools, Skills &amp; the Company Brief</w:t>
             </w:r>
           </w:p>
         </w:tc>
@@ -5661,7 +5627,7 @@
                 <w:b w:val="0"/>
                 <w:sz w:val="19"/>
               </w:rPr>
-              <w:t>One agent + gog + analytics skill</w:t>
+              <w:t>Single agent</w:t>
             </w:r>
           </w:p>
         </w:tc>
@@ -5693,7 +5659,7 @@
                 <w:b w:val="0"/>
                 <w:sz w:val="19"/>
               </w:rPr>
-              <w:t>134–139</w:t>
+              <w:t>125–130</w:t>
             </w:r>
           </w:p>
         </w:tc>
@@ -5727,7 +5693,7 @@
                 <w:b w:val="0"/>
                 <w:sz w:val="19"/>
               </w:rPr>
-              <w:t>Activity 3 — Interactive Dashboard &amp; Professional PPT</w:t>
+              <w:t>Activity 3 — Hermes Gmail, Calendar, Drive &amp; Excel</w:t>
             </w:r>
           </w:p>
         </w:tc>
@@ -5743,7 +5709,7 @@
                 <w:b w:val="0"/>
                 <w:sz w:val="19"/>
               </w:rPr>
-              <w:t>Single agent + four skills</w:t>
+              <w:t>One agent + gog + analytics skill</w:t>
             </w:r>
           </w:p>
         </w:tc>
@@ -5759,7 +5725,7 @@
                 <w:b w:val="0"/>
                 <w:sz w:val="19"/>
               </w:rPr>
-              <w:t>LO1</w:t>
+              <w:t>LO2</w:t>
             </w:r>
           </w:p>
         </w:tc>
@@ -5775,7 +5741,7 @@
                 <w:b w:val="0"/>
                 <w:sz w:val="19"/>
               </w:rPr>
-              <w:t>140–145</w:t>
+              <w:t>131–136</w:t>
             </w:r>
           </w:p>
         </w:tc>
@@ -5809,7 +5775,7 @@
                 <w:b w:val="0"/>
                 <w:sz w:val="19"/>
               </w:rPr>
-              <w:t>Activity 4 — Office Approval &amp; Exception Handling</w:t>
+              <w:t>Activity 4 — Hermes Dashboard, Professional PPT &amp; Single-Agent Video</w:t>
             </w:r>
           </w:p>
         </w:tc>
@@ -5825,7 +5791,7 @@
                 <w:b w:val="0"/>
                 <w:sz w:val="19"/>
               </w:rPr>
-              <w:t>Human–agent collaboration</w:t>
+              <w:t>One agent + office/video skills + human review</w:t>
             </w:r>
           </w:p>
         </w:tc>
@@ -5857,7 +5823,7 @@
                 <w:b w:val="0"/>
                 <w:sz w:val="19"/>
               </w:rPr>
-              <w:t>146–151</w:t>
+              <w:t>137–142</w:t>
             </w:r>
           </w:p>
         </w:tc>
@@ -5939,7 +5905,7 @@
                 <w:b w:val="0"/>
                 <w:sz w:val="19"/>
               </w:rPr>
-              <w:t>171–177</w:t>
+              <w:t>162–168</w:t>
             </w:r>
           </w:p>
         </w:tc>
@@ -6021,7 +5987,7 @@
                 <w:b w:val="0"/>
                 <w:sz w:val="19"/>
               </w:rPr>
-              <w:t>178–189</w:t>
+              <w:t>169–180</w:t>
             </w:r>
           </w:p>
         </w:tc>
@@ -6103,7 +6069,7 @@
                 <w:b w:val="0"/>
                 <w:sz w:val="19"/>
               </w:rPr>
-              <w:t>190–200</w:t>
+              <w:t>181–191</w:t>
             </w:r>
           </w:p>
         </w:tc>
@@ -6185,7 +6151,7 @@
                 <w:b w:val="0"/>
                 <w:sz w:val="19"/>
               </w:rPr>
-              <w:t>201–216</w:t>
+              <w:t>192–207</w:t>
             </w:r>
           </w:p>
         </w:tc>

</xml_diff>

<commit_message>
Courseware v2.8: Topic 1 trainer review
Adds the Singapore AgentSea news, the human-vs-AI-agent analogy, an
AI-agent hub with the model as one component, five collaboration
patterns, five business use cases, AI-for-Science news, and product
logos with embedded setup videos on the Big Five briefings. Removes the
Topic 1 slides the trainer cut. LP, LG, labs and README aligned.

Co-Authored-By: Claude Opus 5.5 <noreply@anthropic.com>
</commit_message>
<xml_diff>
--- a/courseware/LP-Human-AI Workforce with Autonomous AI Agents.docx
+++ b/courseware/LP-Human-AI Workforce with Autonomous AI Agents.docx
@@ -179,7 +179,7 @@
           <w:color w:val="1F6FEB"/>
           <w:sz w:val="24"/>
         </w:rPr>
-        <w:t>Version 2.5</w:t>
+        <w:t>Version 2.8</w:t>
       </w:r>
     </w:p>
     <w:p>
@@ -1310,6 +1310,180 @@
                 <w:sz w:val="19"/>
               </w:rPr>
               <w:t>Always-on comparison extended to the Big Five with Manus Cue (official Manus sources). A features slide for each agent (Claude Duet, Meta Muse, Grok Bot, OpenAI Dots, Manus Cue), plus Manus general-agent capabilities with worked examples and the Manus 2.0 additions; Big Five comparison follows the features. 'How to Set Up Manus Cue' added as a reference route (assessed routes unchanged). Practice Exam slide (exams.tertiaryinfotech.com) restored before the final assessment. LG Topic 1 and LP aligned.</w:t>
+            </w:r>
+          </w:p>
+        </w:tc>
+        <w:tc>
+          <w:tcPr>
+            <w:tcW w:type="dxa" w:w="1440"/>
+          </w:tcPr>
+          <w:p>
+            <w:r/>
+            <w:r>
+              <w:rPr>
+                <w:sz w:val="19"/>
+              </w:rPr>
+              <w:t>Dr. Alfred Ang</w:t>
+            </w:r>
+          </w:p>
+        </w:tc>
+      </w:tr>
+      <w:tr>
+        <w:tc>
+          <w:tcPr>
+            <w:tcW w:type="dxa" w:w="1152"/>
+          </w:tcPr>
+          <w:p>
+            <w:r/>
+            <w:r>
+              <w:rPr>
+                <w:sz w:val="19"/>
+              </w:rPr>
+              <w:t>2.6</w:t>
+            </w:r>
+          </w:p>
+        </w:tc>
+        <w:tc>
+          <w:tcPr>
+            <w:tcW w:type="dxa" w:w="1656"/>
+          </w:tcPr>
+          <w:p>
+            <w:r/>
+            <w:r>
+              <w:rPr>
+                <w:sz w:val="19"/>
+              </w:rPr>
+              <w:t>29 October 2026</w:t>
+            </w:r>
+          </w:p>
+        </w:tc>
+        <w:tc>
+          <w:tcPr>
+            <w:tcW w:type="dxa" w:w="5544"/>
+          </w:tcPr>
+          <w:p>
+            <w:r/>
+            <w:r>
+              <w:rPr>
+                <w:sz w:val="19"/>
+              </w:rPr>
+              <w:t>Streamlined for one continuous narration (223 → 158 slides). Topic 1 now runs history → what agentic AI is → under the hood (moved before Activity 1) → human-in/on-the-loop → work modes and use cases → always-on agents → Activity 1. One briefing slide per always-on agent (Muse, Dots, Grok Bot, Duet, Cue: features plus setup) replaces the separate feature, setup and Singapore-news slides. Every topic now ends with its lab, and Day 2 opens on the Topic 3 divider, which carries the Day 1 recap; overlapping slides were merged or removed (e.g. duplicate skill/tool/permission checks, Day 1 close, Day 2 outcome, repeated RAG and Dots-control slides). Day 1 morning re-timed within LU1; LU hours, activities and assessment unchanged.</w:t>
+            </w:r>
+          </w:p>
+        </w:tc>
+        <w:tc>
+          <w:tcPr>
+            <w:tcW w:type="dxa" w:w="1440"/>
+          </w:tcPr>
+          <w:p>
+            <w:r/>
+            <w:r>
+              <w:rPr>
+                <w:sz w:val="19"/>
+              </w:rPr>
+              <w:t>Dr. Alfred Ang</w:t>
+            </w:r>
+          </w:p>
+        </w:tc>
+      </w:tr>
+      <w:tr>
+        <w:tc>
+          <w:tcPr>
+            <w:tcW w:type="dxa" w:w="1152"/>
+          </w:tcPr>
+          <w:p>
+            <w:r/>
+            <w:r>
+              <w:rPr>
+                <w:sz w:val="19"/>
+              </w:rPr>
+              <w:t>2.7</w:t>
+            </w:r>
+          </w:p>
+        </w:tc>
+        <w:tc>
+          <w:tcPr>
+            <w:tcW w:type="dxa" w:w="1656"/>
+          </w:tcPr>
+          <w:p>
+            <w:r/>
+            <w:r>
+              <w:rPr>
+                <w:sz w:val="19"/>
+              </w:rPr>
+              <w:t>30 October 2026</w:t>
+            </w:r>
+          </w:p>
+        </w:tc>
+        <w:tc>
+          <w:tcPr>
+            <w:tcW w:type="dxa" w:w="5544"/>
+          </w:tcPr>
+          <w:p>
+            <w:r/>
+            <w:r>
+              <w:rPr>
+                <w:sz w:val="19"/>
+              </w:rPr>
+              <w:t>Trainer review of Topic 1 (158 → 145 slides). Added a Singapore news slide after the AI history (Synapxe AgentSea: 12,000+ agents created by 80,000+ public healthcare professionals; The Straits Times, 24 Aug 2026). Added an AI-for-Science news slide after AI for Science (Navier–Stokes, Stanford virtual biotech, 700 OpenAI preprints, OpenAI maths/physics/computing claims), each with its verification status. Added five collaboration-pattern slides (one human/one agent, multiple humans/one agent, one human/multiple agents, multiple humans/multiple agents, inter-company), each with an illustration, an explanation and, for patterns 1–3, a real screenshot with third-party names blurred. AI for Science and the humanoid elderly-care task now show their illustrations beside numbered steps. Each Big Five briefing slide carries the product logo; YouTube Shorts for Muse, Dots, Grok Bot, Duet and Cue embedded as PowerPoint online videos that play on the slide (poster frame and link in the PDF). Removed in Topic 1: application-categories table, the detailed harness slides (weights vs context, context assembly, memory vs knowledge base, RAG, standard LLM vs RAG, authority boundary, four checks, harness limits), human-in/on-the-loop, product development, always-on runtime, Manus general agent, the four Activity 1 check slides, the PP Task 1 slide and the Lab 1 checkpoint slide. The LG keeps the assessed content (application categories, context/memory/RAG, product development); WA answer-key citations re-bound to the remaining slides and LG; questions unchanged.</w:t>
+            </w:r>
+          </w:p>
+        </w:tc>
+        <w:tc>
+          <w:tcPr>
+            <w:tcW w:type="dxa" w:w="1440"/>
+          </w:tcPr>
+          <w:p>
+            <w:r/>
+            <w:r>
+              <w:rPr>
+                <w:sz w:val="19"/>
+              </w:rPr>
+              <w:t>Dr. Alfred Ang</w:t>
+            </w:r>
+          </w:p>
+        </w:tc>
+      </w:tr>
+      <w:tr>
+        <w:tc>
+          <w:tcPr>
+            <w:tcW w:type="dxa" w:w="1152"/>
+          </w:tcPr>
+          <w:p>
+            <w:r/>
+            <w:r>
+              <w:rPr>
+                <w:sz w:val="19"/>
+              </w:rPr>
+              <w:t>2.8</w:t>
+            </w:r>
+          </w:p>
+        </w:tc>
+        <w:tc>
+          <w:tcPr>
+            <w:tcW w:type="dxa" w:w="1656"/>
+          </w:tcPr>
+          <w:p>
+            <w:r/>
+            <w:r>
+              <w:rPr>
+                <w:sz w:val="19"/>
+              </w:rPr>
+              <w:t>30 October 2026</w:t>
+            </w:r>
+          </w:p>
+        </w:tc>
+        <w:tc>
+          <w:tcPr>
+            <w:tcW w:type="dxa" w:w="5544"/>
+          </w:tcPr>
+          <w:p>
+            <w:r/>
+            <w:r>
+              <w:rPr>
+                <w:sz w:val="19"/>
+              </w:rPr>
+              <w:t>Published release of the Topic 1 review. The use-case gallery is now 'AI Agents for Business: Five Use Cases' (customer service, IT service management, finance, sales, procurement and supply chain; Genic Solutions, 30 Sep 2026), replacing the 'Two modes' gallery. AI-for-Science news slide (Navier–Stokes, Stanford virtual biotech, 700 OpenAI maths preprints, OpenAI maths/physics/computing claims) with verification status. New visual analogy slide 'An AI Agent Works Like a Person' (brain + body → food → work; model + harness → tokens → work); the under-the-hood hub now has 'AI agent' at its centre with the model as one component. QA fixes: LP column widths and Lab 1 checkpoint slide range, LG heading/image pagination, Muse and Cue briefing polish, answer-key wording.</w:t>
             </w:r>
           </w:p>
         </w:tc>
@@ -1372,7 +1546,7 @@
         </w:rPr>
         <w:t>Course Information</w:t>
         <w:tab/>
-        <w:t>6</w:t>
+        <w:t>7</w:t>
       </w:r>
     </w:p>
     <w:p>
@@ -1391,7 +1565,7 @@
         </w:rPr>
         <w:t>Learning Outcomes</w:t>
         <w:tab/>
-        <w:t>6</w:t>
+        <w:t>7</w:t>
       </w:r>
     </w:p>
     <w:p>
@@ -1410,7 +1584,7 @@
         </w:rPr>
         <w:t>Topics and Labs</w:t>
         <w:tab/>
-        <w:t>6</w:t>
+        <w:t>7</w:t>
       </w:r>
     </w:p>
     <w:p>
@@ -1429,7 +1603,7 @@
         </w:rPr>
         <w:t>Learning Units (approved Course Proposal TPG-2024060313)</w:t>
         <w:tab/>
-        <w:t>7</w:t>
+        <w:t>8</w:t>
       </w:r>
     </w:p>
     <w:p>
@@ -1448,7 +1622,7 @@
         </w:rPr>
         <w:t>Assessment</w:t>
         <w:tab/>
-        <w:t>7</w:t>
+        <w:t>8</w:t>
       </w:r>
     </w:p>
     <w:p>
@@ -1467,7 +1641,7 @@
         </w:rPr>
         <w:t>Course Schedule</w:t>
         <w:tab/>
-        <w:t>7</w:t>
+        <w:t>8</w:t>
       </w:r>
     </w:p>
     <w:p>
@@ -1487,7 +1661,7 @@
         </w:rPr>
         <w:t>Day 1 — Human–AI overview → always-on assistants → Hermes single-agent office practice (Activities 1–4)</w:t>
         <w:tab/>
-        <w:t>7</w:t>
+        <w:t>8</w:t>
       </w:r>
     </w:p>
     <w:p>
@@ -1507,7 +1681,7 @@
         </w:rPr>
         <w:t>Day 2 — Hermes multi-agent Kanban video team and OpenAI Dots (Activities 5–8), then assessment</w:t>
         <w:tab/>
-        <w:t>8</w:t>
+        <w:t>9</w:t>
       </w:r>
     </w:p>
     <w:p>
@@ -1526,7 +1700,7 @@
         </w:rPr>
         <w:t>Lab Reference</w:t>
         <w:tab/>
-        <w:t>8</w:t>
+        <w:t>10</w:t>
       </w:r>
       <w:r>
         <w:fldChar w:fldCharType="end"/>
@@ -1831,7 +2005,7 @@
                 <w:b w:val="0"/>
                 <w:sz w:val="20"/>
               </w:rPr>
-              <w:t>Human-AI Workforce with Autonomous AI Agents-v2.5.pptx (223 slides)</w:t>
+              <w:t>Human-AI Workforce with Autonomous AI Agents-v2.8.pptx (146 slides)</w:t>
             </w:r>
           </w:p>
         </w:tc>
@@ -2024,7 +2198,7 @@
                 <w:b w:val="0"/>
                 <w:sz w:val="19"/>
               </w:rPr>
-              <w:t>Brief AI history and two human–AI work modes; Big Five: Duet, Muse, Grok Bot, Dots and Manus Cue; Activity 1 · Set up an always-on assistant; Under the hood: harness, loop, context and human decisions.  Activity 1: always-on assistant setup.</w:t>
+              <w:t>Brief AI history and what agentic AI is; Under the hood: the model in a harness, tools, skills and the agentic loop; humans decide; Two work modes, five collaboration patterns, use cases and the Big Five always-on agents; Activity 1 · Set up an always-on assistant.  Activity 1: always-on assistant setup.</w:t>
             </w:r>
           </w:p>
         </w:tc>
@@ -2040,7 +2214,7 @@
                 <w:b w:val="0"/>
                 <w:sz w:val="19"/>
               </w:rPr>
-              <w:t>21–84</w:t>
+              <w:t>20–52</w:t>
             </w:r>
           </w:p>
         </w:tc>
@@ -2091,7 +2265,7 @@
                 <w:b w:val="0"/>
                 <w:sz w:val="19"/>
               </w:rPr>
-              <w:t>85–151</w:t>
+              <w:t>53–94</w:t>
             </w:r>
           </w:p>
         </w:tc>
@@ -2142,7 +2316,7 @@
                 <w:b w:val="0"/>
                 <w:sz w:val="19"/>
               </w:rPr>
-              <w:t>152–215</w:t>
+              <w:t>95–138</w:t>
             </w:r>
           </w:p>
         </w:tc>
@@ -2164,16 +2338,16 @@
         <w:tblLayout w:type="fixed"/>
       </w:tblPr>
       <w:tblGrid>
-        <w:gridCol w:w="1080"/>
-        <w:gridCol w:w="2736"/>
-        <w:gridCol w:w="3456"/>
-        <w:gridCol w:w="1512"/>
-        <w:gridCol w:w="1007"/>
+        <w:gridCol w:w="864"/>
+        <w:gridCol w:w="2592"/>
+        <w:gridCol w:w="3311"/>
+        <w:gridCol w:w="1440"/>
+        <w:gridCol w:w="1440"/>
       </w:tblGrid>
       <w:tr>
         <w:tc>
           <w:tcPr>
-            <w:tcW w:type="dxa" w:w="1080"/>
+            <w:tcW w:type="dxa" w:w="864"/>
             <w:shd w:val="clear" w:color="auto" w:fill="1F6FEB"/>
           </w:tcPr>
           <w:p>
@@ -2194,7 +2368,7 @@
         </w:tc>
         <w:tc>
           <w:tcPr>
-            <w:tcW w:type="dxa" w:w="2736"/>
+            <w:tcW w:type="dxa" w:w="2592"/>
             <w:shd w:val="clear" w:color="auto" w:fill="1F6FEB"/>
           </w:tcPr>
           <w:p>
@@ -2215,7 +2389,7 @@
         </w:tc>
         <w:tc>
           <w:tcPr>
-            <w:tcW w:type="dxa" w:w="3456"/>
+            <w:tcW w:type="dxa" w:w="3312"/>
             <w:shd w:val="clear" w:color="auto" w:fill="1F6FEB"/>
           </w:tcPr>
           <w:p>
@@ -2236,7 +2410,7 @@
         </w:tc>
         <w:tc>
           <w:tcPr>
-            <w:tcW w:type="dxa" w:w="1512"/>
+            <w:tcW w:type="dxa" w:w="1440"/>
             <w:shd w:val="clear" w:color="auto" w:fill="1F6FEB"/>
           </w:tcPr>
           <w:p>
@@ -2257,7 +2431,7 @@
         </w:tc>
         <w:tc>
           <w:tcPr>
-            <w:tcW w:type="dxa" w:w="1008"/>
+            <w:tcW w:type="dxa" w:w="1440"/>
             <w:shd w:val="clear" w:color="auto" w:fill="1F6FEB"/>
           </w:tcPr>
           <w:p>
@@ -2280,7 +2454,7 @@
       <w:tr>
         <w:tc>
           <w:tcPr>
-            <w:tcW w:type="dxa" w:w="1080"/>
+            <w:tcW w:type="dxa" w:w="864"/>
             <w:shd w:val="clear" w:color="auto" w:fill="E8F0FE"/>
           </w:tcPr>
           <w:p>
@@ -2300,7 +2474,7 @@
         </w:tc>
         <w:tc>
           <w:tcPr>
-            <w:tcW w:type="dxa" w:w="2736"/>
+            <w:tcW w:type="dxa" w:w="2592"/>
           </w:tcPr>
           <w:p>
             <w:pPr>
@@ -2319,7 +2493,7 @@
         </w:tc>
         <w:tc>
           <w:tcPr>
-            <w:tcW w:type="dxa" w:w="3456"/>
+            <w:tcW w:type="dxa" w:w="3312"/>
           </w:tcPr>
           <w:p>
             <w:pPr>
@@ -2338,7 +2512,7 @@
         </w:tc>
         <w:tc>
           <w:tcPr>
-            <w:tcW w:type="dxa" w:w="1512"/>
+            <w:tcW w:type="dxa" w:w="1440"/>
           </w:tcPr>
           <w:p>
             <w:pPr>
@@ -2357,7 +2531,7 @@
         </w:tc>
         <w:tc>
           <w:tcPr>
-            <w:tcW w:type="dxa" w:w="1008"/>
+            <w:tcW w:type="dxa" w:w="1440"/>
           </w:tcPr>
           <w:p>
             <w:pPr>
@@ -2378,7 +2552,7 @@
       <w:tr>
         <w:tc>
           <w:tcPr>
-            <w:tcW w:type="dxa" w:w="1080"/>
+            <w:tcW w:type="dxa" w:w="864"/>
             <w:shd w:val="clear" w:color="auto" w:fill="E8F0FE"/>
           </w:tcPr>
           <w:p>
@@ -2395,7 +2569,7 @@
         </w:tc>
         <w:tc>
           <w:tcPr>
-            <w:tcW w:type="dxa" w:w="2736"/>
+            <w:tcW w:type="dxa" w:w="2592"/>
           </w:tcPr>
           <w:p>
             <w:r/>
@@ -2411,7 +2585,7 @@
         </w:tc>
         <w:tc>
           <w:tcPr>
-            <w:tcW w:type="dxa" w:w="3456"/>
+            <w:tcW w:type="dxa" w:w="3312"/>
           </w:tcPr>
           <w:p>
             <w:r/>
@@ -2427,7 +2601,7 @@
         </w:tc>
         <w:tc>
           <w:tcPr>
-            <w:tcW w:type="dxa" w:w="1512"/>
+            <w:tcW w:type="dxa" w:w="1440"/>
           </w:tcPr>
           <w:p>
             <w:r/>
@@ -2443,7 +2617,7 @@
         </w:tc>
         <w:tc>
           <w:tcPr>
-            <w:tcW w:type="dxa" w:w="1008"/>
+            <w:tcW w:type="dxa" w:w="1440"/>
           </w:tcPr>
           <w:p>
             <w:r/>
@@ -2461,7 +2635,7 @@
       <w:tr>
         <w:tc>
           <w:tcPr>
-            <w:tcW w:type="dxa" w:w="1080"/>
+            <w:tcW w:type="dxa" w:w="864"/>
             <w:shd w:val="clear" w:color="auto" w:fill="E8F0FE"/>
           </w:tcPr>
           <w:p>
@@ -2478,7 +2652,7 @@
         </w:tc>
         <w:tc>
           <w:tcPr>
-            <w:tcW w:type="dxa" w:w="2736"/>
+            <w:tcW w:type="dxa" w:w="2592"/>
           </w:tcPr>
           <w:p>
             <w:r/>
@@ -2494,7 +2668,7 @@
         </w:tc>
         <w:tc>
           <w:tcPr>
-            <w:tcW w:type="dxa" w:w="3456"/>
+            <w:tcW w:type="dxa" w:w="3312"/>
           </w:tcPr>
           <w:p>
             <w:r/>
@@ -2510,7 +2684,7 @@
         </w:tc>
         <w:tc>
           <w:tcPr>
-            <w:tcW w:type="dxa" w:w="1512"/>
+            <w:tcW w:type="dxa" w:w="1440"/>
           </w:tcPr>
           <w:p>
             <w:r/>
@@ -2526,7 +2700,7 @@
         </w:tc>
         <w:tc>
           <w:tcPr>
-            <w:tcW w:type="dxa" w:w="1008"/>
+            <w:tcW w:type="dxa" w:w="1440"/>
           </w:tcPr>
           <w:p>
             <w:r/>
@@ -2544,7 +2718,7 @@
       <w:tr>
         <w:tc>
           <w:tcPr>
-            <w:tcW w:type="dxa" w:w="1080"/>
+            <w:tcW w:type="dxa" w:w="864"/>
             <w:shd w:val="clear" w:color="auto" w:fill="E8F7EE"/>
           </w:tcPr>
           <w:p>
@@ -2561,7 +2735,7 @@
         </w:tc>
         <w:tc>
           <w:tcPr>
-            <w:tcW w:type="dxa" w:w="2736"/>
+            <w:tcW w:type="dxa" w:w="2592"/>
           </w:tcPr>
           <w:p>
             <w:r/>
@@ -2577,7 +2751,7 @@
         </w:tc>
         <w:tc>
           <w:tcPr>
-            <w:tcW w:type="dxa" w:w="3456"/>
+            <w:tcW w:type="dxa" w:w="3312"/>
           </w:tcPr>
           <w:p>
             <w:r/>
@@ -2593,7 +2767,7 @@
         </w:tc>
         <w:tc>
           <w:tcPr>
-            <w:tcW w:type="dxa" w:w="1512"/>
+            <w:tcW w:type="dxa" w:w="1440"/>
           </w:tcPr>
           <w:p>
             <w:r/>
@@ -2609,7 +2783,7 @@
         </w:tc>
         <w:tc>
           <w:tcPr>
-            <w:tcW w:type="dxa" w:w="1008"/>
+            <w:tcW w:type="dxa" w:w="1440"/>
           </w:tcPr>
           <w:p>
             <w:r/>
@@ -2722,16 +2896,16 @@
         <w:tblLayout w:type="fixed"/>
       </w:tblPr>
       <w:tblGrid>
-        <w:gridCol w:w="1512"/>
+        <w:gridCol w:w="1440"/>
         <w:gridCol w:w="1080"/>
-        <w:gridCol w:w="5400"/>
+        <w:gridCol w:w="5112"/>
         <w:gridCol w:w="864"/>
-        <w:gridCol w:w="1007"/>
+        <w:gridCol w:w="1368"/>
       </w:tblGrid>
       <w:tr>
         <w:tc>
           <w:tcPr>
-            <w:tcW w:type="dxa" w:w="1512"/>
+            <w:tcW w:type="dxa" w:w="1440"/>
             <w:shd w:val="clear" w:color="auto" w:fill="1F6FEB"/>
           </w:tcPr>
           <w:p>
@@ -2767,7 +2941,7 @@
         </w:tc>
         <w:tc>
           <w:tcPr>
-            <w:tcW w:type="dxa" w:w="5400"/>
+            <w:tcW w:type="dxa" w:w="5112"/>
             <w:shd w:val="clear" w:color="auto" w:fill="1F6FEB"/>
           </w:tcPr>
           <w:p>
@@ -2803,7 +2977,7 @@
         </w:tc>
         <w:tc>
           <w:tcPr>
-            <w:tcW w:type="dxa" w:w="1008"/>
+            <w:tcW w:type="dxa" w:w="1368"/>
             <w:shd w:val="clear" w:color="auto" w:fill="1F6FEB"/>
           </w:tcPr>
           <w:p>
@@ -2823,7 +2997,7 @@
       <w:tr>
         <w:tc>
           <w:tcPr>
-            <w:tcW w:type="dxa" w:w="1512"/>
+            <w:tcW w:type="dxa" w:w="1440"/>
             <w:shd w:val="clear" w:color="auto" w:fill="F3F5F8"/>
           </w:tcPr>
           <w:p>
@@ -2857,7 +3031,7 @@
         </w:tc>
         <w:tc>
           <w:tcPr>
-            <w:tcW w:type="dxa" w:w="5400"/>
+            <w:tcW w:type="dxa" w:w="5112"/>
             <w:shd w:val="clear" w:color="auto" w:fill="F3F5F8"/>
           </w:tcPr>
           <w:p>
@@ -2891,7 +3065,7 @@
         </w:tc>
         <w:tc>
           <w:tcPr>
-            <w:tcW w:type="dxa" w:w="1008"/>
+            <w:tcW w:type="dxa" w:w="1368"/>
             <w:shd w:val="clear" w:color="auto" w:fill="F3F5F8"/>
           </w:tcPr>
           <w:p>
@@ -2902,7 +3076,7 @@
                 <w:b w:val="0"/>
                 <w:sz w:val="19"/>
               </w:rPr>
-              <w:t>1–20</w:t>
+              <w:t>1–19</w:t>
             </w:r>
           </w:p>
         </w:tc>
@@ -2910,7 +3084,7 @@
       <w:tr>
         <w:tc>
           <w:tcPr>
-            <w:tcW w:type="dxa" w:w="1512"/>
+            <w:tcW w:type="dxa" w:w="1440"/>
             <w:shd w:val="clear" w:color="auto" w:fill="E8F0FE"/>
           </w:tcPr>
           <w:p>
@@ -2944,7 +3118,7 @@
         </w:tc>
         <w:tc>
           <w:tcPr>
-            <w:tcW w:type="dxa" w:w="5400"/>
+            <w:tcW w:type="dxa" w:w="5112"/>
             <w:shd w:val="clear" w:color="auto" w:fill="E8F0FE"/>
           </w:tcPr>
           <w:p>
@@ -2955,7 +3129,7 @@
                 <w:b/>
                 <w:sz w:val="19"/>
               </w:rPr>
-              <w:t>Topic 1 (Part A) — brief AI history; agentic AI and always-on agents; human–AI roles, two work modes and use cases; Big Five features (Duet, Muse, Grok Bot, Dots, Manus and Cue), comparison and Singapore update</w:t>
+              <w:t>Topic 1 (Part A) — brief AI history; what agentic AI is; under the hood: the model in a harness, tools and skills, the agentic loop; AI does the work, humans decide; personal assistant vs digital worker; five collaboration patterns (one human/one agent to inter-company); use cases, AI for Science and a humanoid elderly-care task</w:t>
             </w:r>
           </w:p>
         </w:tc>
@@ -2978,7 +3152,7 @@
         </w:tc>
         <w:tc>
           <w:tcPr>
-            <w:tcW w:type="dxa" w:w="1008"/>
+            <w:tcW w:type="dxa" w:w="1368"/>
             <w:shd w:val="clear" w:color="auto" w:fill="E8F0FE"/>
           </w:tcPr>
           <w:p>
@@ -2989,7 +3163,7 @@
                 <w:b w:val="0"/>
                 <w:sz w:val="19"/>
               </w:rPr>
-              <w:t>21–48</w:t>
+              <w:t>20–41</w:t>
             </w:r>
           </w:p>
         </w:tc>
@@ -2997,7 +3171,7 @@
       <w:tr>
         <w:tc>
           <w:tcPr>
-            <w:tcW w:type="dxa" w:w="1512"/>
+            <w:tcW w:type="dxa" w:w="1440"/>
             <w:shd w:val="clear" w:color="auto" w:fill="FFF4E5"/>
           </w:tcPr>
           <w:p>
@@ -3031,7 +3205,7 @@
         </w:tc>
         <w:tc>
           <w:tcPr>
-            <w:tcW w:type="dxa" w:w="5400"/>
+            <w:tcW w:type="dxa" w:w="5112"/>
             <w:shd w:val="clear" w:color="auto" w:fill="FFF4E5"/>
           </w:tcPr>
           <w:p>
@@ -3065,7 +3239,7 @@
         </w:tc>
         <w:tc>
           <w:tcPr>
-            <w:tcW w:type="dxa" w:w="1008"/>
+            <w:tcW w:type="dxa" w:w="1368"/>
             <w:shd w:val="clear" w:color="auto" w:fill="FFF4E5"/>
           </w:tcPr>
           <w:p>
@@ -3084,7 +3258,25 @@
       <w:tr>
         <w:tc>
           <w:tcPr>
-            <w:tcW w:type="dxa" w:w="1512"/>
+            <w:tcW w:type="dxa" w:w="1440"/>
+            <w:shd w:val="clear" w:color="auto" w:fill="E8F0FE"/>
+          </w:tcPr>
+          <w:p>
+            <w:r/>
+            <w:r>
+              <w:rPr>
+                <w:rFonts w:ascii="Arial" w:hAnsi="Arial"/>
+                <w:b/>
+                <w:sz w:val="19"/>
+              </w:rPr>
+              <w:t>11:20–12:00</w:t>
+            </w:r>
+          </w:p>
+        </w:tc>
+        <w:tc>
+          <w:tcPr>
+            <w:tcW w:type="dxa" w:w="1080"/>
+            <w:shd w:val="clear" w:color="auto" w:fill="E8F0FE"/>
           </w:tcPr>
           <w:p>
             <w:r/>
@@ -3094,13 +3286,31 @@
                 <w:b w:val="0"/>
                 <w:sz w:val="19"/>
               </w:rPr>
-              <w:t>11:20–12:35</w:t>
-            </w:r>
-          </w:p>
-        </w:tc>
-        <w:tc>
-          <w:tcPr>
-            <w:tcW w:type="dxa" w:w="1080"/>
+              <w:t>40 min</w:t>
+            </w:r>
+          </w:p>
+        </w:tc>
+        <w:tc>
+          <w:tcPr>
+            <w:tcW w:type="dxa" w:w="5112"/>
+            <w:shd w:val="clear" w:color="auto" w:fill="E8F0FE"/>
+          </w:tcPr>
+          <w:p>
+            <w:r/>
+            <w:r>
+              <w:rPr>
+                <w:rFonts w:ascii="Arial" w:hAnsi="Arial"/>
+                <w:b/>
+                <w:sz w:val="19"/>
+              </w:rPr>
+              <w:t>Topic 1 (Part B) — deployment evolution (OpenClaw → Hermes → hosted agents); the Big Five comparison and one briefing slide each (Muse, Dots, Grok Bot, Duet, Cue) with official sources and setup videos; choose the Activity 1 route</w:t>
+            </w:r>
+          </w:p>
+        </w:tc>
+        <w:tc>
+          <w:tcPr>
+            <w:tcW w:type="dxa" w:w="864"/>
+            <w:shd w:val="clear" w:color="auto" w:fill="E8F0FE"/>
           </w:tcPr>
           <w:p>
             <w:r/>
@@ -3110,13 +3320,14 @@
                 <w:b w:val="0"/>
                 <w:sz w:val="19"/>
               </w:rPr>
-              <w:t>75 min</w:t>
-            </w:r>
-          </w:p>
-        </w:tc>
-        <w:tc>
-          <w:tcPr>
-            <w:tcW w:type="dxa" w:w="5400"/>
+              <w:t>LU1</w:t>
+            </w:r>
+          </w:p>
+        </w:tc>
+        <w:tc>
+          <w:tcPr>
+            <w:tcW w:type="dxa" w:w="1368"/>
+            <w:shd w:val="clear" w:color="auto" w:fill="E8F0FE"/>
           </w:tcPr>
           <w:p>
             <w:r/>
@@ -3126,13 +3337,15 @@
                 <w:b w:val="0"/>
                 <w:sz w:val="19"/>
               </w:rPr>
-              <w:t>Lab 1: Activity 1 — setup plan and walkthroughs (Muse, Dots, Grok Bot; Duet and Cue for reference); connect Gmail/Calendar, schedule check and email draft (PP Task 1 image A)</w:t>
-            </w:r>
-          </w:p>
-        </w:tc>
-        <w:tc>
-          <w:tcPr>
-            <w:tcW w:type="dxa" w:w="864"/>
+              <w:t>42–48</w:t>
+            </w:r>
+          </w:p>
+        </w:tc>
+      </w:tr>
+      <w:tr>
+        <w:tc>
+          <w:tcPr>
+            <w:tcW w:type="dxa" w:w="1440"/>
           </w:tcPr>
           <w:p>
             <w:r/>
@@ -3142,13 +3355,13 @@
                 <w:b w:val="0"/>
                 <w:sz w:val="19"/>
               </w:rPr>
-              <w:t>LU1</w:t>
-            </w:r>
-          </w:p>
-        </w:tc>
-        <w:tc>
-          <w:tcPr>
-            <w:tcW w:type="dxa" w:w="1008"/>
+              <w:t>12:00–13:15</w:t>
+            </w:r>
+          </w:p>
+        </w:tc>
+        <w:tc>
+          <w:tcPr>
+            <w:tcW w:type="dxa" w:w="1080"/>
           </w:tcPr>
           <w:p>
             <w:r/>
@@ -3158,7 +3371,55 @@
                 <w:b w:val="0"/>
                 <w:sz w:val="19"/>
               </w:rPr>
-              <w:t>49–67</w:t>
+              <w:t>75 min</w:t>
+            </w:r>
+          </w:p>
+        </w:tc>
+        <w:tc>
+          <w:tcPr>
+            <w:tcW w:type="dxa" w:w="5112"/>
+          </w:tcPr>
+          <w:p>
+            <w:r/>
+            <w:r>
+              <w:rPr>
+                <w:rFonts w:ascii="Arial" w:hAnsi="Arial"/>
+                <w:b w:val="0"/>
+                <w:sz w:val="19"/>
+              </w:rPr>
+              <w:t>Lab 1: Activity 1 — connect one assistant (Muse, Dots or Grok Bot) to Gmail/Calendar; schedule check and email draft (PP Task 1 image A)</w:t>
+            </w:r>
+          </w:p>
+        </w:tc>
+        <w:tc>
+          <w:tcPr>
+            <w:tcW w:type="dxa" w:w="864"/>
+          </w:tcPr>
+          <w:p>
+            <w:r/>
+            <w:r>
+              <w:rPr>
+                <w:rFonts w:ascii="Arial" w:hAnsi="Arial"/>
+                <w:b w:val="0"/>
+                <w:sz w:val="19"/>
+              </w:rPr>
+              <w:t>LU1</w:t>
+            </w:r>
+          </w:p>
+        </w:tc>
+        <w:tc>
+          <w:tcPr>
+            <w:tcW w:type="dxa" w:w="1368"/>
+          </w:tcPr>
+          <w:p>
+            <w:r/>
+            <w:r>
+              <w:rPr>
+                <w:rFonts w:ascii="Arial" w:hAnsi="Arial"/>
+                <w:b w:val="0"/>
+                <w:sz w:val="19"/>
+              </w:rPr>
+              <w:t>49–52</w:t>
             </w:r>
           </w:p>
         </w:tc>
@@ -3166,7 +3427,7 @@
       <w:tr>
         <w:tc>
           <w:tcPr>
-            <w:tcW w:type="dxa" w:w="1512"/>
+            <w:tcW w:type="dxa" w:w="1440"/>
             <w:shd w:val="clear" w:color="auto" w:fill="E8F0FE"/>
           </w:tcPr>
           <w:p>
@@ -3177,7 +3438,7 @@
                 <w:b/>
                 <w:sz w:val="19"/>
               </w:rPr>
-              <w:t>12:35–12:50</w:t>
+              <w:t>13:15–13:30</w:t>
             </w:r>
           </w:p>
         </w:tc>
@@ -3200,7 +3461,7 @@
         </w:tc>
         <w:tc>
           <w:tcPr>
-            <w:tcW w:type="dxa" w:w="5400"/>
+            <w:tcW w:type="dxa" w:w="5112"/>
             <w:shd w:val="clear" w:color="auto" w:fill="E8F0FE"/>
           </w:tcPr>
           <w:p>
@@ -3211,7 +3472,7 @@
                 <w:b/>
                 <w:sz w:val="19"/>
               </w:rPr>
-              <w:t>Assistant results review — compare source accuracy, approval controls, limits and actual stop state</w:t>
+              <w:t>Lab 1 checkpoint and results review — source accuracy, approval controls, limits and actual stop state (trainer-led, using the Lab 1 checklist)</w:t>
             </w:r>
           </w:p>
         </w:tc>
@@ -3234,7 +3495,7 @@
         </w:tc>
         <w:tc>
           <w:tcPr>
-            <w:tcW w:type="dxa" w:w="1008"/>
+            <w:tcW w:type="dxa" w:w="1368"/>
             <w:shd w:val="clear" w:color="auto" w:fill="E8F0FE"/>
           </w:tcPr>
           <w:p>
@@ -3245,7 +3506,7 @@
                 <w:b w:val="0"/>
                 <w:sz w:val="19"/>
               </w:rPr>
-              <w:t>68</w:t>
+              <w:t>49–52</w:t>
             </w:r>
           </w:p>
         </w:tc>
@@ -3253,25 +3514,8 @@
       <w:tr>
         <w:tc>
           <w:tcPr>
-            <w:tcW w:type="dxa" w:w="1512"/>
-            <w:shd w:val="clear" w:color="auto" w:fill="E8F0FE"/>
-          </w:tcPr>
-          <w:p>
-            <w:r/>
-            <w:r>
-              <w:rPr>
-                <w:rFonts w:ascii="Arial" w:hAnsi="Arial"/>
-                <w:b/>
-                <w:sz w:val="19"/>
-              </w:rPr>
-              <w:t>12:50–13:30</w:t>
-            </w:r>
-          </w:p>
-        </w:tc>
-        <w:tc>
-          <w:tcPr>
-            <w:tcW w:type="dxa" w:w="1080"/>
-            <w:shd w:val="clear" w:color="auto" w:fill="E8F0FE"/>
+            <w:tcW w:type="dxa" w:w="1440"/>
+            <w:shd w:val="clear" w:color="auto" w:fill="FDE9D9"/>
           </w:tcPr>
           <w:p>
             <w:r/>
@@ -3281,31 +3525,14 @@
                 <w:b w:val="0"/>
                 <w:sz w:val="19"/>
               </w:rPr>
-              <w:t>40 min</w:t>
-            </w:r>
-          </w:p>
-        </w:tc>
-        <w:tc>
-          <w:tcPr>
-            <w:tcW w:type="dxa" w:w="5400"/>
-            <w:shd w:val="clear" w:color="auto" w:fill="E8F0FE"/>
-          </w:tcPr>
-          <w:p>
-            <w:r/>
-            <w:r>
-              <w:rPr>
-                <w:rFonts w:ascii="Arial" w:hAnsi="Arial"/>
-                <w:b/>
-                <w:sz w:val="19"/>
-              </w:rPr>
-              <w:t>Under the hood — how agents work: model in a harness, context, memory and RAG, tools and skills, the agentic loop, approvals and human-in/on-the-loop</w:t>
-            </w:r>
-          </w:p>
-        </w:tc>
-        <w:tc>
-          <w:tcPr>
-            <w:tcW w:type="dxa" w:w="864"/>
-            <w:shd w:val="clear" w:color="auto" w:fill="E8F0FE"/>
+              <w:t>13:30–14:30</w:t>
+            </w:r>
+          </w:p>
+        </w:tc>
+        <w:tc>
+          <w:tcPr>
+            <w:tcW w:type="dxa" w:w="1080"/>
+            <w:shd w:val="clear" w:color="auto" w:fill="FDE9D9"/>
           </w:tcPr>
           <w:p>
             <w:r/>
@@ -3315,14 +3542,14 @@
                 <w:b w:val="0"/>
                 <w:sz w:val="19"/>
               </w:rPr>
-              <w:t>LU1</w:t>
-            </w:r>
-          </w:p>
-        </w:tc>
-        <w:tc>
-          <w:tcPr>
-            <w:tcW w:type="dxa" w:w="1008"/>
-            <w:shd w:val="clear" w:color="auto" w:fill="E8F0FE"/>
+              <w:t>60 min</w:t>
+            </w:r>
+          </w:p>
+        </w:tc>
+        <w:tc>
+          <w:tcPr>
+            <w:tcW w:type="dxa" w:w="5112"/>
+            <w:shd w:val="clear" w:color="auto" w:fill="FDE9D9"/>
           </w:tcPr>
           <w:p>
             <w:r/>
@@ -3332,15 +3559,13 @@
                 <w:b w:val="0"/>
                 <w:sz w:val="19"/>
               </w:rPr>
-              <w:t>69–84</w:t>
-            </w:r>
-          </w:p>
-        </w:tc>
-      </w:tr>
-      <w:tr>
-        <w:tc>
-          <w:tcPr>
-            <w:tcW w:type="dxa" w:w="1512"/>
+              <w:t>Lunch break</w:t>
+            </w:r>
+          </w:p>
+        </w:tc>
+        <w:tc>
+          <w:tcPr>
+            <w:tcW w:type="dxa" w:w="864"/>
             <w:shd w:val="clear" w:color="auto" w:fill="FDE9D9"/>
           </w:tcPr>
           <w:p>
@@ -3351,13 +3576,13 @@
                 <w:b w:val="0"/>
                 <w:sz w:val="19"/>
               </w:rPr>
-              <w:t>13:30–14:30</w:t>
-            </w:r>
-          </w:p>
-        </w:tc>
-        <w:tc>
-          <w:tcPr>
-            <w:tcW w:type="dxa" w:w="1080"/>
+              <w:t>—</w:t>
+            </w:r>
+          </w:p>
+        </w:tc>
+        <w:tc>
+          <w:tcPr>
+            <w:tcW w:type="dxa" w:w="1368"/>
             <w:shd w:val="clear" w:color="auto" w:fill="FDE9D9"/>
           </w:tcPr>
           <w:p>
@@ -3368,14 +3593,15 @@
                 <w:b w:val="0"/>
                 <w:sz w:val="19"/>
               </w:rPr>
-              <w:t>60 min</w:t>
-            </w:r>
-          </w:p>
-        </w:tc>
-        <w:tc>
-          <w:tcPr>
-            <w:tcW w:type="dxa" w:w="5400"/>
-            <w:shd w:val="clear" w:color="auto" w:fill="FDE9D9"/>
+              <w:t>—</w:t>
+            </w:r>
+          </w:p>
+        </w:tc>
+      </w:tr>
+      <w:tr>
+        <w:tc>
+          <w:tcPr>
+            <w:tcW w:type="dxa" w:w="1440"/>
           </w:tcPr>
           <w:p>
             <w:r/>
@@ -3385,14 +3611,13 @@
                 <w:b w:val="0"/>
                 <w:sz w:val="19"/>
               </w:rPr>
-              <w:t>Lunch break</w:t>
-            </w:r>
-          </w:p>
-        </w:tc>
-        <w:tc>
-          <w:tcPr>
-            <w:tcW w:type="dxa" w:w="864"/>
-            <w:shd w:val="clear" w:color="auto" w:fill="FDE9D9"/>
+              <w:t>14:30–15:30</w:t>
+            </w:r>
+          </w:p>
+        </w:tc>
+        <w:tc>
+          <w:tcPr>
+            <w:tcW w:type="dxa" w:w="1080"/>
           </w:tcPr>
           <w:p>
             <w:r/>
@@ -3402,14 +3627,13 @@
                 <w:b w:val="0"/>
                 <w:sz w:val="19"/>
               </w:rPr>
-              <w:t>—</w:t>
-            </w:r>
-          </w:p>
-        </w:tc>
-        <w:tc>
-          <w:tcPr>
-            <w:tcW w:type="dxa" w:w="1008"/>
-            <w:shd w:val="clear" w:color="auto" w:fill="FDE9D9"/>
+              <w:t>60 min</w:t>
+            </w:r>
+          </w:p>
+        </w:tc>
+        <w:tc>
+          <w:tcPr>
+            <w:tcW w:type="dxa" w:w="5112"/>
           </w:tcPr>
           <w:p>
             <w:r/>
@@ -3419,15 +3643,13 @@
                 <w:b w:val="0"/>
                 <w:sz w:val="19"/>
               </w:rPr>
-              <w:t>—</w:t>
-            </w:r>
-          </w:p>
-        </w:tc>
-      </w:tr>
-      <w:tr>
-        <w:tc>
-          <w:tcPr>
-            <w:tcW w:type="dxa" w:w="1512"/>
+              <w:t>Lab 2: Activity 2A — introduce Kopi Kaki; Hermes Desktop, features, tools and reviewed skills</w:t>
+            </w:r>
+          </w:p>
+        </w:tc>
+        <w:tc>
+          <w:tcPr>
+            <w:tcW w:type="dxa" w:w="864"/>
           </w:tcPr>
           <w:p>
             <w:r/>
@@ -3437,13 +3659,13 @@
                 <w:b w:val="0"/>
                 <w:sz w:val="19"/>
               </w:rPr>
-              <w:t>14:30–15:30</w:t>
-            </w:r>
-          </w:p>
-        </w:tc>
-        <w:tc>
-          <w:tcPr>
-            <w:tcW w:type="dxa" w:w="1080"/>
+              <w:t>LU1</w:t>
+            </w:r>
+          </w:p>
+        </w:tc>
+        <w:tc>
+          <w:tcPr>
+            <w:tcW w:type="dxa" w:w="1368"/>
           </w:tcPr>
           <w:p>
             <w:r/>
@@ -3453,13 +3675,15 @@
                 <w:b w:val="0"/>
                 <w:sz w:val="19"/>
               </w:rPr>
-              <w:t>60 min</w:t>
-            </w:r>
-          </w:p>
-        </w:tc>
-        <w:tc>
-          <w:tcPr>
-            <w:tcW w:type="dxa" w:w="5400"/>
+              <w:t>53–63</w:t>
+            </w:r>
+          </w:p>
+        </w:tc>
+      </w:tr>
+      <w:tr>
+        <w:tc>
+          <w:tcPr>
+            <w:tcW w:type="dxa" w:w="1440"/>
           </w:tcPr>
           <w:p>
             <w:r/>
@@ -3469,13 +3693,13 @@
                 <w:b w:val="0"/>
                 <w:sz w:val="19"/>
               </w:rPr>
-              <w:t>Lab 2: Activity 2A — introduce Kopi Kaki; Hermes Desktop, features, tools and reviewed skills</w:t>
-            </w:r>
-          </w:p>
-        </w:tc>
-        <w:tc>
-          <w:tcPr>
-            <w:tcW w:type="dxa" w:w="864"/>
+              <w:t>15:30–16:00</w:t>
+            </w:r>
+          </w:p>
+        </w:tc>
+        <w:tc>
+          <w:tcPr>
+            <w:tcW w:type="dxa" w:w="1080"/>
           </w:tcPr>
           <w:p>
             <w:r/>
@@ -3485,13 +3709,13 @@
                 <w:b w:val="0"/>
                 <w:sz w:val="19"/>
               </w:rPr>
-              <w:t>LU1</w:t>
-            </w:r>
-          </w:p>
-        </w:tc>
-        <w:tc>
-          <w:tcPr>
-            <w:tcW w:type="dxa" w:w="1008"/>
+              <w:t>30 min</w:t>
+            </w:r>
+          </w:p>
+        </w:tc>
+        <w:tc>
+          <w:tcPr>
+            <w:tcW w:type="dxa" w:w="5112"/>
           </w:tcPr>
           <w:p>
             <w:r/>
@@ -3501,15 +3725,13 @@
                 <w:b w:val="0"/>
                 <w:sz w:val="19"/>
               </w:rPr>
-              <w:t>85–100</w:t>
-            </w:r>
-          </w:p>
-        </w:tc>
-      </w:tr>
-      <w:tr>
-        <w:tc>
-          <w:tcPr>
-            <w:tcW w:type="dxa" w:w="1512"/>
+              <w:t>Lab 2: Activity 2B — install office/gog/video skills, verify tools and save the source brief</w:t>
+            </w:r>
+          </w:p>
+        </w:tc>
+        <w:tc>
+          <w:tcPr>
+            <w:tcW w:type="dxa" w:w="864"/>
           </w:tcPr>
           <w:p>
             <w:r/>
@@ -3519,13 +3741,13 @@
                 <w:b w:val="0"/>
                 <w:sz w:val="19"/>
               </w:rPr>
-              <w:t>15:30–16:00</w:t>
-            </w:r>
-          </w:p>
-        </w:tc>
-        <w:tc>
-          <w:tcPr>
-            <w:tcW w:type="dxa" w:w="1080"/>
+              <w:t>LU2</w:t>
+            </w:r>
+          </w:p>
+        </w:tc>
+        <w:tc>
+          <w:tcPr>
+            <w:tcW w:type="dxa" w:w="1368"/>
           </w:tcPr>
           <w:p>
             <w:r/>
@@ -3535,13 +3757,16 @@
                 <w:b w:val="0"/>
                 <w:sz w:val="19"/>
               </w:rPr>
-              <w:t>30 min</w:t>
-            </w:r>
-          </w:p>
-        </w:tc>
-        <w:tc>
-          <w:tcPr>
-            <w:tcW w:type="dxa" w:w="5400"/>
+              <w:t>64–68</w:t>
+            </w:r>
+          </w:p>
+        </w:tc>
+      </w:tr>
+      <w:tr>
+        <w:tc>
+          <w:tcPr>
+            <w:tcW w:type="dxa" w:w="1440"/>
+            <w:shd w:val="clear" w:color="auto" w:fill="FFF4E5"/>
           </w:tcPr>
           <w:p>
             <w:r/>
@@ -3551,13 +3776,14 @@
                 <w:b w:val="0"/>
                 <w:sz w:val="19"/>
               </w:rPr>
-              <w:t>Lab 2: Activity 2B — install office/gog/video skills, verify tools and save the source brief</w:t>
-            </w:r>
-          </w:p>
-        </w:tc>
-        <w:tc>
-          <w:tcPr>
-            <w:tcW w:type="dxa" w:w="864"/>
+              <w:t>16:00–16:15</w:t>
+            </w:r>
+          </w:p>
+        </w:tc>
+        <w:tc>
+          <w:tcPr>
+            <w:tcW w:type="dxa" w:w="1080"/>
+            <w:shd w:val="clear" w:color="auto" w:fill="FFF4E5"/>
           </w:tcPr>
           <w:p>
             <w:r/>
@@ -3567,13 +3793,14 @@
                 <w:b w:val="0"/>
                 <w:sz w:val="19"/>
               </w:rPr>
-              <w:t>LU2</w:t>
-            </w:r>
-          </w:p>
-        </w:tc>
-        <w:tc>
-          <w:tcPr>
-            <w:tcW w:type="dxa" w:w="1008"/>
+              <w:t>15 min</w:t>
+            </w:r>
+          </w:p>
+        </w:tc>
+        <w:tc>
+          <w:tcPr>
+            <w:tcW w:type="dxa" w:w="5112"/>
+            <w:shd w:val="clear" w:color="auto" w:fill="FFF4E5"/>
           </w:tcPr>
           <w:p>
             <w:r/>
@@ -3583,15 +3810,13 @@
                 <w:b w:val="0"/>
                 <w:sz w:val="19"/>
               </w:rPr>
-              <w:t>101–106</w:t>
-            </w:r>
-          </w:p>
-        </w:tc>
-      </w:tr>
-      <w:tr>
-        <w:tc>
-          <w:tcPr>
-            <w:tcW w:type="dxa" w:w="1512"/>
+              <w:t>Tea break (included in scheduled LU time)</w:t>
+            </w:r>
+          </w:p>
+        </w:tc>
+        <w:tc>
+          <w:tcPr>
+            <w:tcW w:type="dxa" w:w="864"/>
             <w:shd w:val="clear" w:color="auto" w:fill="FFF4E5"/>
           </w:tcPr>
           <w:p>
@@ -3602,13 +3827,13 @@
                 <w:b w:val="0"/>
                 <w:sz w:val="19"/>
               </w:rPr>
-              <w:t>16:00–16:15</w:t>
-            </w:r>
-          </w:p>
-        </w:tc>
-        <w:tc>
-          <w:tcPr>
-            <w:tcW w:type="dxa" w:w="1080"/>
+              <w:t>LU2</w:t>
+            </w:r>
+          </w:p>
+        </w:tc>
+        <w:tc>
+          <w:tcPr>
+            <w:tcW w:type="dxa" w:w="1368"/>
             <w:shd w:val="clear" w:color="auto" w:fill="FFF4E5"/>
           </w:tcPr>
           <w:p>
@@ -3619,14 +3844,15 @@
                 <w:b w:val="0"/>
                 <w:sz w:val="19"/>
               </w:rPr>
-              <w:t>15 min</w:t>
-            </w:r>
-          </w:p>
-        </w:tc>
-        <w:tc>
-          <w:tcPr>
-            <w:tcW w:type="dxa" w:w="5400"/>
-            <w:shd w:val="clear" w:color="auto" w:fill="FFF4E5"/>
+              <w:t>—</w:t>
+            </w:r>
+          </w:p>
+        </w:tc>
+      </w:tr>
+      <w:tr>
+        <w:tc>
+          <w:tcPr>
+            <w:tcW w:type="dxa" w:w="1440"/>
           </w:tcPr>
           <w:p>
             <w:r/>
@@ -3636,14 +3862,13 @@
                 <w:b w:val="0"/>
                 <w:sz w:val="19"/>
               </w:rPr>
-              <w:t>Tea break (included in scheduled LU time)</w:t>
-            </w:r>
-          </w:p>
-        </w:tc>
-        <w:tc>
-          <w:tcPr>
-            <w:tcW w:type="dxa" w:w="864"/>
-            <w:shd w:val="clear" w:color="auto" w:fill="FFF4E5"/>
+              <w:t>16:15–17:05</w:t>
+            </w:r>
+          </w:p>
+        </w:tc>
+        <w:tc>
+          <w:tcPr>
+            <w:tcW w:type="dxa" w:w="1080"/>
           </w:tcPr>
           <w:p>
             <w:r/>
@@ -3653,14 +3878,13 @@
                 <w:b w:val="0"/>
                 <w:sz w:val="19"/>
               </w:rPr>
-              <w:t>LU2</w:t>
-            </w:r>
-          </w:p>
-        </w:tc>
-        <w:tc>
-          <w:tcPr>
-            <w:tcW w:type="dxa" w:w="1008"/>
-            <w:shd w:val="clear" w:color="auto" w:fill="FFF4E5"/>
+              <w:t>50 min</w:t>
+            </w:r>
+          </w:p>
+        </w:tc>
+        <w:tc>
+          <w:tcPr>
+            <w:tcW w:type="dxa" w:w="5112"/>
           </w:tcPr>
           <w:p>
             <w:r/>
@@ -3670,15 +3894,13 @@
                 <w:b w:val="0"/>
                 <w:sz w:val="19"/>
               </w:rPr>
-              <w:t>—</w:t>
-            </w:r>
-          </w:p>
-        </w:tc>
-      </w:tr>
-      <w:tr>
-        <w:tc>
-          <w:tcPr>
-            <w:tcW w:type="dxa" w:w="1512"/>
+              <w:t>Lab 3: Activity 3 — Hermes gog Gmail/Calendar/Drive and verified Excel analysis</w:t>
+            </w:r>
+          </w:p>
+        </w:tc>
+        <w:tc>
+          <w:tcPr>
+            <w:tcW w:type="dxa" w:w="864"/>
           </w:tcPr>
           <w:p>
             <w:r/>
@@ -3688,13 +3910,13 @@
                 <w:b w:val="0"/>
                 <w:sz w:val="19"/>
               </w:rPr>
-              <w:t>16:15–17:05</w:t>
-            </w:r>
-          </w:p>
-        </w:tc>
-        <w:tc>
-          <w:tcPr>
-            <w:tcW w:type="dxa" w:w="1080"/>
+              <w:t>LU2</w:t>
+            </w:r>
+          </w:p>
+        </w:tc>
+        <w:tc>
+          <w:tcPr>
+            <w:tcW w:type="dxa" w:w="1368"/>
           </w:tcPr>
           <w:p>
             <w:r/>
@@ -3704,13 +3926,15 @@
                 <w:b w:val="0"/>
                 <w:sz w:val="19"/>
               </w:rPr>
-              <w:t>50 min</w:t>
-            </w:r>
-          </w:p>
-        </w:tc>
-        <w:tc>
-          <w:tcPr>
-            <w:tcW w:type="dxa" w:w="5400"/>
+              <w:t>69–78</w:t>
+            </w:r>
+          </w:p>
+        </w:tc>
+      </w:tr>
+      <w:tr>
+        <w:tc>
+          <w:tcPr>
+            <w:tcW w:type="dxa" w:w="1440"/>
           </w:tcPr>
           <w:p>
             <w:r/>
@@ -3720,13 +3944,13 @@
                 <w:b w:val="0"/>
                 <w:sz w:val="19"/>
               </w:rPr>
-              <w:t>Lab 3: Activity 3 — Hermes gog Gmail/Calendar/Drive and verified Excel analysis</w:t>
-            </w:r>
-          </w:p>
-        </w:tc>
-        <w:tc>
-          <w:tcPr>
-            <w:tcW w:type="dxa" w:w="864"/>
+              <w:t>17:05–17:45</w:t>
+            </w:r>
+          </w:p>
+        </w:tc>
+        <w:tc>
+          <w:tcPr>
+            <w:tcW w:type="dxa" w:w="1080"/>
           </w:tcPr>
           <w:p>
             <w:r/>
@@ -3736,13 +3960,13 @@
                 <w:b w:val="0"/>
                 <w:sz w:val="19"/>
               </w:rPr>
-              <w:t>LU2</w:t>
-            </w:r>
-          </w:p>
-        </w:tc>
-        <w:tc>
-          <w:tcPr>
-            <w:tcW w:type="dxa" w:w="1008"/>
+              <w:t>40 min</w:t>
+            </w:r>
+          </w:p>
+        </w:tc>
+        <w:tc>
+          <w:tcPr>
+            <w:tcW w:type="dxa" w:w="5112"/>
           </w:tcPr>
           <w:p>
             <w:r/>
@@ -3752,15 +3976,13 @@
                 <w:b w:val="0"/>
                 <w:sz w:val="19"/>
               </w:rPr>
-              <w:t>107–123</w:t>
-            </w:r>
-          </w:p>
-        </w:tc>
-      </w:tr>
-      <w:tr>
-        <w:tc>
-          <w:tcPr>
-            <w:tcW w:type="dxa" w:w="1512"/>
+              <w:t>Lab 4: Activity 4A — interactive dashboard and professional PPT (PP Task 2; PP Task 1 image B)</w:t>
+            </w:r>
+          </w:p>
+        </w:tc>
+        <w:tc>
+          <w:tcPr>
+            <w:tcW w:type="dxa" w:w="864"/>
           </w:tcPr>
           <w:p>
             <w:r/>
@@ -3770,13 +3992,13 @@
                 <w:b w:val="0"/>
                 <w:sz w:val="19"/>
               </w:rPr>
-              <w:t>17:05–17:45</w:t>
-            </w:r>
-          </w:p>
-        </w:tc>
-        <w:tc>
-          <w:tcPr>
-            <w:tcW w:type="dxa" w:w="1080"/>
+              <w:t>LU2</w:t>
+            </w:r>
+          </w:p>
+        </w:tc>
+        <w:tc>
+          <w:tcPr>
+            <w:tcW w:type="dxa" w:w="1368"/>
           </w:tcPr>
           <w:p>
             <w:r/>
@@ -3786,13 +4008,15 @@
                 <w:b w:val="0"/>
                 <w:sz w:val="19"/>
               </w:rPr>
-              <w:t>40 min</w:t>
-            </w:r>
-          </w:p>
-        </w:tc>
-        <w:tc>
-          <w:tcPr>
-            <w:tcW w:type="dxa" w:w="5400"/>
+              <w:t>79–94</w:t>
+            </w:r>
+          </w:p>
+        </w:tc>
+      </w:tr>
+      <w:tr>
+        <w:tc>
+          <w:tcPr>
+            <w:tcW w:type="dxa" w:w="1440"/>
           </w:tcPr>
           <w:p>
             <w:r/>
@@ -3802,13 +4026,13 @@
                 <w:b w:val="0"/>
                 <w:sz w:val="19"/>
               </w:rPr>
-              <w:t>Lab 4: Activity 4A — interactive dashboard and professional PPT (PP Task 2; PP Task 1 image B)</w:t>
-            </w:r>
-          </w:p>
-        </w:tc>
-        <w:tc>
-          <w:tcPr>
-            <w:tcW w:type="dxa" w:w="864"/>
+              <w:t>17:45–18:15</w:t>
+            </w:r>
+          </w:p>
+        </w:tc>
+        <w:tc>
+          <w:tcPr>
+            <w:tcW w:type="dxa" w:w="1080"/>
           </w:tcPr>
           <w:p>
             <w:r/>
@@ -3818,13 +4042,13 @@
                 <w:b w:val="0"/>
                 <w:sz w:val="19"/>
               </w:rPr>
-              <w:t>LU2</w:t>
-            </w:r>
-          </w:p>
-        </w:tc>
-        <w:tc>
-          <w:tcPr>
-            <w:tcW w:type="dxa" w:w="1008"/>
+              <w:t>30 min</w:t>
+            </w:r>
+          </w:p>
+        </w:tc>
+        <w:tc>
+          <w:tcPr>
+            <w:tcW w:type="dxa" w:w="5112"/>
           </w:tcPr>
           <w:p>
             <w:r/>
@@ -3834,15 +4058,13 @@
                 <w:b w:val="0"/>
                 <w:sz w:val="19"/>
               </w:rPr>
-              <w:t>124–144</w:t>
-            </w:r>
-          </w:p>
-        </w:tc>
-      </w:tr>
-      <w:tr>
-        <w:tc>
-          <w:tcPr>
-            <w:tcW w:type="dxa" w:w="1512"/>
+              <w:t>Lab 4: Activity 4B — single-agent video, exact-version review and one approved test email with Sent readback</w:t>
+            </w:r>
+          </w:p>
+        </w:tc>
+        <w:tc>
+          <w:tcPr>
+            <w:tcW w:type="dxa" w:w="864"/>
           </w:tcPr>
           <w:p>
             <w:r/>
@@ -3852,13 +4074,13 @@
                 <w:b w:val="0"/>
                 <w:sz w:val="19"/>
               </w:rPr>
-              <w:t>17:45–18:15</w:t>
-            </w:r>
-          </w:p>
-        </w:tc>
-        <w:tc>
-          <w:tcPr>
-            <w:tcW w:type="dxa" w:w="1080"/>
+              <w:t>LU2</w:t>
+            </w:r>
+          </w:p>
+        </w:tc>
+        <w:tc>
+          <w:tcPr>
+            <w:tcW w:type="dxa" w:w="1368"/>
           </w:tcPr>
           <w:p>
             <w:r/>
@@ -3868,13 +4090,16 @@
                 <w:b w:val="0"/>
                 <w:sz w:val="19"/>
               </w:rPr>
-              <w:t>30 min</w:t>
-            </w:r>
-          </w:p>
-        </w:tc>
-        <w:tc>
-          <w:tcPr>
-            <w:tcW w:type="dxa" w:w="5400"/>
+              <w:t>79–94</w:t>
+            </w:r>
+          </w:p>
+        </w:tc>
+      </w:tr>
+      <w:tr>
+        <w:tc>
+          <w:tcPr>
+            <w:tcW w:type="dxa" w:w="1440"/>
+            <w:shd w:val="clear" w:color="auto" w:fill="F3F5F8"/>
           </w:tcPr>
           <w:p>
             <w:r/>
@@ -3884,13 +4109,14 @@
                 <w:b w:val="0"/>
                 <w:sz w:val="19"/>
               </w:rPr>
-              <w:t>Lab 4: Activity 4B — single-agent video, exact-version review and one approved test email with Sent readback</w:t>
-            </w:r>
-          </w:p>
-        </w:tc>
-        <w:tc>
-          <w:tcPr>
-            <w:tcW w:type="dxa" w:w="864"/>
+              <w:t>18:15–18:30</w:t>
+            </w:r>
+          </w:p>
+        </w:tc>
+        <w:tc>
+          <w:tcPr>
+            <w:tcW w:type="dxa" w:w="1080"/>
+            <w:shd w:val="clear" w:color="auto" w:fill="F3F5F8"/>
           </w:tcPr>
           <w:p>
             <w:r/>
@@ -3900,13 +4126,14 @@
                 <w:b w:val="0"/>
                 <w:sz w:val="19"/>
               </w:rPr>
-              <w:t>LU2</w:t>
-            </w:r>
-          </w:p>
-        </w:tc>
-        <w:tc>
-          <w:tcPr>
-            <w:tcW w:type="dxa" w:w="1008"/>
+              <w:t>15 min</w:t>
+            </w:r>
+          </w:p>
+        </w:tc>
+        <w:tc>
+          <w:tcPr>
+            <w:tcW w:type="dxa" w:w="5112"/>
+            <w:shd w:val="clear" w:color="auto" w:fill="F3F5F8"/>
           </w:tcPr>
           <w:p>
             <w:r/>
@@ -3916,15 +4143,13 @@
                 <w:b w:val="0"/>
                 <w:sz w:val="19"/>
               </w:rPr>
-              <w:t>124–144</w:t>
-            </w:r>
-          </w:p>
-        </w:tc>
-      </w:tr>
-      <w:tr>
-        <w:tc>
-          <w:tcPr>
-            <w:tcW w:type="dxa" w:w="1512"/>
+              <w:t>Day 1 recap, Q&amp;A and PM digital attendance</w:t>
+            </w:r>
+          </w:p>
+        </w:tc>
+        <w:tc>
+          <w:tcPr>
+            <w:tcW w:type="dxa" w:w="864"/>
             <w:shd w:val="clear" w:color="auto" w:fill="F3F5F8"/>
           </w:tcPr>
           <w:p>
@@ -3935,13 +4160,13 @@
                 <w:b w:val="0"/>
                 <w:sz w:val="19"/>
               </w:rPr>
-              <w:t>18:15–18:30</w:t>
-            </w:r>
-          </w:p>
-        </w:tc>
-        <w:tc>
-          <w:tcPr>
-            <w:tcW w:type="dxa" w:w="1080"/>
+              <w:t>LU2</w:t>
+            </w:r>
+          </w:p>
+        </w:tc>
+        <w:tc>
+          <w:tcPr>
+            <w:tcW w:type="dxa" w:w="1368"/>
             <w:shd w:val="clear" w:color="auto" w:fill="F3F5F8"/>
           </w:tcPr>
           <w:p>
@@ -3952,58 +4177,7 @@
                 <w:b w:val="0"/>
                 <w:sz w:val="19"/>
               </w:rPr>
-              <w:t>15 min</w:t>
-            </w:r>
-          </w:p>
-        </w:tc>
-        <w:tc>
-          <w:tcPr>
-            <w:tcW w:type="dxa" w:w="5400"/>
-            <w:shd w:val="clear" w:color="auto" w:fill="F3F5F8"/>
-          </w:tcPr>
-          <w:p>
-            <w:r/>
-            <w:r>
-              <w:rPr>
-                <w:rFonts w:ascii="Arial" w:hAnsi="Arial"/>
-                <w:b w:val="0"/>
-                <w:sz w:val="19"/>
-              </w:rPr>
-              <w:t>Day 1 recap, Q&amp;A and PM digital attendance</w:t>
-            </w:r>
-          </w:p>
-        </w:tc>
-        <w:tc>
-          <w:tcPr>
-            <w:tcW w:type="dxa" w:w="864"/>
-            <w:shd w:val="clear" w:color="auto" w:fill="F3F5F8"/>
-          </w:tcPr>
-          <w:p>
-            <w:r/>
-            <w:r>
-              <w:rPr>
-                <w:rFonts w:ascii="Arial" w:hAnsi="Arial"/>
-                <w:b w:val="0"/>
-                <w:sz w:val="19"/>
-              </w:rPr>
-              <w:t>LU2</w:t>
-            </w:r>
-          </w:p>
-        </w:tc>
-        <w:tc>
-          <w:tcPr>
-            <w:tcW w:type="dxa" w:w="1008"/>
-            <w:shd w:val="clear" w:color="auto" w:fill="F3F5F8"/>
-          </w:tcPr>
-          <w:p>
-            <w:r/>
-            <w:r>
-              <w:rPr>
-                <w:rFonts w:ascii="Arial" w:hAnsi="Arial"/>
-                <w:b w:val="0"/>
-                <w:sz w:val="19"/>
-              </w:rPr>
-              <w:t>145–150</w:t>
+              <w:t>95</w:t>
             </w:r>
           </w:p>
         </w:tc>
@@ -4036,16 +4210,16 @@
         <w:tblLayout w:type="fixed"/>
       </w:tblPr>
       <w:tblGrid>
-        <w:gridCol w:w="1512"/>
+        <w:gridCol w:w="1440"/>
         <w:gridCol w:w="1080"/>
-        <w:gridCol w:w="5400"/>
+        <w:gridCol w:w="5112"/>
         <w:gridCol w:w="864"/>
-        <w:gridCol w:w="1007"/>
+        <w:gridCol w:w="1368"/>
       </w:tblGrid>
       <w:tr>
         <w:tc>
           <w:tcPr>
-            <w:tcW w:type="dxa" w:w="1512"/>
+            <w:tcW w:type="dxa" w:w="1440"/>
             <w:shd w:val="clear" w:color="auto" w:fill="1F6FEB"/>
           </w:tcPr>
           <w:p>
@@ -4081,7 +4255,7 @@
         </w:tc>
         <w:tc>
           <w:tcPr>
-            <w:tcW w:type="dxa" w:w="5400"/>
+            <w:tcW w:type="dxa" w:w="5112"/>
             <w:shd w:val="clear" w:color="auto" w:fill="1F6FEB"/>
           </w:tcPr>
           <w:p>
@@ -4117,7 +4291,7 @@
         </w:tc>
         <w:tc>
           <w:tcPr>
-            <w:tcW w:type="dxa" w:w="1008"/>
+            <w:tcW w:type="dxa" w:w="1368"/>
             <w:shd w:val="clear" w:color="auto" w:fill="1F6FEB"/>
           </w:tcPr>
           <w:p>
@@ -4137,7 +4311,7 @@
       <w:tr>
         <w:tc>
           <w:tcPr>
-            <w:tcW w:type="dxa" w:w="1512"/>
+            <w:tcW w:type="dxa" w:w="1440"/>
             <w:shd w:val="clear" w:color="auto" w:fill="F3F5F8"/>
           </w:tcPr>
           <w:p>
@@ -4171,7 +4345,7 @@
         </w:tc>
         <w:tc>
           <w:tcPr>
-            <w:tcW w:type="dxa" w:w="5400"/>
+            <w:tcW w:type="dxa" w:w="5112"/>
             <w:shd w:val="clear" w:color="auto" w:fill="F3F5F8"/>
           </w:tcPr>
           <w:p>
@@ -4205,7 +4379,7 @@
         </w:tc>
         <w:tc>
           <w:tcPr>
-            <w:tcW w:type="dxa" w:w="1008"/>
+            <w:tcW w:type="dxa" w:w="1368"/>
             <w:shd w:val="clear" w:color="auto" w:fill="F3F5F8"/>
           </w:tcPr>
           <w:p>
@@ -4216,7 +4390,7 @@
                 <w:b w:val="0"/>
                 <w:sz w:val="19"/>
               </w:rPr>
-              <w:t>150–152</w:t>
+              <w:t>95</w:t>
             </w:r>
           </w:p>
         </w:tc>
@@ -4224,7 +4398,7 @@
       <w:tr>
         <w:tc>
           <w:tcPr>
-            <w:tcW w:type="dxa" w:w="1512"/>
+            <w:tcW w:type="dxa" w:w="1440"/>
           </w:tcPr>
           <w:p>
             <w:r/>
@@ -4256,7 +4430,7 @@
         </w:tc>
         <w:tc>
           <w:tcPr>
-            <w:tcW w:type="dxa" w:w="5400"/>
+            <w:tcW w:type="dxa" w:w="5112"/>
           </w:tcPr>
           <w:p>
             <w:r/>
@@ -4288,7 +4462,7 @@
         </w:tc>
         <w:tc>
           <w:tcPr>
-            <w:tcW w:type="dxa" w:w="1008"/>
+            <w:tcW w:type="dxa" w:w="1368"/>
           </w:tcPr>
           <w:p>
             <w:r/>
@@ -4298,7 +4472,7 @@
                 <w:b w:val="0"/>
                 <w:sz w:val="19"/>
               </w:rPr>
-              <w:t>153–175</w:t>
+              <w:t>96–109</w:t>
             </w:r>
           </w:p>
         </w:tc>
@@ -4306,7 +4480,7 @@
       <w:tr>
         <w:tc>
           <w:tcPr>
-            <w:tcW w:type="dxa" w:w="1512"/>
+            <w:tcW w:type="dxa" w:w="1440"/>
           </w:tcPr>
           <w:p>
             <w:r/>
@@ -4338,7 +4512,7 @@
         </w:tc>
         <w:tc>
           <w:tcPr>
-            <w:tcW w:type="dxa" w:w="5400"/>
+            <w:tcW w:type="dxa" w:w="5112"/>
           </w:tcPr>
           <w:p>
             <w:r/>
@@ -4370,7 +4544,7 @@
         </w:tc>
         <w:tc>
           <w:tcPr>
-            <w:tcW w:type="dxa" w:w="1008"/>
+            <w:tcW w:type="dxa" w:w="1368"/>
           </w:tcPr>
           <w:p>
             <w:r/>
@@ -4380,7 +4554,7 @@
                 <w:b w:val="0"/>
                 <w:sz w:val="19"/>
               </w:rPr>
-              <w:t>153–175</w:t>
+              <w:t>96–109</w:t>
             </w:r>
           </w:p>
         </w:tc>
@@ -4388,7 +4562,7 @@
       <w:tr>
         <w:tc>
           <w:tcPr>
-            <w:tcW w:type="dxa" w:w="1512"/>
+            <w:tcW w:type="dxa" w:w="1440"/>
             <w:shd w:val="clear" w:color="auto" w:fill="FFF4E5"/>
           </w:tcPr>
           <w:p>
@@ -4422,7 +4596,7 @@
         </w:tc>
         <w:tc>
           <w:tcPr>
-            <w:tcW w:type="dxa" w:w="5400"/>
+            <w:tcW w:type="dxa" w:w="5112"/>
             <w:shd w:val="clear" w:color="auto" w:fill="FFF4E5"/>
           </w:tcPr>
           <w:p>
@@ -4456,7 +4630,7 @@
         </w:tc>
         <w:tc>
           <w:tcPr>
-            <w:tcW w:type="dxa" w:w="1008"/>
+            <w:tcW w:type="dxa" w:w="1368"/>
             <w:shd w:val="clear" w:color="auto" w:fill="FFF4E5"/>
           </w:tcPr>
           <w:p>
@@ -4475,7 +4649,7 @@
       <w:tr>
         <w:tc>
           <w:tcPr>
-            <w:tcW w:type="dxa" w:w="1512"/>
+            <w:tcW w:type="dxa" w:w="1440"/>
             <w:shd w:val="clear" w:color="auto" w:fill="E8F0FE"/>
           </w:tcPr>
           <w:p>
@@ -4509,7 +4683,7 @@
         </w:tc>
         <w:tc>
           <w:tcPr>
-            <w:tcW w:type="dxa" w:w="5400"/>
+            <w:tcW w:type="dxa" w:w="5112"/>
             <w:shd w:val="clear" w:color="auto" w:fill="E8F0FE"/>
           </w:tcPr>
           <w:p>
@@ -4543,7 +4717,7 @@
         </w:tc>
         <w:tc>
           <w:tcPr>
-            <w:tcW w:type="dxa" w:w="1008"/>
+            <w:tcW w:type="dxa" w:w="1368"/>
             <w:shd w:val="clear" w:color="auto" w:fill="E8F0FE"/>
           </w:tcPr>
           <w:p>
@@ -4554,7 +4728,7 @@
                 <w:b w:val="0"/>
                 <w:sz w:val="19"/>
               </w:rPr>
-              <w:t>176</w:t>
+              <w:t>110</w:t>
             </w:r>
           </w:p>
         </w:tc>
@@ -4562,7 +4736,7 @@
       <w:tr>
         <w:tc>
           <w:tcPr>
-            <w:tcW w:type="dxa" w:w="1512"/>
+            <w:tcW w:type="dxa" w:w="1440"/>
           </w:tcPr>
           <w:p>
             <w:r/>
@@ -4594,7 +4768,7 @@
         </w:tc>
         <w:tc>
           <w:tcPr>
-            <w:tcW w:type="dxa" w:w="5400"/>
+            <w:tcW w:type="dxa" w:w="5112"/>
           </w:tcPr>
           <w:p>
             <w:r/>
@@ -4626,7 +4800,7 @@
         </w:tc>
         <w:tc>
           <w:tcPr>
-            <w:tcW w:type="dxa" w:w="1008"/>
+            <w:tcW w:type="dxa" w:w="1368"/>
           </w:tcPr>
           <w:p>
             <w:r/>
@@ -4636,7 +4810,7 @@
                 <w:b w:val="0"/>
                 <w:sz w:val="19"/>
               </w:rPr>
-              <w:t>177–187</w:t>
+              <w:t>111–118</w:t>
             </w:r>
           </w:p>
         </w:tc>
@@ -4644,7 +4818,7 @@
       <w:tr>
         <w:tc>
           <w:tcPr>
-            <w:tcW w:type="dxa" w:w="1512"/>
+            <w:tcW w:type="dxa" w:w="1440"/>
             <w:shd w:val="clear" w:color="auto" w:fill="FDE9D9"/>
           </w:tcPr>
           <w:p>
@@ -4678,7 +4852,7 @@
         </w:tc>
         <w:tc>
           <w:tcPr>
-            <w:tcW w:type="dxa" w:w="5400"/>
+            <w:tcW w:type="dxa" w:w="5112"/>
             <w:shd w:val="clear" w:color="auto" w:fill="FDE9D9"/>
           </w:tcPr>
           <w:p>
@@ -4712,7 +4886,7 @@
         </w:tc>
         <w:tc>
           <w:tcPr>
-            <w:tcW w:type="dxa" w:w="1008"/>
+            <w:tcW w:type="dxa" w:w="1368"/>
             <w:shd w:val="clear" w:color="auto" w:fill="FDE9D9"/>
           </w:tcPr>
           <w:p>
@@ -4731,7 +4905,7 @@
       <w:tr>
         <w:tc>
           <w:tcPr>
-            <w:tcW w:type="dxa" w:w="1512"/>
+            <w:tcW w:type="dxa" w:w="1440"/>
           </w:tcPr>
           <w:p>
             <w:r/>
@@ -4763,7 +4937,7 @@
         </w:tc>
         <w:tc>
           <w:tcPr>
-            <w:tcW w:type="dxa" w:w="5400"/>
+            <w:tcW w:type="dxa" w:w="5112"/>
           </w:tcPr>
           <w:p>
             <w:r/>
@@ -4795,7 +4969,7 @@
         </w:tc>
         <w:tc>
           <w:tcPr>
-            <w:tcW w:type="dxa" w:w="1008"/>
+            <w:tcW w:type="dxa" w:w="1368"/>
           </w:tcPr>
           <w:p>
             <w:r/>
@@ -4805,7 +4979,7 @@
                 <w:b w:val="0"/>
                 <w:sz w:val="19"/>
               </w:rPr>
-              <w:t>188–198</w:t>
+              <w:t>119–126</w:t>
             </w:r>
           </w:p>
         </w:tc>
@@ -4813,7 +4987,7 @@
       <w:tr>
         <w:tc>
           <w:tcPr>
-            <w:tcW w:type="dxa" w:w="1512"/>
+            <w:tcW w:type="dxa" w:w="1440"/>
           </w:tcPr>
           <w:p>
             <w:r/>
@@ -4845,7 +5019,7 @@
         </w:tc>
         <w:tc>
           <w:tcPr>
-            <w:tcW w:type="dxa" w:w="5400"/>
+            <w:tcW w:type="dxa" w:w="5112"/>
           </w:tcPr>
           <w:p>
             <w:r/>
@@ -4877,7 +5051,7 @@
         </w:tc>
         <w:tc>
           <w:tcPr>
-            <w:tcW w:type="dxa" w:w="1008"/>
+            <w:tcW w:type="dxa" w:w="1368"/>
           </w:tcPr>
           <w:p>
             <w:r/>
@@ -4887,7 +5061,7 @@
                 <w:b w:val="0"/>
                 <w:sz w:val="19"/>
               </w:rPr>
-              <w:t>199–214</w:t>
+              <w:t>127–138</w:t>
             </w:r>
           </w:p>
         </w:tc>
@@ -4895,7 +5069,7 @@
       <w:tr>
         <w:tc>
           <w:tcPr>
-            <w:tcW w:type="dxa" w:w="1512"/>
+            <w:tcW w:type="dxa" w:w="1440"/>
           </w:tcPr>
           <w:p>
             <w:r/>
@@ -4927,7 +5101,7 @@
         </w:tc>
         <w:tc>
           <w:tcPr>
-            <w:tcW w:type="dxa" w:w="5400"/>
+            <w:tcW w:type="dxa" w:w="5112"/>
           </w:tcPr>
           <w:p>
             <w:r/>
@@ -4959,7 +5133,7 @@
         </w:tc>
         <w:tc>
           <w:tcPr>
-            <w:tcW w:type="dxa" w:w="1008"/>
+            <w:tcW w:type="dxa" w:w="1368"/>
           </w:tcPr>
           <w:p>
             <w:r/>
@@ -4969,7 +5143,7 @@
                 <w:b w:val="0"/>
                 <w:sz w:val="19"/>
               </w:rPr>
-              <w:t>199–214</w:t>
+              <w:t>127–138</w:t>
             </w:r>
           </w:p>
         </w:tc>
@@ -4977,7 +5151,7 @@
       <w:tr>
         <w:tc>
           <w:tcPr>
-            <w:tcW w:type="dxa" w:w="1512"/>
+            <w:tcW w:type="dxa" w:w="1440"/>
             <w:shd w:val="clear" w:color="auto" w:fill="FFF4E5"/>
           </w:tcPr>
           <w:p>
@@ -5011,7 +5185,7 @@
         </w:tc>
         <w:tc>
           <w:tcPr>
-            <w:tcW w:type="dxa" w:w="5400"/>
+            <w:tcW w:type="dxa" w:w="5112"/>
             <w:shd w:val="clear" w:color="auto" w:fill="FFF4E5"/>
           </w:tcPr>
           <w:p>
@@ -5045,7 +5219,7 @@
         </w:tc>
         <w:tc>
           <w:tcPr>
-            <w:tcW w:type="dxa" w:w="1008"/>
+            <w:tcW w:type="dxa" w:w="1368"/>
             <w:shd w:val="clear" w:color="auto" w:fill="FFF4E5"/>
           </w:tcPr>
           <w:p>
@@ -5064,7 +5238,7 @@
       <w:tr>
         <w:tc>
           <w:tcPr>
-            <w:tcW w:type="dxa" w:w="1512"/>
+            <w:tcW w:type="dxa" w:w="1440"/>
           </w:tcPr>
           <w:p>
             <w:r/>
@@ -5096,7 +5270,7 @@
         </w:tc>
         <w:tc>
           <w:tcPr>
-            <w:tcW w:type="dxa" w:w="5400"/>
+            <w:tcW w:type="dxa" w:w="5112"/>
           </w:tcPr>
           <w:p>
             <w:r/>
@@ -5128,7 +5302,7 @@
         </w:tc>
         <w:tc>
           <w:tcPr>
-            <w:tcW w:type="dxa" w:w="1008"/>
+            <w:tcW w:type="dxa" w:w="1368"/>
           </w:tcPr>
           <w:p>
             <w:r/>
@@ -5138,7 +5312,7 @@
                 <w:b w:val="0"/>
                 <w:sz w:val="19"/>
               </w:rPr>
-              <w:t>199–214</w:t>
+              <w:t>127–138</w:t>
             </w:r>
           </w:p>
         </w:tc>
@@ -5146,7 +5320,7 @@
       <w:tr>
         <w:tc>
           <w:tcPr>
-            <w:tcW w:type="dxa" w:w="1512"/>
+            <w:tcW w:type="dxa" w:w="1440"/>
             <w:shd w:val="clear" w:color="auto" w:fill="F3F5F8"/>
           </w:tcPr>
           <w:p>
@@ -5180,7 +5354,7 @@
         </w:tc>
         <w:tc>
           <w:tcPr>
-            <w:tcW w:type="dxa" w:w="5400"/>
+            <w:tcW w:type="dxa" w:w="5112"/>
             <w:shd w:val="clear" w:color="auto" w:fill="F3F5F8"/>
           </w:tcPr>
           <w:p>
@@ -5214,7 +5388,7 @@
         </w:tc>
         <w:tc>
           <w:tcPr>
-            <w:tcW w:type="dxa" w:w="1008"/>
+            <w:tcW w:type="dxa" w:w="1368"/>
             <w:shd w:val="clear" w:color="auto" w:fill="F3F5F8"/>
           </w:tcPr>
           <w:p>
@@ -5225,7 +5399,7 @@
                 <w:b w:val="0"/>
                 <w:sz w:val="19"/>
               </w:rPr>
-              <w:t>215–219</w:t>
+              <w:t>139–142</w:t>
             </w:r>
           </w:p>
         </w:tc>
@@ -5233,7 +5407,7 @@
       <w:tr>
         <w:tc>
           <w:tcPr>
-            <w:tcW w:type="dxa" w:w="1512"/>
+            <w:tcW w:type="dxa" w:w="1440"/>
             <w:shd w:val="clear" w:color="auto" w:fill="E8F7EE"/>
           </w:tcPr>
           <w:p>
@@ -5267,7 +5441,7 @@
         </w:tc>
         <w:tc>
           <w:tcPr>
-            <w:tcW w:type="dxa" w:w="5400"/>
+            <w:tcW w:type="dxa" w:w="5112"/>
             <w:shd w:val="clear" w:color="auto" w:fill="E8F7EE"/>
           </w:tcPr>
           <w:p>
@@ -5301,7 +5475,7 @@
         </w:tc>
         <w:tc>
           <w:tcPr>
-            <w:tcW w:type="dxa" w:w="1008"/>
+            <w:tcW w:type="dxa" w:w="1368"/>
             <w:shd w:val="clear" w:color="auto" w:fill="E8F7EE"/>
           </w:tcPr>
           <w:p>
@@ -5320,7 +5494,7 @@
       <w:tr>
         <w:tc>
           <w:tcPr>
-            <w:tcW w:type="dxa" w:w="1512"/>
+            <w:tcW w:type="dxa" w:w="1440"/>
             <w:shd w:val="clear" w:color="auto" w:fill="E8F7EE"/>
           </w:tcPr>
           <w:p>
@@ -5354,7 +5528,7 @@
         </w:tc>
         <w:tc>
           <w:tcPr>
-            <w:tcW w:type="dxa" w:w="5400"/>
+            <w:tcW w:type="dxa" w:w="5112"/>
             <w:shd w:val="clear" w:color="auto" w:fill="E8F7EE"/>
           </w:tcPr>
           <w:p>
@@ -5365,7 +5539,7 @@
                 <w:b/>
                 <w:sz w:val="19"/>
               </w:rPr>
-              <w:t>Written Assessment (WA) — 1 hour, open book</w:t>
+              <w:t>Written Assessment (WA) — 1 hour, open book; TRAQOM survey and assessment attendance first</w:t>
             </w:r>
           </w:p>
         </w:tc>
@@ -5388,7 +5562,7 @@
         </w:tc>
         <w:tc>
           <w:tcPr>
-            <w:tcW w:type="dxa" w:w="1008"/>
+            <w:tcW w:type="dxa" w:w="1368"/>
             <w:shd w:val="clear" w:color="auto" w:fill="E8F7EE"/>
           </w:tcPr>
           <w:p>
@@ -5399,7 +5573,7 @@
                 <w:b w:val="0"/>
                 <w:sz w:val="19"/>
               </w:rPr>
-              <w:t>220–223</w:t>
+              <w:t>143–146</w:t>
             </w:r>
           </w:p>
         </w:tc>
@@ -5407,7 +5581,7 @@
       <w:tr>
         <w:tc>
           <w:tcPr>
-            <w:tcW w:type="dxa" w:w="1512"/>
+            <w:tcW w:type="dxa" w:w="1440"/>
             <w:shd w:val="clear" w:color="auto" w:fill="E8F7EE"/>
           </w:tcPr>
           <w:p>
@@ -5441,7 +5615,7 @@
         </w:tc>
         <w:tc>
           <w:tcPr>
-            <w:tcW w:type="dxa" w:w="5400"/>
+            <w:tcW w:type="dxa" w:w="5112"/>
             <w:shd w:val="clear" w:color="auto" w:fill="E8F7EE"/>
           </w:tcPr>
           <w:p>
@@ -5452,7 +5626,7 @@
                 <w:b/>
                 <w:sz w:val="19"/>
               </w:rPr>
-              <w:t>Practical Performance (PP) — 1 hour, open book; TRAQOM survey and PM / assessment attendance</w:t>
+              <w:t>Practical Performance (PP) — 1 hour, open book; submit answers on the LMS and take PM attendance</w:t>
             </w:r>
           </w:p>
         </w:tc>
@@ -5475,7 +5649,7 @@
         </w:tc>
         <w:tc>
           <w:tcPr>
-            <w:tcW w:type="dxa" w:w="1008"/>
+            <w:tcW w:type="dxa" w:w="1368"/>
             <w:shd w:val="clear" w:color="auto" w:fill="E8F7EE"/>
           </w:tcPr>
           <w:p>
@@ -5486,7 +5660,7 @@
                 <w:b w:val="0"/>
                 <w:sz w:val="19"/>
               </w:rPr>
-              <w:t>220–223</w:t>
+              <w:t>143–146</w:t>
             </w:r>
           </w:p>
         </w:tc>
@@ -5518,8 +5692,8 @@
         <w:tblLayout w:type="fixed"/>
       </w:tblPr>
       <w:tblGrid>
-        <w:gridCol w:w="1296"/>
-        <w:gridCol w:w="4896"/>
+        <w:gridCol w:w="1584"/>
+        <w:gridCol w:w="4608"/>
         <w:gridCol w:w="2160"/>
         <w:gridCol w:w="720"/>
         <w:gridCol w:w="1007"/>
@@ -5527,7 +5701,7 @@
       <w:tr>
         <w:tc>
           <w:tcPr>
-            <w:tcW w:type="dxa" w:w="1296"/>
+            <w:tcW w:type="dxa" w:w="1584"/>
             <w:shd w:val="clear" w:color="auto" w:fill="1F6FEB"/>
           </w:tcPr>
           <w:p>
@@ -5545,7 +5719,7 @@
         </w:tc>
         <w:tc>
           <w:tcPr>
-            <w:tcW w:type="dxa" w:w="4896"/>
+            <w:tcW w:type="dxa" w:w="4608"/>
             <w:shd w:val="clear" w:color="auto" w:fill="1F6FEB"/>
           </w:tcPr>
           <w:p>
@@ -5619,7 +5793,7 @@
       <w:tr>
         <w:tc>
           <w:tcPr>
-            <w:tcW w:type="dxa" w:w="1296"/>
+            <w:tcW w:type="dxa" w:w="1584"/>
           </w:tcPr>
           <w:p>
             <w:r/>
@@ -5635,7 +5809,7 @@
         </w:tc>
         <w:tc>
           <w:tcPr>
-            <w:tcW w:type="dxa" w:w="4896"/>
+            <w:tcW w:type="dxa" w:w="4608"/>
           </w:tcPr>
           <w:p>
             <w:r/>
@@ -5693,7 +5867,7 @@
                 <w:b w:val="0"/>
                 <w:sz w:val="19"/>
               </w:rPr>
-              <w:t>49–67</w:t>
+              <w:t>49–52</w:t>
             </w:r>
           </w:p>
         </w:tc>
@@ -5701,7 +5875,7 @@
       <w:tr>
         <w:tc>
           <w:tcPr>
-            <w:tcW w:type="dxa" w:w="1296"/>
+            <w:tcW w:type="dxa" w:w="1584"/>
           </w:tcPr>
           <w:p>
             <w:r/>
@@ -5717,7 +5891,7 @@
         </w:tc>
         <w:tc>
           <w:tcPr>
-            <w:tcW w:type="dxa" w:w="4896"/>
+            <w:tcW w:type="dxa" w:w="4608"/>
           </w:tcPr>
           <w:p>
             <w:r/>
@@ -5775,7 +5949,7 @@
                 <w:b w:val="0"/>
                 <w:sz w:val="19"/>
               </w:rPr>
-              <w:t>93–106</w:t>
+              <w:t>64–68</w:t>
             </w:r>
           </w:p>
         </w:tc>
@@ -5783,7 +5957,7 @@
       <w:tr>
         <w:tc>
           <w:tcPr>
-            <w:tcW w:type="dxa" w:w="1296"/>
+            <w:tcW w:type="dxa" w:w="1584"/>
           </w:tcPr>
           <w:p>
             <w:r/>
@@ -5799,7 +5973,7 @@
         </w:tc>
         <w:tc>
           <w:tcPr>
-            <w:tcW w:type="dxa" w:w="4896"/>
+            <w:tcW w:type="dxa" w:w="4608"/>
           </w:tcPr>
           <w:p>
             <w:r/>
@@ -5857,7 +6031,7 @@
                 <w:b w:val="0"/>
                 <w:sz w:val="19"/>
               </w:rPr>
-              <w:t>107–123</w:t>
+              <w:t>74–78</w:t>
             </w:r>
           </w:p>
         </w:tc>
@@ -5865,7 +6039,7 @@
       <w:tr>
         <w:tc>
           <w:tcPr>
-            <w:tcW w:type="dxa" w:w="1296"/>
+            <w:tcW w:type="dxa" w:w="1584"/>
           </w:tcPr>
           <w:p>
             <w:r/>
@@ -5881,7 +6055,7 @@
         </w:tc>
         <w:tc>
           <w:tcPr>
-            <w:tcW w:type="dxa" w:w="4896"/>
+            <w:tcW w:type="dxa" w:w="4608"/>
           </w:tcPr>
           <w:p>
             <w:r/>
@@ -5939,7 +6113,7 @@
                 <w:b w:val="0"/>
                 <w:sz w:val="19"/>
               </w:rPr>
-              <w:t>124–144</w:t>
+              <w:t>87–94</w:t>
             </w:r>
           </w:p>
         </w:tc>
@@ -5947,7 +6121,7 @@
       <w:tr>
         <w:tc>
           <w:tcPr>
-            <w:tcW w:type="dxa" w:w="1296"/>
+            <w:tcW w:type="dxa" w:w="1584"/>
           </w:tcPr>
           <w:p>
             <w:r/>
@@ -5963,7 +6137,7 @@
         </w:tc>
         <w:tc>
           <w:tcPr>
-            <w:tcW w:type="dxa" w:w="4896"/>
+            <w:tcW w:type="dxa" w:w="4608"/>
           </w:tcPr>
           <w:p>
             <w:r/>
@@ -6021,7 +6195,7 @@
                 <w:b w:val="0"/>
                 <w:sz w:val="19"/>
               </w:rPr>
-              <w:t>153–175</w:t>
+              <w:t>103–109</w:t>
             </w:r>
           </w:p>
         </w:tc>
@@ -6029,7 +6203,7 @@
       <w:tr>
         <w:tc>
           <w:tcPr>
-            <w:tcW w:type="dxa" w:w="1296"/>
+            <w:tcW w:type="dxa" w:w="1584"/>
           </w:tcPr>
           <w:p>
             <w:r/>
@@ -6045,7 +6219,7 @@
         </w:tc>
         <w:tc>
           <w:tcPr>
-            <w:tcW w:type="dxa" w:w="4896"/>
+            <w:tcW w:type="dxa" w:w="4608"/>
           </w:tcPr>
           <w:p>
             <w:r/>
@@ -6103,7 +6277,7 @@
                 <w:b w:val="0"/>
                 <w:sz w:val="19"/>
               </w:rPr>
-              <w:t>176–187</w:t>
+              <w:t>115–118</w:t>
             </w:r>
           </w:p>
         </w:tc>
@@ -6111,7 +6285,7 @@
       <w:tr>
         <w:tc>
           <w:tcPr>
-            <w:tcW w:type="dxa" w:w="1296"/>
+            <w:tcW w:type="dxa" w:w="1584"/>
           </w:tcPr>
           <w:p>
             <w:r/>
@@ -6127,7 +6301,7 @@
         </w:tc>
         <w:tc>
           <w:tcPr>
-            <w:tcW w:type="dxa" w:w="4896"/>
+            <w:tcW w:type="dxa" w:w="4608"/>
           </w:tcPr>
           <w:p>
             <w:r/>
@@ -6185,7 +6359,7 @@
                 <w:b w:val="0"/>
                 <w:sz w:val="19"/>
               </w:rPr>
-              <w:t>188–198</w:t>
+              <w:t>122–126</w:t>
             </w:r>
           </w:p>
         </w:tc>
@@ -6193,7 +6367,7 @@
       <w:tr>
         <w:tc>
           <w:tcPr>
-            <w:tcW w:type="dxa" w:w="1296"/>
+            <w:tcW w:type="dxa" w:w="1584"/>
           </w:tcPr>
           <w:p>
             <w:r/>
@@ -6209,7 +6383,7 @@
         </w:tc>
         <w:tc>
           <w:tcPr>
-            <w:tcW w:type="dxa" w:w="4896"/>
+            <w:tcW w:type="dxa" w:w="4608"/>
           </w:tcPr>
           <w:p>
             <w:r/>
@@ -6267,7 +6441,7 @@
                 <w:b w:val="0"/>
                 <w:sz w:val="19"/>
               </w:rPr>
-              <w:t>199–214</w:t>
+              <w:t>134–138</w:t>
             </w:r>
           </w:p>
         </w:tc>

</xml_diff>

<commit_message>
Courseware v3.3: Activity 1 rework, playable videos, Wispr Flow
- Activity 1 split into 1A (join Meta Muse with the trainer invite code),
  1B (OpenAI Dots on ChatGPT Pro/Business Premium) and 1C (speak prompts
  with Wispr Flow); runs on Kopi Kaki Co. meetings, with Meet Kopi Kaki Co.
  moved into Lab 1
- YouTube videos play on click in PowerPoint (Online Film markup and
  click-to-play timing) with an Open in YouTube fallback link
- Scenario 2 live WhatsApp try-it slide; collaboration scenarios with named
  examples; Hermes Desktop download button; WSL runtime slide removed
- LG, LP, labs and prompts page rebuilt; v2.8 deck untracked (archived)

Co-Authored-By: Claude Opus 5.5 <noreply@anthropic.com>
</commit_message>
<xml_diff>
--- a/courseware/LP-Human-AI Workforce with Autonomous AI Agents.docx
+++ b/courseware/LP-Human-AI Workforce with Autonomous AI Agents.docx
@@ -179,7 +179,7 @@
           <w:color w:val="1F6FEB"/>
           <w:sz w:val="24"/>
         </w:rPr>
-        <w:t>Version 2.8</w:t>
+        <w:t>Version 3.3</w:t>
       </w:r>
     </w:p>
     <w:p>
@@ -1484,6 +1484,296 @@
                 <w:sz w:val="19"/>
               </w:rPr>
               <w:t>Published release of the Topic 1 review. The use-case gallery is now 'AI Agents for Business: Five Use Cases' (customer service, IT service management, finance, sales, procurement and supply chain; Genic Solutions, 30 Sep 2026), replacing the 'Two modes' gallery. AI-for-Science news slide (Navier–Stokes, Stanford virtual biotech, 700 OpenAI maths preprints, OpenAI maths/physics/computing claims) with verification status. New visual analogy slide 'An AI Agent Works Like a Person' (brain + body → food → work; model + harness → tokens → work); the under-the-hood hub now has 'AI agent' at its centre with the model as one component. QA fixes: LP column widths and Lab 1 checkpoint slide range, LG heading/image pagination, Muse and Cue briefing polish, answer-key wording.</w:t>
+            </w:r>
+          </w:p>
+        </w:tc>
+        <w:tc>
+          <w:tcPr>
+            <w:tcW w:type="dxa" w:w="1440"/>
+          </w:tcPr>
+          <w:p>
+            <w:r/>
+            <w:r>
+              <w:rPr>
+                <w:sz w:val="19"/>
+              </w:rPr>
+              <w:t>Dr. Alfred Ang</w:t>
+            </w:r>
+          </w:p>
+        </w:tc>
+      </w:tr>
+      <w:tr>
+        <w:tc>
+          <w:tcPr>
+            <w:tcW w:type="dxa" w:w="1152"/>
+          </w:tcPr>
+          <w:p>
+            <w:r/>
+            <w:r>
+              <w:rPr>
+                <w:sz w:val="19"/>
+              </w:rPr>
+              <w:t>2.9</w:t>
+            </w:r>
+          </w:p>
+        </w:tc>
+        <w:tc>
+          <w:tcPr>
+            <w:tcW w:type="dxa" w:w="1656"/>
+          </w:tcPr>
+          <w:p>
+            <w:r/>
+            <w:r>
+              <w:rPr>
+                <w:sz w:val="19"/>
+              </w:rPr>
+              <w:t>30 October 2026</w:t>
+            </w:r>
+          </w:p>
+        </w:tc>
+        <w:tc>
+          <w:tcPr>
+            <w:tcW w:type="dxa" w:w="5544"/>
+          </w:tcPr>
+          <w:p>
+            <w:r/>
+            <w:r>
+              <w:rPr>
+                <w:sz w:val="19"/>
+              </w:rPr>
+              <w:t>The five collaboration patterns are now five collaboration scenarios. Each slide has a one-line pitch, a vivid hook and three named real-world examples (e.g. Scenario 1: OpenAI Dots, Meta Muse, Grok Bot, Claude Duet, Manus Cue; Hermes Desktop; Claude Code/Codex). The repeated 'How it works / The human decides / Watch for' rows were removed. LG 1.5 rewritten to match.</w:t>
+            </w:r>
+          </w:p>
+        </w:tc>
+        <w:tc>
+          <w:tcPr>
+            <w:tcW w:type="dxa" w:w="1440"/>
+          </w:tcPr>
+          <w:p>
+            <w:r/>
+            <w:r>
+              <w:rPr>
+                <w:sz w:val="19"/>
+              </w:rPr>
+              <w:t>Dr. Alfred Ang</w:t>
+            </w:r>
+          </w:p>
+        </w:tc>
+      </w:tr>
+      <w:tr>
+        <w:tc>
+          <w:tcPr>
+            <w:tcW w:type="dxa" w:w="1152"/>
+          </w:tcPr>
+          <w:p>
+            <w:r/>
+            <w:r>
+              <w:rPr>
+                <w:sz w:val="19"/>
+              </w:rPr>
+              <w:t>3.0</w:t>
+            </w:r>
+          </w:p>
+        </w:tc>
+        <w:tc>
+          <w:tcPr>
+            <w:tcW w:type="dxa" w:w="1656"/>
+          </w:tcPr>
+          <w:p>
+            <w:r/>
+            <w:r>
+              <w:rPr>
+                <w:sz w:val="19"/>
+              </w:rPr>
+              <w:t>30 October 2026</w:t>
+            </w:r>
+          </w:p>
+        </w:tc>
+        <w:tc>
+          <w:tcPr>
+            <w:tcW w:type="dxa" w:w="5544"/>
+          </w:tcPr>
+          <w:p>
+            <w:r/>
+            <w:r>
+              <w:rPr>
+                <w:sz w:val="19"/>
+              </w:rPr>
+              <w:t>Trainer review of v2.9. Activity 1 is now two parts: 1A, every learner joins Meta Muse at muse.ai (Facebook sign-in) and redeems the trainer’s invite code H1KWDZ in Settings → General → Usage within 48 hours (1 billion Muse tokens each); 1B, learners whose ChatGPT plan includes dots (Pro and Business Premium at launch, per OpenAI) set up an OpenAI Dot with a standing job. Two new visual lab slides (invite card, plan check, embedded Dots setup video). Grok Bot moved to a reference route. New slide after Scenario 2: learners scan Tertiary Infotech Academy’s WhatsApp Business QR code and try a one-agent, many-people chat live. Assessment unchanged.</w:t>
+            </w:r>
+          </w:p>
+        </w:tc>
+        <w:tc>
+          <w:tcPr>
+            <w:tcW w:type="dxa" w:w="1440"/>
+          </w:tcPr>
+          <w:p>
+            <w:r/>
+            <w:r>
+              <w:rPr>
+                <w:sz w:val="19"/>
+              </w:rPr>
+              <w:t>Dr. Alfred Ang</w:t>
+            </w:r>
+          </w:p>
+        </w:tc>
+      </w:tr>
+      <w:tr>
+        <w:tc>
+          <w:tcPr>
+            <w:tcW w:type="dxa" w:w="1152"/>
+          </w:tcPr>
+          <w:p>
+            <w:r/>
+            <w:r>
+              <w:rPr>
+                <w:sz w:val="19"/>
+              </w:rPr>
+              <w:t>3.1</w:t>
+            </w:r>
+          </w:p>
+        </w:tc>
+        <w:tc>
+          <w:tcPr>
+            <w:tcW w:type="dxa" w:w="1656"/>
+          </w:tcPr>
+          <w:p>
+            <w:r/>
+            <w:r>
+              <w:rPr>
+                <w:sz w:val="19"/>
+              </w:rPr>
+              <w:t>30 October 2026</w:t>
+            </w:r>
+          </w:p>
+        </w:tc>
+        <w:tc>
+          <w:tcPr>
+            <w:tcW w:type="dxa" w:w="5544"/>
+          </w:tcPr>
+          <w:p>
+            <w:r/>
+            <w:r>
+              <w:rPr>
+                <w:sz w:val="19"/>
+              </w:rPr>
+              <w:t>YouTube videos now play inside PowerPoint: each video carries PowerPoint’s online-video embed (web video iframe) instead of a linked media file. Activity 1 now uses the Kopi Kaki Co. scenario: learners check any company meeting (launch review, supplier tasting, outlet visit) and draft a reply; the ‘Meet Kopi Kaki Co.’ slide moves from Topic 2 into Activity 1. Hermes Desktop download link added to its setup slide and the Learner Guide; the native-vs-WSL runtime slide removed. PP Task 1 wording: ‘a meeting schedule’ instead of ‘a training schedule’; questions, K/A codes and rubric unchanged.</w:t>
+            </w:r>
+          </w:p>
+        </w:tc>
+        <w:tc>
+          <w:tcPr>
+            <w:tcW w:type="dxa" w:w="1440"/>
+          </w:tcPr>
+          <w:p>
+            <w:r/>
+            <w:r>
+              <w:rPr>
+                <w:sz w:val="19"/>
+              </w:rPr>
+              <w:t>Dr. Alfred Ang</w:t>
+            </w:r>
+          </w:p>
+        </w:tc>
+      </w:tr>
+      <w:tr>
+        <w:tc>
+          <w:tcPr>
+            <w:tcW w:type="dxa" w:w="1152"/>
+          </w:tcPr>
+          <w:p>
+            <w:r/>
+            <w:r>
+              <w:rPr>
+                <w:sz w:val="19"/>
+              </w:rPr>
+              <w:t>3.2</w:t>
+            </w:r>
+          </w:p>
+        </w:tc>
+        <w:tc>
+          <w:tcPr>
+            <w:tcW w:type="dxa" w:w="1656"/>
+          </w:tcPr>
+          <w:p>
+            <w:r/>
+            <w:r>
+              <w:rPr>
+                <w:sz w:val="19"/>
+              </w:rPr>
+              <w:t>30 October 2026</w:t>
+            </w:r>
+          </w:p>
+        </w:tc>
+        <w:tc>
+          <w:tcPr>
+            <w:tcW w:type="dxa" w:w="5544"/>
+          </w:tcPr>
+          <w:p>
+            <w:r/>
+            <w:r>
+              <w:rPr>
+                <w:sz w:val="19"/>
+              </w:rPr>
+              <w:t>YouTube videos fixed to play on click in PowerPoint: each video now uses the exact markup and click-to-play timing of PowerPoint’s Insert › Video › Online Film, copied from a trainer-tested sample (v3.1 videos showed only the poster).</w:t>
+            </w:r>
+          </w:p>
+        </w:tc>
+        <w:tc>
+          <w:tcPr>
+            <w:tcW w:type="dxa" w:w="1440"/>
+          </w:tcPr>
+          <w:p>
+            <w:r/>
+            <w:r>
+              <w:rPr>
+                <w:sz w:val="19"/>
+              </w:rPr>
+              <w:t>Dr. Alfred Ang</w:t>
+            </w:r>
+          </w:p>
+        </w:tc>
+      </w:tr>
+      <w:tr>
+        <w:tc>
+          <w:tcPr>
+            <w:tcW w:type="dxa" w:w="1152"/>
+          </w:tcPr>
+          <w:p>
+            <w:r/>
+            <w:r>
+              <w:rPr>
+                <w:sz w:val="19"/>
+              </w:rPr>
+              <w:t>3.3</w:t>
+            </w:r>
+          </w:p>
+        </w:tc>
+        <w:tc>
+          <w:tcPr>
+            <w:tcW w:type="dxa" w:w="1656"/>
+          </w:tcPr>
+          <w:p>
+            <w:r/>
+            <w:r>
+              <w:rPr>
+                <w:sz w:val="19"/>
+              </w:rPr>
+              <w:t>30 October 2026</w:t>
+            </w:r>
+          </w:p>
+        </w:tc>
+        <w:tc>
+          <w:tcPr>
+            <w:tcW w:type="dxa" w:w="5544"/>
+          </w:tcPr>
+          <w:p>
+            <w:r/>
+            <w:r>
+              <w:rPr>
+                <w:sz w:val="19"/>
+              </w:rPr>
+              <w:t>Activity 1C added: learners install Wispr Flow (wisprflow.ai) and speak their prompts to Muse, Dots and Hermes instead of typing; new pitch slide with a typed vs spoken before/after and a download button. Activity 1B trimmed to 10 minutes; Lab 1 stays 75 minutes. Every video also gets an Open in YouTube fallback link. Trainer note: PowerPoint blocks online videos in a downloaded deck until Enable Content is clicked.</w:t>
             </w:r>
           </w:p>
         </w:tc>
@@ -1546,7 +1836,7 @@
         </w:rPr>
         <w:t>Course Information</w:t>
         <w:tab/>
-        <w:t>7</w:t>
+        <w:t>8</w:t>
       </w:r>
     </w:p>
     <w:p>
@@ -1565,7 +1855,7 @@
         </w:rPr>
         <w:t>Learning Outcomes</w:t>
         <w:tab/>
-        <w:t>7</w:t>
+        <w:t>8</w:t>
       </w:r>
     </w:p>
     <w:p>
@@ -1584,7 +1874,7 @@
         </w:rPr>
         <w:t>Topics and Labs</w:t>
         <w:tab/>
-        <w:t>7</w:t>
+        <w:t>8</w:t>
       </w:r>
     </w:p>
     <w:p>
@@ -1603,7 +1893,7 @@
         </w:rPr>
         <w:t>Learning Units (approved Course Proposal TPG-2024060313)</w:t>
         <w:tab/>
-        <w:t>8</w:t>
+        <w:t>9</w:t>
       </w:r>
     </w:p>
     <w:p>
@@ -1622,7 +1912,7 @@
         </w:rPr>
         <w:t>Assessment</w:t>
         <w:tab/>
-        <w:t>8</w:t>
+        <w:t>9</w:t>
       </w:r>
     </w:p>
     <w:p>
@@ -1641,7 +1931,7 @@
         </w:rPr>
         <w:t>Course Schedule</w:t>
         <w:tab/>
-        <w:t>8</w:t>
+        <w:t>9</w:t>
       </w:r>
     </w:p>
     <w:p>
@@ -1661,7 +1951,7 @@
         </w:rPr>
         <w:t>Day 1 — Human–AI overview → always-on assistants → Hermes single-agent office practice (Activities 1–4)</w:t>
         <w:tab/>
-        <w:t>8</w:t>
+        <w:t>9</w:t>
       </w:r>
     </w:p>
     <w:p>
@@ -1681,7 +1971,7 @@
         </w:rPr>
         <w:t>Day 2 — Hermes multi-agent Kanban video team and OpenAI Dots (Activities 5–8), then assessment</w:t>
         <w:tab/>
-        <w:t>9</w:t>
+        <w:t>10</w:t>
       </w:r>
     </w:p>
     <w:p>
@@ -1700,7 +1990,7 @@
         </w:rPr>
         <w:t>Lab Reference</w:t>
         <w:tab/>
-        <w:t>10</w:t>
+        <w:t>11</w:t>
       </w:r>
       <w:r>
         <w:fldChar w:fldCharType="end"/>
@@ -2005,7 +2295,7 @@
                 <w:b w:val="0"/>
                 <w:sz w:val="20"/>
               </w:rPr>
-              <w:t>Human-AI Workforce with Autonomous AI Agents-v2.8.pptx (146 slides)</w:t>
+              <w:t>Human-AI Workforce with Autonomous AI Agents-v3.3.pptx (149 slides)</w:t>
             </w:r>
           </w:p>
         </w:tc>
@@ -2198,7 +2488,7 @@
                 <w:b w:val="0"/>
                 <w:sz w:val="19"/>
               </w:rPr>
-              <w:t>Brief AI history and what agentic AI is; Under the hood: the model in a harness, tools, skills and the agentic loop; humans decide; Two work modes, five collaboration patterns, use cases and the Big Five always-on agents; Activity 1 · Set up an always-on assistant.  Activity 1: always-on assistant setup.</w:t>
+              <w:t>Brief AI history and what agentic AI is; Under the hood: the model in a harness, tools, skills and the agentic loop; humans decide; Two work modes, five collaboration scenarios, use cases and the Big Five always-on agents; Activity 1 · Join Meta Muse (invite code) and set up an OpenAI Dot.  Activity 1: always-on assistant setup.</w:t>
             </w:r>
           </w:p>
         </w:tc>
@@ -2214,7 +2504,7 @@
                 <w:b w:val="0"/>
                 <w:sz w:val="19"/>
               </w:rPr>
-              <w:t>20–52</w:t>
+              <w:t>20–57</w:t>
             </w:r>
           </w:p>
         </w:tc>
@@ -2265,7 +2555,7 @@
                 <w:b w:val="0"/>
                 <w:sz w:val="19"/>
               </w:rPr>
-              <w:t>53–94</w:t>
+              <w:t>58–97</w:t>
             </w:r>
           </w:p>
         </w:tc>
@@ -2316,7 +2606,7 @@
                 <w:b w:val="0"/>
                 <w:sz w:val="19"/>
               </w:rPr>
-              <w:t>95–138</w:t>
+              <w:t>98–141</w:t>
             </w:r>
           </w:p>
         </w:tc>
@@ -3129,7 +3419,7 @@
                 <w:b/>
                 <w:sz w:val="19"/>
               </w:rPr>
-              <w:t>Topic 1 (Part A) — brief AI history; what agentic AI is; under the hood: the model in a harness, tools and skills, the agentic loop; AI does the work, humans decide; personal assistant vs digital worker; five collaboration patterns (one human/one agent to inter-company); use cases, AI for Science and a humanoid elderly-care task</w:t>
+              <w:t>Topic 1 (Part A) — brief AI history; what agentic AI is; under the hood: the model in a harness, tools and skills, the agentic loop; AI does the work, humans decide; personal assistant vs digital worker; five collaboration scenarios with named examples (one human/one agent to inter-company); use cases, AI for Science and a humanoid elderly-care task</w:t>
             </w:r>
           </w:p>
         </w:tc>
@@ -3163,7 +3453,7 @@
                 <w:b w:val="0"/>
                 <w:sz w:val="19"/>
               </w:rPr>
-              <w:t>20–41</w:t>
+              <w:t>20–42</w:t>
             </w:r>
           </w:p>
         </w:tc>
@@ -3303,7 +3593,7 @@
                 <w:b/>
                 <w:sz w:val="19"/>
               </w:rPr>
-              <w:t>Topic 1 (Part B) — deployment evolution (OpenClaw → Hermes → hosted agents); the Big Five comparison and one briefing slide each (Muse, Dots, Grok Bot, Duet, Cue) with official sources and setup videos; choose the Activity 1 route</w:t>
+              <w:t>Topic 1 (Part B) — deployment evolution (OpenClaw → Hermes → hosted agents); the Big Five comparison and one briefing slide each (Muse, Dots, Grok Bot, Duet, Cue) with official sources and setup videos; Scenario 2 tried live on WhatsApp</w:t>
             </w:r>
           </w:p>
         </w:tc>
@@ -3337,7 +3627,7 @@
                 <w:b w:val="0"/>
                 <w:sz w:val="19"/>
               </w:rPr>
-              <w:t>42–48</w:t>
+              <w:t>43–49</w:t>
             </w:r>
           </w:p>
         </w:tc>
@@ -3387,7 +3677,7 @@
                 <w:b w:val="0"/>
                 <w:sz w:val="19"/>
               </w:rPr>
-              <w:t>Lab 1: Activity 1 — connect one assistant (Muse, Dots or Grok Bot) to Gmail/Calendar; schedule check and email draft (PP Task 1 image A)</w:t>
+              <w:t>Lab 1: Activity 1A — join Meta Muse at muse.ai and redeem the trainer’s invite code; Activity 1B — set up an OpenAI Dot (Pro/Business Premium); Activity 1C — speak prompts with Wispr Flow; connect Gmail/Calendar, schedule check and email draft (PP Task 1 image A)</w:t>
             </w:r>
           </w:p>
         </w:tc>
@@ -3419,7 +3709,7 @@
                 <w:b w:val="0"/>
                 <w:sz w:val="19"/>
               </w:rPr>
-              <w:t>49–52</w:t>
+              <w:t>50–57</w:t>
             </w:r>
           </w:p>
         </w:tc>
@@ -3506,7 +3796,7 @@
                 <w:b w:val="0"/>
                 <w:sz w:val="19"/>
               </w:rPr>
-              <w:t>49–52</w:t>
+              <w:t>50–57</w:t>
             </w:r>
           </w:p>
         </w:tc>
@@ -3643,7 +3933,7 @@
                 <w:b w:val="0"/>
                 <w:sz w:val="19"/>
               </w:rPr>
-              <w:t>Lab 2: Activity 2A — introduce Kopi Kaki; Hermes Desktop, features, tools and reviewed skills</w:t>
+              <w:t>Lab 2: Activity 2A — the Kopi Kaki company pack; Hermes Desktop, features, tools and reviewed skills</w:t>
             </w:r>
           </w:p>
         </w:tc>
@@ -3675,7 +3965,7 @@
                 <w:b w:val="0"/>
                 <w:sz w:val="19"/>
               </w:rPr>
-              <w:t>53–63</w:t>
+              <w:t>58–66</w:t>
             </w:r>
           </w:p>
         </w:tc>
@@ -3757,7 +4047,7 @@
                 <w:b w:val="0"/>
                 <w:sz w:val="19"/>
               </w:rPr>
-              <w:t>64–68</w:t>
+              <w:t>67–71</w:t>
             </w:r>
           </w:p>
         </w:tc>
@@ -3926,7 +4216,7 @@
                 <w:b w:val="0"/>
                 <w:sz w:val="19"/>
               </w:rPr>
-              <w:t>69–78</w:t>
+              <w:t>72–81</w:t>
             </w:r>
           </w:p>
         </w:tc>
@@ -4008,7 +4298,7 @@
                 <w:b w:val="0"/>
                 <w:sz w:val="19"/>
               </w:rPr>
-              <w:t>79–94</w:t>
+              <w:t>82–97</w:t>
             </w:r>
           </w:p>
         </w:tc>
@@ -4090,7 +4380,7 @@
                 <w:b w:val="0"/>
                 <w:sz w:val="19"/>
               </w:rPr>
-              <w:t>79–94</w:t>
+              <w:t>82–97</w:t>
             </w:r>
           </w:p>
         </w:tc>
@@ -4177,7 +4467,7 @@
                 <w:b w:val="0"/>
                 <w:sz w:val="19"/>
               </w:rPr>
-              <w:t>95</w:t>
+              <w:t>98</w:t>
             </w:r>
           </w:p>
         </w:tc>
@@ -4390,7 +4680,7 @@
                 <w:b w:val="0"/>
                 <w:sz w:val="19"/>
               </w:rPr>
-              <w:t>95</w:t>
+              <w:t>98</w:t>
             </w:r>
           </w:p>
         </w:tc>
@@ -4472,7 +4762,7 @@
                 <w:b w:val="0"/>
                 <w:sz w:val="19"/>
               </w:rPr>
-              <w:t>96–109</w:t>
+              <w:t>99–112</w:t>
             </w:r>
           </w:p>
         </w:tc>
@@ -4554,7 +4844,7 @@
                 <w:b w:val="0"/>
                 <w:sz w:val="19"/>
               </w:rPr>
-              <w:t>96–109</w:t>
+              <w:t>99–112</w:t>
             </w:r>
           </w:p>
         </w:tc>
@@ -4728,7 +5018,7 @@
                 <w:b w:val="0"/>
                 <w:sz w:val="19"/>
               </w:rPr>
-              <w:t>110</w:t>
+              <w:t>113</w:t>
             </w:r>
           </w:p>
         </w:tc>
@@ -4810,7 +5100,7 @@
                 <w:b w:val="0"/>
                 <w:sz w:val="19"/>
               </w:rPr>
-              <w:t>111–118</w:t>
+              <w:t>114–121</w:t>
             </w:r>
           </w:p>
         </w:tc>
@@ -4979,7 +5269,7 @@
                 <w:b w:val="0"/>
                 <w:sz w:val="19"/>
               </w:rPr>
-              <w:t>119–126</w:t>
+              <w:t>122–129</w:t>
             </w:r>
           </w:p>
         </w:tc>
@@ -5061,7 +5351,7 @@
                 <w:b w:val="0"/>
                 <w:sz w:val="19"/>
               </w:rPr>
-              <w:t>127–138</w:t>
+              <w:t>130–141</w:t>
             </w:r>
           </w:p>
         </w:tc>
@@ -5143,7 +5433,7 @@
                 <w:b w:val="0"/>
                 <w:sz w:val="19"/>
               </w:rPr>
-              <w:t>127–138</w:t>
+              <w:t>130–141</w:t>
             </w:r>
           </w:p>
         </w:tc>
@@ -5312,7 +5602,7 @@
                 <w:b w:val="0"/>
                 <w:sz w:val="19"/>
               </w:rPr>
-              <w:t>127–138</w:t>
+              <w:t>130–141</w:t>
             </w:r>
           </w:p>
         </w:tc>
@@ -5399,7 +5689,7 @@
                 <w:b w:val="0"/>
                 <w:sz w:val="19"/>
               </w:rPr>
-              <w:t>139–142</w:t>
+              <w:t>142–145</w:t>
             </w:r>
           </w:p>
         </w:tc>
@@ -5573,7 +5863,7 @@
                 <w:b w:val="0"/>
                 <w:sz w:val="19"/>
               </w:rPr>
-              <w:t>143–146</w:t>
+              <w:t>146–149</w:t>
             </w:r>
           </w:p>
         </w:tc>
@@ -5660,7 +5950,7 @@
                 <w:b w:val="0"/>
                 <w:sz w:val="19"/>
               </w:rPr>
-              <w:t>143–146</w:t>
+              <w:t>146–149</w:t>
             </w:r>
           </w:p>
         </w:tc>
@@ -5819,7 +6109,7 @@
                 <w:b w:val="0"/>
                 <w:sz w:val="19"/>
               </w:rPr>
-              <w:t>Activity 1 — Set Up an Always-On Personal Assistant</w:t>
+              <w:t>Activity 1 — Join Meta Muse, Set Up an OpenAI Dot</w:t>
             </w:r>
           </w:p>
         </w:tc>
@@ -5867,7 +6157,7 @@
                 <w:b w:val="0"/>
                 <w:sz w:val="19"/>
               </w:rPr>
-              <w:t>49–52</w:t>
+              <w:t>50–57</w:t>
             </w:r>
           </w:p>
         </w:tc>
@@ -5949,7 +6239,7 @@
                 <w:b w:val="0"/>
                 <w:sz w:val="19"/>
               </w:rPr>
-              <w:t>64–68</w:t>
+              <w:t>67–71</w:t>
             </w:r>
           </w:p>
         </w:tc>
@@ -6031,7 +6321,7 @@
                 <w:b w:val="0"/>
                 <w:sz w:val="19"/>
               </w:rPr>
-              <w:t>74–78</w:t>
+              <w:t>77–81</w:t>
             </w:r>
           </w:p>
         </w:tc>
@@ -6113,7 +6403,7 @@
                 <w:b w:val="0"/>
                 <w:sz w:val="19"/>
               </w:rPr>
-              <w:t>87–94</w:t>
+              <w:t>90–97</w:t>
             </w:r>
           </w:p>
         </w:tc>
@@ -6195,7 +6485,7 @@
                 <w:b w:val="0"/>
                 <w:sz w:val="19"/>
               </w:rPr>
-              <w:t>103–109</w:t>
+              <w:t>106–112</w:t>
             </w:r>
           </w:p>
         </w:tc>
@@ -6277,7 +6567,7 @@
                 <w:b w:val="0"/>
                 <w:sz w:val="19"/>
               </w:rPr>
-              <w:t>115–118</w:t>
+              <w:t>118–121</w:t>
             </w:r>
           </w:p>
         </w:tc>
@@ -6359,7 +6649,7 @@
                 <w:b w:val="0"/>
                 <w:sz w:val="19"/>
               </w:rPr>
-              <w:t>122–126</w:t>
+              <w:t>125–129</w:t>
             </w:r>
           </w:p>
         </w:tc>
@@ -6441,7 +6731,7 @@
                 <w:b w:val="0"/>
                 <w:sz w:val="19"/>
               </w:rPr>
-              <w:t>134–138</w:t>
+              <w:t>137–141</w:t>
             </w:r>
           </w:p>
         </w:tc>

</xml_diff>

<commit_message>
Courseware v3.4: founder story, Hermes teams, Paperclip bonus
- Topic 2: Hermes as your first AI employee (Desktop, MiniMax demo,
  Telegram, tools, skills, Firecrawl, gog, cron + 8:00 email summary);
  guided setup lab; Activity 2 Kopi Kaki website (skills.sh UX skills);
  Activity 3 pitch deck (PPT tool + skill, PP Task 2)
- Topic 3: multi-agent introduction, ACP / each-agent-can / hand-off
  slides, video tools, profiles, Kanban, bots; Activity 4 social media
  team; Activity 5 video team (PP Task 3); 5 principles of AI security
- Bonus: Paperclip one-person company with the original screenshots
- Labs, lab PDFs, COPY-PROMPTS and the prompts page regenerated with
  every step and prompt; old Activities 2-8 retired; README updated

Co-Authored-By: Claude Opus 5.5 <noreply@anthropic.com>
</commit_message>
<xml_diff>
--- a/courseware/LP-Human-AI Workforce with Autonomous AI Agents.docx
+++ b/courseware/LP-Human-AI Workforce with Autonomous AI Agents.docx
@@ -179,7 +179,7 @@
           <w:color w:val="1F6FEB"/>
           <w:sz w:val="24"/>
         </w:rPr>
-        <w:t>Version 3.3</w:t>
+        <w:t>Version 3.4</w:t>
       </w:r>
     </w:p>
     <w:p>
@@ -1774,6 +1774,64 @@
                 <w:sz w:val="19"/>
               </w:rPr>
               <w:t>Activity 1C added: learners install Wispr Flow (wisprflow.ai) and speak their prompts to Muse, Dots and Hermes instead of typing; new pitch slide with a typed vs spoken before/after and a download button. Activity 1B trimmed to 10 minutes; Lab 1 stays 75 minutes. Every video also gets an Open in YouTube fallback link. Trainer note: PowerPoint blocks online videos in a downloaded deck until Enable Content is clicked.</w:t>
+            </w:r>
+          </w:p>
+        </w:tc>
+        <w:tc>
+          <w:tcPr>
+            <w:tcW w:type="dxa" w:w="1440"/>
+          </w:tcPr>
+          <w:p>
+            <w:r/>
+            <w:r>
+              <w:rPr>
+                <w:sz w:val="19"/>
+              </w:rPr>
+              <w:t>Dr. Alfred Ang</w:t>
+            </w:r>
+          </w:p>
+        </w:tc>
+      </w:tr>
+      <w:tr>
+        <w:tc>
+          <w:tcPr>
+            <w:tcW w:type="dxa" w:w="1152"/>
+          </w:tcPr>
+          <w:p>
+            <w:r/>
+            <w:r>
+              <w:rPr>
+                <w:sz w:val="19"/>
+              </w:rPr>
+              <w:t>3.4</w:t>
+            </w:r>
+          </w:p>
+        </w:tc>
+        <w:tc>
+          <w:tcPr>
+            <w:tcW w:type="dxa" w:w="1656"/>
+          </w:tcPr>
+          <w:p>
+            <w:r/>
+            <w:r>
+              <w:rPr>
+                <w:sz w:val="19"/>
+              </w:rPr>
+              <w:t>31 October 2026</w:t>
+            </w:r>
+          </w:p>
+        </w:tc>
+        <w:tc>
+          <w:tcPr>
+            <w:tcW w:type="dxa" w:w="5544"/>
+          </w:tcPr>
+          <w:p>
+            <w:r/>
+            <w:r>
+              <w:rPr>
+                <w:sz w:val="19"/>
+              </w:rPr>
+              <w:t>One founder story: you are the founder-CEO of Kopi Kaki Co., a Singapore kopi startup, and AI agents help you start it — three mandatory topics and one optional bonus. Topic 1 unchanged (Activity 1: Meta Muse or OpenAI Dots as your always-on CEO assistant). Topic 2 rebuilt as 'Hermes Agent — Your First AI Employee': what Hermes is, Hermes Desktop, connecting a model (MiniMax demo; the one-day trial is marked awaiting verification), Telegram, tools, reviewed skills, Firecrawl web search, gog for Gmail/Calendar with one approved send, cron schedules and a daily 8:00 email-summary cron, with a guided setup lab; Activity 2 installs UX skills from skills.sh and builds the Kopi Kaki website; Activity 3 uses a PPT tool and skill to build the Kopi Kaki pitch deck (PP Task 2). Topic 3 rebuilt as 'Hermes Teams': a general introduction to multiple agents (each agent has its own tools, unique skills, model, instructions and context window), the trainer's three multi-agent slides recreated (Agent Communication Protocol, 'Each agent can…', the damaged-order hand-off), video skills and tools (HyperFrames, Remotion, Manim), profiles, Kanban and bots; Activity 4 social media marketing team (researcher, LinkedIn/Facebook/Instagram writers, image creator, posts gallery); Activity 5 video production team (researcher, scriptwriter, voice-over, producer, reviewer, human approval via a review link; PP Task 3); grounding/RAG and evaluation concepts; the 5 Principles of AI Security (as in the Agentic AI Applications with Claude Code deck). Bonus topic: Paperclip — Kopi Kaki as a one-person company (CEO with instructions → Chief of Staff → marketing team → org chart → the launch video, compared with the Hermes Kanban team), using the original Paperclip screenshots. Old Activities 3, 6, 7 and 8 removed. Mock company reframed as a startup. PP evidence: Task 1 one Muse/Dots screenshot; Task 2 one Hermes PPT screenshot; Task 3 two screenshots (Kanban board + video); questions unchanged. Labs, lab PDFs, COPY-PROMPTS and the prompts page regenerated with every step and copy-ready prompt, including Paperclip.</w:t>
             </w:r>
           </w:p>
         </w:tc>
@@ -1836,7 +1894,7 @@
         </w:rPr>
         <w:t>Course Information</w:t>
         <w:tab/>
-        <w:t>8</w:t>
+        <w:t>9</w:t>
       </w:r>
     </w:p>
     <w:p>
@@ -1855,7 +1913,7 @@
         </w:rPr>
         <w:t>Learning Outcomes</w:t>
         <w:tab/>
-        <w:t>8</w:t>
+        <w:t>9</w:t>
       </w:r>
     </w:p>
     <w:p>
@@ -1874,7 +1932,7 @@
         </w:rPr>
         <w:t>Topics and Labs</w:t>
         <w:tab/>
-        <w:t>8</w:t>
+        <w:t>9</w:t>
       </w:r>
     </w:p>
     <w:p>
@@ -1893,7 +1951,7 @@
         </w:rPr>
         <w:t>Learning Units (approved Course Proposal TPG-2024060313)</w:t>
         <w:tab/>
-        <w:t>9</w:t>
+        <w:t>10</w:t>
       </w:r>
     </w:p>
     <w:p>
@@ -1912,7 +1970,7 @@
         </w:rPr>
         <w:t>Assessment</w:t>
         <w:tab/>
-        <w:t>9</w:t>
+        <w:t>10</w:t>
       </w:r>
     </w:p>
     <w:p>
@@ -1931,7 +1989,7 @@
         </w:rPr>
         <w:t>Course Schedule</w:t>
         <w:tab/>
-        <w:t>9</w:t>
+        <w:t>10</w:t>
       </w:r>
     </w:p>
     <w:p>
@@ -1949,9 +2007,9 @@
           <w:color w:val="333333"/>
           <w:sz w:val="21"/>
         </w:rPr>
-        <w:t>Day 1 — Human–AI overview → always-on assistants → Hermes single-agent office practice (Activities 1–4)</w:t>
+        <w:t>Day 1 — Human–AI overview → always-on assistants → Hermes Agent setup, tools, skills and schedules (Activities 1–3)</w:t>
         <w:tab/>
-        <w:t>9</w:t>
+        <w:t>10</w:t>
       </w:r>
     </w:p>
     <w:p>
@@ -1969,9 +2027,9 @@
           <w:color w:val="333333"/>
           <w:sz w:val="21"/>
         </w:rPr>
-        <w:t>Day 2 — Hermes multi-agent Kanban video team and OpenAI Dots (Activities 5–8), then assessment</w:t>
+        <w:t>Day 2 — Hermes marketing and video teams with profiles, Kanban and bots (Activities 4–5), AI security, optional Paperclip bonus, then assessment</w:t>
         <w:tab/>
-        <w:t>10</w:t>
+        <w:t>11</w:t>
       </w:r>
     </w:p>
     <w:p>
@@ -1990,7 +2048,7 @@
         </w:rPr>
         <w:t>Lab Reference</w:t>
         <w:tab/>
-        <w:t>11</w:t>
+        <w:t>12</w:t>
       </w:r>
       <w:r>
         <w:fldChar w:fldCharType="end"/>
@@ -2260,7 +2318,7 @@
                 <w:b w:val="0"/>
                 <w:sz w:val="20"/>
               </w:rPr>
-              <w:t>Kopi Kaki Co. — a fictional Singapore kopi chain launching the Gula Melaka Cold Brew (#ShiokColdBrew) — all company data is fictional</w:t>
+              <w:t>Kopi Kaki Co. — a fictional Singapore kopi startup you found, launching the Gula Melaka Cold Brew at its Tiong Bahru flagship on 1 Dec 2026 (#ShiokColdBrew) — all company data is fictional</w:t>
             </w:r>
           </w:p>
         </w:tc>
@@ -2295,7 +2353,7 @@
                 <w:b w:val="0"/>
                 <w:sz w:val="20"/>
               </w:rPr>
-              <w:t>Human-AI Workforce with Autonomous AI Agents-v3.3.pptx (149 slides)</w:t>
+              <w:t>Human-AI Workforce with Autonomous AI Agents-v3.4.pptx (147 slides)</w:t>
             </w:r>
           </w:p>
         </w:tc>
@@ -2523,7 +2581,7 @@
                 <w:b/>
                 <w:sz w:val="19"/>
               </w:rPr>
-              <w:t>Topic 2: Hermes Agent — Single-Agent Office Automation, Tools &amp; Skills</w:t>
+              <w:t>Topic 2: Hermes Agent — Your First AI Employee: Setup, Tools, Skills &amp; Schedules</w:t>
             </w:r>
           </w:p>
         </w:tc>
@@ -2539,7 +2597,7 @@
                 <w:b w:val="0"/>
                 <w:sz w:val="19"/>
               </w:rPr>
-              <w:t>Activity 2 · Hermes Desktop, tools, skills and source brief; Activity 3 · gog: Gmail, Calendar, Drive and Excel; Activity 4 · Dashboard, professional PPT and single-agent video; Human review and one approved training email.</w:t>
+              <w:t>What Hermes Agent is; set up Hermes Desktop and connect a model (MiniMax demo); Telegram, tools, skills and cron schedules; gog for Gmail and Calendar; a daily email-summary cron; Firecrawl web search; Activity 2 · UX skills from skills.sh build the Kopi Kaki website; Activity 3 · PPT tool + skill build a professional Kopi Kaki deck (PP Task 2).</w:t>
             </w:r>
           </w:p>
         </w:tc>
@@ -2555,7 +2613,7 @@
                 <w:b w:val="0"/>
                 <w:sz w:val="19"/>
               </w:rPr>
-              <w:t>58–97</w:t>
+              <w:t>58–90</w:t>
             </w:r>
           </w:p>
         </w:tc>
@@ -2574,7 +2632,7 @@
                 <w:b/>
                 <w:sz w:val="19"/>
               </w:rPr>
-              <w:t>Topic 3: Hermes Teams &amp; OpenAI Dots — Kanban, Video &amp; Human Oversight</w:t>
+              <w:t>Topic 3: Hermes Teams — Marketing &amp; Video Production with Profiles, Kanban &amp; Bots</w:t>
             </w:r>
           </w:p>
         </w:tc>
@@ -2590,7 +2648,7 @@
                 <w:b w:val="0"/>
                 <w:sz w:val="19"/>
               </w:rPr>
-              <w:t>Activity 5 · Hermes bots and Kanban video studio; Activity 6 · Source retrieval, verification and maintenance; Activity 7 · Dots: supervised launch review; Activity 8 · Team video revision, local release and evaluation.</w:t>
+              <w:t>Multiple agents: own tools, skills, model, instructions and context window; how agents talk (ACP); Video tools (HyperFrames, Remotion, Manim); profiles, Kanban and bots; Activity 4 · Social media marketing team: LinkedIn, Facebook and Instagram posts with images; Activity 5 · Video production team: research → script → video → voice-over → review → your approval (PP Task 3); Five principles of AI security.</w:t>
             </w:r>
           </w:p>
         </w:tc>
@@ -2606,7 +2664,7 @@
                 <w:b w:val="0"/>
                 <w:sz w:val="19"/>
               </w:rPr>
-              <w:t>98–141</w:t>
+              <w:t>91–139</w:t>
             </w:r>
           </w:p>
         </w:tc>
@@ -2796,7 +2854,7 @@
                 <w:b w:val="0"/>
                 <w:sz w:val="19"/>
               </w:rPr>
-              <w:t>Topic 1 history, collaboration, harness and Big Five + Activity 1 always-on setup + Activity 2A Hermes Desktop and company brief</w:t>
+              <w:t>Topic 1 history, collaboration, harness and Big Five + Activity 1 always-on assistant + Topic 2 Part A: Hermes Agent, Desktop, model (MiniMax) and Telegram</w:t>
             </w:r>
           </w:p>
         </w:tc>
@@ -2885,7 +2943,7 @@
                 <w:b w:val="0"/>
                 <w:sz w:val="19"/>
               </w:rPr>
-              <w:t>Activity 2B skills/tools + Activities 3–5: Google/Excel, office/video artifacts, human approval and Kanban video studio</w:t>
+              <w:t>Topic 2 Part B: tools, skills, Firecrawl, gog and cron schedules + Activities 2–3 (Kopi website, professional PPT) + Topic 3 team set-up + Activity 4 social media marketing team</w:t>
             </w:r>
           </w:p>
         </w:tc>
@@ -2968,7 +3026,7 @@
                 <w:b w:val="0"/>
                 <w:sz w:val="19"/>
               </w:rPr>
-              <w:t>Activities 6–8: source assurance, Dots, video-team revision and evaluation</w:t>
+              <w:t>Activity 5 video production team (researcher source checks, review and human approval), five principles of AI security, evaluation metrics and the optional Paperclip comparison</w:t>
             </w:r>
           </w:p>
         </w:tc>
@@ -3125,7 +3183,7 @@
         <w:rPr>
           <w:sz w:val="22"/>
         </w:rPr>
-        <w:t>Practical Performance (PP) — three tasks plus written analysis, 1 hour, open book. Task 1: TWO screenshots (Activity 1 chosen always-on assistant and Activity 4 Hermes-generated artifact). Task 2: ONE professional PPT screenshot using skills/tools (Activity 4). Task 3: ONE real multi-agent Kanban video-team screenshot with Hermes bots (Activity 5 or 8).</w:t>
+        <w:t>Practical Performance (PP) — three tasks plus written analysis, 1 hour, open book. Task 1: ONE Meta Muse or OpenAI Dots screenshot (Activity 1). Task 2: ONE Hermes Desktop/dashboard screenshot of the professional PPT (Activity 3). Task 3: TWO screenshots — the Hermes Kanban board and the video it produced (Activity 5).</w:t>
       </w:r>
     </w:p>
     <w:p>
@@ -3174,7 +3232,7 @@
         <w:pStyle w:val="Heading2"/>
       </w:pPr>
       <w:r>
-        <w:t>Day 1 — Human–AI overview → always-on assistants → Hermes single-agent office practice (Activities 1–4)</w:t>
+        <w:t>Day 1 — Human–AI overview → always-on assistants → Hermes Agent setup, tools, skills and schedules (Activities 1–3)</w:t>
       </w:r>
     </w:p>
     <w:tbl>
@@ -3677,7 +3735,7 @@
                 <w:b w:val="0"/>
                 <w:sz w:val="19"/>
               </w:rPr>
-              <w:t>Lab 1: 1A — join Meta Muse with the trainer’s invite code; 1B — set up an OpenAI Dot (Pro/Business Premium); 1C — speak prompts with Wispr Flow; Kopi Kaki schedule check and email draft (PP Task 1 image A)</w:t>
+              <w:t>Lab 1: Activity 1 — 1A join Meta Muse with the trainer’s invite code; 1B set up an OpenAI Dot (Pro/Business Premium); 1C speak prompts with Wispr Flow; Kopi Kaki schedule check and email draft (PP Task 1)</w:t>
             </w:r>
           </w:p>
         </w:tc>
@@ -3762,7 +3820,7 @@
                 <w:b/>
                 <w:sz w:val="19"/>
               </w:rPr>
-              <w:t>Lab 1 checkpoint and results review — source accuracy, approval controls, limits and actual stop state (trainer-led, using the Lab 1 checklist)</w:t>
+              <w:t>Activity 1 checkpoint and results review — source accuracy, approval controls, limits and actual stop state</w:t>
             </w:r>
           </w:p>
         </w:tc>
@@ -3892,6 +3950,24 @@
         <w:tc>
           <w:tcPr>
             <w:tcW w:type="dxa" w:w="1440"/>
+            <w:shd w:val="clear" w:color="auto" w:fill="E8F0FE"/>
+          </w:tcPr>
+          <w:p>
+            <w:r/>
+            <w:r>
+              <w:rPr>
+                <w:rFonts w:ascii="Arial" w:hAnsi="Arial"/>
+                <w:b/>
+                <w:sz w:val="19"/>
+              </w:rPr>
+              <w:t>14:30–15:30</w:t>
+            </w:r>
+          </w:p>
+        </w:tc>
+        <w:tc>
+          <w:tcPr>
+            <w:tcW w:type="dxa" w:w="1080"/>
+            <w:shd w:val="clear" w:color="auto" w:fill="E8F0FE"/>
           </w:tcPr>
           <w:p>
             <w:r/>
@@ -3901,13 +3977,31 @@
                 <w:b w:val="0"/>
                 <w:sz w:val="19"/>
               </w:rPr>
-              <w:t>14:30–15:30</w:t>
-            </w:r>
-          </w:p>
-        </w:tc>
-        <w:tc>
-          <w:tcPr>
-            <w:tcW w:type="dxa" w:w="1080"/>
+              <w:t>60 min</w:t>
+            </w:r>
+          </w:p>
+        </w:tc>
+        <w:tc>
+          <w:tcPr>
+            <w:tcW w:type="dxa" w:w="5112"/>
+            <w:shd w:val="clear" w:color="auto" w:fill="E8F0FE"/>
+          </w:tcPr>
+          <w:p>
+            <w:r/>
+            <w:r>
+              <w:rPr>
+                <w:rFonts w:ascii="Arial" w:hAnsi="Arial"/>
+                <w:b/>
+                <w:sz w:val="19"/>
+              </w:rPr>
+              <w:t>Topic 2 (Part A) — meet Kopi Kaki Co.; what Hermes Agent is; set up Hermes Desktop; connect a model (MiniMax demo); connect Telegram</w:t>
+            </w:r>
+          </w:p>
+        </w:tc>
+        <w:tc>
+          <w:tcPr>
+            <w:tcW w:type="dxa" w:w="864"/>
+            <w:shd w:val="clear" w:color="auto" w:fill="E8F0FE"/>
           </w:tcPr>
           <w:p>
             <w:r/>
@@ -3917,13 +4011,14 @@
                 <w:b w:val="0"/>
                 <w:sz w:val="19"/>
               </w:rPr>
-              <w:t>60 min</w:t>
-            </w:r>
-          </w:p>
-        </w:tc>
-        <w:tc>
-          <w:tcPr>
-            <w:tcW w:type="dxa" w:w="5112"/>
+              <w:t>LU1</w:t>
+            </w:r>
+          </w:p>
+        </w:tc>
+        <w:tc>
+          <w:tcPr>
+            <w:tcW w:type="dxa" w:w="1368"/>
+            <w:shd w:val="clear" w:color="auto" w:fill="E8F0FE"/>
           </w:tcPr>
           <w:p>
             <w:r/>
@@ -3933,13 +4028,33 @@
                 <w:b w:val="0"/>
                 <w:sz w:val="19"/>
               </w:rPr>
-              <w:t>Lab 2: Activity 2A — the Kopi Kaki company pack; Hermes Desktop, features, tools and reviewed skills</w:t>
-            </w:r>
-          </w:p>
-        </w:tc>
-        <w:tc>
-          <w:tcPr>
-            <w:tcW w:type="dxa" w:w="864"/>
+              <w:t>58–66</w:t>
+            </w:r>
+          </w:p>
+        </w:tc>
+      </w:tr>
+      <w:tr>
+        <w:tc>
+          <w:tcPr>
+            <w:tcW w:type="dxa" w:w="1440"/>
+            <w:shd w:val="clear" w:color="auto" w:fill="E8F0FE"/>
+          </w:tcPr>
+          <w:p>
+            <w:r/>
+            <w:r>
+              <w:rPr>
+                <w:rFonts w:ascii="Arial" w:hAnsi="Arial"/>
+                <w:b/>
+                <w:sz w:val="19"/>
+              </w:rPr>
+              <w:t>15:30–16:00</w:t>
+            </w:r>
+          </w:p>
+        </w:tc>
+        <w:tc>
+          <w:tcPr>
+            <w:tcW w:type="dxa" w:w="1080"/>
+            <w:shd w:val="clear" w:color="auto" w:fill="E8F0FE"/>
           </w:tcPr>
           <w:p>
             <w:r/>
@@ -3949,13 +4064,31 @@
                 <w:b w:val="0"/>
                 <w:sz w:val="19"/>
               </w:rPr>
-              <w:t>LU1</w:t>
-            </w:r>
-          </w:p>
-        </w:tc>
-        <w:tc>
-          <w:tcPr>
-            <w:tcW w:type="dxa" w:w="1368"/>
+              <w:t>30 min</w:t>
+            </w:r>
+          </w:p>
+        </w:tc>
+        <w:tc>
+          <w:tcPr>
+            <w:tcW w:type="dxa" w:w="5112"/>
+            <w:shd w:val="clear" w:color="auto" w:fill="E8F0FE"/>
+          </w:tcPr>
+          <w:p>
+            <w:r/>
+            <w:r>
+              <w:rPr>
+                <w:rFonts w:ascii="Arial" w:hAnsi="Arial"/>
+                <w:b/>
+                <w:sz w:val="19"/>
+              </w:rPr>
+              <w:t>Topic 2 (Part B) — configure tools; review and install skills; Firecrawl web search</w:t>
+            </w:r>
+          </w:p>
+        </w:tc>
+        <w:tc>
+          <w:tcPr>
+            <w:tcW w:type="dxa" w:w="864"/>
+            <w:shd w:val="clear" w:color="auto" w:fill="E8F0FE"/>
           </w:tcPr>
           <w:p>
             <w:r/>
@@ -3965,7 +4098,24 @@
                 <w:b w:val="0"/>
                 <w:sz w:val="19"/>
               </w:rPr>
-              <w:t>58–66</w:t>
+              <w:t>LU2</w:t>
+            </w:r>
+          </w:p>
+        </w:tc>
+        <w:tc>
+          <w:tcPr>
+            <w:tcW w:type="dxa" w:w="1368"/>
+            <w:shd w:val="clear" w:color="auto" w:fill="E8F0FE"/>
+          </w:tcPr>
+          <w:p>
+            <w:r/>
+            <w:r>
+              <w:rPr>
+                <w:rFonts w:ascii="Arial" w:hAnsi="Arial"/>
+                <w:b w:val="0"/>
+                <w:sz w:val="19"/>
+              </w:rPr>
+              <w:t>67–70</w:t>
             </w:r>
           </w:p>
         </w:tc>
@@ -3974,6 +4124,7 @@
         <w:tc>
           <w:tcPr>
             <w:tcW w:type="dxa" w:w="1440"/>
+            <w:shd w:val="clear" w:color="auto" w:fill="FFF4E5"/>
           </w:tcPr>
           <w:p>
             <w:r/>
@@ -3983,13 +4134,14 @@
                 <w:b w:val="0"/>
                 <w:sz w:val="19"/>
               </w:rPr>
-              <w:t>15:30–16:00</w:t>
+              <w:t>16:00–16:15</w:t>
             </w:r>
           </w:p>
         </w:tc>
         <w:tc>
           <w:tcPr>
             <w:tcW w:type="dxa" w:w="1080"/>
+            <w:shd w:val="clear" w:color="auto" w:fill="FFF4E5"/>
           </w:tcPr>
           <w:p>
             <w:r/>
@@ -3999,13 +4151,14 @@
                 <w:b w:val="0"/>
                 <w:sz w:val="19"/>
               </w:rPr>
-              <w:t>30 min</w:t>
+              <w:t>15 min</w:t>
             </w:r>
           </w:p>
         </w:tc>
         <w:tc>
           <w:tcPr>
             <w:tcW w:type="dxa" w:w="5112"/>
+            <w:shd w:val="clear" w:color="auto" w:fill="FFF4E5"/>
           </w:tcPr>
           <w:p>
             <w:r/>
@@ -4015,13 +4168,14 @@
                 <w:b w:val="0"/>
                 <w:sz w:val="19"/>
               </w:rPr>
-              <w:t>Lab 2: Activity 2B — install office/gog/video skills, verify tools and save the source brief</w:t>
+              <w:t>Tea break (included in scheduled LU time)</w:t>
             </w:r>
           </w:p>
         </w:tc>
         <w:tc>
           <w:tcPr>
             <w:tcW w:type="dxa" w:w="864"/>
+            <w:shd w:val="clear" w:color="auto" w:fill="FFF4E5"/>
           </w:tcPr>
           <w:p>
             <w:r/>
@@ -4038,6 +4192,7 @@
         <w:tc>
           <w:tcPr>
             <w:tcW w:type="dxa" w:w="1368"/>
+            <w:shd w:val="clear" w:color="auto" w:fill="FFF4E5"/>
           </w:tcPr>
           <w:p>
             <w:r/>
@@ -4047,7 +4202,7 @@
                 <w:b w:val="0"/>
                 <w:sz w:val="19"/>
               </w:rPr>
-              <w:t>67–71</w:t>
+              <w:t>—</w:t>
             </w:r>
           </w:p>
         </w:tc>
@@ -4056,7 +4211,24 @@
         <w:tc>
           <w:tcPr>
             <w:tcW w:type="dxa" w:w="1440"/>
-            <w:shd w:val="clear" w:color="auto" w:fill="FFF4E5"/>
+            <w:shd w:val="clear" w:color="auto" w:fill="E8F0FE"/>
+          </w:tcPr>
+          <w:p>
+            <w:r/>
+            <w:r>
+              <w:rPr>
+                <w:rFonts w:ascii="Arial" w:hAnsi="Arial"/>
+                <w:b/>
+                <w:sz w:val="19"/>
+              </w:rPr>
+              <w:t>16:15–16:45</w:t>
+            </w:r>
+          </w:p>
+        </w:tc>
+        <w:tc>
+          <w:tcPr>
+            <w:tcW w:type="dxa" w:w="1080"/>
+            <w:shd w:val="clear" w:color="auto" w:fill="E8F0FE"/>
           </w:tcPr>
           <w:p>
             <w:r/>
@@ -4066,14 +4238,31 @@
                 <w:b w:val="0"/>
                 <w:sz w:val="19"/>
               </w:rPr>
-              <w:t>16:00–16:15</w:t>
-            </w:r>
-          </w:p>
-        </w:tc>
-        <w:tc>
-          <w:tcPr>
-            <w:tcW w:type="dxa" w:w="1080"/>
-            <w:shd w:val="clear" w:color="auto" w:fill="FFF4E5"/>
+              <w:t>30 min</w:t>
+            </w:r>
+          </w:p>
+        </w:tc>
+        <w:tc>
+          <w:tcPr>
+            <w:tcW w:type="dxa" w:w="5112"/>
+            <w:shd w:val="clear" w:color="auto" w:fill="E8F0FE"/>
+          </w:tcPr>
+          <w:p>
+            <w:r/>
+            <w:r>
+              <w:rPr>
+                <w:rFonts w:ascii="Arial" w:hAnsi="Arial"/>
+                <w:b/>
+                <w:sz w:val="19"/>
+              </w:rPr>
+              <w:t>Topic 2 (Part C) — gog: read and send Gmail, check Calendar; cron schedules; a daily email-summary cron to Telegram</w:t>
+            </w:r>
+          </w:p>
+        </w:tc>
+        <w:tc>
+          <w:tcPr>
+            <w:tcW w:type="dxa" w:w="864"/>
+            <w:shd w:val="clear" w:color="auto" w:fill="E8F0FE"/>
           </w:tcPr>
           <w:p>
             <w:r/>
@@ -4083,14 +4272,14 @@
                 <w:b w:val="0"/>
                 <w:sz w:val="19"/>
               </w:rPr>
-              <w:t>15 min</w:t>
-            </w:r>
-          </w:p>
-        </w:tc>
-        <w:tc>
-          <w:tcPr>
-            <w:tcW w:type="dxa" w:w="5112"/>
-            <w:shd w:val="clear" w:color="auto" w:fill="FFF4E5"/>
+              <w:t>LU2</w:t>
+            </w:r>
+          </w:p>
+        </w:tc>
+        <w:tc>
+          <w:tcPr>
+            <w:tcW w:type="dxa" w:w="1368"/>
+            <w:shd w:val="clear" w:color="auto" w:fill="E8F0FE"/>
           </w:tcPr>
           <w:p>
             <w:r/>
@@ -4100,14 +4289,15 @@
                 <w:b w:val="0"/>
                 <w:sz w:val="19"/>
               </w:rPr>
-              <w:t>Tea break (included in scheduled LU time)</w:t>
-            </w:r>
-          </w:p>
-        </w:tc>
-        <w:tc>
-          <w:tcPr>
-            <w:tcW w:type="dxa" w:w="864"/>
-            <w:shd w:val="clear" w:color="auto" w:fill="FFF4E5"/>
+              <w:t>71–77</w:t>
+            </w:r>
+          </w:p>
+        </w:tc>
+      </w:tr>
+      <w:tr>
+        <w:tc>
+          <w:tcPr>
+            <w:tcW w:type="dxa" w:w="1440"/>
           </w:tcPr>
           <w:p>
             <w:r/>
@@ -4117,14 +4307,13 @@
                 <w:b w:val="0"/>
                 <w:sz w:val="19"/>
               </w:rPr>
-              <w:t>LU2</w:t>
-            </w:r>
-          </w:p>
-        </w:tc>
-        <w:tc>
-          <w:tcPr>
-            <w:tcW w:type="dxa" w:w="1368"/>
-            <w:shd w:val="clear" w:color="auto" w:fill="FFF4E5"/>
+              <w:t>16:45–17:30</w:t>
+            </w:r>
+          </w:p>
+        </w:tc>
+        <w:tc>
+          <w:tcPr>
+            <w:tcW w:type="dxa" w:w="1080"/>
           </w:tcPr>
           <w:p>
             <w:r/>
@@ -4134,7 +4323,55 @@
                 <w:b w:val="0"/>
                 <w:sz w:val="19"/>
               </w:rPr>
-              <w:t>—</w:t>
+              <w:t>45 min</w:t>
+            </w:r>
+          </w:p>
+        </w:tc>
+        <w:tc>
+          <w:tcPr>
+            <w:tcW w:type="dxa" w:w="5112"/>
+          </w:tcPr>
+          <w:p>
+            <w:r/>
+            <w:r>
+              <w:rPr>
+                <w:rFonts w:ascii="Arial" w:hAnsi="Arial"/>
+                <w:b w:val="0"/>
+                <w:sz w:val="19"/>
+              </w:rPr>
+              <w:t>Lab 2: Activity 2 — install UX skills from skills.sh; Hermes builds the Kopi Kaki website</w:t>
+            </w:r>
+          </w:p>
+        </w:tc>
+        <w:tc>
+          <w:tcPr>
+            <w:tcW w:type="dxa" w:w="864"/>
+          </w:tcPr>
+          <w:p>
+            <w:r/>
+            <w:r>
+              <w:rPr>
+                <w:rFonts w:ascii="Arial" w:hAnsi="Arial"/>
+                <w:b w:val="0"/>
+                <w:sz w:val="19"/>
+              </w:rPr>
+              <w:t>LU2</w:t>
+            </w:r>
+          </w:p>
+        </w:tc>
+        <w:tc>
+          <w:tcPr>
+            <w:tcW w:type="dxa" w:w="1368"/>
+          </w:tcPr>
+          <w:p>
+            <w:r/>
+            <w:r>
+              <w:rPr>
+                <w:rFonts w:ascii="Arial" w:hAnsi="Arial"/>
+                <w:b w:val="0"/>
+                <w:sz w:val="19"/>
+              </w:rPr>
+              <w:t>78–83</w:t>
             </w:r>
           </w:p>
         </w:tc>
@@ -4152,7 +4389,7 @@
                 <w:b w:val="0"/>
                 <w:sz w:val="19"/>
               </w:rPr>
-              <w:t>16:15–17:05</w:t>
+              <w:t>17:30–18:15</w:t>
             </w:r>
           </w:p>
         </w:tc>
@@ -4168,7 +4405,7 @@
                 <w:b w:val="0"/>
                 <w:sz w:val="19"/>
               </w:rPr>
-              <w:t>50 min</w:t>
+              <w:t>45 min</w:t>
             </w:r>
           </w:p>
         </w:tc>
@@ -4184,7 +4421,7 @@
                 <w:b w:val="0"/>
                 <w:sz w:val="19"/>
               </w:rPr>
-              <w:t>Lab 3: Activity 3 — Hermes gog Gmail/Calendar/Drive and verified Excel analysis</w:t>
+              <w:t>Lab 3: Activity 3 — PPT tool + skill: Hermes builds a professional Kopi Kaki deck (PP Task 2)</w:t>
             </w:r>
           </w:p>
         </w:tc>
@@ -4216,7 +4453,7 @@
                 <w:b w:val="0"/>
                 <w:sz w:val="19"/>
               </w:rPr>
-              <w:t>72–81</w:t>
+              <w:t>84–90</w:t>
             </w:r>
           </w:p>
         </w:tc>
@@ -4225,6 +4462,7 @@
         <w:tc>
           <w:tcPr>
             <w:tcW w:type="dxa" w:w="1440"/>
+            <w:shd w:val="clear" w:color="auto" w:fill="F3F5F8"/>
           </w:tcPr>
           <w:p>
             <w:r/>
@@ -4234,13 +4472,14 @@
                 <w:b w:val="0"/>
                 <w:sz w:val="19"/>
               </w:rPr>
-              <w:t>17:05–17:45</w:t>
+              <w:t>18:15–18:30</w:t>
             </w:r>
           </w:p>
         </w:tc>
         <w:tc>
           <w:tcPr>
             <w:tcW w:type="dxa" w:w="1080"/>
+            <w:shd w:val="clear" w:color="auto" w:fill="F3F5F8"/>
           </w:tcPr>
           <w:p>
             <w:r/>
@@ -4250,13 +4489,14 @@
                 <w:b w:val="0"/>
                 <w:sz w:val="19"/>
               </w:rPr>
-              <w:t>40 min</w:t>
+              <w:t>15 min</w:t>
             </w:r>
           </w:p>
         </w:tc>
         <w:tc>
           <w:tcPr>
             <w:tcW w:type="dxa" w:w="5112"/>
+            <w:shd w:val="clear" w:color="auto" w:fill="F3F5F8"/>
           </w:tcPr>
           <w:p>
             <w:r/>
@@ -4266,13 +4506,14 @@
                 <w:b w:val="0"/>
                 <w:sz w:val="19"/>
               </w:rPr>
-              <w:t>Lab 4: Activity 4A — interactive dashboard and professional PPT (PP Task 2; PP Task 1 image B)</w:t>
+              <w:t>Day 1 recap, Q&amp;A and PM digital attendance</w:t>
             </w:r>
           </w:p>
         </w:tc>
         <w:tc>
           <w:tcPr>
             <w:tcW w:type="dxa" w:w="864"/>
+            <w:shd w:val="clear" w:color="auto" w:fill="F3F5F8"/>
           </w:tcPr>
           <w:p>
             <w:r/>
@@ -4289,6 +4530,7 @@
         <w:tc>
           <w:tcPr>
             <w:tcW w:type="dxa" w:w="1368"/>
+            <w:shd w:val="clear" w:color="auto" w:fill="F3F5F8"/>
           </w:tcPr>
           <w:p>
             <w:r/>
@@ -4298,176 +4540,7 @@
                 <w:b w:val="0"/>
                 <w:sz w:val="19"/>
               </w:rPr>
-              <w:t>82–97</w:t>
-            </w:r>
-          </w:p>
-        </w:tc>
-      </w:tr>
-      <w:tr>
-        <w:tc>
-          <w:tcPr>
-            <w:tcW w:type="dxa" w:w="1440"/>
-          </w:tcPr>
-          <w:p>
-            <w:r/>
-            <w:r>
-              <w:rPr>
-                <w:rFonts w:ascii="Arial" w:hAnsi="Arial"/>
-                <w:b w:val="0"/>
-                <w:sz w:val="19"/>
-              </w:rPr>
-              <w:t>17:45–18:15</w:t>
-            </w:r>
-          </w:p>
-        </w:tc>
-        <w:tc>
-          <w:tcPr>
-            <w:tcW w:type="dxa" w:w="1080"/>
-          </w:tcPr>
-          <w:p>
-            <w:r/>
-            <w:r>
-              <w:rPr>
-                <w:rFonts w:ascii="Arial" w:hAnsi="Arial"/>
-                <w:b w:val="0"/>
-                <w:sz w:val="19"/>
-              </w:rPr>
-              <w:t>30 min</w:t>
-            </w:r>
-          </w:p>
-        </w:tc>
-        <w:tc>
-          <w:tcPr>
-            <w:tcW w:type="dxa" w:w="5112"/>
-          </w:tcPr>
-          <w:p>
-            <w:r/>
-            <w:r>
-              <w:rPr>
-                <w:rFonts w:ascii="Arial" w:hAnsi="Arial"/>
-                <w:b w:val="0"/>
-                <w:sz w:val="19"/>
-              </w:rPr>
-              <w:t>Lab 4: Activity 4B — single-agent video, exact-version review and one approved test email with Sent readback</w:t>
-            </w:r>
-          </w:p>
-        </w:tc>
-        <w:tc>
-          <w:tcPr>
-            <w:tcW w:type="dxa" w:w="864"/>
-          </w:tcPr>
-          <w:p>
-            <w:r/>
-            <w:r>
-              <w:rPr>
-                <w:rFonts w:ascii="Arial" w:hAnsi="Arial"/>
-                <w:b w:val="0"/>
-                <w:sz w:val="19"/>
-              </w:rPr>
-              <w:t>LU2</w:t>
-            </w:r>
-          </w:p>
-        </w:tc>
-        <w:tc>
-          <w:tcPr>
-            <w:tcW w:type="dxa" w:w="1368"/>
-          </w:tcPr>
-          <w:p>
-            <w:r/>
-            <w:r>
-              <w:rPr>
-                <w:rFonts w:ascii="Arial" w:hAnsi="Arial"/>
-                <w:b w:val="0"/>
-                <w:sz w:val="19"/>
-              </w:rPr>
-              <w:t>82–97</w:t>
-            </w:r>
-          </w:p>
-        </w:tc>
-      </w:tr>
-      <w:tr>
-        <w:tc>
-          <w:tcPr>
-            <w:tcW w:type="dxa" w:w="1440"/>
-            <w:shd w:val="clear" w:color="auto" w:fill="F3F5F8"/>
-          </w:tcPr>
-          <w:p>
-            <w:r/>
-            <w:r>
-              <w:rPr>
-                <w:rFonts w:ascii="Arial" w:hAnsi="Arial"/>
-                <w:b w:val="0"/>
-                <w:sz w:val="19"/>
-              </w:rPr>
-              <w:t>18:15–18:30</w:t>
-            </w:r>
-          </w:p>
-        </w:tc>
-        <w:tc>
-          <w:tcPr>
-            <w:tcW w:type="dxa" w:w="1080"/>
-            <w:shd w:val="clear" w:color="auto" w:fill="F3F5F8"/>
-          </w:tcPr>
-          <w:p>
-            <w:r/>
-            <w:r>
-              <w:rPr>
-                <w:rFonts w:ascii="Arial" w:hAnsi="Arial"/>
-                <w:b w:val="0"/>
-                <w:sz w:val="19"/>
-              </w:rPr>
-              <w:t>15 min</w:t>
-            </w:r>
-          </w:p>
-        </w:tc>
-        <w:tc>
-          <w:tcPr>
-            <w:tcW w:type="dxa" w:w="5112"/>
-            <w:shd w:val="clear" w:color="auto" w:fill="F3F5F8"/>
-          </w:tcPr>
-          <w:p>
-            <w:r/>
-            <w:r>
-              <w:rPr>
-                <w:rFonts w:ascii="Arial" w:hAnsi="Arial"/>
-                <w:b w:val="0"/>
-                <w:sz w:val="19"/>
-              </w:rPr>
-              <w:t>Day 1 recap, Q&amp;A and PM digital attendance</w:t>
-            </w:r>
-          </w:p>
-        </w:tc>
-        <w:tc>
-          <w:tcPr>
-            <w:tcW w:type="dxa" w:w="864"/>
-            <w:shd w:val="clear" w:color="auto" w:fill="F3F5F8"/>
-          </w:tcPr>
-          <w:p>
-            <w:r/>
-            <w:r>
-              <w:rPr>
-                <w:rFonts w:ascii="Arial" w:hAnsi="Arial"/>
-                <w:b w:val="0"/>
-                <w:sz w:val="19"/>
-              </w:rPr>
-              <w:t>LU2</w:t>
-            </w:r>
-          </w:p>
-        </w:tc>
-        <w:tc>
-          <w:tcPr>
-            <w:tcW w:type="dxa" w:w="1368"/>
-            <w:shd w:val="clear" w:color="auto" w:fill="F3F5F8"/>
-          </w:tcPr>
-          <w:p>
-            <w:r/>
-            <w:r>
-              <w:rPr>
-                <w:rFonts w:ascii="Arial" w:hAnsi="Arial"/>
-                <w:b w:val="0"/>
-                <w:sz w:val="19"/>
-              </w:rPr>
-              <w:t>98</w:t>
+              <w:t>91</w:t>
             </w:r>
           </w:p>
         </w:tc>
@@ -4488,7 +4561,7 @@
         <w:pStyle w:val="Heading2"/>
       </w:pPr>
       <w:r>
-        <w:t>Day 2 — Hermes multi-agent Kanban video team and OpenAI Dots (Activities 5–8), then assessment</w:t>
+        <w:t>Day 2 — Hermes marketing and video teams with profiles, Kanban and bots (Activities 4–5), AI security, optional Paperclip bonus, then assessment</w:t>
       </w:r>
     </w:p>
     <w:tbl>
@@ -4646,7 +4719,7 @@
                 <w:b w:val="0"/>
                 <w:sz w:val="19"/>
               </w:rPr>
-              <w:t>Day 1 recap and AM attendance; prepare the multi-agent board</w:t>
+              <w:t>Day 1 recap and AM attendance</w:t>
             </w:r>
           </w:p>
         </w:tc>
@@ -4680,7 +4753,7 @@
                 <w:b w:val="0"/>
                 <w:sz w:val="19"/>
               </w:rPr>
-              <w:t>98</w:t>
+              <w:t>91</w:t>
             </w:r>
           </w:p>
         </w:tc>
@@ -4689,6 +4762,24 @@
         <w:tc>
           <w:tcPr>
             <w:tcW w:type="dxa" w:w="1440"/>
+            <w:shd w:val="clear" w:color="auto" w:fill="E8F0FE"/>
+          </w:tcPr>
+          <w:p>
+            <w:r/>
+            <w:r>
+              <w:rPr>
+                <w:rFonts w:ascii="Arial" w:hAnsi="Arial"/>
+                <w:b/>
+                <w:sz w:val="19"/>
+              </w:rPr>
+              <w:t>9:45–10:15</w:t>
+            </w:r>
+          </w:p>
+        </w:tc>
+        <w:tc>
+          <w:tcPr>
+            <w:tcW w:type="dxa" w:w="1080"/>
+            <w:shd w:val="clear" w:color="auto" w:fill="E8F0FE"/>
           </w:tcPr>
           <w:p>
             <w:r/>
@@ -4698,13 +4789,31 @@
                 <w:b w:val="0"/>
                 <w:sz w:val="19"/>
               </w:rPr>
-              <w:t>9:45–10:35</w:t>
-            </w:r>
-          </w:p>
-        </w:tc>
-        <w:tc>
-          <w:tcPr>
-            <w:tcW w:type="dxa" w:w="1080"/>
+              <w:t>30 min</w:t>
+            </w:r>
+          </w:p>
+        </w:tc>
+        <w:tc>
+          <w:tcPr>
+            <w:tcW w:type="dxa" w:w="5112"/>
+            <w:shd w:val="clear" w:color="auto" w:fill="E8F0FE"/>
+          </w:tcPr>
+          <w:p>
+            <w:r/>
+            <w:r>
+              <w:rPr>
+                <w:rFonts w:ascii="Arial" w:hAnsi="Arial"/>
+                <w:b/>
+                <w:sz w:val="19"/>
+              </w:rPr>
+              <w:t>Topic 3 (Part A) — introduction to multiple agents (each with its own tools, skills, model, instructions and context window); how agents talk (ACP); video skills and tools (HyperFrames, Remotion, Manim); Hermes profiles, the Kanban board and bots</w:t>
+            </w:r>
+          </w:p>
+        </w:tc>
+        <w:tc>
+          <w:tcPr>
+            <w:tcW w:type="dxa" w:w="864"/>
+            <w:shd w:val="clear" w:color="auto" w:fill="E8F0FE"/>
           </w:tcPr>
           <w:p>
             <w:r/>
@@ -4714,13 +4823,14 @@
                 <w:b w:val="0"/>
                 <w:sz w:val="19"/>
               </w:rPr>
-              <w:t>50 min</w:t>
-            </w:r>
-          </w:p>
-        </w:tc>
-        <w:tc>
-          <w:tcPr>
-            <w:tcW w:type="dxa" w:w="5112"/>
+              <w:t>LU2</w:t>
+            </w:r>
+          </w:p>
+        </w:tc>
+        <w:tc>
+          <w:tcPr>
+            <w:tcW w:type="dxa" w:w="1368"/>
+            <w:shd w:val="clear" w:color="auto" w:fill="E8F0FE"/>
           </w:tcPr>
           <w:p>
             <w:r/>
@@ -4730,13 +4840,15 @@
                 <w:b w:val="0"/>
                 <w:sz w:val="19"/>
               </w:rPr>
-              <w:t>Lab 5: Activity 5A — Hermes bots, Kanban roles, dependencies and video production</w:t>
-            </w:r>
-          </w:p>
-        </w:tc>
-        <w:tc>
-          <w:tcPr>
-            <w:tcW w:type="dxa" w:w="864"/>
+              <w:t>91–103</w:t>
+            </w:r>
+          </w:p>
+        </w:tc>
+      </w:tr>
+      <w:tr>
+        <w:tc>
+          <w:tcPr>
+            <w:tcW w:type="dxa" w:w="1440"/>
           </w:tcPr>
           <w:p>
             <w:r/>
@@ -4746,13 +4858,13 @@
                 <w:b w:val="0"/>
                 <w:sz w:val="19"/>
               </w:rPr>
-              <w:t>LU2</w:t>
-            </w:r>
-          </w:p>
-        </w:tc>
-        <w:tc>
-          <w:tcPr>
-            <w:tcW w:type="dxa" w:w="1368"/>
+              <w:t>10:15–11:15</w:t>
+            </w:r>
+          </w:p>
+        </w:tc>
+        <w:tc>
+          <w:tcPr>
+            <w:tcW w:type="dxa" w:w="1080"/>
           </w:tcPr>
           <w:p>
             <w:r/>
@@ -4762,7 +4874,55 @@
                 <w:b w:val="0"/>
                 <w:sz w:val="19"/>
               </w:rPr>
-              <w:t>99–112</w:t>
+              <w:t>60 min</w:t>
+            </w:r>
+          </w:p>
+        </w:tc>
+        <w:tc>
+          <w:tcPr>
+            <w:tcW w:type="dxa" w:w="5112"/>
+          </w:tcPr>
+          <w:p>
+            <w:r/>
+            <w:r>
+              <w:rPr>
+                <w:rFonts w:ascii="Arial" w:hAnsi="Arial"/>
+                <w:b w:val="0"/>
+                <w:sz w:val="19"/>
+              </w:rPr>
+              <w:t>Lab 4: Activity 4 — social media marketing team: researcher, LinkedIn/Facebook/Instagram writers and image creator; review the posts gallery</w:t>
+            </w:r>
+          </w:p>
+        </w:tc>
+        <w:tc>
+          <w:tcPr>
+            <w:tcW w:type="dxa" w:w="864"/>
+          </w:tcPr>
+          <w:p>
+            <w:r/>
+            <w:r>
+              <w:rPr>
+                <w:rFonts w:ascii="Arial" w:hAnsi="Arial"/>
+                <w:b w:val="0"/>
+                <w:sz w:val="19"/>
+              </w:rPr>
+              <w:t>LU2</w:t>
+            </w:r>
+          </w:p>
+        </w:tc>
+        <w:tc>
+          <w:tcPr>
+            <w:tcW w:type="dxa" w:w="1368"/>
+          </w:tcPr>
+          <w:p>
+            <w:r/>
+            <w:r>
+              <w:rPr>
+                <w:rFonts w:ascii="Arial" w:hAnsi="Arial"/>
+                <w:b w:val="0"/>
+                <w:sz w:val="19"/>
+              </w:rPr>
+              <w:t>104–109</w:t>
             </w:r>
           </w:p>
         </w:tc>
@@ -4771,6 +4931,7 @@
         <w:tc>
           <w:tcPr>
             <w:tcW w:type="dxa" w:w="1440"/>
+            <w:shd w:val="clear" w:color="auto" w:fill="FFF4E5"/>
           </w:tcPr>
           <w:p>
             <w:r/>
@@ -4780,13 +4941,14 @@
                 <w:b w:val="0"/>
                 <w:sz w:val="19"/>
               </w:rPr>
-              <w:t>10:35–11:10</w:t>
+              <w:t>11:15–11:30</w:t>
             </w:r>
           </w:p>
         </w:tc>
         <w:tc>
           <w:tcPr>
             <w:tcW w:type="dxa" w:w="1080"/>
+            <w:shd w:val="clear" w:color="auto" w:fill="FFF4E5"/>
           </w:tcPr>
           <w:p>
             <w:r/>
@@ -4796,13 +4958,14 @@
                 <w:b w:val="0"/>
                 <w:sz w:val="19"/>
               </w:rPr>
-              <w:t>35 min</w:t>
+              <w:t>15 min</w:t>
             </w:r>
           </w:p>
         </w:tc>
         <w:tc>
           <w:tcPr>
             <w:tcW w:type="dxa" w:w="5112"/>
+            <w:shd w:val="clear" w:color="auto" w:fill="FFF4E5"/>
           </w:tcPr>
           <w:p>
             <w:r/>
@@ -4812,13 +4975,14 @@
                 <w:b w:val="0"/>
                 <w:sz w:val="19"/>
               </w:rPr>
-              <w:t>Lab 5: Activity 5B — independent audit, human revision and video-team evidence</w:t>
+              <w:t>Tea break (included in scheduled LU time)</w:t>
             </w:r>
           </w:p>
         </w:tc>
         <w:tc>
           <w:tcPr>
             <w:tcW w:type="dxa" w:w="864"/>
+            <w:shd w:val="clear" w:color="auto" w:fill="FFF4E5"/>
           </w:tcPr>
           <w:p>
             <w:r/>
@@ -4835,6 +4999,7 @@
         <w:tc>
           <w:tcPr>
             <w:tcW w:type="dxa" w:w="1368"/>
+            <w:shd w:val="clear" w:color="auto" w:fill="FFF4E5"/>
           </w:tcPr>
           <w:p>
             <w:r/>
@@ -4844,7 +5009,7 @@
                 <w:b w:val="0"/>
                 <w:sz w:val="19"/>
               </w:rPr>
-              <w:t>99–112</w:t>
+              <w:t>—</w:t>
             </w:r>
           </w:p>
         </w:tc>
@@ -4853,7 +5018,6 @@
         <w:tc>
           <w:tcPr>
             <w:tcW w:type="dxa" w:w="1440"/>
-            <w:shd w:val="clear" w:color="auto" w:fill="FFF4E5"/>
           </w:tcPr>
           <w:p>
             <w:r/>
@@ -4863,7 +5027,346 @@
                 <w:b w:val="0"/>
                 <w:sz w:val="19"/>
               </w:rPr>
-              <w:t>11:10–11:25</w:t>
+              <w:t>11:30–12:15</w:t>
+            </w:r>
+          </w:p>
+        </w:tc>
+        <w:tc>
+          <w:tcPr>
+            <w:tcW w:type="dxa" w:w="1080"/>
+          </w:tcPr>
+          <w:p>
+            <w:r/>
+            <w:r>
+              <w:rPr>
+                <w:rFonts w:ascii="Arial" w:hAnsi="Arial"/>
+                <w:b w:val="0"/>
+                <w:sz w:val="19"/>
+              </w:rPr>
+              <w:t>45 min</w:t>
+            </w:r>
+          </w:p>
+        </w:tc>
+        <w:tc>
+          <w:tcPr>
+            <w:tcW w:type="dxa" w:w="5112"/>
+          </w:tcPr>
+          <w:p>
+            <w:r/>
+            <w:r>
+              <w:rPr>
+                <w:rFonts w:ascii="Arial" w:hAnsi="Arial"/>
+                <w:b w:val="0"/>
+                <w:sz w:val="19"/>
+              </w:rPr>
+              <w:t>Lab 5: Activity 5A — video production team: profiles, Kanban board and bots; researcher source checks and script</w:t>
+            </w:r>
+          </w:p>
+        </w:tc>
+        <w:tc>
+          <w:tcPr>
+            <w:tcW w:type="dxa" w:w="864"/>
+          </w:tcPr>
+          <w:p>
+            <w:r/>
+            <w:r>
+              <w:rPr>
+                <w:rFonts w:ascii="Arial" w:hAnsi="Arial"/>
+                <w:b w:val="0"/>
+                <w:sz w:val="19"/>
+              </w:rPr>
+              <w:t>LU3</w:t>
+            </w:r>
+          </w:p>
+        </w:tc>
+        <w:tc>
+          <w:tcPr>
+            <w:tcW w:type="dxa" w:w="1368"/>
+          </w:tcPr>
+          <w:p>
+            <w:r/>
+            <w:r>
+              <w:rPr>
+                <w:rFonts w:ascii="Arial" w:hAnsi="Arial"/>
+                <w:b w:val="0"/>
+                <w:sz w:val="19"/>
+              </w:rPr>
+              <w:t>110–114</w:t>
+            </w:r>
+          </w:p>
+        </w:tc>
+      </w:tr>
+      <w:tr>
+        <w:tc>
+          <w:tcPr>
+            <w:tcW w:type="dxa" w:w="1440"/>
+            <w:shd w:val="clear" w:color="auto" w:fill="FDE9D9"/>
+          </w:tcPr>
+          <w:p>
+            <w:r/>
+            <w:r>
+              <w:rPr>
+                <w:rFonts w:ascii="Arial" w:hAnsi="Arial"/>
+                <w:b w:val="0"/>
+                <w:sz w:val="19"/>
+              </w:rPr>
+              <w:t>12:15–13:15</w:t>
+            </w:r>
+          </w:p>
+        </w:tc>
+        <w:tc>
+          <w:tcPr>
+            <w:tcW w:type="dxa" w:w="1080"/>
+            <w:shd w:val="clear" w:color="auto" w:fill="FDE9D9"/>
+          </w:tcPr>
+          <w:p>
+            <w:r/>
+            <w:r>
+              <w:rPr>
+                <w:rFonts w:ascii="Arial" w:hAnsi="Arial"/>
+                <w:b w:val="0"/>
+                <w:sz w:val="19"/>
+              </w:rPr>
+              <w:t>60 min</w:t>
+            </w:r>
+          </w:p>
+        </w:tc>
+        <w:tc>
+          <w:tcPr>
+            <w:tcW w:type="dxa" w:w="5112"/>
+            <w:shd w:val="clear" w:color="auto" w:fill="FDE9D9"/>
+          </w:tcPr>
+          <w:p>
+            <w:r/>
+            <w:r>
+              <w:rPr>
+                <w:rFonts w:ascii="Arial" w:hAnsi="Arial"/>
+                <w:b w:val="0"/>
+                <w:sz w:val="19"/>
+              </w:rPr>
+              <w:t>Lunch break</w:t>
+            </w:r>
+          </w:p>
+        </w:tc>
+        <w:tc>
+          <w:tcPr>
+            <w:tcW w:type="dxa" w:w="864"/>
+            <w:shd w:val="clear" w:color="auto" w:fill="FDE9D9"/>
+          </w:tcPr>
+          <w:p>
+            <w:r/>
+            <w:r>
+              <w:rPr>
+                <w:rFonts w:ascii="Arial" w:hAnsi="Arial"/>
+                <w:b w:val="0"/>
+                <w:sz w:val="19"/>
+              </w:rPr>
+              <w:t>—</w:t>
+            </w:r>
+          </w:p>
+        </w:tc>
+        <w:tc>
+          <w:tcPr>
+            <w:tcW w:type="dxa" w:w="1368"/>
+            <w:shd w:val="clear" w:color="auto" w:fill="FDE9D9"/>
+          </w:tcPr>
+          <w:p>
+            <w:r/>
+            <w:r>
+              <w:rPr>
+                <w:rFonts w:ascii="Arial" w:hAnsi="Arial"/>
+                <w:b w:val="0"/>
+                <w:sz w:val="19"/>
+              </w:rPr>
+              <w:t>—</w:t>
+            </w:r>
+          </w:p>
+        </w:tc>
+      </w:tr>
+      <w:tr>
+        <w:tc>
+          <w:tcPr>
+            <w:tcW w:type="dxa" w:w="1440"/>
+          </w:tcPr>
+          <w:p>
+            <w:r/>
+            <w:r>
+              <w:rPr>
+                <w:rFonts w:ascii="Arial" w:hAnsi="Arial"/>
+                <w:b w:val="0"/>
+                <w:sz w:val="19"/>
+              </w:rPr>
+              <w:t>13:15–14:40</w:t>
+            </w:r>
+          </w:p>
+        </w:tc>
+        <w:tc>
+          <w:tcPr>
+            <w:tcW w:type="dxa" w:w="1080"/>
+          </w:tcPr>
+          <w:p>
+            <w:r/>
+            <w:r>
+              <w:rPr>
+                <w:rFonts w:ascii="Arial" w:hAnsi="Arial"/>
+                <w:b w:val="0"/>
+                <w:sz w:val="19"/>
+              </w:rPr>
+              <w:t>85 min</w:t>
+            </w:r>
+          </w:p>
+        </w:tc>
+        <w:tc>
+          <w:tcPr>
+            <w:tcW w:type="dxa" w:w="5112"/>
+          </w:tcPr>
+          <w:p>
+            <w:r/>
+            <w:r>
+              <w:rPr>
+                <w:rFonts w:ascii="Arial" w:hAnsi="Arial"/>
+                <w:b w:val="0"/>
+                <w:sz w:val="19"/>
+              </w:rPr>
+              <w:t>Lab 5: Activity 5B — video production, voice-over and review; human approval of the exact video via its review link (PP Task 3)</w:t>
+            </w:r>
+          </w:p>
+        </w:tc>
+        <w:tc>
+          <w:tcPr>
+            <w:tcW w:type="dxa" w:w="864"/>
+          </w:tcPr>
+          <w:p>
+            <w:r/>
+            <w:r>
+              <w:rPr>
+                <w:rFonts w:ascii="Arial" w:hAnsi="Arial"/>
+                <w:b w:val="0"/>
+                <w:sz w:val="19"/>
+              </w:rPr>
+              <w:t>LU3</w:t>
+            </w:r>
+          </w:p>
+        </w:tc>
+        <w:tc>
+          <w:tcPr>
+            <w:tcW w:type="dxa" w:w="1368"/>
+          </w:tcPr>
+          <w:p>
+            <w:r/>
+            <w:r>
+              <w:rPr>
+                <w:rFonts w:ascii="Arial" w:hAnsi="Arial"/>
+                <w:b w:val="0"/>
+                <w:sz w:val="19"/>
+              </w:rPr>
+              <w:t>115–120</w:t>
+            </w:r>
+          </w:p>
+        </w:tc>
+      </w:tr>
+      <w:tr>
+        <w:tc>
+          <w:tcPr>
+            <w:tcW w:type="dxa" w:w="1440"/>
+            <w:shd w:val="clear" w:color="auto" w:fill="E8F0FE"/>
+          </w:tcPr>
+          <w:p>
+            <w:r/>
+            <w:r>
+              <w:rPr>
+                <w:rFonts w:ascii="Arial" w:hAnsi="Arial"/>
+                <w:b/>
+                <w:sz w:val="19"/>
+              </w:rPr>
+              <w:t>14:40–15:10</w:t>
+            </w:r>
+          </w:p>
+        </w:tc>
+        <w:tc>
+          <w:tcPr>
+            <w:tcW w:type="dxa" w:w="1080"/>
+            <w:shd w:val="clear" w:color="auto" w:fill="E8F0FE"/>
+          </w:tcPr>
+          <w:p>
+            <w:r/>
+            <w:r>
+              <w:rPr>
+                <w:rFonts w:ascii="Arial" w:hAnsi="Arial"/>
+                <w:b w:val="0"/>
+                <w:sz w:val="19"/>
+              </w:rPr>
+              <w:t>30 min</w:t>
+            </w:r>
+          </w:p>
+        </w:tc>
+        <w:tc>
+          <w:tcPr>
+            <w:tcW w:type="dxa" w:w="5112"/>
+            <w:shd w:val="clear" w:color="auto" w:fill="E8F0FE"/>
+          </w:tcPr>
+          <w:p>
+            <w:r/>
+            <w:r>
+              <w:rPr>
+                <w:rFonts w:ascii="Arial" w:hAnsi="Arial"/>
+                <w:b/>
+                <w:sz w:val="19"/>
+              </w:rPr>
+              <w:t>Topic 3 (Part B) — five principles of AI security; RAG vs a standard LLM; four metrics to evaluate and improve the team</w:t>
+            </w:r>
+          </w:p>
+        </w:tc>
+        <w:tc>
+          <w:tcPr>
+            <w:tcW w:type="dxa" w:w="864"/>
+            <w:shd w:val="clear" w:color="auto" w:fill="E8F0FE"/>
+          </w:tcPr>
+          <w:p>
+            <w:r/>
+            <w:r>
+              <w:rPr>
+                <w:rFonts w:ascii="Arial" w:hAnsi="Arial"/>
+                <w:b w:val="0"/>
+                <w:sz w:val="19"/>
+              </w:rPr>
+              <w:t>LU3</w:t>
+            </w:r>
+          </w:p>
+        </w:tc>
+        <w:tc>
+          <w:tcPr>
+            <w:tcW w:type="dxa" w:w="1368"/>
+            <w:shd w:val="clear" w:color="auto" w:fill="E8F0FE"/>
+          </w:tcPr>
+          <w:p>
+            <w:r/>
+            <w:r>
+              <w:rPr>
+                <w:rFonts w:ascii="Arial" w:hAnsi="Arial"/>
+                <w:b w:val="0"/>
+                <w:sz w:val="19"/>
+              </w:rPr>
+              <w:t>121–123</w:t>
+            </w:r>
+          </w:p>
+        </w:tc>
+      </w:tr>
+      <w:tr>
+        <w:tc>
+          <w:tcPr>
+            <w:tcW w:type="dxa" w:w="1440"/>
+            <w:shd w:val="clear" w:color="auto" w:fill="FFF4E5"/>
+          </w:tcPr>
+          <w:p>
+            <w:r/>
+            <w:r>
+              <w:rPr>
+                <w:rFonts w:ascii="Arial" w:hAnsi="Arial"/>
+                <w:b w:val="0"/>
+                <w:sz w:val="19"/>
+              </w:rPr>
+              <w:t>15:10–15:25</w:t>
             </w:r>
           </w:p>
         </w:tc>
@@ -4914,7 +5417,7 @@
                 <w:b w:val="0"/>
                 <w:sz w:val="19"/>
               </w:rPr>
-              <w:t>LU2</w:t>
+              <w:t>LU3</w:t>
             </w:r>
           </w:p>
         </w:tc>
@@ -4950,7 +5453,7 @@
                 <w:b/>
                 <w:sz w:val="19"/>
               </w:rPr>
-              <w:t>11:25–11:30</w:t>
+              <w:t>15:25–16:00</w:t>
             </w:r>
           </w:p>
         </w:tc>
@@ -4967,7 +5470,7 @@
                 <w:b w:val="0"/>
                 <w:sz w:val="19"/>
               </w:rPr>
-              <w:t>5 min</w:t>
+              <w:t>35 min</w:t>
             </w:r>
           </w:p>
         </w:tc>
@@ -4984,7 +5487,7 @@
                 <w:b/>
                 <w:sz w:val="19"/>
               </w:rPr>
-              <w:t>Source assurance introduction — claims, passages, versions and owners</w:t>
+              <w:t>Bonus (optional) — Paperclip: Kopi Kaki as a one-person company (trainer demo; full lab self-paced) and comparison with the Hermes Kanban team</w:t>
             </w:r>
           </w:p>
         </w:tc>
@@ -5001,7 +5504,7 @@
                 <w:b w:val="0"/>
                 <w:sz w:val="19"/>
               </w:rPr>
-              <w:t>LU2</w:t>
+              <w:t>LU3</w:t>
             </w:r>
           </w:p>
         </w:tc>
@@ -5018,7 +5521,7 @@
                 <w:b w:val="0"/>
                 <w:sz w:val="19"/>
               </w:rPr>
-              <w:t>113</w:t>
+              <w:t>124–139</w:t>
             </w:r>
           </w:p>
         </w:tc>
@@ -5027,6 +5530,7 @@
         <w:tc>
           <w:tcPr>
             <w:tcW w:type="dxa" w:w="1440"/>
+            <w:shd w:val="clear" w:color="auto" w:fill="F3F5F8"/>
           </w:tcPr>
           <w:p>
             <w:r/>
@@ -5036,13 +5540,14 @@
                 <w:b w:val="0"/>
                 <w:sz w:val="19"/>
               </w:rPr>
-              <w:t>11:30–12:15</w:t>
+              <w:t>16:00–16:15</w:t>
             </w:r>
           </w:p>
         </w:tc>
         <w:tc>
           <w:tcPr>
             <w:tcW w:type="dxa" w:w="1080"/>
+            <w:shd w:val="clear" w:color="auto" w:fill="F3F5F8"/>
           </w:tcPr>
           <w:p>
             <w:r/>
@@ -5052,13 +5557,14 @@
                 <w:b w:val="0"/>
                 <w:sz w:val="19"/>
               </w:rPr>
-              <w:t>45 min</w:t>
+              <w:t>15 min</w:t>
             </w:r>
           </w:p>
         </w:tc>
         <w:tc>
           <w:tcPr>
             <w:tcW w:type="dxa" w:w="5112"/>
+            <w:shd w:val="clear" w:color="auto" w:fill="F3F5F8"/>
           </w:tcPr>
           <w:p>
             <w:r/>
@@ -5068,13 +5574,14 @@
                 <w:b w:val="0"/>
                 <w:sz w:val="19"/>
               </w:rPr>
-              <w:t>Lab 6: Activity 6 — source retrieval, verification and RAG maintenance</w:t>
+              <w:t>Course recap, practice questions and Q&amp;A</w:t>
             </w:r>
           </w:p>
         </w:tc>
         <w:tc>
           <w:tcPr>
             <w:tcW w:type="dxa" w:w="864"/>
+            <w:shd w:val="clear" w:color="auto" w:fill="F3F5F8"/>
           </w:tcPr>
           <w:p>
             <w:r/>
@@ -5091,6 +5598,7 @@
         <w:tc>
           <w:tcPr>
             <w:tcW w:type="dxa" w:w="1368"/>
+            <w:shd w:val="clear" w:color="auto" w:fill="F3F5F8"/>
           </w:tcPr>
           <w:p>
             <w:r/>
@@ -5100,7 +5608,7 @@
                 <w:b w:val="0"/>
                 <w:sz w:val="19"/>
               </w:rPr>
-              <w:t>114–121</w:t>
+              <w:t>140–143</w:t>
             </w:r>
           </w:p>
         </w:tc>
@@ -5109,7 +5617,24 @@
         <w:tc>
           <w:tcPr>
             <w:tcW w:type="dxa" w:w="1440"/>
-            <w:shd w:val="clear" w:color="auto" w:fill="FDE9D9"/>
+            <w:shd w:val="clear" w:color="auto" w:fill="E8F7EE"/>
+          </w:tcPr>
+          <w:p>
+            <w:r/>
+            <w:r>
+              <w:rPr>
+                <w:rFonts w:ascii="Arial" w:hAnsi="Arial"/>
+                <w:b/>
+                <w:sz w:val="19"/>
+              </w:rPr>
+              <w:t>16:15–16:30</w:t>
+            </w:r>
+          </w:p>
+        </w:tc>
+        <w:tc>
+          <w:tcPr>
+            <w:tcW w:type="dxa" w:w="1080"/>
+            <w:shd w:val="clear" w:color="auto" w:fill="E8F7EE"/>
           </w:tcPr>
           <w:p>
             <w:r/>
@@ -5119,14 +5644,31 @@
                 <w:b w:val="0"/>
                 <w:sz w:val="19"/>
               </w:rPr>
-              <w:t>12:15–13:15</w:t>
-            </w:r>
-          </w:p>
-        </w:tc>
-        <w:tc>
-          <w:tcPr>
-            <w:tcW w:type="dxa" w:w="1080"/>
-            <w:shd w:val="clear" w:color="auto" w:fill="FDE9D9"/>
+              <w:t>15 min</w:t>
+            </w:r>
+          </w:p>
+        </w:tc>
+        <w:tc>
+          <w:tcPr>
+            <w:tcW w:type="dxa" w:w="5112"/>
+            <w:shd w:val="clear" w:color="auto" w:fill="E8F7EE"/>
+          </w:tcPr>
+          <w:p>
+            <w:r/>
+            <w:r>
+              <w:rPr>
+                <w:rFonts w:ascii="Arial" w:hAnsi="Arial"/>
+                <w:b/>
+                <w:sz w:val="19"/>
+              </w:rPr>
+              <w:t>Briefing for Assessment</w:t>
+            </w:r>
+          </w:p>
+        </w:tc>
+        <w:tc>
+          <w:tcPr>
+            <w:tcW w:type="dxa" w:w="864"/>
+            <w:shd w:val="clear" w:color="auto" w:fill="E8F7EE"/>
           </w:tcPr>
           <w:p>
             <w:r/>
@@ -5136,14 +5678,14 @@
                 <w:b w:val="0"/>
                 <w:sz w:val="19"/>
               </w:rPr>
-              <w:t>60 min</w:t>
-            </w:r>
-          </w:p>
-        </w:tc>
-        <w:tc>
-          <w:tcPr>
-            <w:tcW w:type="dxa" w:w="5112"/>
-            <w:shd w:val="clear" w:color="auto" w:fill="FDE9D9"/>
+              <w:t>LU3</w:t>
+            </w:r>
+          </w:p>
+        </w:tc>
+        <w:tc>
+          <w:tcPr>
+            <w:tcW w:type="dxa" w:w="1368"/>
+            <w:shd w:val="clear" w:color="auto" w:fill="E8F7EE"/>
           </w:tcPr>
           <w:p>
             <w:r/>
@@ -5153,14 +5695,33 @@
                 <w:b w:val="0"/>
                 <w:sz w:val="19"/>
               </w:rPr>
-              <w:t>Lunch break</w:t>
-            </w:r>
-          </w:p>
-        </w:tc>
-        <w:tc>
-          <w:tcPr>
-            <w:tcW w:type="dxa" w:w="864"/>
-            <w:shd w:val="clear" w:color="auto" w:fill="FDE9D9"/>
+              <w:t>16</w:t>
+            </w:r>
+          </w:p>
+        </w:tc>
+      </w:tr>
+      <w:tr>
+        <w:tc>
+          <w:tcPr>
+            <w:tcW w:type="dxa" w:w="1440"/>
+            <w:shd w:val="clear" w:color="auto" w:fill="E8F7EE"/>
+          </w:tcPr>
+          <w:p>
+            <w:r/>
+            <w:r>
+              <w:rPr>
+                <w:rFonts w:ascii="Arial" w:hAnsi="Arial"/>
+                <w:b/>
+                <w:sz w:val="19"/>
+              </w:rPr>
+              <w:t>16:30–17:30</w:t>
+            </w:r>
+          </w:p>
+        </w:tc>
+        <w:tc>
+          <w:tcPr>
+            <w:tcW w:type="dxa" w:w="1080"/>
+            <w:shd w:val="clear" w:color="auto" w:fill="E8F7EE"/>
           </w:tcPr>
           <w:p>
             <w:r/>
@@ -5170,14 +5731,31 @@
                 <w:b w:val="0"/>
                 <w:sz w:val="19"/>
               </w:rPr>
-              <w:t>—</w:t>
-            </w:r>
-          </w:p>
-        </w:tc>
-        <w:tc>
-          <w:tcPr>
-            <w:tcW w:type="dxa" w:w="1368"/>
-            <w:shd w:val="clear" w:color="auto" w:fill="FDE9D9"/>
+              <w:t>60 min</w:t>
+            </w:r>
+          </w:p>
+        </w:tc>
+        <w:tc>
+          <w:tcPr>
+            <w:tcW w:type="dxa" w:w="5112"/>
+            <w:shd w:val="clear" w:color="auto" w:fill="E8F7EE"/>
+          </w:tcPr>
+          <w:p>
+            <w:r/>
+            <w:r>
+              <w:rPr>
+                <w:rFonts w:ascii="Arial" w:hAnsi="Arial"/>
+                <w:b/>
+                <w:sz w:val="19"/>
+              </w:rPr>
+              <w:t>Written Assessment (WA) — 1 hour, open book; TRAQOM survey and assessment attendance first</w:t>
+            </w:r>
+          </w:p>
+        </w:tc>
+        <w:tc>
+          <w:tcPr>
+            <w:tcW w:type="dxa" w:w="864"/>
+            <w:shd w:val="clear" w:color="auto" w:fill="E8F7EE"/>
           </w:tcPr>
           <w:p>
             <w:r/>
@@ -5187,7 +5765,24 @@
                 <w:b w:val="0"/>
                 <w:sz w:val="19"/>
               </w:rPr>
-              <w:t>—</w:t>
+              <w:t>Assessment</w:t>
+            </w:r>
+          </w:p>
+        </w:tc>
+        <w:tc>
+          <w:tcPr>
+            <w:tcW w:type="dxa" w:w="1368"/>
+            <w:shd w:val="clear" w:color="auto" w:fill="E8F7EE"/>
+          </w:tcPr>
+          <w:p>
+            <w:r/>
+            <w:r>
+              <w:rPr>
+                <w:rFonts w:ascii="Arial" w:hAnsi="Arial"/>
+                <w:b w:val="0"/>
+                <w:sz w:val="19"/>
+              </w:rPr>
+              <w:t>144–147</w:t>
             </w:r>
           </w:p>
         </w:tc>
@@ -5196,6 +5791,24 @@
         <w:tc>
           <w:tcPr>
             <w:tcW w:type="dxa" w:w="1440"/>
+            <w:shd w:val="clear" w:color="auto" w:fill="E8F7EE"/>
+          </w:tcPr>
+          <w:p>
+            <w:r/>
+            <w:r>
+              <w:rPr>
+                <w:rFonts w:ascii="Arial" w:hAnsi="Arial"/>
+                <w:b/>
+                <w:sz w:val="19"/>
+              </w:rPr>
+              <w:t>17:30–18:30</w:t>
+            </w:r>
+          </w:p>
+        </w:tc>
+        <w:tc>
+          <w:tcPr>
+            <w:tcW w:type="dxa" w:w="1080"/>
+            <w:shd w:val="clear" w:color="auto" w:fill="E8F7EE"/>
           </w:tcPr>
           <w:p>
             <w:r/>
@@ -5205,13 +5818,31 @@
                 <w:b w:val="0"/>
                 <w:sz w:val="19"/>
               </w:rPr>
-              <w:t>13:15–13:50</w:t>
-            </w:r>
-          </w:p>
-        </w:tc>
-        <w:tc>
-          <w:tcPr>
-            <w:tcW w:type="dxa" w:w="1080"/>
+              <w:t>60 min</w:t>
+            </w:r>
+          </w:p>
+        </w:tc>
+        <w:tc>
+          <w:tcPr>
+            <w:tcW w:type="dxa" w:w="5112"/>
+            <w:shd w:val="clear" w:color="auto" w:fill="E8F7EE"/>
+          </w:tcPr>
+          <w:p>
+            <w:r/>
+            <w:r>
+              <w:rPr>
+                <w:rFonts w:ascii="Arial" w:hAnsi="Arial"/>
+                <w:b/>
+                <w:sz w:val="19"/>
+              </w:rPr>
+              <w:t>Practical Performance (PP) — 1 hour, open book; submit answers on the LMS and take PM attendance</w:t>
+            </w:r>
+          </w:p>
+        </w:tc>
+        <w:tc>
+          <w:tcPr>
+            <w:tcW w:type="dxa" w:w="864"/>
+            <w:shd w:val="clear" w:color="auto" w:fill="E8F7EE"/>
           </w:tcPr>
           <w:p>
             <w:r/>
@@ -5221,13 +5852,14 @@
                 <w:b w:val="0"/>
                 <w:sz w:val="19"/>
               </w:rPr>
-              <w:t>35 min</w:t>
-            </w:r>
-          </w:p>
-        </w:tc>
-        <w:tc>
-          <w:tcPr>
-            <w:tcW w:type="dxa" w:w="5112"/>
+              <w:t>Assessment</w:t>
+            </w:r>
+          </w:p>
+        </w:tc>
+        <w:tc>
+          <w:tcPr>
+            <w:tcW w:type="dxa" w:w="1368"/>
+            <w:shd w:val="clear" w:color="auto" w:fill="E8F7EE"/>
           </w:tcPr>
           <w:p>
             <w:r/>
@@ -5237,720 +5869,7 @@
                 <w:b w:val="0"/>
                 <w:sz w:val="19"/>
               </w:rPr>
-              <w:t>Lab 7: Activity 7 — supervised OpenAI Dots launch review and Hermes comparison</w:t>
-            </w:r>
-          </w:p>
-        </w:tc>
-        <w:tc>
-          <w:tcPr>
-            <w:tcW w:type="dxa" w:w="864"/>
-          </w:tcPr>
-          <w:p>
-            <w:r/>
-            <w:r>
-              <w:rPr>
-                <w:rFonts w:ascii="Arial" w:hAnsi="Arial"/>
-                <w:b w:val="0"/>
-                <w:sz w:val="19"/>
-              </w:rPr>
-              <w:t>LU3</w:t>
-            </w:r>
-          </w:p>
-        </w:tc>
-        <w:tc>
-          <w:tcPr>
-            <w:tcW w:type="dxa" w:w="1368"/>
-          </w:tcPr>
-          <w:p>
-            <w:r/>
-            <w:r>
-              <w:rPr>
-                <w:rFonts w:ascii="Arial" w:hAnsi="Arial"/>
-                <w:b w:val="0"/>
-                <w:sz w:val="19"/>
-              </w:rPr>
-              <w:t>122–129</w:t>
-            </w:r>
-          </w:p>
-        </w:tc>
-      </w:tr>
-      <w:tr>
-        <w:tc>
-          <w:tcPr>
-            <w:tcW w:type="dxa" w:w="1440"/>
-          </w:tcPr>
-          <w:p>
-            <w:r/>
-            <w:r>
-              <w:rPr>
-                <w:rFonts w:ascii="Arial" w:hAnsi="Arial"/>
-                <w:b w:val="0"/>
-                <w:sz w:val="19"/>
-              </w:rPr>
-              <w:t>13:50–14:40</w:t>
-            </w:r>
-          </w:p>
-        </w:tc>
-        <w:tc>
-          <w:tcPr>
-            <w:tcW w:type="dxa" w:w="1080"/>
-          </w:tcPr>
-          <w:p>
-            <w:r/>
-            <w:r>
-              <w:rPr>
-                <w:rFonts w:ascii="Arial" w:hAnsi="Arial"/>
-                <w:b w:val="0"/>
-                <w:sz w:val="19"/>
-              </w:rPr>
-              <w:t>50 min</w:t>
-            </w:r>
-          </w:p>
-        </w:tc>
-        <w:tc>
-          <w:tcPr>
-            <w:tcW w:type="dxa" w:w="5112"/>
-          </w:tcPr>
-          <w:p>
-            <w:r/>
-            <w:r>
-              <w:rPr>
-                <w:rFonts w:ascii="Arial" w:hAnsi="Arial"/>
-                <w:b w:val="0"/>
-                <w:sz w:val="19"/>
-              </w:rPr>
-              <w:t>Lab 8: Activity 8A — multi-agent Kanban video revision with Hermes bots (PP Task 3)</w:t>
-            </w:r>
-          </w:p>
-        </w:tc>
-        <w:tc>
-          <w:tcPr>
-            <w:tcW w:type="dxa" w:w="864"/>
-          </w:tcPr>
-          <w:p>
-            <w:r/>
-            <w:r>
-              <w:rPr>
-                <w:rFonts w:ascii="Arial" w:hAnsi="Arial"/>
-                <w:b w:val="0"/>
-                <w:sz w:val="19"/>
-              </w:rPr>
-              <w:t>LU3</w:t>
-            </w:r>
-          </w:p>
-        </w:tc>
-        <w:tc>
-          <w:tcPr>
-            <w:tcW w:type="dxa" w:w="1368"/>
-          </w:tcPr>
-          <w:p>
-            <w:r/>
-            <w:r>
-              <w:rPr>
-                <w:rFonts w:ascii="Arial" w:hAnsi="Arial"/>
-                <w:b w:val="0"/>
-                <w:sz w:val="19"/>
-              </w:rPr>
-              <w:t>130–141</w:t>
-            </w:r>
-          </w:p>
-        </w:tc>
-      </w:tr>
-      <w:tr>
-        <w:tc>
-          <w:tcPr>
-            <w:tcW w:type="dxa" w:w="1440"/>
-          </w:tcPr>
-          <w:p>
-            <w:r/>
-            <w:r>
-              <w:rPr>
-                <w:rFonts w:ascii="Arial" w:hAnsi="Arial"/>
-                <w:b w:val="0"/>
-                <w:sz w:val="19"/>
-              </w:rPr>
-              <w:t>14:40–15:10</w:t>
-            </w:r>
-          </w:p>
-        </w:tc>
-        <w:tc>
-          <w:tcPr>
-            <w:tcW w:type="dxa" w:w="1080"/>
-          </w:tcPr>
-          <w:p>
-            <w:r/>
-            <w:r>
-              <w:rPr>
-                <w:rFonts w:ascii="Arial" w:hAnsi="Arial"/>
-                <w:b w:val="0"/>
-                <w:sz w:val="19"/>
-              </w:rPr>
-              <w:t>30 min</w:t>
-            </w:r>
-          </w:p>
-        </w:tc>
-        <w:tc>
-          <w:tcPr>
-            <w:tcW w:type="dxa" w:w="5112"/>
-          </w:tcPr>
-          <w:p>
-            <w:r/>
-            <w:r>
-              <w:rPr>
-                <w:rFonts w:ascii="Arial" w:hAnsi="Arial"/>
-                <w:b w:val="0"/>
-                <w:sz w:val="19"/>
-              </w:rPr>
-              <w:t>Lab 8: Activity 8B — repeat-run test, failed-source recovery and exact-version review</w:t>
-            </w:r>
-          </w:p>
-        </w:tc>
-        <w:tc>
-          <w:tcPr>
-            <w:tcW w:type="dxa" w:w="864"/>
-          </w:tcPr>
-          <w:p>
-            <w:r/>
-            <w:r>
-              <w:rPr>
-                <w:rFonts w:ascii="Arial" w:hAnsi="Arial"/>
-                <w:b w:val="0"/>
-                <w:sz w:val="19"/>
-              </w:rPr>
-              <w:t>LU3</w:t>
-            </w:r>
-          </w:p>
-        </w:tc>
-        <w:tc>
-          <w:tcPr>
-            <w:tcW w:type="dxa" w:w="1368"/>
-          </w:tcPr>
-          <w:p>
-            <w:r/>
-            <w:r>
-              <w:rPr>
-                <w:rFonts w:ascii="Arial" w:hAnsi="Arial"/>
-                <w:b w:val="0"/>
-                <w:sz w:val="19"/>
-              </w:rPr>
-              <w:t>130–141</w:t>
-            </w:r>
-          </w:p>
-        </w:tc>
-      </w:tr>
-      <w:tr>
-        <w:tc>
-          <w:tcPr>
-            <w:tcW w:type="dxa" w:w="1440"/>
-            <w:shd w:val="clear" w:color="auto" w:fill="FFF4E5"/>
-          </w:tcPr>
-          <w:p>
-            <w:r/>
-            <w:r>
-              <w:rPr>
-                <w:rFonts w:ascii="Arial" w:hAnsi="Arial"/>
-                <w:b w:val="0"/>
-                <w:sz w:val="19"/>
-              </w:rPr>
-              <w:t>15:10–15:25</w:t>
-            </w:r>
-          </w:p>
-        </w:tc>
-        <w:tc>
-          <w:tcPr>
-            <w:tcW w:type="dxa" w:w="1080"/>
-            <w:shd w:val="clear" w:color="auto" w:fill="FFF4E5"/>
-          </w:tcPr>
-          <w:p>
-            <w:r/>
-            <w:r>
-              <w:rPr>
-                <w:rFonts w:ascii="Arial" w:hAnsi="Arial"/>
-                <w:b w:val="0"/>
-                <w:sz w:val="19"/>
-              </w:rPr>
-              <w:t>15 min</w:t>
-            </w:r>
-          </w:p>
-        </w:tc>
-        <w:tc>
-          <w:tcPr>
-            <w:tcW w:type="dxa" w:w="5112"/>
-            <w:shd w:val="clear" w:color="auto" w:fill="FFF4E5"/>
-          </w:tcPr>
-          <w:p>
-            <w:r/>
-            <w:r>
-              <w:rPr>
-                <w:rFonts w:ascii="Arial" w:hAnsi="Arial"/>
-                <w:b w:val="0"/>
-                <w:sz w:val="19"/>
-              </w:rPr>
-              <w:t>Tea break (included in scheduled LU time)</w:t>
-            </w:r>
-          </w:p>
-        </w:tc>
-        <w:tc>
-          <w:tcPr>
-            <w:tcW w:type="dxa" w:w="864"/>
-            <w:shd w:val="clear" w:color="auto" w:fill="FFF4E5"/>
-          </w:tcPr>
-          <w:p>
-            <w:r/>
-            <w:r>
-              <w:rPr>
-                <w:rFonts w:ascii="Arial" w:hAnsi="Arial"/>
-                <w:b w:val="0"/>
-                <w:sz w:val="19"/>
-              </w:rPr>
-              <w:t>LU3</w:t>
-            </w:r>
-          </w:p>
-        </w:tc>
-        <w:tc>
-          <w:tcPr>
-            <w:tcW w:type="dxa" w:w="1368"/>
-            <w:shd w:val="clear" w:color="auto" w:fill="FFF4E5"/>
-          </w:tcPr>
-          <w:p>
-            <w:r/>
-            <w:r>
-              <w:rPr>
-                <w:rFonts w:ascii="Arial" w:hAnsi="Arial"/>
-                <w:b w:val="0"/>
-                <w:sz w:val="19"/>
-              </w:rPr>
-              <w:t>—</w:t>
-            </w:r>
-          </w:p>
-        </w:tc>
-      </w:tr>
-      <w:tr>
-        <w:tc>
-          <w:tcPr>
-            <w:tcW w:type="dxa" w:w="1440"/>
-          </w:tcPr>
-          <w:p>
-            <w:r/>
-            <w:r>
-              <w:rPr>
-                <w:rFonts w:ascii="Arial" w:hAnsi="Arial"/>
-                <w:b w:val="0"/>
-                <w:sz w:val="19"/>
-              </w:rPr>
-              <w:t>15:25–16:00</w:t>
-            </w:r>
-          </w:p>
-        </w:tc>
-        <w:tc>
-          <w:tcPr>
-            <w:tcW w:type="dxa" w:w="1080"/>
-          </w:tcPr>
-          <w:p>
-            <w:r/>
-            <w:r>
-              <w:rPr>
-                <w:rFonts w:ascii="Arial" w:hAnsi="Arial"/>
-                <w:b w:val="0"/>
-                <w:sz w:val="19"/>
-              </w:rPr>
-              <w:t>35 min</w:t>
-            </w:r>
-          </w:p>
-        </w:tc>
-        <w:tc>
-          <w:tcPr>
-            <w:tcW w:type="dxa" w:w="5112"/>
-          </w:tcPr>
-          <w:p>
-            <w:r/>
-            <w:r>
-              <w:rPr>
-                <w:rFonts w:ascii="Arial" w:hAnsi="Arial"/>
-                <w:b w:val="0"/>
-                <w:sz w:val="19"/>
-              </w:rPr>
-              <w:t>Lab 8: Activity 8C — final local release, scorecard and team improvement</w:t>
-            </w:r>
-          </w:p>
-        </w:tc>
-        <w:tc>
-          <w:tcPr>
-            <w:tcW w:type="dxa" w:w="864"/>
-          </w:tcPr>
-          <w:p>
-            <w:r/>
-            <w:r>
-              <w:rPr>
-                <w:rFonts w:ascii="Arial" w:hAnsi="Arial"/>
-                <w:b w:val="0"/>
-                <w:sz w:val="19"/>
-              </w:rPr>
-              <w:t>LU3</w:t>
-            </w:r>
-          </w:p>
-        </w:tc>
-        <w:tc>
-          <w:tcPr>
-            <w:tcW w:type="dxa" w:w="1368"/>
-          </w:tcPr>
-          <w:p>
-            <w:r/>
-            <w:r>
-              <w:rPr>
-                <w:rFonts w:ascii="Arial" w:hAnsi="Arial"/>
-                <w:b w:val="0"/>
-                <w:sz w:val="19"/>
-              </w:rPr>
-              <w:t>130–141</w:t>
-            </w:r>
-          </w:p>
-        </w:tc>
-      </w:tr>
-      <w:tr>
-        <w:tc>
-          <w:tcPr>
-            <w:tcW w:type="dxa" w:w="1440"/>
-            <w:shd w:val="clear" w:color="auto" w:fill="F3F5F8"/>
-          </w:tcPr>
-          <w:p>
-            <w:r/>
-            <w:r>
-              <w:rPr>
-                <w:rFonts w:ascii="Arial" w:hAnsi="Arial"/>
-                <w:b w:val="0"/>
-                <w:sz w:val="19"/>
-              </w:rPr>
-              <w:t>16:00–16:15</w:t>
-            </w:r>
-          </w:p>
-        </w:tc>
-        <w:tc>
-          <w:tcPr>
-            <w:tcW w:type="dxa" w:w="1080"/>
-            <w:shd w:val="clear" w:color="auto" w:fill="F3F5F8"/>
-          </w:tcPr>
-          <w:p>
-            <w:r/>
-            <w:r>
-              <w:rPr>
-                <w:rFonts w:ascii="Arial" w:hAnsi="Arial"/>
-                <w:b w:val="0"/>
-                <w:sz w:val="19"/>
-              </w:rPr>
-              <w:t>15 min</w:t>
-            </w:r>
-          </w:p>
-        </w:tc>
-        <w:tc>
-          <w:tcPr>
-            <w:tcW w:type="dxa" w:w="5112"/>
-            <w:shd w:val="clear" w:color="auto" w:fill="F3F5F8"/>
-          </w:tcPr>
-          <w:p>
-            <w:r/>
-            <w:r>
-              <w:rPr>
-                <w:rFonts w:ascii="Arial" w:hAnsi="Arial"/>
-                <w:b w:val="0"/>
-                <w:sz w:val="19"/>
-              </w:rPr>
-              <w:t>Course recap, practice questions and Q&amp;A</w:t>
-            </w:r>
-          </w:p>
-        </w:tc>
-        <w:tc>
-          <w:tcPr>
-            <w:tcW w:type="dxa" w:w="864"/>
-            <w:shd w:val="clear" w:color="auto" w:fill="F3F5F8"/>
-          </w:tcPr>
-          <w:p>
-            <w:r/>
-            <w:r>
-              <w:rPr>
-                <w:rFonts w:ascii="Arial" w:hAnsi="Arial"/>
-                <w:b w:val="0"/>
-                <w:sz w:val="19"/>
-              </w:rPr>
-              <w:t>LU3</w:t>
-            </w:r>
-          </w:p>
-        </w:tc>
-        <w:tc>
-          <w:tcPr>
-            <w:tcW w:type="dxa" w:w="1368"/>
-            <w:shd w:val="clear" w:color="auto" w:fill="F3F5F8"/>
-          </w:tcPr>
-          <w:p>
-            <w:r/>
-            <w:r>
-              <w:rPr>
-                <w:rFonts w:ascii="Arial" w:hAnsi="Arial"/>
-                <w:b w:val="0"/>
-                <w:sz w:val="19"/>
-              </w:rPr>
-              <w:t>142–145</w:t>
-            </w:r>
-          </w:p>
-        </w:tc>
-      </w:tr>
-      <w:tr>
-        <w:tc>
-          <w:tcPr>
-            <w:tcW w:type="dxa" w:w="1440"/>
-            <w:shd w:val="clear" w:color="auto" w:fill="E8F7EE"/>
-          </w:tcPr>
-          <w:p>
-            <w:r/>
-            <w:r>
-              <w:rPr>
-                <w:rFonts w:ascii="Arial" w:hAnsi="Arial"/>
-                <w:b/>
-                <w:sz w:val="19"/>
-              </w:rPr>
-              <w:t>16:15–16:30</w:t>
-            </w:r>
-          </w:p>
-        </w:tc>
-        <w:tc>
-          <w:tcPr>
-            <w:tcW w:type="dxa" w:w="1080"/>
-            <w:shd w:val="clear" w:color="auto" w:fill="E8F7EE"/>
-          </w:tcPr>
-          <w:p>
-            <w:r/>
-            <w:r>
-              <w:rPr>
-                <w:rFonts w:ascii="Arial" w:hAnsi="Arial"/>
-                <w:b w:val="0"/>
-                <w:sz w:val="19"/>
-              </w:rPr>
-              <w:t>15 min</w:t>
-            </w:r>
-          </w:p>
-        </w:tc>
-        <w:tc>
-          <w:tcPr>
-            <w:tcW w:type="dxa" w:w="5112"/>
-            <w:shd w:val="clear" w:color="auto" w:fill="E8F7EE"/>
-          </w:tcPr>
-          <w:p>
-            <w:r/>
-            <w:r>
-              <w:rPr>
-                <w:rFonts w:ascii="Arial" w:hAnsi="Arial"/>
-                <w:b/>
-                <w:sz w:val="19"/>
-              </w:rPr>
-              <w:t>Briefing for Assessment</w:t>
-            </w:r>
-          </w:p>
-        </w:tc>
-        <w:tc>
-          <w:tcPr>
-            <w:tcW w:type="dxa" w:w="864"/>
-            <w:shd w:val="clear" w:color="auto" w:fill="E8F7EE"/>
-          </w:tcPr>
-          <w:p>
-            <w:r/>
-            <w:r>
-              <w:rPr>
-                <w:rFonts w:ascii="Arial" w:hAnsi="Arial"/>
-                <w:b w:val="0"/>
-                <w:sz w:val="19"/>
-              </w:rPr>
-              <w:t>LU3</w:t>
-            </w:r>
-          </w:p>
-        </w:tc>
-        <w:tc>
-          <w:tcPr>
-            <w:tcW w:type="dxa" w:w="1368"/>
-            <w:shd w:val="clear" w:color="auto" w:fill="E8F7EE"/>
-          </w:tcPr>
-          <w:p>
-            <w:r/>
-            <w:r>
-              <w:rPr>
-                <w:rFonts w:ascii="Arial" w:hAnsi="Arial"/>
-                <w:b w:val="0"/>
-                <w:sz w:val="19"/>
-              </w:rPr>
-              <w:t>16</w:t>
-            </w:r>
-          </w:p>
-        </w:tc>
-      </w:tr>
-      <w:tr>
-        <w:tc>
-          <w:tcPr>
-            <w:tcW w:type="dxa" w:w="1440"/>
-            <w:shd w:val="clear" w:color="auto" w:fill="E8F7EE"/>
-          </w:tcPr>
-          <w:p>
-            <w:r/>
-            <w:r>
-              <w:rPr>
-                <w:rFonts w:ascii="Arial" w:hAnsi="Arial"/>
-                <w:b/>
-                <w:sz w:val="19"/>
-              </w:rPr>
-              <w:t>16:30–17:30</w:t>
-            </w:r>
-          </w:p>
-        </w:tc>
-        <w:tc>
-          <w:tcPr>
-            <w:tcW w:type="dxa" w:w="1080"/>
-            <w:shd w:val="clear" w:color="auto" w:fill="E8F7EE"/>
-          </w:tcPr>
-          <w:p>
-            <w:r/>
-            <w:r>
-              <w:rPr>
-                <w:rFonts w:ascii="Arial" w:hAnsi="Arial"/>
-                <w:b w:val="0"/>
-                <w:sz w:val="19"/>
-              </w:rPr>
-              <w:t>60 min</w:t>
-            </w:r>
-          </w:p>
-        </w:tc>
-        <w:tc>
-          <w:tcPr>
-            <w:tcW w:type="dxa" w:w="5112"/>
-            <w:shd w:val="clear" w:color="auto" w:fill="E8F7EE"/>
-          </w:tcPr>
-          <w:p>
-            <w:r/>
-            <w:r>
-              <w:rPr>
-                <w:rFonts w:ascii="Arial" w:hAnsi="Arial"/>
-                <w:b/>
-                <w:sz w:val="19"/>
-              </w:rPr>
-              <w:t>Written Assessment (WA) — 1 hour, open book; TRAQOM survey and assessment attendance first</w:t>
-            </w:r>
-          </w:p>
-        </w:tc>
-        <w:tc>
-          <w:tcPr>
-            <w:tcW w:type="dxa" w:w="864"/>
-            <w:shd w:val="clear" w:color="auto" w:fill="E8F7EE"/>
-          </w:tcPr>
-          <w:p>
-            <w:r/>
-            <w:r>
-              <w:rPr>
-                <w:rFonts w:ascii="Arial" w:hAnsi="Arial"/>
-                <w:b w:val="0"/>
-                <w:sz w:val="19"/>
-              </w:rPr>
-              <w:t>Assessment</w:t>
-            </w:r>
-          </w:p>
-        </w:tc>
-        <w:tc>
-          <w:tcPr>
-            <w:tcW w:type="dxa" w:w="1368"/>
-            <w:shd w:val="clear" w:color="auto" w:fill="E8F7EE"/>
-          </w:tcPr>
-          <w:p>
-            <w:r/>
-            <w:r>
-              <w:rPr>
-                <w:rFonts w:ascii="Arial" w:hAnsi="Arial"/>
-                <w:b w:val="0"/>
-                <w:sz w:val="19"/>
-              </w:rPr>
-              <w:t>146–149</w:t>
-            </w:r>
-          </w:p>
-        </w:tc>
-      </w:tr>
-      <w:tr>
-        <w:tc>
-          <w:tcPr>
-            <w:tcW w:type="dxa" w:w="1440"/>
-            <w:shd w:val="clear" w:color="auto" w:fill="E8F7EE"/>
-          </w:tcPr>
-          <w:p>
-            <w:r/>
-            <w:r>
-              <w:rPr>
-                <w:rFonts w:ascii="Arial" w:hAnsi="Arial"/>
-                <w:b/>
-                <w:sz w:val="19"/>
-              </w:rPr>
-              <w:t>17:30–18:30</w:t>
-            </w:r>
-          </w:p>
-        </w:tc>
-        <w:tc>
-          <w:tcPr>
-            <w:tcW w:type="dxa" w:w="1080"/>
-            <w:shd w:val="clear" w:color="auto" w:fill="E8F7EE"/>
-          </w:tcPr>
-          <w:p>
-            <w:r/>
-            <w:r>
-              <w:rPr>
-                <w:rFonts w:ascii="Arial" w:hAnsi="Arial"/>
-                <w:b w:val="0"/>
-                <w:sz w:val="19"/>
-              </w:rPr>
-              <w:t>60 min</w:t>
-            </w:r>
-          </w:p>
-        </w:tc>
-        <w:tc>
-          <w:tcPr>
-            <w:tcW w:type="dxa" w:w="5112"/>
-            <w:shd w:val="clear" w:color="auto" w:fill="E8F7EE"/>
-          </w:tcPr>
-          <w:p>
-            <w:r/>
-            <w:r>
-              <w:rPr>
-                <w:rFonts w:ascii="Arial" w:hAnsi="Arial"/>
-                <w:b/>
-                <w:sz w:val="19"/>
-              </w:rPr>
-              <w:t>Practical Performance (PP) — 1 hour, open book; submit answers on the LMS and take PM attendance</w:t>
-            </w:r>
-          </w:p>
-        </w:tc>
-        <w:tc>
-          <w:tcPr>
-            <w:tcW w:type="dxa" w:w="864"/>
-            <w:shd w:val="clear" w:color="auto" w:fill="E8F7EE"/>
-          </w:tcPr>
-          <w:p>
-            <w:r/>
-            <w:r>
-              <w:rPr>
-                <w:rFonts w:ascii="Arial" w:hAnsi="Arial"/>
-                <w:b w:val="0"/>
-                <w:sz w:val="19"/>
-              </w:rPr>
-              <w:t>Assessment</w:t>
-            </w:r>
-          </w:p>
-        </w:tc>
-        <w:tc>
-          <w:tcPr>
-            <w:tcW w:type="dxa" w:w="1368"/>
-            <w:shd w:val="clear" w:color="auto" w:fill="E8F7EE"/>
-          </w:tcPr>
-          <w:p>
-            <w:r/>
-            <w:r>
-              <w:rPr>
-                <w:rFonts w:ascii="Arial" w:hAnsi="Arial"/>
-                <w:b w:val="0"/>
-                <w:sz w:val="19"/>
-              </w:rPr>
-              <w:t>146–149</w:t>
+              <w:t>144–147</w:t>
             </w:r>
           </w:p>
         </w:tc>
@@ -6109,7 +6028,7 @@
                 <w:b w:val="0"/>
                 <w:sz w:val="19"/>
               </w:rPr>
-              <w:t>Activity 1 — Join Meta Muse, Set Up an OpenAI Dot</w:t>
+              <w:t>Activity 1 — Your Always-On CEO Assistant: Meta Muse or OpenAI Dots</w:t>
             </w:r>
           </w:p>
         </w:tc>
@@ -6175,7 +6094,7 @@
                 <w:b/>
                 <w:sz w:val="19"/>
               </w:rPr>
-              <w:t>Lab 2 (Day 1)</w:t>
+              <w:t>Topic 2 Setup (Day 1)</w:t>
             </w:r>
           </w:p>
         </w:tc>
@@ -6191,7 +6110,7 @@
                 <w:b w:val="0"/>
                 <w:sz w:val="19"/>
               </w:rPr>
-              <w:t>Activity 2 — Hermes Desktop, Tools, Skills &amp; the Company Brief</w:t>
+              <w:t>Hire Your First AI Employee — Hermes Agent Setup</w:t>
             </w:r>
           </w:p>
         </w:tc>
@@ -6207,7 +6126,7 @@
                 <w:b w:val="0"/>
                 <w:sz w:val="19"/>
               </w:rPr>
-              <w:t>Single agent</w:t>
+              <w:t>One agent, many tools</w:t>
             </w:r>
           </w:p>
         </w:tc>
@@ -6223,7 +6142,7 @@
                 <w:b w:val="0"/>
                 <w:sz w:val="19"/>
               </w:rPr>
-              <w:t>LO1</w:t>
+              <w:t>LO1/LO2</w:t>
             </w:r>
           </w:p>
         </w:tc>
@@ -6239,7 +6158,7 @@
                 <w:b w:val="0"/>
                 <w:sz w:val="19"/>
               </w:rPr>
-              <w:t>67–71</w:t>
+              <w:t>73–77</w:t>
             </w:r>
           </w:p>
         </w:tc>
@@ -6257,7 +6176,7 @@
                 <w:b/>
                 <w:sz w:val="19"/>
               </w:rPr>
-              <w:t>Lab 3 (Day 1)</w:t>
+              <w:t>Lab 2 (Day 1)</w:t>
             </w:r>
           </w:p>
         </w:tc>
@@ -6273,7 +6192,7 @@
                 <w:b w:val="0"/>
                 <w:sz w:val="19"/>
               </w:rPr>
-              <w:t>Activity 3 — Hermes Gmail, Calendar, Drive &amp; Excel</w:t>
+              <w:t>Activity 2 — UX Skills from skills.sh Build the Kopi Kaki Website</w:t>
             </w:r>
           </w:p>
         </w:tc>
@@ -6289,7 +6208,7 @@
                 <w:b w:val="0"/>
                 <w:sz w:val="19"/>
               </w:rPr>
-              <w:t>One agent + gog + analytics skill</w:t>
+              <w:t>One agent + installed UX skills</w:t>
             </w:r>
           </w:p>
         </w:tc>
@@ -6321,7 +6240,7 @@
                 <w:b w:val="0"/>
                 <w:sz w:val="19"/>
               </w:rPr>
-              <w:t>77–81</w:t>
+              <w:t>79–83</w:t>
             </w:r>
           </w:p>
         </w:tc>
@@ -6339,7 +6258,7 @@
                 <w:b/>
                 <w:sz w:val="19"/>
               </w:rPr>
-              <w:t>Lab 4 (Day 1)</w:t>
+              <w:t>Lab 3 (Day 1)</w:t>
             </w:r>
           </w:p>
         </w:tc>
@@ -6355,7 +6274,7 @@
                 <w:b w:val="0"/>
                 <w:sz w:val="19"/>
               </w:rPr>
-              <w:t>Activity 4 — Hermes Dashboard, Professional PPT &amp; Single-Agent Video</w:t>
+              <w:t>Activity 3 — PPT Tool + Skill Build the Kopi Kaki Pitch Deck</w:t>
             </w:r>
           </w:p>
         </w:tc>
@@ -6371,7 +6290,7 @@
                 <w:b w:val="0"/>
                 <w:sz w:val="19"/>
               </w:rPr>
-              <w:t>One agent + office/video skills + human review</w:t>
+              <w:t>One agent + PPT tool and skill</w:t>
             </w:r>
           </w:p>
         </w:tc>
@@ -6403,7 +6322,7 @@
                 <w:b w:val="0"/>
                 <w:sz w:val="19"/>
               </w:rPr>
-              <w:t>90–97</w:t>
+              <w:t>86–90</w:t>
             </w:r>
           </w:p>
         </w:tc>
@@ -6421,7 +6340,7 @@
                 <w:b/>
                 <w:sz w:val="19"/>
               </w:rPr>
-              <w:t>Lab 5 (Day 2)</w:t>
+              <w:t>Lab 4 (Day 2)</w:t>
             </w:r>
           </w:p>
         </w:tc>
@@ -6437,7 +6356,7 @@
                 <w:b w:val="0"/>
                 <w:sz w:val="19"/>
               </w:rPr>
-              <w:t>Activity 5 — Hermes Bots &amp; Kanban Video Studio</w:t>
+              <w:t>Activity 4 — Your Social Media Marketing Team</w:t>
             </w:r>
           </w:p>
         </w:tc>
@@ -6453,7 +6372,7 @@
                 <w:b w:val="0"/>
                 <w:sz w:val="19"/>
               </w:rPr>
-              <w:t>Multi-agent (ordered pipeline)</w:t>
+              <w:t>Multi-agent team on a Kanban board</w:t>
             </w:r>
           </w:p>
         </w:tc>
@@ -6485,7 +6404,7 @@
                 <w:b w:val="0"/>
                 <w:sz w:val="19"/>
               </w:rPr>
-              <w:t>106–112</w:t>
+              <w:t>105–109</w:t>
             </w:r>
           </w:p>
         </w:tc>
@@ -6503,7 +6422,7 @@
                 <w:b/>
                 <w:sz w:val="19"/>
               </w:rPr>
-              <w:t>Lab 6 (Day 2)</w:t>
+              <w:t>Lab 5 (Day 2)</w:t>
             </w:r>
           </w:p>
         </w:tc>
@@ -6519,7 +6438,7 @@
                 <w:b w:val="0"/>
                 <w:sz w:val="19"/>
               </w:rPr>
-              <w:t>Activity 6 — Source Assurance, RAG Comparison &amp; Maintenance</w:t>
+              <w:t>Activity 5 — Your Video Production Team</w:t>
             </w:r>
           </w:p>
         </w:tc>
@@ -6535,7 +6454,7 @@
                 <w:b w:val="0"/>
                 <w:sz w:val="19"/>
               </w:rPr>
-              <w:t>Multi-agent team + human oversight</w:t>
+              <w:t>Multi-agent production line + human review</w:t>
             </w:r>
           </w:p>
         </w:tc>
@@ -6567,7 +6486,7 @@
                 <w:b w:val="0"/>
                 <w:sz w:val="19"/>
               </w:rPr>
-              <w:t>118–121</w:t>
+              <w:t>115–120</w:t>
             </w:r>
           </w:p>
         </w:tc>
@@ -6585,7 +6504,7 @@
                 <w:b/>
                 <w:sz w:val="19"/>
               </w:rPr>
-              <w:t>Lab 7 (Day 2)</w:t>
+              <w:t>Bonus Lab (Day 2)</w:t>
             </w:r>
           </w:p>
         </w:tc>
@@ -6601,7 +6520,7 @@
                 <w:b w:val="0"/>
                 <w:sz w:val="19"/>
               </w:rPr>
-              <w:t>Activity 7 — OpenAI Dots: Supervised Launch Review</w:t>
+              <w:t>Paperclip: Run Kopi Kaki as a One-Person Company</w:t>
             </w:r>
           </w:p>
         </w:tc>
@@ -6617,7 +6536,7 @@
                 <w:b w:val="0"/>
                 <w:sz w:val="19"/>
               </w:rPr>
-              <w:t>Persistent assistant + human supervision</w:t>
+              <w:t>AI company with an org chart, governed by you</w:t>
             </w:r>
           </w:p>
         </w:tc>
@@ -6649,89 +6568,7 @@
                 <w:b w:val="0"/>
                 <w:sz w:val="19"/>
               </w:rPr>
-              <w:t>125–129</w:t>
-            </w:r>
-          </w:p>
-        </w:tc>
-      </w:tr>
-      <w:tr>
-        <w:tc>
-          <w:tcPr>
-            <w:tcW w:type="dxa" w:w="1584"/>
-          </w:tcPr>
-          <w:p>
-            <w:r/>
-            <w:r>
-              <w:rPr>
-                <w:rFonts w:ascii="Arial" w:hAnsi="Arial"/>
-                <w:b/>
-                <w:sz w:val="19"/>
-              </w:rPr>
-              <w:t>Lab 8 (Day 2)</w:t>
-            </w:r>
-          </w:p>
-        </w:tc>
-        <w:tc>
-          <w:tcPr>
-            <w:tcW w:type="dxa" w:w="4608"/>
-          </w:tcPr>
-          <w:p>
-            <w:r/>
-            <w:r>
-              <w:rPr>
-                <w:rFonts w:ascii="Arial" w:hAnsi="Arial"/>
-                <w:b w:val="0"/>
-                <w:sz w:val="19"/>
-              </w:rPr>
-              <w:t>Activity 8 — Revise, Verify &amp; Release the Team Video Locally</w:t>
-            </w:r>
-          </w:p>
-        </w:tc>
-        <w:tc>
-          <w:tcPr>
-            <w:tcW w:type="dxa" w:w="2160"/>
-          </w:tcPr>
-          <w:p>
-            <w:r/>
-            <w:r>
-              <w:rPr>
-                <w:rFonts w:ascii="Arial" w:hAnsi="Arial"/>
-                <w:b w:val="0"/>
-                <w:sz w:val="19"/>
-              </w:rPr>
-              <w:t>Multi-agent team + human oversight</w:t>
-            </w:r>
-          </w:p>
-        </w:tc>
-        <w:tc>
-          <w:tcPr>
-            <w:tcW w:type="dxa" w:w="720"/>
-          </w:tcPr>
-          <w:p>
-            <w:r/>
-            <w:r>
-              <w:rPr>
-                <w:rFonts w:ascii="Arial" w:hAnsi="Arial"/>
-                <w:b w:val="0"/>
-                <w:sz w:val="19"/>
-              </w:rPr>
-              <w:t>LO3</w:t>
-            </w:r>
-          </w:p>
-        </w:tc>
-        <w:tc>
-          <w:tcPr>
-            <w:tcW w:type="dxa" w:w="1008"/>
-          </w:tcPr>
-          <w:p>
-            <w:r/>
-            <w:r>
-              <w:rPr>
-                <w:rFonts w:ascii="Arial" w:hAnsi="Arial"/>
-                <w:b w:val="0"/>
-                <w:sz w:val="19"/>
-              </w:rPr>
-              <w:t>137–141</w:t>
+              <w:t>134–139</w:t>
             </w:r>
           </w:p>
         </w:tc>
@@ -6742,7 +6579,7 @@
         <w:rPr>
           <w:sz w:val="20"/>
         </w:rPr>
-        <w:t>Lab materials: labs/labNN-*/ (README, LAB-NN-Instructions.pdf, COPY-PROMPTS.txt, data/) and the Lab Prompts page prompts/index.html in the course repository.</w:t>
+        <w:t>Lab materials: one folder per lab under labs/ (README, LAB-&lt;code&gt;-Instructions.pdf, COPY-PROMPTS.txt, data/) and the Lab Prompts page prompts/index.html (also on the course GitHub Page). The bonus Paperclip lab is optional.</w:t>
       </w:r>
     </w:p>
     <w:sectPr>

</xml_diff>

<commit_message>
Courseware v3.5: Hermes Desktop only, bots, Kanban by prompt, content crons
- No command lines for learners: every Topic 2/3 step is a Hermes Desktop
  click or a prompt the agent carries out; trainer Desktop screenshots added
  with explanations (personal details blurred).
- Model: ChatGPT Plus for the class, Nous Portal free tier as alternative;
  Gmail via Connectors sign-in (no OAuth client, no gog CLI).
- Activities 2-3 single agent; 4 five named bots in a group chat; 5 one
  prompt builds the Kanban video team; new Activity 6 content crons.
- Day 2 retimed inside LU3 (4 h). Assessment v7 unchanged.
- PDFs free of Type 3 fonts (fixes blank pages in Microsoft Edge).

Co-Authored-By: Claude Opus 5.5 <noreply@anthropic.com>
</commit_message>
<xml_diff>
--- a/courseware/LP-Human-AI Workforce with Autonomous AI Agents.docx
+++ b/courseware/LP-Human-AI Workforce with Autonomous AI Agents.docx
@@ -179,7 +179,7 @@
           <w:color w:val="1F6FEB"/>
           <w:sz w:val="24"/>
         </w:rPr>
-        <w:t>Version 3.4</w:t>
+        <w:t>Version 3.5</w:t>
       </w:r>
     </w:p>
     <w:p>
@@ -1832,6 +1832,64 @@
                 <w:sz w:val="19"/>
               </w:rPr>
               <w:t>One founder story: you are the founder-CEO of Kopi Kaki Co., a Singapore kopi startup, and AI agents help you start it — three mandatory topics and one optional bonus. Topic 1 unchanged (Activity 1: Meta Muse or OpenAI Dots as your always-on CEO assistant). Topic 2 rebuilt as 'Hermes Agent — Your First AI Employee': what Hermes is, Hermes Desktop, connecting a model (MiniMax demo; the one-day trial is marked awaiting verification), Telegram, tools, reviewed skills, Firecrawl web search, gog for Gmail/Calendar with one approved send, cron schedules and a daily 8:00 email-summary cron, with a guided setup lab; Activity 2 installs UX skills from skills.sh and builds the Kopi Kaki website; Activity 3 uses a PPT tool and skill to build the Kopi Kaki pitch deck (PP Task 2). Topic 3 rebuilt as 'Hermes Teams': a general introduction to multiple agents (each agent has its own tools, unique skills, model, instructions and context window), the trainer's three multi-agent slides recreated (Agent Communication Protocol, 'Each agent can…', the damaged-order hand-off), video skills and tools (HyperFrames, Remotion, Manim), profiles, Kanban and bots; Activity 4 social media marketing team (researcher, LinkedIn/Facebook/Instagram writers, image creator, posts gallery); Activity 5 video production team (researcher, scriptwriter, voice-over, producer, reviewer, human approval via a review link; PP Task 3); grounding/RAG and evaluation concepts; the 5 Principles of AI Security (as in the Agentic AI Applications with Claude Code deck). Bonus topic: Paperclip — Kopi Kaki as a one-person company (CEO with instructions → Chief of Staff → marketing team → org chart → the launch video, compared with the Hermes Kanban team), using the original Paperclip screenshots. Old Activities 3, 6, 7 and 8 removed. Mock company reframed as a startup. PP evidence: Task 1 one Muse/Dots screenshot; Task 2 one Hermes PPT screenshot; Task 3 two screenshots (Kanban board + video); questions unchanged. Labs, lab PDFs, COPY-PROMPTS and the prompts page regenerated with every step and copy-ready prompt, including Paperclip.</w:t>
+            </w:r>
+          </w:p>
+        </w:tc>
+        <w:tc>
+          <w:tcPr>
+            <w:tcW w:type="dxa" w:w="1440"/>
+          </w:tcPr>
+          <w:p>
+            <w:r/>
+            <w:r>
+              <w:rPr>
+                <w:sz w:val="19"/>
+              </w:rPr>
+              <w:t>Dr. Alfred Ang</w:t>
+            </w:r>
+          </w:p>
+        </w:tc>
+      </w:tr>
+      <w:tr>
+        <w:tc>
+          <w:tcPr>
+            <w:tcW w:type="dxa" w:w="1152"/>
+          </w:tcPr>
+          <w:p>
+            <w:r/>
+            <w:r>
+              <w:rPr>
+                <w:sz w:val="19"/>
+              </w:rPr>
+              <w:t>3.5</w:t>
+            </w:r>
+          </w:p>
+        </w:tc>
+        <w:tc>
+          <w:tcPr>
+            <w:tcW w:type="dxa" w:w="1656"/>
+          </w:tcPr>
+          <w:p>
+            <w:r/>
+            <w:r>
+              <w:rPr>
+                <w:sz w:val="19"/>
+              </w:rPr>
+              <w:t>31 October 2026</w:t>
+            </w:r>
+          </w:p>
+        </w:tc>
+        <w:tc>
+          <w:tcPr>
+            <w:tcW w:type="dxa" w:w="5544"/>
+          </w:tcPr>
+          <w:p>
+            <w:r/>
+            <w:r>
+              <w:rPr>
+                <w:sz w:val="19"/>
+              </w:rPr>
+              <w:t>No command lines for learners: every Topic 2 and Topic 3 step is now a click in Hermes Desktop or a prompt Mia carries out. Trainer screenshots of Hermes Desktop v0.22.5 added with explanations (version check, Settings → Model, Telegram Create with QR and Connected with the user ID blurred, Settings → Voice, Capabilities → Skills and Connectors, install a skill by asking, Scheduled jobs, bot Edit Profile, bot group chat, the Activity 2 website). Model: this class uses the learner's ChatGPT Plus plan (the free AI subscription slide now says to choose ChatGPT Plus); the Nous Portal Free tier ($0, free models only) and paid Nous plans (Plus USD 20, Super 100, Ultra 200) shown as alternatives; the MiniMax demo removed. Gmail now connects with a Google sign-in through Capabilities → Connectors (no OAuth client, no gog CLI; free-tier connector access marked awaiting verification); a reviewed kopi-email-brief skill replaces gog-office. Activities: 2 and 3 are explicitly single-agent; Activity 4 now hires five named bots (Rafi, Lin, Farah, Ivy, Pixel) with New Agent and runs them in one group chat; Activity 5 builds the video team and its Kanban board from one prompt (voice-over uses Hermes's free Edge text-to-speech); new Activity 6 schedules jobs that auto-generate the weekly social drafts and a video draft, still behind human approval. Day 2 retimed inside the approved LU3 4 hours (Lab 5B 70 min, Lab 6 30 min, Paperclip demo 20 min). Paperclip bonus installs through Mia. Assessment questions, K/A codes and PP evidence unchanged.</w:t>
             </w:r>
           </w:p>
         </w:tc>
@@ -2027,7 +2085,7 @@
           <w:color w:val="333333"/>
           <w:sz w:val="21"/>
         </w:rPr>
-        <w:t>Day 2 — Hermes marketing and video teams with profiles, Kanban and bots (Activities 4–5), AI security, optional Paperclip bonus, then assessment</w:t>
+        <w:t>Day 2 — Hermes bots in a group chat, a Kanban video team and content crons (Activities 4–6), AI security, optional Paperclip bonus, then assessment</w:t>
         <w:tab/>
         <w:t>11</w:t>
       </w:r>
@@ -2353,7 +2411,7 @@
                 <w:b w:val="0"/>
                 <w:sz w:val="20"/>
               </w:rPr>
-              <w:t>Human-AI Workforce with Autonomous AI Agents-v3.4.pptx (147 slides)</w:t>
+              <w:t>Human-AI Workforce with Autonomous AI Agents-v3.5.pptx (159 slides)</w:t>
             </w:r>
           </w:p>
         </w:tc>
@@ -2597,7 +2655,7 @@
                 <w:b w:val="0"/>
                 <w:sz w:val="19"/>
               </w:rPr>
-              <w:t>What Hermes Agent is; set up Hermes Desktop and connect a model (MiniMax demo); Telegram, tools, skills and cron schedules; gog for Gmail and Calendar; a daily email-summary cron; Firecrawl web search; Activity 2 · UX skills from skills.sh build the Kopi Kaki website; Activity 3 · PPT tool + skill build a professional Kopi Kaki deck (PP Task 2).</w:t>
+              <w:t>What Hermes Agent is; install Hermes Desktop; give Mia a brain: Nous free tier, your ChatGPT Plus plan or a paid model; Telegram by QR code, voice, tools and skills, all from the Desktop window; Gmail by Google sign-in (Connectors), Firecrawl web search and scheduled jobs; Activity 2 · One agent + UX skills build the Kopi Kaki website; Activity 3 · One agent + PPT tool and skill build the Kopi Kaki deck (PP Task 2).</w:t>
             </w:r>
           </w:p>
         </w:tc>
@@ -2613,7 +2671,7 @@
                 <w:b w:val="0"/>
                 <w:sz w:val="19"/>
               </w:rPr>
-              <w:t>58–90</w:t>
+              <w:t>58–95</w:t>
             </w:r>
           </w:p>
         </w:tc>
@@ -2632,7 +2690,7 @@
                 <w:b/>
                 <w:sz w:val="19"/>
               </w:rPr>
-              <w:t>Topic 3: Hermes Teams — Marketing &amp; Video Production with Profiles, Kanban &amp; Bots</w:t>
+              <w:t>Topic 3: Hermes Teams — Bots, Group Chats, Kanban &amp; Crons for Marketing and Video</w:t>
             </w:r>
           </w:p>
         </w:tc>
@@ -2648,7 +2706,7 @@
                 <w:b w:val="0"/>
                 <w:sz w:val="19"/>
               </w:rPr>
-              <w:t>Multiple agents: own tools, skills, model, instructions and context window; how agents talk (ACP); Video tools (HyperFrames, Remotion, Manim); profiles, Kanban and bots; Activity 4 · Social media marketing team: LinkedIn, Facebook and Instagram posts with images; Activity 5 · Video production team: research → script → video → voice-over → review → your approval (PP Task 3); Five principles of AI security.</w:t>
+              <w:t>Multiple agents: own tools, skills, model, instructions and context window; how agents talk (ACP); Activity 4 · Hire five named bots, put them in one group chat, get LinkedIn, Facebook and Instagram posts; Activity 5 · One prompt builds a video team and its Kanban board: research → script → video → review → your approval (PP Task 3); Activity 6 · Crons auto-generate next week’s posts and video drafts, still behind your approval; Five principles of AI security.</w:t>
             </w:r>
           </w:p>
         </w:tc>
@@ -2664,7 +2722,7 @@
                 <w:b w:val="0"/>
                 <w:sz w:val="19"/>
               </w:rPr>
-              <w:t>91–139</w:t>
+              <w:t>96–151</w:t>
             </w:r>
           </w:p>
         </w:tc>
@@ -2854,7 +2912,7 @@
                 <w:b w:val="0"/>
                 <w:sz w:val="19"/>
               </w:rPr>
-              <w:t>Topic 1 history, collaboration, harness and Big Five + Activity 1 always-on assistant + Topic 2 Part A: Hermes Agent, Desktop, model (MiniMax) and Telegram</w:t>
+              <w:t>Topic 1 history, collaboration, harness and Big Five + Activity 1 always-on assistant + Topic 2 Part A: Hermes Agent, Desktop, model (Nous free tier or ChatGPT Plus) and Telegram</w:t>
             </w:r>
           </w:p>
         </w:tc>
@@ -2943,7 +3001,7 @@
                 <w:b w:val="0"/>
                 <w:sz w:val="19"/>
               </w:rPr>
-              <w:t>Topic 2 Part B: tools, skills, Firecrawl, gog and cron schedules + Activities 2–3 (Kopi website, professional PPT) + Topic 3 team set-up + Activity 4 social media marketing team</w:t>
+              <w:t>Topic 2 Part B: voice, tools, skills, Firecrawl, Gmail connector and scheduled jobs + Activities 2–3 (single-agent website and PPT) + Topic 3 bots and group chats + Activity 4 social media bots</w:t>
             </w:r>
           </w:p>
         </w:tc>
@@ -3026,7 +3084,7 @@
                 <w:b w:val="0"/>
                 <w:sz w:val="19"/>
               </w:rPr>
-              <w:t>Activity 5 video production team (researcher source checks, review and human approval), five principles of AI security, evaluation metrics and the optional Paperclip comparison</w:t>
+              <w:t>Activity 5 Kanban video team (researcher source checks, review and human approval), Activity 6 content crons, five principles of AI security, evaluation metrics and the optional Paperclip comparison</w:t>
             </w:r>
           </w:p>
         </w:tc>
@@ -3994,7 +4052,7 @@
                 <w:b/>
                 <w:sz w:val="19"/>
               </w:rPr>
-              <w:t>Topic 2 (Part A) — meet Kopi Kaki Co.; what Hermes Agent is; set up Hermes Desktop; connect a model (MiniMax demo); connect Telegram</w:t>
+              <w:t>Topic 2 (Part A) — meet Kopi Kaki Co.; what Hermes Agent is; install Hermes Desktop; connect a model (Nous Portal free tier or your ChatGPT Plus plan); Telegram by QR code</w:t>
             </w:r>
           </w:p>
         </w:tc>
@@ -4081,7 +4139,7 @@
                 <w:b/>
                 <w:sz w:val="19"/>
               </w:rPr>
-              <w:t>Topic 2 (Part B) — configure tools; review and install skills; Firecrawl web search</w:t>
+              <w:t>Topic 2 (Part B) — voice; tools and skills from Capabilities; Firecrawl web search</w:t>
             </w:r>
           </w:p>
         </w:tc>
@@ -4115,7 +4173,7 @@
                 <w:b w:val="0"/>
                 <w:sz w:val="19"/>
               </w:rPr>
-              <w:t>67–70</w:t>
+              <w:t>67–72</w:t>
             </w:r>
           </w:p>
         </w:tc>
@@ -4255,7 +4313,7 @@
                 <w:b/>
                 <w:sz w:val="19"/>
               </w:rPr>
-              <w:t>Topic 2 (Part C) — gog: read and send Gmail, check Calendar; cron schedules; a daily email-summary cron to Telegram</w:t>
+              <w:t>Topic 2 (Part C) — Gmail by Google sign-in (Connectors); scheduled jobs; a daily email summary to Telegram</w:t>
             </w:r>
           </w:p>
         </w:tc>
@@ -4289,7 +4347,7 @@
                 <w:b w:val="0"/>
                 <w:sz w:val="19"/>
               </w:rPr>
-              <w:t>71–77</w:t>
+              <w:t>73–80</w:t>
             </w:r>
           </w:p>
         </w:tc>
@@ -4339,7 +4397,7 @@
                 <w:b w:val="0"/>
                 <w:sz w:val="19"/>
               </w:rPr>
-              <w:t>Lab 2: Activity 2 — install UX skills from skills.sh; Hermes builds the Kopi Kaki website</w:t>
+              <w:t>Lab 2: Activity 2 — single agent: Mia installs UX skills from skills.sh and builds the Kopi Kaki website</w:t>
             </w:r>
           </w:p>
         </w:tc>
@@ -4371,7 +4429,7 @@
                 <w:b w:val="0"/>
                 <w:sz w:val="19"/>
               </w:rPr>
-              <w:t>78–83</w:t>
+              <w:t>81–88</w:t>
             </w:r>
           </w:p>
         </w:tc>
@@ -4421,7 +4479,7 @@
                 <w:b w:val="0"/>
                 <w:sz w:val="19"/>
               </w:rPr>
-              <w:t>Lab 3: Activity 3 — PPT tool + skill: Hermes builds a professional Kopi Kaki deck (PP Task 2)</w:t>
+              <w:t>Lab 3: Activity 3 — single agent: PPT tool + skill build a professional Kopi Kaki deck (PP Task 2)</w:t>
             </w:r>
           </w:p>
         </w:tc>
@@ -4453,7 +4511,7 @@
                 <w:b w:val="0"/>
                 <w:sz w:val="19"/>
               </w:rPr>
-              <w:t>84–90</w:t>
+              <w:t>89–95</w:t>
             </w:r>
           </w:p>
         </w:tc>
@@ -4540,7 +4598,7 @@
                 <w:b w:val="0"/>
                 <w:sz w:val="19"/>
               </w:rPr>
-              <w:t>91</w:t>
+              <w:t>96</w:t>
             </w:r>
           </w:p>
         </w:tc>
@@ -4561,7 +4619,7 @@
         <w:pStyle w:val="Heading2"/>
       </w:pPr>
       <w:r>
-        <w:t>Day 2 — Hermes marketing and video teams with profiles, Kanban and bots (Activities 4–5), AI security, optional Paperclip bonus, then assessment</w:t>
+        <w:t>Day 2 — Hermes bots in a group chat, a Kanban video team and content crons (Activities 4–6), AI security, optional Paperclip bonus, then assessment</w:t>
       </w:r>
     </w:p>
     <w:tbl>
@@ -4753,7 +4811,7 @@
                 <w:b w:val="0"/>
                 <w:sz w:val="19"/>
               </w:rPr>
-              <w:t>91</w:t>
+              <w:t>96</w:t>
             </w:r>
           </w:p>
         </w:tc>
@@ -4806,7 +4864,7 @@
                 <w:b/>
                 <w:sz w:val="19"/>
               </w:rPr>
-              <w:t>Topic 3 (Part A) — introduction to multiple agents (each with its own tools, skills, model, instructions and context window); how agents talk (ACP); video skills and tools (HyperFrames, Remotion, Manim); Hermes profiles, the Kanban board and bots</w:t>
+              <w:t>Topic 3 (Part A) — introduction to multiple agents (each with its own tools, skills, model, instructions and context window); how agents talk (ACP); hire bots with New Agent; group chats</w:t>
             </w:r>
           </w:p>
         </w:tc>
@@ -4840,7 +4898,7 @@
                 <w:b w:val="0"/>
                 <w:sz w:val="19"/>
               </w:rPr>
-              <w:t>91–103</w:t>
+              <w:t>96–102</w:t>
             </w:r>
           </w:p>
         </w:tc>
@@ -4890,7 +4948,7 @@
                 <w:b w:val="0"/>
                 <w:sz w:val="19"/>
               </w:rPr>
-              <w:t>Lab 4: Activity 4 — social media marketing team: researcher, LinkedIn/Facebook/Instagram writers and image creator; review the posts gallery</w:t>
+              <w:t>Lab 4: Activity 4 — five named bots (researcher, LinkedIn, Facebook and Instagram writers, image creator) in one group chat write the launch posts; you approve each</w:t>
             </w:r>
           </w:p>
         </w:tc>
@@ -4922,7 +4980,7 @@
                 <w:b w:val="0"/>
                 <w:sz w:val="19"/>
               </w:rPr>
-              <w:t>104–109</w:t>
+              <w:t>103–112</w:t>
             </w:r>
           </w:p>
         </w:tc>
@@ -5059,7 +5117,7 @@
                 <w:b w:val="0"/>
                 <w:sz w:val="19"/>
               </w:rPr>
-              <w:t>Lab 5: Activity 5A — video production team: profiles, Kanban board and bots; researcher source checks and script</w:t>
+              <w:t>Lab 5: Activity 5A — video skills and tools; one prompt creates the video team and its Kanban board; researcher source checks and script</w:t>
             </w:r>
           </w:p>
         </w:tc>
@@ -5091,7 +5149,7 @@
                 <w:b w:val="0"/>
                 <w:sz w:val="19"/>
               </w:rPr>
-              <w:t>110–114</w:t>
+              <w:t>113–120</w:t>
             </w:r>
           </w:p>
         </w:tc>
@@ -5196,7 +5254,7 @@
                 <w:b w:val="0"/>
                 <w:sz w:val="19"/>
               </w:rPr>
-              <w:t>13:15–14:40</w:t>
+              <w:t>13:15–14:25</w:t>
             </w:r>
           </w:p>
         </w:tc>
@@ -5212,7 +5270,7 @@
                 <w:b w:val="0"/>
                 <w:sz w:val="19"/>
               </w:rPr>
-              <w:t>85 min</w:t>
+              <w:t>70 min</w:t>
             </w:r>
           </w:p>
         </w:tc>
@@ -5260,7 +5318,7 @@
                 <w:b w:val="0"/>
                 <w:sz w:val="19"/>
               </w:rPr>
-              <w:t>115–120</w:t>
+              <w:t>121–126</w:t>
             </w:r>
           </w:p>
         </w:tc>
@@ -5269,6 +5327,175 @@
         <w:tc>
           <w:tcPr>
             <w:tcW w:type="dxa" w:w="1440"/>
+          </w:tcPr>
+          <w:p>
+            <w:r/>
+            <w:r>
+              <w:rPr>
+                <w:rFonts w:ascii="Arial" w:hAnsi="Arial"/>
+                <w:b w:val="0"/>
+                <w:sz w:val="19"/>
+              </w:rPr>
+              <w:t>14:25–14:55</w:t>
+            </w:r>
+          </w:p>
+        </w:tc>
+        <w:tc>
+          <w:tcPr>
+            <w:tcW w:type="dxa" w:w="1080"/>
+          </w:tcPr>
+          <w:p>
+            <w:r/>
+            <w:r>
+              <w:rPr>
+                <w:rFonts w:ascii="Arial" w:hAnsi="Arial"/>
+                <w:b w:val="0"/>
+                <w:sz w:val="19"/>
+              </w:rPr>
+              <w:t>30 min</w:t>
+            </w:r>
+          </w:p>
+        </w:tc>
+        <w:tc>
+          <w:tcPr>
+            <w:tcW w:type="dxa" w:w="5112"/>
+          </w:tcPr>
+          <w:p>
+            <w:r/>
+            <w:r>
+              <w:rPr>
+                <w:rFonts w:ascii="Arial" w:hAnsi="Arial"/>
+                <w:b w:val="0"/>
+                <w:sz w:val="19"/>
+              </w:rPr>
+              <w:t>Lab 6: Activity 6 — scheduled jobs auto-generate the weekly social posts and a video draft; you approve before anything is used</w:t>
+            </w:r>
+          </w:p>
+        </w:tc>
+        <w:tc>
+          <w:tcPr>
+            <w:tcW w:type="dxa" w:w="864"/>
+          </w:tcPr>
+          <w:p>
+            <w:r/>
+            <w:r>
+              <w:rPr>
+                <w:rFonts w:ascii="Arial" w:hAnsi="Arial"/>
+                <w:b w:val="0"/>
+                <w:sz w:val="19"/>
+              </w:rPr>
+              <w:t>LU3</w:t>
+            </w:r>
+          </w:p>
+        </w:tc>
+        <w:tc>
+          <w:tcPr>
+            <w:tcW w:type="dxa" w:w="1368"/>
+          </w:tcPr>
+          <w:p>
+            <w:r/>
+            <w:r>
+              <w:rPr>
+                <w:rFonts w:ascii="Arial" w:hAnsi="Arial"/>
+                <w:b w:val="0"/>
+                <w:sz w:val="19"/>
+              </w:rPr>
+              <w:t>127–132</w:t>
+            </w:r>
+          </w:p>
+        </w:tc>
+      </w:tr>
+      <w:tr>
+        <w:tc>
+          <w:tcPr>
+            <w:tcW w:type="dxa" w:w="1440"/>
+            <w:shd w:val="clear" w:color="auto" w:fill="FFF4E5"/>
+          </w:tcPr>
+          <w:p>
+            <w:r/>
+            <w:r>
+              <w:rPr>
+                <w:rFonts w:ascii="Arial" w:hAnsi="Arial"/>
+                <w:b w:val="0"/>
+                <w:sz w:val="19"/>
+              </w:rPr>
+              <w:t>14:55–15:10</w:t>
+            </w:r>
+          </w:p>
+        </w:tc>
+        <w:tc>
+          <w:tcPr>
+            <w:tcW w:type="dxa" w:w="1080"/>
+            <w:shd w:val="clear" w:color="auto" w:fill="FFF4E5"/>
+          </w:tcPr>
+          <w:p>
+            <w:r/>
+            <w:r>
+              <w:rPr>
+                <w:rFonts w:ascii="Arial" w:hAnsi="Arial"/>
+                <w:b w:val="0"/>
+                <w:sz w:val="19"/>
+              </w:rPr>
+              <w:t>15 min</w:t>
+            </w:r>
+          </w:p>
+        </w:tc>
+        <w:tc>
+          <w:tcPr>
+            <w:tcW w:type="dxa" w:w="5112"/>
+            <w:shd w:val="clear" w:color="auto" w:fill="FFF4E5"/>
+          </w:tcPr>
+          <w:p>
+            <w:r/>
+            <w:r>
+              <w:rPr>
+                <w:rFonts w:ascii="Arial" w:hAnsi="Arial"/>
+                <w:b w:val="0"/>
+                <w:sz w:val="19"/>
+              </w:rPr>
+              <w:t>Tea break (included in scheduled LU time)</w:t>
+            </w:r>
+          </w:p>
+        </w:tc>
+        <w:tc>
+          <w:tcPr>
+            <w:tcW w:type="dxa" w:w="864"/>
+            <w:shd w:val="clear" w:color="auto" w:fill="FFF4E5"/>
+          </w:tcPr>
+          <w:p>
+            <w:r/>
+            <w:r>
+              <w:rPr>
+                <w:rFonts w:ascii="Arial" w:hAnsi="Arial"/>
+                <w:b w:val="0"/>
+                <w:sz w:val="19"/>
+              </w:rPr>
+              <w:t>LU3</w:t>
+            </w:r>
+          </w:p>
+        </w:tc>
+        <w:tc>
+          <w:tcPr>
+            <w:tcW w:type="dxa" w:w="1368"/>
+            <w:shd w:val="clear" w:color="auto" w:fill="FFF4E5"/>
+          </w:tcPr>
+          <w:p>
+            <w:r/>
+            <w:r>
+              <w:rPr>
+                <w:rFonts w:ascii="Arial" w:hAnsi="Arial"/>
+                <w:b w:val="0"/>
+                <w:sz w:val="19"/>
+              </w:rPr>
+              <w:t>—</w:t>
+            </w:r>
+          </w:p>
+        </w:tc>
+      </w:tr>
+      <w:tr>
+        <w:tc>
+          <w:tcPr>
+            <w:tcW w:type="dxa" w:w="1440"/>
             <w:shd w:val="clear" w:color="auto" w:fill="E8F0FE"/>
           </w:tcPr>
           <w:p>
@@ -5279,7 +5506,7 @@
                 <w:b/>
                 <w:sz w:val="19"/>
               </w:rPr>
-              <w:t>14:40–15:10</w:t>
+              <w:t>15:10–15:40</w:t>
             </w:r>
           </w:p>
         </w:tc>
@@ -5347,7 +5574,7 @@
                 <w:b w:val="0"/>
                 <w:sz w:val="19"/>
               </w:rPr>
-              <w:t>121–123</w:t>
+              <w:t>133–135</w:t>
             </w:r>
           </w:p>
         </w:tc>
@@ -5356,7 +5583,24 @@
         <w:tc>
           <w:tcPr>
             <w:tcW w:type="dxa" w:w="1440"/>
-            <w:shd w:val="clear" w:color="auto" w:fill="FFF4E5"/>
+            <w:shd w:val="clear" w:color="auto" w:fill="E8F0FE"/>
+          </w:tcPr>
+          <w:p>
+            <w:r/>
+            <w:r>
+              <w:rPr>
+                <w:rFonts w:ascii="Arial" w:hAnsi="Arial"/>
+                <w:b/>
+                <w:sz w:val="19"/>
+              </w:rPr>
+              <w:t>15:40–16:00</w:t>
+            </w:r>
+          </w:p>
+        </w:tc>
+        <w:tc>
+          <w:tcPr>
+            <w:tcW w:type="dxa" w:w="1080"/>
+            <w:shd w:val="clear" w:color="auto" w:fill="E8F0FE"/>
           </w:tcPr>
           <w:p>
             <w:r/>
@@ -5366,14 +5610,31 @@
                 <w:b w:val="0"/>
                 <w:sz w:val="19"/>
               </w:rPr>
-              <w:t>15:10–15:25</w:t>
-            </w:r>
-          </w:p>
-        </w:tc>
-        <w:tc>
-          <w:tcPr>
-            <w:tcW w:type="dxa" w:w="1080"/>
-            <w:shd w:val="clear" w:color="auto" w:fill="FFF4E5"/>
+              <w:t>20 min</w:t>
+            </w:r>
+          </w:p>
+        </w:tc>
+        <w:tc>
+          <w:tcPr>
+            <w:tcW w:type="dxa" w:w="5112"/>
+            <w:shd w:val="clear" w:color="auto" w:fill="E8F0FE"/>
+          </w:tcPr>
+          <w:p>
+            <w:r/>
+            <w:r>
+              <w:rPr>
+                <w:rFonts w:ascii="Arial" w:hAnsi="Arial"/>
+                <w:b/>
+                <w:sz w:val="19"/>
+              </w:rPr>
+              <w:t>Bonus (optional) — Paperclip: Kopi Kaki as a one-person company (trainer demo; full lab self-paced) and comparison with the Hermes Kanban team</w:t>
+            </w:r>
+          </w:p>
+        </w:tc>
+        <w:tc>
+          <w:tcPr>
+            <w:tcW w:type="dxa" w:w="864"/>
+            <w:shd w:val="clear" w:color="auto" w:fill="E8F0FE"/>
           </w:tcPr>
           <w:p>
             <w:r/>
@@ -5383,14 +5644,14 @@
                 <w:b w:val="0"/>
                 <w:sz w:val="19"/>
               </w:rPr>
-              <w:t>15 min</w:t>
-            </w:r>
-          </w:p>
-        </w:tc>
-        <w:tc>
-          <w:tcPr>
-            <w:tcW w:type="dxa" w:w="5112"/>
-            <w:shd w:val="clear" w:color="auto" w:fill="FFF4E5"/>
+              <w:t>LU3</w:t>
+            </w:r>
+          </w:p>
+        </w:tc>
+        <w:tc>
+          <w:tcPr>
+            <w:tcW w:type="dxa" w:w="1368"/>
+            <w:shd w:val="clear" w:color="auto" w:fill="E8F0FE"/>
           </w:tcPr>
           <w:p>
             <w:r/>
@@ -5400,14 +5661,16 @@
                 <w:b w:val="0"/>
                 <w:sz w:val="19"/>
               </w:rPr>
-              <w:t>Tea break (included in scheduled LU time)</w:t>
-            </w:r>
-          </w:p>
-        </w:tc>
-        <w:tc>
-          <w:tcPr>
-            <w:tcW w:type="dxa" w:w="864"/>
-            <w:shd w:val="clear" w:color="auto" w:fill="FFF4E5"/>
+              <w:t>136–151</w:t>
+            </w:r>
+          </w:p>
+        </w:tc>
+      </w:tr>
+      <w:tr>
+        <w:tc>
+          <w:tcPr>
+            <w:tcW w:type="dxa" w:w="1440"/>
+            <w:shd w:val="clear" w:color="auto" w:fill="F3F5F8"/>
           </w:tcPr>
           <w:p>
             <w:r/>
@@ -5417,14 +5680,14 @@
                 <w:b w:val="0"/>
                 <w:sz w:val="19"/>
               </w:rPr>
-              <w:t>LU3</w:t>
-            </w:r>
-          </w:p>
-        </w:tc>
-        <w:tc>
-          <w:tcPr>
-            <w:tcW w:type="dxa" w:w="1368"/>
-            <w:shd w:val="clear" w:color="auto" w:fill="FFF4E5"/>
+              <w:t>16:00–16:15</w:t>
+            </w:r>
+          </w:p>
+        </w:tc>
+        <w:tc>
+          <w:tcPr>
+            <w:tcW w:type="dxa" w:w="1080"/>
+            <w:shd w:val="clear" w:color="auto" w:fill="F3F5F8"/>
           </w:tcPr>
           <w:p>
             <w:r/>
@@ -5434,7 +5697,58 @@
                 <w:b w:val="0"/>
                 <w:sz w:val="19"/>
               </w:rPr>
-              <w:t>—</w:t>
+              <w:t>15 min</w:t>
+            </w:r>
+          </w:p>
+        </w:tc>
+        <w:tc>
+          <w:tcPr>
+            <w:tcW w:type="dxa" w:w="5112"/>
+            <w:shd w:val="clear" w:color="auto" w:fill="F3F5F8"/>
+          </w:tcPr>
+          <w:p>
+            <w:r/>
+            <w:r>
+              <w:rPr>
+                <w:rFonts w:ascii="Arial" w:hAnsi="Arial"/>
+                <w:b w:val="0"/>
+                <w:sz w:val="19"/>
+              </w:rPr>
+              <w:t>Course recap, practice questions and Q&amp;A</w:t>
+            </w:r>
+          </w:p>
+        </w:tc>
+        <w:tc>
+          <w:tcPr>
+            <w:tcW w:type="dxa" w:w="864"/>
+            <w:shd w:val="clear" w:color="auto" w:fill="F3F5F8"/>
+          </w:tcPr>
+          <w:p>
+            <w:r/>
+            <w:r>
+              <w:rPr>
+                <w:rFonts w:ascii="Arial" w:hAnsi="Arial"/>
+                <w:b w:val="0"/>
+                <w:sz w:val="19"/>
+              </w:rPr>
+              <w:t>LU3</w:t>
+            </w:r>
+          </w:p>
+        </w:tc>
+        <w:tc>
+          <w:tcPr>
+            <w:tcW w:type="dxa" w:w="1368"/>
+            <w:shd w:val="clear" w:color="auto" w:fill="F3F5F8"/>
+          </w:tcPr>
+          <w:p>
+            <w:r/>
+            <w:r>
+              <w:rPr>
+                <w:rFonts w:ascii="Arial" w:hAnsi="Arial"/>
+                <w:b w:val="0"/>
+                <w:sz w:val="19"/>
+              </w:rPr>
+              <w:t>152–155</w:t>
             </w:r>
           </w:p>
         </w:tc>
@@ -5443,7 +5757,7 @@
         <w:tc>
           <w:tcPr>
             <w:tcW w:type="dxa" w:w="1440"/>
-            <w:shd w:val="clear" w:color="auto" w:fill="E8F0FE"/>
+            <w:shd w:val="clear" w:color="auto" w:fill="E8F7EE"/>
           </w:tcPr>
           <w:p>
             <w:r/>
@@ -5453,14 +5767,14 @@
                 <w:b/>
                 <w:sz w:val="19"/>
               </w:rPr>
-              <w:t>15:25–16:00</w:t>
+              <w:t>16:15–16:30</w:t>
             </w:r>
           </w:p>
         </w:tc>
         <w:tc>
           <w:tcPr>
             <w:tcW w:type="dxa" w:w="1080"/>
-            <w:shd w:val="clear" w:color="auto" w:fill="E8F0FE"/>
+            <w:shd w:val="clear" w:color="auto" w:fill="E8F7EE"/>
           </w:tcPr>
           <w:p>
             <w:r/>
@@ -5470,14 +5784,14 @@
                 <w:b w:val="0"/>
                 <w:sz w:val="19"/>
               </w:rPr>
-              <w:t>35 min</w:t>
+              <w:t>15 min</w:t>
             </w:r>
           </w:p>
         </w:tc>
         <w:tc>
           <w:tcPr>
             <w:tcW w:type="dxa" w:w="5112"/>
-            <w:shd w:val="clear" w:color="auto" w:fill="E8F0FE"/>
+            <w:shd w:val="clear" w:color="auto" w:fill="E8F7EE"/>
           </w:tcPr>
           <w:p>
             <w:r/>
@@ -5487,14 +5801,14 @@
                 <w:b/>
                 <w:sz w:val="19"/>
               </w:rPr>
-              <w:t>Bonus (optional) — Paperclip: Kopi Kaki as a one-person company (trainer demo; full lab self-paced) and comparison with the Hermes Kanban team</w:t>
+              <w:t>Briefing for Assessment</w:t>
             </w:r>
           </w:p>
         </w:tc>
         <w:tc>
           <w:tcPr>
             <w:tcW w:type="dxa" w:w="864"/>
-            <w:shd w:val="clear" w:color="auto" w:fill="E8F0FE"/>
+            <w:shd w:val="clear" w:color="auto" w:fill="E8F7EE"/>
           </w:tcPr>
           <w:p>
             <w:r/>
@@ -5511,7 +5825,7 @@
         <w:tc>
           <w:tcPr>
             <w:tcW w:type="dxa" w:w="1368"/>
-            <w:shd w:val="clear" w:color="auto" w:fill="E8F0FE"/>
+            <w:shd w:val="clear" w:color="auto" w:fill="E8F7EE"/>
           </w:tcPr>
           <w:p>
             <w:r/>
@@ -5521,7 +5835,7 @@
                 <w:b w:val="0"/>
                 <w:sz w:val="19"/>
               </w:rPr>
-              <w:t>124–139</w:t>
+              <w:t>16</w:t>
             </w:r>
           </w:p>
         </w:tc>
@@ -5530,7 +5844,24 @@
         <w:tc>
           <w:tcPr>
             <w:tcW w:type="dxa" w:w="1440"/>
-            <w:shd w:val="clear" w:color="auto" w:fill="F3F5F8"/>
+            <w:shd w:val="clear" w:color="auto" w:fill="E8F7EE"/>
+          </w:tcPr>
+          <w:p>
+            <w:r/>
+            <w:r>
+              <w:rPr>
+                <w:rFonts w:ascii="Arial" w:hAnsi="Arial"/>
+                <w:b/>
+                <w:sz w:val="19"/>
+              </w:rPr>
+              <w:t>16:30–17:30</w:t>
+            </w:r>
+          </w:p>
+        </w:tc>
+        <w:tc>
+          <w:tcPr>
+            <w:tcW w:type="dxa" w:w="1080"/>
+            <w:shd w:val="clear" w:color="auto" w:fill="E8F7EE"/>
           </w:tcPr>
           <w:p>
             <w:r/>
@@ -5540,14 +5871,31 @@
                 <w:b w:val="0"/>
                 <w:sz w:val="19"/>
               </w:rPr>
-              <w:t>16:00–16:15</w:t>
-            </w:r>
-          </w:p>
-        </w:tc>
-        <w:tc>
-          <w:tcPr>
-            <w:tcW w:type="dxa" w:w="1080"/>
-            <w:shd w:val="clear" w:color="auto" w:fill="F3F5F8"/>
+              <w:t>60 min</w:t>
+            </w:r>
+          </w:p>
+        </w:tc>
+        <w:tc>
+          <w:tcPr>
+            <w:tcW w:type="dxa" w:w="5112"/>
+            <w:shd w:val="clear" w:color="auto" w:fill="E8F7EE"/>
+          </w:tcPr>
+          <w:p>
+            <w:r/>
+            <w:r>
+              <w:rPr>
+                <w:rFonts w:ascii="Arial" w:hAnsi="Arial"/>
+                <w:b/>
+                <w:sz w:val="19"/>
+              </w:rPr>
+              <w:t>Written Assessment (WA) — 1 hour, open book; TRAQOM survey and assessment attendance first</w:t>
+            </w:r>
+          </w:p>
+        </w:tc>
+        <w:tc>
+          <w:tcPr>
+            <w:tcW w:type="dxa" w:w="864"/>
+            <w:shd w:val="clear" w:color="auto" w:fill="E8F7EE"/>
           </w:tcPr>
           <w:p>
             <w:r/>
@@ -5557,14 +5905,14 @@
                 <w:b w:val="0"/>
                 <w:sz w:val="19"/>
               </w:rPr>
-              <w:t>15 min</w:t>
-            </w:r>
-          </w:p>
-        </w:tc>
-        <w:tc>
-          <w:tcPr>
-            <w:tcW w:type="dxa" w:w="5112"/>
-            <w:shd w:val="clear" w:color="auto" w:fill="F3F5F8"/>
+              <w:t>Assessment</w:t>
+            </w:r>
+          </w:p>
+        </w:tc>
+        <w:tc>
+          <w:tcPr>
+            <w:tcW w:type="dxa" w:w="1368"/>
+            <w:shd w:val="clear" w:color="auto" w:fill="E8F7EE"/>
           </w:tcPr>
           <w:p>
             <w:r/>
@@ -5574,14 +5922,33 @@
                 <w:b w:val="0"/>
                 <w:sz w:val="19"/>
               </w:rPr>
-              <w:t>Course recap, practice questions and Q&amp;A</w:t>
-            </w:r>
-          </w:p>
-        </w:tc>
-        <w:tc>
-          <w:tcPr>
-            <w:tcW w:type="dxa" w:w="864"/>
-            <w:shd w:val="clear" w:color="auto" w:fill="F3F5F8"/>
+              <w:t>156–159</w:t>
+            </w:r>
+          </w:p>
+        </w:tc>
+      </w:tr>
+      <w:tr>
+        <w:tc>
+          <w:tcPr>
+            <w:tcW w:type="dxa" w:w="1440"/>
+            <w:shd w:val="clear" w:color="auto" w:fill="E8F7EE"/>
+          </w:tcPr>
+          <w:p>
+            <w:r/>
+            <w:r>
+              <w:rPr>
+                <w:rFonts w:ascii="Arial" w:hAnsi="Arial"/>
+                <w:b/>
+                <w:sz w:val="19"/>
+              </w:rPr>
+              <w:t>17:30–18:30</w:t>
+            </w:r>
+          </w:p>
+        </w:tc>
+        <w:tc>
+          <w:tcPr>
+            <w:tcW w:type="dxa" w:w="1080"/>
+            <w:shd w:val="clear" w:color="auto" w:fill="E8F7EE"/>
           </w:tcPr>
           <w:p>
             <w:r/>
@@ -5591,14 +5958,31 @@
                 <w:b w:val="0"/>
                 <w:sz w:val="19"/>
               </w:rPr>
-              <w:t>LU3</w:t>
-            </w:r>
-          </w:p>
-        </w:tc>
-        <w:tc>
-          <w:tcPr>
-            <w:tcW w:type="dxa" w:w="1368"/>
-            <w:shd w:val="clear" w:color="auto" w:fill="F3F5F8"/>
+              <w:t>60 min</w:t>
+            </w:r>
+          </w:p>
+        </w:tc>
+        <w:tc>
+          <w:tcPr>
+            <w:tcW w:type="dxa" w:w="5112"/>
+            <w:shd w:val="clear" w:color="auto" w:fill="E8F7EE"/>
+          </w:tcPr>
+          <w:p>
+            <w:r/>
+            <w:r>
+              <w:rPr>
+                <w:rFonts w:ascii="Arial" w:hAnsi="Arial"/>
+                <w:b/>
+                <w:sz w:val="19"/>
+              </w:rPr>
+              <w:t>Practical Performance (PP) — 1 hour, open book; submit answers on the LMS and take PM attendance</w:t>
+            </w:r>
+          </w:p>
+        </w:tc>
+        <w:tc>
+          <w:tcPr>
+            <w:tcW w:type="dxa" w:w="864"/>
+            <w:shd w:val="clear" w:color="auto" w:fill="E8F7EE"/>
           </w:tcPr>
           <w:p>
             <w:r/>
@@ -5608,32 +5992,13 @@
                 <w:b w:val="0"/>
                 <w:sz w:val="19"/>
               </w:rPr>
-              <w:t>140–143</w:t>
-            </w:r>
-          </w:p>
-        </w:tc>
-      </w:tr>
-      <w:tr>
-        <w:tc>
-          <w:tcPr>
-            <w:tcW w:type="dxa" w:w="1440"/>
-            <w:shd w:val="clear" w:color="auto" w:fill="E8F7EE"/>
-          </w:tcPr>
-          <w:p>
-            <w:r/>
-            <w:r>
-              <w:rPr>
-                <w:rFonts w:ascii="Arial" w:hAnsi="Arial"/>
-                <w:b/>
-                <w:sz w:val="19"/>
-              </w:rPr>
-              <w:t>16:15–16:30</w:t>
-            </w:r>
-          </w:p>
-        </w:tc>
-        <w:tc>
-          <w:tcPr>
-            <w:tcW w:type="dxa" w:w="1080"/>
+              <w:t>Assessment</w:t>
+            </w:r>
+          </w:p>
+        </w:tc>
+        <w:tc>
+          <w:tcPr>
+            <w:tcW w:type="dxa" w:w="1368"/>
             <w:shd w:val="clear" w:color="auto" w:fill="E8F7EE"/>
           </w:tcPr>
           <w:p>
@@ -5644,232 +6009,7 @@
                 <w:b w:val="0"/>
                 <w:sz w:val="19"/>
               </w:rPr>
-              <w:t>15 min</w:t>
-            </w:r>
-          </w:p>
-        </w:tc>
-        <w:tc>
-          <w:tcPr>
-            <w:tcW w:type="dxa" w:w="5112"/>
-            <w:shd w:val="clear" w:color="auto" w:fill="E8F7EE"/>
-          </w:tcPr>
-          <w:p>
-            <w:r/>
-            <w:r>
-              <w:rPr>
-                <w:rFonts w:ascii="Arial" w:hAnsi="Arial"/>
-                <w:b/>
-                <w:sz w:val="19"/>
-              </w:rPr>
-              <w:t>Briefing for Assessment</w:t>
-            </w:r>
-          </w:p>
-        </w:tc>
-        <w:tc>
-          <w:tcPr>
-            <w:tcW w:type="dxa" w:w="864"/>
-            <w:shd w:val="clear" w:color="auto" w:fill="E8F7EE"/>
-          </w:tcPr>
-          <w:p>
-            <w:r/>
-            <w:r>
-              <w:rPr>
-                <w:rFonts w:ascii="Arial" w:hAnsi="Arial"/>
-                <w:b w:val="0"/>
-                <w:sz w:val="19"/>
-              </w:rPr>
-              <w:t>LU3</w:t>
-            </w:r>
-          </w:p>
-        </w:tc>
-        <w:tc>
-          <w:tcPr>
-            <w:tcW w:type="dxa" w:w="1368"/>
-            <w:shd w:val="clear" w:color="auto" w:fill="E8F7EE"/>
-          </w:tcPr>
-          <w:p>
-            <w:r/>
-            <w:r>
-              <w:rPr>
-                <w:rFonts w:ascii="Arial" w:hAnsi="Arial"/>
-                <w:b w:val="0"/>
-                <w:sz w:val="19"/>
-              </w:rPr>
-              <w:t>16</w:t>
-            </w:r>
-          </w:p>
-        </w:tc>
-      </w:tr>
-      <w:tr>
-        <w:tc>
-          <w:tcPr>
-            <w:tcW w:type="dxa" w:w="1440"/>
-            <w:shd w:val="clear" w:color="auto" w:fill="E8F7EE"/>
-          </w:tcPr>
-          <w:p>
-            <w:r/>
-            <w:r>
-              <w:rPr>
-                <w:rFonts w:ascii="Arial" w:hAnsi="Arial"/>
-                <w:b/>
-                <w:sz w:val="19"/>
-              </w:rPr>
-              <w:t>16:30–17:30</w:t>
-            </w:r>
-          </w:p>
-        </w:tc>
-        <w:tc>
-          <w:tcPr>
-            <w:tcW w:type="dxa" w:w="1080"/>
-            <w:shd w:val="clear" w:color="auto" w:fill="E8F7EE"/>
-          </w:tcPr>
-          <w:p>
-            <w:r/>
-            <w:r>
-              <w:rPr>
-                <w:rFonts w:ascii="Arial" w:hAnsi="Arial"/>
-                <w:b w:val="0"/>
-                <w:sz w:val="19"/>
-              </w:rPr>
-              <w:t>60 min</w:t>
-            </w:r>
-          </w:p>
-        </w:tc>
-        <w:tc>
-          <w:tcPr>
-            <w:tcW w:type="dxa" w:w="5112"/>
-            <w:shd w:val="clear" w:color="auto" w:fill="E8F7EE"/>
-          </w:tcPr>
-          <w:p>
-            <w:r/>
-            <w:r>
-              <w:rPr>
-                <w:rFonts w:ascii="Arial" w:hAnsi="Arial"/>
-                <w:b/>
-                <w:sz w:val="19"/>
-              </w:rPr>
-              <w:t>Written Assessment (WA) — 1 hour, open book; TRAQOM survey and assessment attendance first</w:t>
-            </w:r>
-          </w:p>
-        </w:tc>
-        <w:tc>
-          <w:tcPr>
-            <w:tcW w:type="dxa" w:w="864"/>
-            <w:shd w:val="clear" w:color="auto" w:fill="E8F7EE"/>
-          </w:tcPr>
-          <w:p>
-            <w:r/>
-            <w:r>
-              <w:rPr>
-                <w:rFonts w:ascii="Arial" w:hAnsi="Arial"/>
-                <w:b w:val="0"/>
-                <w:sz w:val="19"/>
-              </w:rPr>
-              <w:t>Assessment</w:t>
-            </w:r>
-          </w:p>
-        </w:tc>
-        <w:tc>
-          <w:tcPr>
-            <w:tcW w:type="dxa" w:w="1368"/>
-            <w:shd w:val="clear" w:color="auto" w:fill="E8F7EE"/>
-          </w:tcPr>
-          <w:p>
-            <w:r/>
-            <w:r>
-              <w:rPr>
-                <w:rFonts w:ascii="Arial" w:hAnsi="Arial"/>
-                <w:b w:val="0"/>
-                <w:sz w:val="19"/>
-              </w:rPr>
-              <w:t>144–147</w:t>
-            </w:r>
-          </w:p>
-        </w:tc>
-      </w:tr>
-      <w:tr>
-        <w:tc>
-          <w:tcPr>
-            <w:tcW w:type="dxa" w:w="1440"/>
-            <w:shd w:val="clear" w:color="auto" w:fill="E8F7EE"/>
-          </w:tcPr>
-          <w:p>
-            <w:r/>
-            <w:r>
-              <w:rPr>
-                <w:rFonts w:ascii="Arial" w:hAnsi="Arial"/>
-                <w:b/>
-                <w:sz w:val="19"/>
-              </w:rPr>
-              <w:t>17:30–18:30</w:t>
-            </w:r>
-          </w:p>
-        </w:tc>
-        <w:tc>
-          <w:tcPr>
-            <w:tcW w:type="dxa" w:w="1080"/>
-            <w:shd w:val="clear" w:color="auto" w:fill="E8F7EE"/>
-          </w:tcPr>
-          <w:p>
-            <w:r/>
-            <w:r>
-              <w:rPr>
-                <w:rFonts w:ascii="Arial" w:hAnsi="Arial"/>
-                <w:b w:val="0"/>
-                <w:sz w:val="19"/>
-              </w:rPr>
-              <w:t>60 min</w:t>
-            </w:r>
-          </w:p>
-        </w:tc>
-        <w:tc>
-          <w:tcPr>
-            <w:tcW w:type="dxa" w:w="5112"/>
-            <w:shd w:val="clear" w:color="auto" w:fill="E8F7EE"/>
-          </w:tcPr>
-          <w:p>
-            <w:r/>
-            <w:r>
-              <w:rPr>
-                <w:rFonts w:ascii="Arial" w:hAnsi="Arial"/>
-                <w:b/>
-                <w:sz w:val="19"/>
-              </w:rPr>
-              <w:t>Practical Performance (PP) — 1 hour, open book; submit answers on the LMS and take PM attendance</w:t>
-            </w:r>
-          </w:p>
-        </w:tc>
-        <w:tc>
-          <w:tcPr>
-            <w:tcW w:type="dxa" w:w="864"/>
-            <w:shd w:val="clear" w:color="auto" w:fill="E8F7EE"/>
-          </w:tcPr>
-          <w:p>
-            <w:r/>
-            <w:r>
-              <w:rPr>
-                <w:rFonts w:ascii="Arial" w:hAnsi="Arial"/>
-                <w:b w:val="0"/>
-                <w:sz w:val="19"/>
-              </w:rPr>
-              <w:t>Assessment</w:t>
-            </w:r>
-          </w:p>
-        </w:tc>
-        <w:tc>
-          <w:tcPr>
-            <w:tcW w:type="dxa" w:w="1368"/>
-            <w:shd w:val="clear" w:color="auto" w:fill="E8F7EE"/>
-          </w:tcPr>
-          <w:p>
-            <w:r/>
-            <w:r>
-              <w:rPr>
-                <w:rFonts w:ascii="Arial" w:hAnsi="Arial"/>
-                <w:b w:val="0"/>
-                <w:sz w:val="19"/>
-              </w:rPr>
-              <w:t>144–147</w:t>
+              <w:t>156–159</w:t>
             </w:r>
           </w:p>
         </w:tc>
@@ -6158,7 +6298,7 @@
                 <w:b w:val="0"/>
                 <w:sz w:val="19"/>
               </w:rPr>
-              <w:t>73–77</w:t>
+              <w:t>76–80</w:t>
             </w:r>
           </w:p>
         </w:tc>
@@ -6192,7 +6332,7 @@
                 <w:b w:val="0"/>
                 <w:sz w:val="19"/>
               </w:rPr>
-              <w:t>Activity 2 — UX Skills from skills.sh Build the Kopi Kaki Website</w:t>
+              <w:t>Activity 2 — One Agent Builds the Kopi Kaki Website with UX Skills</w:t>
             </w:r>
           </w:p>
         </w:tc>
@@ -6208,7 +6348,7 @@
                 <w:b w:val="0"/>
                 <w:sz w:val="19"/>
               </w:rPr>
-              <w:t>One agent + installed UX skills</w:t>
+              <w:t>Single agent + installed UX skills</w:t>
             </w:r>
           </w:p>
         </w:tc>
@@ -6240,7 +6380,7 @@
                 <w:b w:val="0"/>
                 <w:sz w:val="19"/>
               </w:rPr>
-              <w:t>79–83</w:t>
+              <w:t>83–88</w:t>
             </w:r>
           </w:p>
         </w:tc>
@@ -6274,7 +6414,7 @@
                 <w:b w:val="0"/>
                 <w:sz w:val="19"/>
               </w:rPr>
-              <w:t>Activity 3 — PPT Tool + Skill Build the Kopi Kaki Pitch Deck</w:t>
+              <w:t>Activity 3 — One Agent Builds the Kopi Kaki Pitch Deck with a PPT Tool and Skill</w:t>
             </w:r>
           </w:p>
         </w:tc>
@@ -6290,7 +6430,7 @@
                 <w:b w:val="0"/>
                 <w:sz w:val="19"/>
               </w:rPr>
-              <w:t>One agent + PPT tool and skill</w:t>
+              <w:t>Single agent + PPT tool and skill</w:t>
             </w:r>
           </w:p>
         </w:tc>
@@ -6322,7 +6462,7 @@
                 <w:b w:val="0"/>
                 <w:sz w:val="19"/>
               </w:rPr>
-              <w:t>86–90</w:t>
+              <w:t>91–95</w:t>
             </w:r>
           </w:p>
         </w:tc>
@@ -6356,7 +6496,7 @@
                 <w:b w:val="0"/>
                 <w:sz w:val="19"/>
               </w:rPr>
-              <w:t>Activity 4 — Your Social Media Marketing Team</w:t>
+              <w:t>Activity 4 — Your Social Media Team: Five Bots in One Group Chat</w:t>
             </w:r>
           </w:p>
         </w:tc>
@@ -6372,7 +6512,7 @@
                 <w:b w:val="0"/>
                 <w:sz w:val="19"/>
               </w:rPr>
-              <w:t>Multi-agent team on a Kanban board</w:t>
+              <w:t>Multiple named bots in one group chat</w:t>
             </w:r>
           </w:p>
         </w:tc>
@@ -6404,7 +6544,7 @@
                 <w:b w:val="0"/>
                 <w:sz w:val="19"/>
               </w:rPr>
-              <w:t>105–109</w:t>
+              <w:t>107–112</w:t>
             </w:r>
           </w:p>
         </w:tc>
@@ -6438,7 +6578,7 @@
                 <w:b w:val="0"/>
                 <w:sz w:val="19"/>
               </w:rPr>
-              <w:t>Activity 5 — Your Video Production Team</w:t>
+              <w:t>Activity 5 — Your Video Team on a Kanban Board</w:t>
             </w:r>
           </w:p>
         </w:tc>
@@ -6454,7 +6594,7 @@
                 <w:b w:val="0"/>
                 <w:sz w:val="19"/>
               </w:rPr>
-              <w:t>Multi-agent production line + human review</w:t>
+              <w:t>Agent team on a Kanban board + human gates</w:t>
             </w:r>
           </w:p>
         </w:tc>
@@ -6486,7 +6626,7 @@
                 <w:b w:val="0"/>
                 <w:sz w:val="19"/>
               </w:rPr>
-              <w:t>115–120</w:t>
+              <w:t>121–126</w:t>
             </w:r>
           </w:p>
         </w:tc>
@@ -6504,7 +6644,7 @@
                 <w:b/>
                 <w:sz w:val="19"/>
               </w:rPr>
-              <w:t>Bonus Lab (Day 2)</w:t>
+              <w:t>Lab 6 (Day 2)</w:t>
             </w:r>
           </w:p>
         </w:tc>
@@ -6520,7 +6660,7 @@
                 <w:b w:val="0"/>
                 <w:sz w:val="19"/>
               </w:rPr>
-              <w:t>Paperclip: Run Kopi Kaki as a One-Person Company</w:t>
+              <w:t>Activity 6 — Crons Make Next Week's Posts and Video While You Sleep</w:t>
             </w:r>
           </w:p>
         </w:tc>
@@ -6536,7 +6676,7 @@
                 <w:b w:val="0"/>
                 <w:sz w:val="19"/>
               </w:rPr>
-              <w:t>AI company with an org chart, governed by you</w:t>
+              <w:t>Scheduled jobs that start the team's work</w:t>
             </w:r>
           </w:p>
         </w:tc>
@@ -6568,7 +6708,89 @@
                 <w:b w:val="0"/>
                 <w:sz w:val="19"/>
               </w:rPr>
-              <w:t>134–139</w:t>
+              <w:t>128–132</w:t>
+            </w:r>
+          </w:p>
+        </w:tc>
+      </w:tr>
+      <w:tr>
+        <w:tc>
+          <w:tcPr>
+            <w:tcW w:type="dxa" w:w="1584"/>
+          </w:tcPr>
+          <w:p>
+            <w:r/>
+            <w:r>
+              <w:rPr>
+                <w:rFonts w:ascii="Arial" w:hAnsi="Arial"/>
+                <w:b/>
+                <w:sz w:val="19"/>
+              </w:rPr>
+              <w:t>Bonus Lab (Day 2)</w:t>
+            </w:r>
+          </w:p>
+        </w:tc>
+        <w:tc>
+          <w:tcPr>
+            <w:tcW w:type="dxa" w:w="4608"/>
+          </w:tcPr>
+          <w:p>
+            <w:r/>
+            <w:r>
+              <w:rPr>
+                <w:rFonts w:ascii="Arial" w:hAnsi="Arial"/>
+                <w:b w:val="0"/>
+                <w:sz w:val="19"/>
+              </w:rPr>
+              <w:t>Paperclip: Run Kopi Kaki as a One-Person Company</w:t>
+            </w:r>
+          </w:p>
+        </w:tc>
+        <w:tc>
+          <w:tcPr>
+            <w:tcW w:type="dxa" w:w="2160"/>
+          </w:tcPr>
+          <w:p>
+            <w:r/>
+            <w:r>
+              <w:rPr>
+                <w:rFonts w:ascii="Arial" w:hAnsi="Arial"/>
+                <w:b w:val="0"/>
+                <w:sz w:val="19"/>
+              </w:rPr>
+              <w:t>AI company with an org chart, governed by you</w:t>
+            </w:r>
+          </w:p>
+        </w:tc>
+        <w:tc>
+          <w:tcPr>
+            <w:tcW w:type="dxa" w:w="720"/>
+          </w:tcPr>
+          <w:p>
+            <w:r/>
+            <w:r>
+              <w:rPr>
+                <w:rFonts w:ascii="Arial" w:hAnsi="Arial"/>
+                <w:b w:val="0"/>
+                <w:sz w:val="19"/>
+              </w:rPr>
+              <w:t>LO3</w:t>
+            </w:r>
+          </w:p>
+        </w:tc>
+        <w:tc>
+          <w:tcPr>
+            <w:tcW w:type="dxa" w:w="1008"/>
+          </w:tcPr>
+          <w:p>
+            <w:r/>
+            <w:r>
+              <w:rPr>
+                <w:rFonts w:ascii="Arial" w:hAnsi="Arial"/>
+                <w:b w:val="0"/>
+                <w:sz w:val="19"/>
+              </w:rPr>
+              <w:t>146–151</w:t>
             </w:r>
           </w:p>
         </w:tc>

</xml_diff>

<commit_message>
Courseware v3.7: Topic 2 reorder, Big Five models, multi-agent diagrams, prompt buttons
- Topic 1: Big Five compared by model inside and use case; agent components
  and tools-vs-skills moved to Topic 2.
- Topic 2 in the trainer's order: what an AI agent is, Hermes, install,
  AGENTS.md via + -> Folder..., provider and model (Nous free Solar Mini 4
  or ChatGPT Plus), Telegram by QR or BotFather, tools and skills (Gmail,
  web design, PPTX; Firecrawl kept), Activities 2 and 3.
- Topic 3: ACP/A2A removed; hub-and-spoke, request flow, task
  decomposition, 5-step framework and subagents as native diagrams.
- COPY THE PROMPTS button on every lab intro and prompt slide, linked to
  prompts/#lab-<code>; Practice Exam and lab checkpoint slides removed.
- LP, LG, labs, prompts page and README aligned. Assessment v7 unchanged.

Co-Authored-By: Claude Opus 5.5 <noreply@anthropic.com>
</commit_message>
<xml_diff>
--- a/courseware/LP-Human-AI Workforce with Autonomous AI Agents.docx
+++ b/courseware/LP-Human-AI Workforce with Autonomous AI Agents.docx
@@ -179,7 +179,7 @@
           <w:color w:val="1F6FEB"/>
           <w:sz w:val="24"/>
         </w:rPr>
-        <w:t>Version 3.5</w:t>
+        <w:t>Version 3.7</w:t>
       </w:r>
     </w:p>
     <w:p>
@@ -1890,6 +1890,122 @@
                 <w:sz w:val="19"/>
               </w:rPr>
               <w:t>No command lines for learners: every Topic 2 and Topic 3 step is now a click in Hermes Desktop or a prompt Mia carries out. Trainer screenshots of Hermes Desktop v0.22.5 added with explanations (version check, Settings → Model, Telegram Create with QR and Connected with the user ID blurred, Settings → Voice, Capabilities → Skills and Connectors, install a skill by asking, Scheduled jobs, bot Edit Profile, bot group chat, the Activity 2 website). Model: this class uses the learner's ChatGPT Plus plan (the free AI subscription slide now says to choose ChatGPT Plus); the Nous Portal Free tier ($0, free models only) and paid Nous plans (Plus USD 20, Super 100, Ultra 200) shown as alternatives; the MiniMax demo removed. Gmail now connects with a Google sign-in through Capabilities → Connectors (no OAuth client, no gog CLI; free-tier connector access marked awaiting verification); a reviewed kopi-email-brief skill replaces gog-office. Activities: 2 and 3 are explicitly single-agent; Activity 4 now hires five named bots (Rafi, Lin, Farah, Ivy, Pixel) with New Agent and runs them in one group chat; Activity 5 builds the video team and its Kanban board from one prompt (voice-over uses Hermes's free Edge text-to-speech); new Activity 6 schedules jobs that auto-generate the weekly social drafts and a video draft, still behind human approval. Day 2 retimed inside the approved LU3 4 hours (Lab 5B 70 min, Lab 6 30 min, Paperclip demo 20 min). Paperclip bonus installs through Mia. Assessment questions, K/A codes and PP evidence unchanged.</w:t>
+            </w:r>
+          </w:p>
+        </w:tc>
+        <w:tc>
+          <w:tcPr>
+            <w:tcW w:type="dxa" w:w="1440"/>
+          </w:tcPr>
+          <w:p>
+            <w:r/>
+            <w:r>
+              <w:rPr>
+                <w:sz w:val="19"/>
+              </w:rPr>
+              <w:t>Dr. Alfred Ang</w:t>
+            </w:r>
+          </w:p>
+        </w:tc>
+      </w:tr>
+      <w:tr>
+        <w:tc>
+          <w:tcPr>
+            <w:tcW w:type="dxa" w:w="1152"/>
+          </w:tcPr>
+          <w:p>
+            <w:r/>
+            <w:r>
+              <w:rPr>
+                <w:sz w:val="19"/>
+              </w:rPr>
+              <w:t>3.6</w:t>
+            </w:r>
+          </w:p>
+        </w:tc>
+        <w:tc>
+          <w:tcPr>
+            <w:tcW w:type="dxa" w:w="1656"/>
+          </w:tcPr>
+          <w:p>
+            <w:r/>
+            <w:r>
+              <w:rPr>
+                <w:sz w:val="19"/>
+              </w:rPr>
+              <w:t>31 October 2026</w:t>
+            </w:r>
+          </w:p>
+        </w:tc>
+        <w:tc>
+          <w:tcPr>
+            <w:tcW w:type="dxa" w:w="5544"/>
+          </w:tcPr>
+          <w:p>
+            <w:r/>
+            <w:r>
+              <w:rPr>
+                <w:sz w:val="19"/>
+              </w:rPr>
+              <w:t>Topic 1: the Big Five comparison is back with the model inside each agent (Muse Spark, GPT-6 Astra, Grok 4.6/4.7, Claude Opus 5.5, Manus 2.0 harness), what to use it for and a Kopi Kaki job, checked against each maker's announcement on 31 Oct 2026. Topic 3: the ACP/A2A protocol content is removed; the trainer's multi-agent screenshots are redrawn as native diagrams with Kopi Kaki examples: hub-and-spoke, how a request travels, task decomposition (the 5-step framework, answered for Activity 5) and subagents (Hermes delegate_task). Trainer hand edits ported: no Checkpoint &amp; Reflection slides in the labs, no 'Was the team worth it?' slide. Topic 2 reordered by the trainer: what an AI agent is (components moved from Topic 1) → what Hermes Agent is → install, then hand Mia the AGENTS.md rulebook (+ → Folder… attaches the kopi-kaki folder; the first prompt tells her to follow it) → provider and model (Nous free Upstage Solar Mini 4 or ChatGPT Plus) → Telegram, two ways (Create with QR, or manually with BotFather) → tools and skills (the difference, moved from Topic 1; Gmail, web design and PPTX; Firecrawl kept for Topic 3) → Activities 2 and 3. Every lab slide links to its section of the Lab Prompts page. Assessment v7 unchanged.</w:t>
+            </w:r>
+          </w:p>
+        </w:tc>
+        <w:tc>
+          <w:tcPr>
+            <w:tcW w:type="dxa" w:w="1440"/>
+          </w:tcPr>
+          <w:p>
+            <w:r/>
+            <w:r>
+              <w:rPr>
+                <w:sz w:val="19"/>
+              </w:rPr>
+              <w:t>Dr. Alfred Ang</w:t>
+            </w:r>
+          </w:p>
+        </w:tc>
+      </w:tr>
+      <w:tr>
+        <w:tc>
+          <w:tcPr>
+            <w:tcW w:type="dxa" w:w="1152"/>
+          </w:tcPr>
+          <w:p>
+            <w:r/>
+            <w:r>
+              <w:rPr>
+                <w:sz w:val="19"/>
+              </w:rPr>
+              <w:t>3.7</w:t>
+            </w:r>
+          </w:p>
+        </w:tc>
+        <w:tc>
+          <w:tcPr>
+            <w:tcW w:type="dxa" w:w="1656"/>
+          </w:tcPr>
+          <w:p>
+            <w:r/>
+            <w:r>
+              <w:rPr>
+                <w:sz w:val="19"/>
+              </w:rPr>
+              <w:t>1 November 2026</w:t>
+            </w:r>
+          </w:p>
+        </w:tc>
+        <w:tc>
+          <w:tcPr>
+            <w:tcW w:type="dxa" w:w="5544"/>
+          </w:tcPr>
+          <w:p>
+            <w:r/>
+            <w:r>
+              <w:rPr>
+                <w:sz w:val="19"/>
+              </w:rPr>
+              <w:t>A prominent orange COPY THE PROMPTS button on every lab intro and prompt slide opens that lab on the Lab Prompts page (prompts/#lab-&lt;code&gt;). The Practice Exam slide is removed at the trainer's request. Learner Guide: the Topic 2 setup lab now sits before Activities 2 and 3, as in the deck. Assessment v7 unchanged.</w:t>
             </w:r>
           </w:p>
         </w:tc>
@@ -1952,7 +2068,7 @@
         </w:rPr>
         <w:t>Course Information</w:t>
         <w:tab/>
-        <w:t>9</w:t>
+        <w:t>10</w:t>
       </w:r>
     </w:p>
     <w:p>
@@ -1971,7 +2087,7 @@
         </w:rPr>
         <w:t>Learning Outcomes</w:t>
         <w:tab/>
-        <w:t>9</w:t>
+        <w:t>10</w:t>
       </w:r>
     </w:p>
     <w:p>
@@ -1990,7 +2106,7 @@
         </w:rPr>
         <w:t>Topics and Labs</w:t>
         <w:tab/>
-        <w:t>9</w:t>
+        <w:t>10</w:t>
       </w:r>
     </w:p>
     <w:p>
@@ -2009,7 +2125,7 @@
         </w:rPr>
         <w:t>Learning Units (approved Course Proposal TPG-2024060313)</w:t>
         <w:tab/>
-        <w:t>10</w:t>
+        <w:t>11</w:t>
       </w:r>
     </w:p>
     <w:p>
@@ -2028,7 +2144,7 @@
         </w:rPr>
         <w:t>Assessment</w:t>
         <w:tab/>
-        <w:t>10</w:t>
+        <w:t>11</w:t>
       </w:r>
     </w:p>
     <w:p>
@@ -2047,7 +2163,7 @@
         </w:rPr>
         <w:t>Course Schedule</w:t>
         <w:tab/>
-        <w:t>10</w:t>
+        <w:t>12</w:t>
       </w:r>
     </w:p>
     <w:p>
@@ -2067,7 +2183,7 @@
         </w:rPr>
         <w:t>Day 1 — Human–AI overview → always-on assistants → Hermes Agent setup, tools, skills and schedules (Activities 1–3)</w:t>
         <w:tab/>
-        <w:t>10</w:t>
+        <w:t>12</w:t>
       </w:r>
     </w:p>
     <w:p>
@@ -2087,7 +2203,7 @@
         </w:rPr>
         <w:t>Day 2 — Hermes bots in a group chat, a Kanban video team and content crons (Activities 4–6), AI security, optional Paperclip bonus, then assessment</w:t>
         <w:tab/>
-        <w:t>11</w:t>
+        <w:t>12</w:t>
       </w:r>
     </w:p>
     <w:p>
@@ -2106,7 +2222,7 @@
         </w:rPr>
         <w:t>Lab Reference</w:t>
         <w:tab/>
-        <w:t>12</w:t>
+        <w:t>13</w:t>
       </w:r>
       <w:r>
         <w:fldChar w:fldCharType="end"/>
@@ -2411,7 +2527,7 @@
                 <w:b w:val="0"/>
                 <w:sz w:val="20"/>
               </w:rPr>
-              <w:t>Human-AI Workforce with Autonomous AI Agents-v3.5.pptx (159 slides)</w:t>
+              <w:t>Human-AI Workforce with Autonomous AI Agents-v3.7.pptx (158 slides)</w:t>
             </w:r>
           </w:p>
         </w:tc>
@@ -2620,7 +2736,7 @@
                 <w:b w:val="0"/>
                 <w:sz w:val="19"/>
               </w:rPr>
-              <w:t>20–57</w:t>
+              <w:t>20–56</w:t>
             </w:r>
           </w:p>
         </w:tc>
@@ -2655,7 +2771,7 @@
                 <w:b w:val="0"/>
                 <w:sz w:val="19"/>
               </w:rPr>
-              <w:t>What Hermes Agent is; install Hermes Desktop; give Mia a brain: Nous free tier, your ChatGPT Plus plan or a paid model; Telegram by QR code, voice, tools and skills, all from the Desktop window; Gmail by Google sign-in (Connectors), Firecrawl web search and scheduled jobs; Activity 2 · One agent + UX skills build the Kopi Kaki website; Activity 3 · One agent + PPT tool and skill build the Kopi Kaki deck (PP Task 2).</w:t>
+              <w:t>What an AI agent is, part by part; what Hermes Agent is; install Hermes Desktop and point it at your kopi-kaki folder; Provider and model: Nous Portal free (Upstage Solar Mini 4) or your ChatGPT Plus plan; Telegram bot by QR code or BotFather; Tools and skills: the difference, then Gmail, web design and PPTX; Firecrawl web search; scheduled jobs; Activity 2 · One agent + UX skills build the Kopi Kaki website; Activity 3 · One agent + PPT tool and skill build the Kopi Kaki deck (PP Task 2).</w:t>
             </w:r>
           </w:p>
         </w:tc>
@@ -2671,7 +2787,7 @@
                 <w:b w:val="0"/>
                 <w:sz w:val="19"/>
               </w:rPr>
-              <w:t>58–95</w:t>
+              <w:t>57–96</w:t>
             </w:r>
           </w:p>
         </w:tc>
@@ -2706,7 +2822,7 @@
                 <w:b w:val="0"/>
                 <w:sz w:val="19"/>
               </w:rPr>
-              <w:t>Multiple agents: own tools, skills, model, instructions and context window; how agents talk (ACP); Activity 4 · Hire five named bots, put them in one group chat, get LinkedIn, Facebook and Instagram posts; Activity 5 · One prompt builds a video team and its Kanban board: research → script → video → review → your approval (PP Task 3); Activity 6 · Crons auto-generate next week’s posts and video drafts, still behind your approval; Five principles of AI security.</w:t>
+              <w:t>Multiple agents: own tools, skills, model, instructions and context window; hub-and-spoke, task decomposition and subagents; Activity 4 · Hire five named bots, put them in one group chat, get LinkedIn, Facebook and Instagram posts; Activity 5 · One prompt builds a video team and its Kanban board: research → script → video → review → your approval (PP Task 3); Activity 6 · Crons auto-generate next week’s posts and video drafts, still behind your approval; Five principles of AI security.</w:t>
             </w:r>
           </w:p>
         </w:tc>
@@ -2722,7 +2838,7 @@
                 <w:b w:val="0"/>
                 <w:sz w:val="19"/>
               </w:rPr>
-              <w:t>96–151</w:t>
+              <w:t>97–151</w:t>
             </w:r>
           </w:p>
         </w:tc>
@@ -2912,7 +3028,7 @@
                 <w:b w:val="0"/>
                 <w:sz w:val="19"/>
               </w:rPr>
-              <w:t>Topic 1 history, collaboration, harness and Big Five + Activity 1 always-on assistant + Topic 2 Part A: Hermes Agent, Desktop, model (Nous free tier or ChatGPT Plus) and Telegram</w:t>
+              <w:t>Topic 1 history, collaboration, harness and Big Five + Activity 1 always-on assistant + Topic 2 Part A: what an AI agent is, Hermes Agent, Desktop and the company folder, provider and model (Nous free Solar Mini 4 or ChatGPT Plus) and a Telegram bot (QR or BotFather)</w:t>
             </w:r>
           </w:p>
         </w:tc>
@@ -3001,7 +3117,7 @@
                 <w:b w:val="0"/>
                 <w:sz w:val="19"/>
               </w:rPr>
-              <w:t>Topic 2 Part B: voice, tools, skills, Firecrawl, Gmail connector and scheduled jobs + Activities 2–3 (single-agent website and PPT) + Topic 3 bots and group chats + Activity 4 social media bots</w:t>
+              <w:t>Topic 2 Parts B–C: voice, tools vs skills, Firecrawl, then Gmail (connector + scheduled brief), web design and PPTX + Activities 2–3 (single-agent website and PPT) + Topic 3 bots and group chats + Activity 4 social media bots</w:t>
             </w:r>
           </w:p>
         </w:tc>
@@ -3535,7 +3651,7 @@
                 <w:b/>
                 <w:sz w:val="19"/>
               </w:rPr>
-              <w:t>Topic 1 (Part A) — AI history; what agentic AI is; under the hood (model, harness, tools, skills, loop); humans decide; assistant vs digital worker; five collaboration scenarios (Scenario 2 tried live on WhatsApp); use cases, AI for Science, humanoid elderly care</w:t>
+              <w:t>Topic 1 (Part A) — AI history; what agentic AI is; under the hood (brain-and-body analogy, the agentic loop); humans decide; assistant vs digital worker; five collaboration scenarios (Scenario 2 tried live on WhatsApp); use cases, AI for Science, humanoid elderly care</w:t>
             </w:r>
           </w:p>
         </w:tc>
@@ -3569,7 +3685,7 @@
                 <w:b w:val="0"/>
                 <w:sz w:val="19"/>
               </w:rPr>
-              <w:t>20–42</w:t>
+              <w:t>20–40</w:t>
             </w:r>
           </w:p>
         </w:tc>
@@ -3743,7 +3859,7 @@
                 <w:b w:val="0"/>
                 <w:sz w:val="19"/>
               </w:rPr>
-              <w:t>43–49</w:t>
+              <w:t>41–48</w:t>
             </w:r>
           </w:p>
         </w:tc>
@@ -3825,7 +3941,7 @@
                 <w:b w:val="0"/>
                 <w:sz w:val="19"/>
               </w:rPr>
-              <w:t>50–57</w:t>
+              <w:t>49–56</w:t>
             </w:r>
           </w:p>
         </w:tc>
@@ -3912,7 +4028,7 @@
                 <w:b w:val="0"/>
                 <w:sz w:val="19"/>
               </w:rPr>
-              <w:t>50–57</w:t>
+              <w:t>49–56</w:t>
             </w:r>
           </w:p>
         </w:tc>
@@ -4052,7 +4168,7 @@
                 <w:b/>
                 <w:sz w:val="19"/>
               </w:rPr>
-              <w:t>Topic 2 (Part A) — meet Kopi Kaki Co.; what Hermes Agent is; install Hermes Desktop; connect a model (Nous Portal free tier or your ChatGPT Plus plan); Telegram by QR code</w:t>
+              <w:t>Topic 2 (Part A) — meet Kopi Kaki Co.; what an AI agent is (its components); what Hermes Agent is; install Hermes Desktop and point it at the kopi-kaki folder; provider and model (Nous free Solar Mini 4 or ChatGPT Plus); a Telegram bot (Create with QR, or manually with BotFather)</w:t>
             </w:r>
           </w:p>
         </w:tc>
@@ -4086,7 +4202,7 @@
                 <w:b w:val="0"/>
                 <w:sz w:val="19"/>
               </w:rPr>
-              <w:t>58–66</w:t>
+              <w:t>57–69</w:t>
             </w:r>
           </w:p>
         </w:tc>
@@ -4139,7 +4255,7 @@
                 <w:b/>
                 <w:sz w:val="19"/>
               </w:rPr>
-              <w:t>Topic 2 (Part B) — voice; tools and skills from Capabilities; Firecrawl web search</w:t>
+              <w:t>Topic 2 (Part B) — voice; tools vs skills; tools and skills from Capabilities; Firecrawl web search</w:t>
             </w:r>
           </w:p>
         </w:tc>
@@ -4173,7 +4289,7 @@
                 <w:b w:val="0"/>
                 <w:sz w:val="19"/>
               </w:rPr>
-              <w:t>67–72</w:t>
+              <w:t>70–75</w:t>
             </w:r>
           </w:p>
         </w:tc>
@@ -4313,7 +4429,7 @@
                 <w:b/>
                 <w:sz w:val="19"/>
               </w:rPr>
-              <w:t>Topic 2 (Part C) — Gmail by Google sign-in (Connectors); scheduled jobs; a daily email summary to Telegram</w:t>
+              <w:t>Topic 2 (Part C) — tools and skills in action: Gmail by Google sign-in plus a daily email summary; web-design skills from skills.sh; the PPTX tool and pitch-deck skill</w:t>
             </w:r>
           </w:p>
         </w:tc>
@@ -4347,7 +4463,7 @@
                 <w:b w:val="0"/>
                 <w:sz w:val="19"/>
               </w:rPr>
-              <w:t>73–80</w:t>
+              <w:t>76–84</w:t>
             </w:r>
           </w:p>
         </w:tc>
@@ -4429,7 +4545,7 @@
                 <w:b w:val="0"/>
                 <w:sz w:val="19"/>
               </w:rPr>
-              <w:t>81–88</w:t>
+              <w:t>85–90</w:t>
             </w:r>
           </w:p>
         </w:tc>
@@ -4511,7 +4627,7 @@
                 <w:b w:val="0"/>
                 <w:sz w:val="19"/>
               </w:rPr>
-              <w:t>89–95</w:t>
+              <w:t>91–96</w:t>
             </w:r>
           </w:p>
         </w:tc>
@@ -4598,7 +4714,7 @@
                 <w:b w:val="0"/>
                 <w:sz w:val="19"/>
               </w:rPr>
-              <w:t>96</w:t>
+              <w:t>97</w:t>
             </w:r>
           </w:p>
         </w:tc>
@@ -4811,7 +4927,7 @@
                 <w:b w:val="0"/>
                 <w:sz w:val="19"/>
               </w:rPr>
-              <w:t>96</w:t>
+              <w:t>97</w:t>
             </w:r>
           </w:p>
         </w:tc>
@@ -4864,7 +4980,7 @@
                 <w:b/>
                 <w:sz w:val="19"/>
               </w:rPr>
-              <w:t>Topic 3 (Part A) — introduction to multiple agents (each with its own tools, skills, model, instructions and context window); how agents talk (ACP); hire bots with New Agent; group chats</w:t>
+              <w:t>Topic 3 (Part A) — introduction to multiple agents (each with its own tools, skills, model, instructions and context window); hub-and-spoke, task decomposition and subagents; hire bots with New Agent; group chats</w:t>
             </w:r>
           </w:p>
         </w:tc>
@@ -4898,7 +5014,7 @@
                 <w:b w:val="0"/>
                 <w:sz w:val="19"/>
               </w:rPr>
-              <w:t>96–102</w:t>
+              <w:t>97–109</w:t>
             </w:r>
           </w:p>
         </w:tc>
@@ -4980,7 +5096,7 @@
                 <w:b w:val="0"/>
                 <w:sz w:val="19"/>
               </w:rPr>
-              <w:t>103–112</w:t>
+              <w:t>110–116</w:t>
             </w:r>
           </w:p>
         </w:tc>
@@ -5149,7 +5265,7 @@
                 <w:b w:val="0"/>
                 <w:sz w:val="19"/>
               </w:rPr>
-              <w:t>113–120</w:t>
+              <w:t>117–120</w:t>
             </w:r>
           </w:p>
         </w:tc>
@@ -5318,7 +5434,7 @@
                 <w:b w:val="0"/>
                 <w:sz w:val="19"/>
               </w:rPr>
-              <w:t>121–126</w:t>
+              <w:t>121–125</w:t>
             </w:r>
           </w:p>
         </w:tc>
@@ -5400,7 +5516,7 @@
                 <w:b w:val="0"/>
                 <w:sz w:val="19"/>
               </w:rPr>
-              <w:t>127–132</w:t>
+              <w:t>126–130</w:t>
             </w:r>
           </w:p>
         </w:tc>
@@ -5574,7 +5690,7 @@
                 <w:b w:val="0"/>
                 <w:sz w:val="19"/>
               </w:rPr>
-              <w:t>133–135</w:t>
+              <w:t>131–136</w:t>
             </w:r>
           </w:p>
         </w:tc>
@@ -5661,7 +5777,7 @@
                 <w:b w:val="0"/>
                 <w:sz w:val="19"/>
               </w:rPr>
-              <w:t>136–151</w:t>
+              <w:t>137–151</w:t>
             </w:r>
           </w:p>
         </w:tc>
@@ -5748,7 +5864,7 @@
                 <w:b w:val="0"/>
                 <w:sz w:val="19"/>
               </w:rPr>
-              <w:t>152–155</w:t>
+              <w:t>152–154</w:t>
             </w:r>
           </w:p>
         </w:tc>
@@ -5922,7 +6038,7 @@
                 <w:b w:val="0"/>
                 <w:sz w:val="19"/>
               </w:rPr>
-              <w:t>156–159</w:t>
+              <w:t>155–158</w:t>
             </w:r>
           </w:p>
         </w:tc>
@@ -6009,7 +6125,7 @@
                 <w:b w:val="0"/>
                 <w:sz w:val="19"/>
               </w:rPr>
-              <w:t>156–159</w:t>
+              <w:t>155–158</w:t>
             </w:r>
           </w:p>
         </w:tc>
@@ -6216,7 +6332,7 @@
                 <w:b w:val="0"/>
                 <w:sz w:val="19"/>
               </w:rPr>
-              <w:t>50–57</w:t>
+              <w:t>49–56</w:t>
             </w:r>
           </w:p>
         </w:tc>
@@ -6298,7 +6414,7 @@
                 <w:b w:val="0"/>
                 <w:sz w:val="19"/>
               </w:rPr>
-              <w:t>76–80</w:t>
+              <w:t>81–84</w:t>
             </w:r>
           </w:p>
         </w:tc>
@@ -6380,7 +6496,7 @@
                 <w:b w:val="0"/>
                 <w:sz w:val="19"/>
               </w:rPr>
-              <w:t>83–88</w:t>
+              <w:t>86–90</w:t>
             </w:r>
           </w:p>
         </w:tc>
@@ -6462,7 +6578,7 @@
                 <w:b w:val="0"/>
                 <w:sz w:val="19"/>
               </w:rPr>
-              <w:t>91–95</w:t>
+              <w:t>93–96</w:t>
             </w:r>
           </w:p>
         </w:tc>
@@ -6544,7 +6660,7 @@
                 <w:b w:val="0"/>
                 <w:sz w:val="19"/>
               </w:rPr>
-              <w:t>107–112</w:t>
+              <w:t>112–116</w:t>
             </w:r>
           </w:p>
         </w:tc>
@@ -6626,7 +6742,7 @@
                 <w:b w:val="0"/>
                 <w:sz w:val="19"/>
               </w:rPr>
-              <w:t>121–126</w:t>
+              <w:t>121–125</w:t>
             </w:r>
           </w:p>
         </w:tc>
@@ -6708,7 +6824,7 @@
                 <w:b w:val="0"/>
                 <w:sz w:val="19"/>
               </w:rPr>
-              <w:t>128–132</w:t>
+              <w:t>127–130</w:t>
             </w:r>
           </w:p>
         </w:tc>
@@ -6790,7 +6906,7 @@
                 <w:b w:val="0"/>
                 <w:sz w:val="19"/>
               </w:rPr>
-              <w:t>146–151</w:t>
+              <w:t>147–151</w:t>
             </w:r>
           </w:p>
         </w:tc>

</xml_diff>